<commit_message>
Fix 5-month rollout for 2-week pot cycles
Recalculate monthly boosts so each month holds at most two
sequential 2-week pots (25k / 45k / 80k / 50k / 100k STX).

Co-authored-by: cryptosmith.btc <Zeus-Adin@users.noreply.github.com>
</commit_message>
<xml_diff>
--- a/StacksPot-Growth-Acceleration-Proposal.docx
+++ b/StacksPot-Growth-Acceleration-Proposal.docx
@@ -3097,6 +3097,116 @@
           <w:color w:val="2B6CB0"/>
           <w:sz w:val="26"/>
         </w:rPr>
+        <w:t>Pot Cycle Length</w:t>
+      </w:r>
+    </w:p>
+    <w:p>
+      <w:pPr>
+        <w:spacing w:before="0" w:after="160" w:lineRule="auto" w:line="276"/>
+      </w:pPr>
+      <w:r>
+        <w:rPr>
+          <w:rFonts w:ascii="Calibri" w:hAnsi="Calibri" w:eastAsia="Calibri"/>
+          <w:b w:val="0"/>
+          <w:i w:val="0"/>
+          <w:color w:val="1F2937"/>
+          <w:sz w:val="22"/>
+        </w:rPr>
+        <w:t xml:space="preserve">Each sponsored pot runs on a </w:t>
+      </w:r>
+      <w:r>
+        <w:rPr>
+          <w:rFonts w:ascii="Calibri" w:hAnsi="Calibri" w:eastAsia="Calibri"/>
+          <w:b/>
+          <w:i w:val="0"/>
+          <w:color w:val="1F2937"/>
+          <w:sz w:val="22"/>
+        </w:rPr>
+        <w:t>2-week cycle</w:t>
+      </w:r>
+      <w:r>
+        <w:rPr>
+          <w:rFonts w:ascii="Calibri" w:hAnsi="Calibri" w:eastAsia="Calibri"/>
+          <w:b w:val="0"/>
+          <w:i w:val="0"/>
+          <w:color w:val="1F2937"/>
+          <w:sz w:val="22"/>
+        </w:rPr>
+        <w:t xml:space="preserve">. Over a 5-month program (~20 weeks), that provides capacity for about </w:t>
+      </w:r>
+      <w:r>
+        <w:rPr>
+          <w:rFonts w:ascii="Calibri" w:hAnsi="Calibri" w:eastAsia="Calibri"/>
+          <w:b/>
+          <w:i w:val="0"/>
+          <w:color w:val="1F2937"/>
+          <w:sz w:val="22"/>
+        </w:rPr>
+        <w:t>10 bi-weekly cycles</w:t>
+      </w:r>
+      <w:r>
+        <w:rPr>
+          <w:rFonts w:ascii="Calibri" w:hAnsi="Calibri" w:eastAsia="Calibri"/>
+          <w:b w:val="0"/>
+          <w:i w:val="0"/>
+          <w:color w:val="1F2937"/>
+          <w:sz w:val="22"/>
+        </w:rPr>
+        <w:t xml:space="preserve">. The </w:t>
+      </w:r>
+      <w:r>
+        <w:rPr>
+          <w:rFonts w:ascii="Calibri" w:hAnsi="Calibri" w:eastAsia="Calibri"/>
+          <w:b/>
+          <w:i w:val="0"/>
+          <w:color w:val="1F2937"/>
+          <w:sz w:val="22"/>
+        </w:rPr>
+        <w:t>8 sponsored pots</w:t>
+      </w:r>
+      <w:r>
+        <w:rPr>
+          <w:rFonts w:ascii="Calibri" w:hAnsi="Calibri" w:eastAsia="Calibri"/>
+          <w:b w:val="0"/>
+          <w:i w:val="0"/>
+          <w:color w:val="1F2937"/>
+          <w:sz w:val="22"/>
+        </w:rPr>
+        <w:t xml:space="preserve"> therefore occupy </w:t>
+      </w:r>
+      <w:r>
+        <w:rPr>
+          <w:rFonts w:ascii="Calibri" w:hAnsi="Calibri" w:eastAsia="Calibri"/>
+          <w:b/>
+          <w:i w:val="0"/>
+          <w:color w:val="1F2937"/>
+          <w:sz w:val="22"/>
+        </w:rPr>
+        <w:t>16 weeks</w:t>
+      </w:r>
+      <w:r>
+        <w:rPr>
+          <w:rFonts w:ascii="Calibri" w:hAnsi="Calibri" w:eastAsia="Calibri"/>
+          <w:b w:val="0"/>
+          <w:i w:val="0"/>
+          <w:color w:val="1F2937"/>
+          <w:sz w:val="22"/>
+        </w:rPr>
+        <w:t xml:space="preserve"> of active campaigns, with remaining weeks used for pacing, community-led pots, and program wrap-up.</w:t>
+      </w:r>
+    </w:p>
+    <w:p>
+      <w:pPr>
+        <w:spacing w:before="240" w:after="120" w:lineRule="auto" w:line="276"/>
+      </w:pPr>
+      <w:r>
+        <w:rPr>
+          <w:rFonts w:ascii="Calibri" w:hAnsi="Calibri" w:eastAsia="Calibri"/>
+          <w:b/>
+          <w:i w:val="0"/>
+          <w:color w:val="2B6CB0"/>
+          <w:sz w:val="26"/>
+        </w:rPr>
         <w:t>Indicative 5-Month Rollout</w:t>
       </w:r>
     </w:p>
@@ -3112,7 +3222,7 @@
           <w:color w:val="1F2937"/>
           <w:sz w:val="22"/>
         </w:rPr>
-        <w:t>Campaigns will be sequenced to build familiarity, then scale commitment:</w:t>
+        <w:t>Campaigns are sequenced one pot per 2-week cycle—about two pots per month—to build familiarity, then scale commitment:</w:t>
       </w:r>
     </w:p>
     <w:tbl>
@@ -3123,15 +3233,16 @@
         <w:tblLook w:firstColumn="1" w:firstRow="1" w:lastColumn="0" w:lastRow="0" w:noHBand="0" w:noVBand="1" w:val="04A0"/>
       </w:tblPr>
       <w:tblGrid>
-        <w:gridCol w:w="2340"/>
-        <w:gridCol w:w="2340"/>
-        <w:gridCol w:w="2340"/>
-        <w:gridCol w:w="2340"/>
+        <w:gridCol w:w="1872"/>
+        <w:gridCol w:w="1872"/>
+        <w:gridCol w:w="1872"/>
+        <w:gridCol w:w="1872"/>
+        <w:gridCol w:w="1872"/>
       </w:tblGrid>
       <w:tr>
         <w:tc>
           <w:tcPr>
-            <w:tcW w:type="dxa" w:w="1008"/>
+            <w:tcW w:type="dxa" w:w="864"/>
             <w:shd w:fill="1A365D" w:val="clear"/>
             <w:tcBorders>
               <w:top w:val="single" w:sz="4" w:space="0" w:color="1A365D"/>
@@ -3160,7 +3271,7 @@
         </w:tc>
         <w:tc>
           <w:tcPr>
-            <w:tcW w:type="dxa" w:w="4320"/>
+            <w:tcW w:type="dxa" w:w="3744"/>
             <w:shd w:fill="1A365D" w:val="clear"/>
             <w:tcBorders>
               <w:top w:val="single" w:sz="4" w:space="0" w:color="1A365D"/>
@@ -3218,7 +3329,36 @@
         </w:tc>
         <w:tc>
           <w:tcPr>
-            <w:tcW w:type="dxa" w:w="1872"/>
+            <w:tcW w:type="dxa" w:w="1008"/>
+            <w:shd w:fill="1A365D" w:val="clear"/>
+            <w:tcBorders>
+              <w:top w:val="single" w:sz="4" w:space="0" w:color="1A365D"/>
+              <w:left w:val="single" w:sz="4" w:space="0" w:color="1A365D"/>
+              <w:bottom w:val="single" w:sz="4" w:space="0" w:color="1A365D"/>
+              <w:right w:val="single" w:sz="4" w:space="0" w:color="1A365D"/>
+            </w:tcBorders>
+          </w:tcPr>
+          <w:p>
+            <w:pPr>
+              <w:spacing w:before="40" w:after="40" w:lineRule="auto" w:line="240"/>
+              <w:jc w:val="center"/>
+            </w:pPr>
+            <w:r/>
+            <w:r>
+              <w:rPr>
+                <w:rFonts w:ascii="Calibri" w:hAnsi="Calibri" w:eastAsia="Calibri"/>
+                <w:b/>
+                <w:i w:val="0"/>
+                <w:color w:val="FFFFFF"/>
+                <w:sz w:val="20"/>
+              </w:rPr>
+              <w:t>Cycles</w:t>
+            </w:r>
+          </w:p>
+        </w:tc>
+        <w:tc>
+          <w:tcPr>
+            <w:tcW w:type="dxa" w:w="1728"/>
             <w:shd w:fill="1A365D" w:val="clear"/>
             <w:tcBorders>
               <w:top w:val="single" w:sz="4" w:space="0" w:color="1A365D"/>
@@ -3249,7 +3389,7 @@
       <w:tr>
         <w:tc>
           <w:tcPr>
-            <w:tcW w:type="dxa" w:w="1008"/>
+            <w:tcW w:type="dxa" w:w="864"/>
             <w:tcBorders>
               <w:top w:val="single" w:sz="4" w:space="0" w:color="CBD5E1"/>
               <w:left w:val="single" w:sz="4" w:space="0" w:color="CBD5E1"/>
@@ -3277,7 +3417,7 @@
         </w:tc>
         <w:tc>
           <w:tcPr>
-            <w:tcW w:type="dxa" w:w="4320"/>
+            <w:tcW w:type="dxa" w:w="3744"/>
             <w:tcBorders>
               <w:top w:val="single" w:sz="4" w:space="0" w:color="CBD5E1"/>
               <w:left w:val="single" w:sz="4" w:space="0" w:color="CBD5E1"/>
@@ -3288,7 +3428,7 @@
           <w:p>
             <w:pPr>
               <w:spacing w:before="40" w:after="40" w:lineRule="auto" w:line="240"/>
-              <w:jc w:val="right"/>
+              <w:jc w:val="left"/>
             </w:pPr>
             <w:r/>
             <w:r>
@@ -3327,13 +3467,13 @@
                 <w:color w:val="1F2937"/>
                 <w:sz w:val="20"/>
               </w:rPr>
-              <w:t>25 / 30 / 35 STX</w:t>
+              <w:t>25 STX → 30 STX</w:t>
             </w:r>
           </w:p>
         </w:tc>
         <w:tc>
           <w:tcPr>
-            <w:tcW w:type="dxa" w:w="1872"/>
+            <w:tcW w:type="dxa" w:w="1008"/>
             <w:tcBorders>
               <w:top w:val="single" w:sz="4" w:space="0" w:color="CBD5E1"/>
               <w:left w:val="single" w:sz="4" w:space="0" w:color="CBD5E1"/>
@@ -3355,7 +3495,35 @@
                 <w:color w:val="1F2937"/>
                 <w:sz w:val="20"/>
               </w:rPr>
-              <w:t>45,000 STX</w:t>
+              <w:t>2</w:t>
+            </w:r>
+          </w:p>
+        </w:tc>
+        <w:tc>
+          <w:tcPr>
+            <w:tcW w:type="dxa" w:w="1728"/>
+            <w:tcBorders>
+              <w:top w:val="single" w:sz="4" w:space="0" w:color="CBD5E1"/>
+              <w:left w:val="single" w:sz="4" w:space="0" w:color="CBD5E1"/>
+              <w:bottom w:val="single" w:sz="4" w:space="0" w:color="CBD5E1"/>
+              <w:right w:val="single" w:sz="4" w:space="0" w:color="CBD5E1"/>
+            </w:tcBorders>
+          </w:tcPr>
+          <w:p>
+            <w:pPr>
+              <w:spacing w:before="40" w:after="40" w:lineRule="auto" w:line="240"/>
+              <w:jc w:val="right"/>
+            </w:pPr>
+            <w:r/>
+            <w:r>
+              <w:rPr>
+                <w:rFonts w:ascii="Calibri" w:hAnsi="Calibri" w:eastAsia="Calibri"/>
+                <w:b w:val="0"/>
+                <w:i w:val="0"/>
+                <w:color w:val="1F2937"/>
+                <w:sz w:val="20"/>
+              </w:rPr>
+              <w:t>25,000 STX</w:t>
             </w:r>
           </w:p>
         </w:tc>
@@ -3363,7 +3531,7 @@
       <w:tr>
         <w:tc>
           <w:tcPr>
-            <w:tcW w:type="dxa" w:w="1008"/>
+            <w:tcW w:type="dxa" w:w="864"/>
             <w:tcBorders>
               <w:top w:val="single" w:sz="4" w:space="0" w:color="CBD5E1"/>
               <w:left w:val="single" w:sz="4" w:space="0" w:color="CBD5E1"/>
@@ -3392,7 +3560,7 @@
         </w:tc>
         <w:tc>
           <w:tcPr>
-            <w:tcW w:type="dxa" w:w="4320"/>
+            <w:tcW w:type="dxa" w:w="3744"/>
             <w:tcBorders>
               <w:top w:val="single" w:sz="4" w:space="0" w:color="CBD5E1"/>
               <w:left w:val="single" w:sz="4" w:space="0" w:color="CBD5E1"/>
@@ -3404,7 +3572,7 @@
           <w:p>
             <w:pPr>
               <w:spacing w:before="40" w:after="40" w:lineRule="auto" w:line="240"/>
-              <w:jc w:val="right"/>
+              <w:jc w:val="left"/>
             </w:pPr>
             <w:r/>
             <w:r>
@@ -3444,13 +3612,13 @@
                 <w:color w:val="1F2937"/>
                 <w:sz w:val="20"/>
               </w:rPr>
-              <w:t>40 / 45 STX</w:t>
+              <w:t>35 STX → 40 STX</w:t>
             </w:r>
           </w:p>
         </w:tc>
         <w:tc>
           <w:tcPr>
-            <w:tcW w:type="dxa" w:w="1872"/>
+            <w:tcW w:type="dxa" w:w="1008"/>
             <w:tcBorders>
               <w:top w:val="single" w:sz="4" w:space="0" w:color="CBD5E1"/>
               <w:left w:val="single" w:sz="4" w:space="0" w:color="CBD5E1"/>
@@ -3473,7 +3641,36 @@
                 <w:color w:val="1F2937"/>
                 <w:sz w:val="20"/>
               </w:rPr>
-              <w:t>55,000 STX</w:t>
+              <w:t>2</w:t>
+            </w:r>
+          </w:p>
+        </w:tc>
+        <w:tc>
+          <w:tcPr>
+            <w:tcW w:type="dxa" w:w="1728"/>
+            <w:tcBorders>
+              <w:top w:val="single" w:sz="4" w:space="0" w:color="CBD5E1"/>
+              <w:left w:val="single" w:sz="4" w:space="0" w:color="CBD5E1"/>
+              <w:bottom w:val="single" w:sz="4" w:space="0" w:color="CBD5E1"/>
+              <w:right w:val="single" w:sz="4" w:space="0" w:color="CBD5E1"/>
+            </w:tcBorders>
+            <w:shd w:fill="F7FAFC" w:val="clear"/>
+          </w:tcPr>
+          <w:p>
+            <w:pPr>
+              <w:spacing w:before="40" w:after="40" w:lineRule="auto" w:line="240"/>
+              <w:jc w:val="right"/>
+            </w:pPr>
+            <w:r/>
+            <w:r>
+              <w:rPr>
+                <w:rFonts w:ascii="Calibri" w:hAnsi="Calibri" w:eastAsia="Calibri"/>
+                <w:b w:val="0"/>
+                <w:i w:val="0"/>
+                <w:color w:val="1F2937"/>
+                <w:sz w:val="20"/>
+              </w:rPr>
+              <w:t>45,000 STX</w:t>
             </w:r>
           </w:p>
         </w:tc>
@@ -3481,7 +3678,7 @@
       <w:tr>
         <w:tc>
           <w:tcPr>
-            <w:tcW w:type="dxa" w:w="1008"/>
+            <w:tcW w:type="dxa" w:w="864"/>
             <w:tcBorders>
               <w:top w:val="single" w:sz="4" w:space="0" w:color="CBD5E1"/>
               <w:left w:val="single" w:sz="4" w:space="0" w:color="CBD5E1"/>
@@ -3509,7 +3706,7 @@
         </w:tc>
         <w:tc>
           <w:tcPr>
-            <w:tcW w:type="dxa" w:w="4320"/>
+            <w:tcW w:type="dxa" w:w="3744"/>
             <w:tcBorders>
               <w:top w:val="single" w:sz="4" w:space="0" w:color="CBD5E1"/>
               <w:left w:val="single" w:sz="4" w:space="0" w:color="CBD5E1"/>
@@ -3520,7 +3717,7 @@
           <w:p>
             <w:pPr>
               <w:spacing w:before="40" w:after="40" w:lineRule="auto" w:line="240"/>
-              <w:jc w:val="right"/>
+              <w:jc w:val="left"/>
             </w:pPr>
             <w:r/>
             <w:r>
@@ -3531,7 +3728,7 @@
                 <w:color w:val="1F2937"/>
                 <w:sz w:val="20"/>
               </w:rPr>
-              <w:t>Deepen community pots</w:t>
+              <w:t>Scale community pots</w:t>
             </w:r>
           </w:p>
         </w:tc>
@@ -3559,13 +3756,13 @@
                 <w:color w:val="1F2937"/>
                 <w:sz w:val="20"/>
               </w:rPr>
-              <w:t>50 STX (1 of 2)</w:t>
+              <w:t>45 STX → 50 STX (1 of 2)</w:t>
             </w:r>
           </w:p>
         </w:tc>
         <w:tc>
           <w:tcPr>
-            <w:tcW w:type="dxa" w:w="1872"/>
+            <w:tcW w:type="dxa" w:w="1008"/>
             <w:tcBorders>
               <w:top w:val="single" w:sz="4" w:space="0" w:color="CBD5E1"/>
               <w:left w:val="single" w:sz="4" w:space="0" w:color="CBD5E1"/>
@@ -3587,7 +3784,35 @@
                 <w:color w:val="1F2937"/>
                 <w:sz w:val="20"/>
               </w:rPr>
-              <w:t>50,000 STX</w:t>
+              <w:t>2</w:t>
+            </w:r>
+          </w:p>
+        </w:tc>
+        <w:tc>
+          <w:tcPr>
+            <w:tcW w:type="dxa" w:w="1728"/>
+            <w:tcBorders>
+              <w:top w:val="single" w:sz="4" w:space="0" w:color="CBD5E1"/>
+              <w:left w:val="single" w:sz="4" w:space="0" w:color="CBD5E1"/>
+              <w:bottom w:val="single" w:sz="4" w:space="0" w:color="CBD5E1"/>
+              <w:right w:val="single" w:sz="4" w:space="0" w:color="CBD5E1"/>
+            </w:tcBorders>
+          </w:tcPr>
+          <w:p>
+            <w:pPr>
+              <w:spacing w:before="40" w:after="40" w:lineRule="auto" w:line="240"/>
+              <w:jc w:val="right"/>
+            </w:pPr>
+            <w:r/>
+            <w:r>
+              <w:rPr>
+                <w:rFonts w:ascii="Calibri" w:hAnsi="Calibri" w:eastAsia="Calibri"/>
+                <w:b w:val="0"/>
+                <w:i w:val="0"/>
+                <w:color w:val="1F2937"/>
+                <w:sz w:val="20"/>
+              </w:rPr>
+              <w:t>80,000 STX</w:t>
             </w:r>
           </w:p>
         </w:tc>
@@ -3595,7 +3820,7 @@
       <w:tr>
         <w:tc>
           <w:tcPr>
-            <w:tcW w:type="dxa" w:w="1008"/>
+            <w:tcW w:type="dxa" w:w="864"/>
             <w:tcBorders>
               <w:top w:val="single" w:sz="4" w:space="0" w:color="CBD5E1"/>
               <w:left w:val="single" w:sz="4" w:space="0" w:color="CBD5E1"/>
@@ -3624,7 +3849,7 @@
         </w:tc>
         <w:tc>
           <w:tcPr>
-            <w:tcW w:type="dxa" w:w="4320"/>
+            <w:tcW w:type="dxa" w:w="3744"/>
             <w:tcBorders>
               <w:top w:val="single" w:sz="4" w:space="0" w:color="CBD5E1"/>
               <w:left w:val="single" w:sz="4" w:space="0" w:color="CBD5E1"/>
@@ -3636,7 +3861,7 @@
           <w:p>
             <w:pPr>
               <w:spacing w:before="40" w:after="40" w:lineRule="auto" w:line="240"/>
-              <w:jc w:val="right"/>
+              <w:jc w:val="left"/>
             </w:pPr>
             <w:r/>
             <w:r>
@@ -3682,7 +3907,36 @@
         </w:tc>
         <w:tc>
           <w:tcPr>
-            <w:tcW w:type="dxa" w:w="1872"/>
+            <w:tcW w:type="dxa" w:w="1008"/>
+            <w:tcBorders>
+              <w:top w:val="single" w:sz="4" w:space="0" w:color="CBD5E1"/>
+              <w:left w:val="single" w:sz="4" w:space="0" w:color="CBD5E1"/>
+              <w:bottom w:val="single" w:sz="4" w:space="0" w:color="CBD5E1"/>
+              <w:right w:val="single" w:sz="4" w:space="0" w:color="CBD5E1"/>
+            </w:tcBorders>
+            <w:shd w:fill="F7FAFC" w:val="clear"/>
+          </w:tcPr>
+          <w:p>
+            <w:pPr>
+              <w:spacing w:before="40" w:after="40" w:lineRule="auto" w:line="240"/>
+              <w:jc w:val="right"/>
+            </w:pPr>
+            <w:r/>
+            <w:r>
+              <w:rPr>
+                <w:rFonts w:ascii="Calibri" w:hAnsi="Calibri" w:eastAsia="Calibri"/>
+                <w:b w:val="0"/>
+                <w:i w:val="0"/>
+                <w:color w:val="1F2937"/>
+                <w:sz w:val="20"/>
+              </w:rPr>
+              <w:t>1</w:t>
+            </w:r>
+          </w:p>
+        </w:tc>
+        <w:tc>
+          <w:tcPr>
+            <w:tcW w:type="dxa" w:w="1728"/>
             <w:tcBorders>
               <w:top w:val="single" w:sz="4" w:space="0" w:color="CBD5E1"/>
               <w:left w:val="single" w:sz="4" w:space="0" w:color="CBD5E1"/>
@@ -3713,7 +3967,7 @@
       <w:tr>
         <w:tc>
           <w:tcPr>
-            <w:tcW w:type="dxa" w:w="1008"/>
+            <w:tcW w:type="dxa" w:w="864"/>
             <w:tcBorders>
               <w:top w:val="single" w:sz="4" w:space="0" w:color="CBD5E1"/>
               <w:left w:val="single" w:sz="4" w:space="0" w:color="CBD5E1"/>
@@ -3741,7 +3995,7 @@
         </w:tc>
         <w:tc>
           <w:tcPr>
-            <w:tcW w:type="dxa" w:w="4320"/>
+            <w:tcW w:type="dxa" w:w="3744"/>
             <w:tcBorders>
               <w:top w:val="single" w:sz="4" w:space="0" w:color="CBD5E1"/>
               <w:left w:val="single" w:sz="4" w:space="0" w:color="CBD5E1"/>
@@ -3752,7 +4006,7 @@
           <w:p>
             <w:pPr>
               <w:spacing w:before="40" w:after="40" w:lineRule="auto" w:line="240"/>
-              <w:jc w:val="right"/>
+              <w:jc w:val="left"/>
             </w:pPr>
             <w:r/>
             <w:r>
@@ -3797,7 +4051,35 @@
         </w:tc>
         <w:tc>
           <w:tcPr>
-            <w:tcW w:type="dxa" w:w="1872"/>
+            <w:tcW w:type="dxa" w:w="1008"/>
+            <w:tcBorders>
+              <w:top w:val="single" w:sz="4" w:space="0" w:color="CBD5E1"/>
+              <w:left w:val="single" w:sz="4" w:space="0" w:color="CBD5E1"/>
+              <w:bottom w:val="single" w:sz="4" w:space="0" w:color="CBD5E1"/>
+              <w:right w:val="single" w:sz="4" w:space="0" w:color="CBD5E1"/>
+            </w:tcBorders>
+          </w:tcPr>
+          <w:p>
+            <w:pPr>
+              <w:spacing w:before="40" w:after="40" w:lineRule="auto" w:line="240"/>
+              <w:jc w:val="right"/>
+            </w:pPr>
+            <w:r/>
+            <w:r>
+              <w:rPr>
+                <w:rFonts w:ascii="Calibri" w:hAnsi="Calibri" w:eastAsia="Calibri"/>
+                <w:b w:val="0"/>
+                <w:i w:val="0"/>
+                <w:color w:val="1F2937"/>
+                <w:sz w:val="20"/>
+              </w:rPr>
+              <w:t>1</w:t>
+            </w:r>
+          </w:p>
+        </w:tc>
+        <w:tc>
+          <w:tcPr>
+            <w:tcW w:type="dxa" w:w="1728"/>
             <w:tcBorders>
               <w:top w:val="single" w:sz="4" w:space="0" w:color="CBD5E1"/>
               <w:left w:val="single" w:sz="4" w:space="0" w:color="CBD5E1"/>
@@ -3827,7 +4109,7 @@
       <w:tr>
         <w:tc>
           <w:tcPr>
-            <w:tcW w:type="dxa" w:w="1008"/>
+            <w:tcW w:type="dxa" w:w="864"/>
             <w:tcBorders>
               <w:top w:val="single" w:sz="4" w:space="0" w:color="CBD5E1"/>
               <w:left w:val="single" w:sz="4" w:space="0" w:color="CBD5E1"/>
@@ -3856,7 +4138,7 @@
         </w:tc>
         <w:tc>
           <w:tcPr>
-            <w:tcW w:type="dxa" w:w="4320"/>
+            <w:tcW w:type="dxa" w:w="3744"/>
             <w:tcBorders>
               <w:top w:val="single" w:sz="4" w:space="0" w:color="CBD5E1"/>
               <w:left w:val="single" w:sz="4" w:space="0" w:color="CBD5E1"/>
@@ -3869,7 +4151,7 @@
           <w:p>
             <w:pPr>
               <w:spacing w:before="40" w:after="40" w:lineRule="auto" w:line="240"/>
-              <w:jc w:val="right"/>
+              <w:jc w:val="left"/>
             </w:pPr>
             <w:r/>
             <w:r>
@@ -3916,7 +4198,37 @@
         </w:tc>
         <w:tc>
           <w:tcPr>
-            <w:tcW w:type="dxa" w:w="1872"/>
+            <w:tcW w:type="dxa" w:w="1008"/>
+            <w:tcBorders>
+              <w:top w:val="single" w:sz="4" w:space="0" w:color="CBD5E1"/>
+              <w:left w:val="single" w:sz="4" w:space="0" w:color="CBD5E1"/>
+              <w:bottom w:val="single" w:sz="4" w:space="0" w:color="CBD5E1"/>
+              <w:right w:val="single" w:sz="4" w:space="0" w:color="CBD5E1"/>
+            </w:tcBorders>
+            <w:shd w:fill="F7FAFC" w:val="clear"/>
+            <w:shd w:fill="EEF2F7" w:val="clear"/>
+          </w:tcPr>
+          <w:p>
+            <w:pPr>
+              <w:spacing w:before="40" w:after="40" w:lineRule="auto" w:line="240"/>
+              <w:jc w:val="right"/>
+            </w:pPr>
+            <w:r/>
+            <w:r>
+              <w:rPr>
+                <w:rFonts w:ascii="Calibri" w:hAnsi="Calibri" w:eastAsia="Calibri"/>
+                <w:b/>
+                <w:i w:val="0"/>
+                <w:color w:val="1A365D"/>
+                <w:sz w:val="20"/>
+              </w:rPr>
+              <w:t>8</w:t>
+            </w:r>
+          </w:p>
+        </w:tc>
+        <w:tc>
+          <w:tcPr>
+            <w:tcW w:type="dxa" w:w="1728"/>
             <w:tcBorders>
               <w:top w:val="single" w:sz="4" w:space="0" w:color="CBD5E1"/>
               <w:left w:val="single" w:sz="4" w:space="0" w:color="CBD5E1"/>
@@ -3953,6 +4265,81 @@
     </w:p>
     <w:p>
       <w:pPr>
+        <w:spacing w:before="0" w:after="160" w:lineRule="auto" w:line="264"/>
+      </w:pPr>
+      <w:r>
+        <w:rPr>
+          <w:rFonts w:ascii="Calibri" w:hAnsi="Calibri" w:eastAsia="Calibri"/>
+          <w:b w:val="0"/>
+          <w:i/>
+          <w:color w:val="4A5568"/>
+          <w:sz w:val="20"/>
+        </w:rPr>
+        <w:t xml:space="preserve">Month 1 boost: </w:t>
+      </w:r>
+      <w:r>
+        <w:rPr>
+          <w:rFonts w:ascii="Calibri" w:hAnsi="Calibri" w:eastAsia="Calibri"/>
+          <w:b/>
+          <w:i/>
+          <w:color w:val="4A5568"/>
+          <w:sz w:val="20"/>
+        </w:rPr>
+        <w:t>10,000 + 15,000 = 25,000 STX</w:t>
+      </w:r>
+      <w:r>
+        <w:rPr>
+          <w:rFonts w:ascii="Calibri" w:hAnsi="Calibri" w:eastAsia="Calibri"/>
+          <w:b w:val="0"/>
+          <w:i/>
+          <w:color w:val="4A5568"/>
+          <w:sz w:val="20"/>
+        </w:rPr>
+        <w:t xml:space="preserve">  ·  Month 2: </w:t>
+      </w:r>
+      <w:r>
+        <w:rPr>
+          <w:rFonts w:ascii="Calibri" w:hAnsi="Calibri" w:eastAsia="Calibri"/>
+          <w:b/>
+          <w:i/>
+          <w:color w:val="4A5568"/>
+          <w:sz w:val="20"/>
+        </w:rPr>
+        <w:t>20,000 + 25,000 = 45,000 STX</w:t>
+      </w:r>
+      <w:r>
+        <w:rPr>
+          <w:rFonts w:ascii="Calibri" w:hAnsi="Calibri" w:eastAsia="Calibri"/>
+          <w:b w:val="0"/>
+          <w:i/>
+          <w:color w:val="4A5568"/>
+          <w:sz w:val="20"/>
+        </w:rPr>
+        <w:t xml:space="preserve">  ·  Month 3: </w:t>
+      </w:r>
+      <w:r>
+        <w:rPr>
+          <w:rFonts w:ascii="Calibri" w:hAnsi="Calibri" w:eastAsia="Calibri"/>
+          <w:b/>
+          <w:i/>
+          <w:color w:val="4A5568"/>
+          <w:sz w:val="20"/>
+        </w:rPr>
+        <w:t>30,000 + 50,000 = 80,000 STX</w:t>
+      </w:r>
+      <w:r>
+        <w:rPr>
+          <w:rFonts w:ascii="Calibri" w:hAnsi="Calibri" w:eastAsia="Calibri"/>
+          <w:b w:val="0"/>
+          <w:i/>
+          <w:color w:val="4A5568"/>
+          <w:sz w:val="20"/>
+        </w:rPr>
+        <w:t>.</w:t>
+      </w:r>
+    </w:p>
+    <w:p>
+      <w:pPr>
         <w:spacing w:before="0" w:after="160" w:lineRule="auto" w:line="276"/>
       </w:pPr>
       <w:r>
@@ -3963,7 +4350,7 @@
           <w:color w:val="1F2937"/>
           <w:sz w:val="22"/>
         </w:rPr>
-        <w:t>Timing may be adjusted slightly based on fill rates, community readiness, and observed demand, while remaining within the 5-month window and total allocation.</w:t>
+        <w:t>Timing may be adjusted slightly based on fill rates, community readiness, and observed demand, while remaining within the 5-month window, 2-week cycle length, and total allocation.</w:t>
       </w:r>
     </w:p>
     <w:p>

</xml_diff>

<commit_message>
Recast proposal for 8 pots per 2-week cycle
Model each cycle as the full 8-pot / 300k STX mix, so a month
runs 16 pots (600k STX) and the 5-month program totals 80 pots
and ~3,000,000 STX.

Co-authored-by: cryptosmith.btc <Zeus-Adin@users.noreply.github.com>
</commit_message>
<xml_diff>
--- a/StacksPot-Growth-Acceleration-Proposal.docx
+++ b/StacksPot-Growth-Acceleration-Proposal.docx
@@ -55,7 +55,7 @@
       <w:tr>
         <w:tc>
           <w:tcPr>
-            <w:tcW w:type="dxa" w:w="3168"/>
+            <w:tcW w:type="dxa" w:w="3456"/>
             <w:shd w:fill="1A365D" w:val="clear"/>
             <w:tcBorders>
               <w:top w:val="single" w:sz="4" w:space="0" w:color="1A365D"/>
@@ -84,7 +84,7 @@
         </w:tc>
         <w:tc>
           <w:tcPr>
-            <w:tcW w:type="dxa" w:w="6192"/>
+            <w:tcW w:type="dxa" w:w="5904"/>
             <w:tcBorders>
               <w:top w:val="single" w:sz="4" w:space="0" w:color="CBD5E1"/>
               <w:left w:val="single" w:sz="4" w:space="0" w:color="CBD5E1"/>
@@ -115,7 +115,7 @@
       <w:tr>
         <w:tc>
           <w:tcPr>
-            <w:tcW w:type="dxa" w:w="3168"/>
+            <w:tcW w:type="dxa" w:w="3456"/>
             <w:shd w:fill="1A365D" w:val="clear"/>
             <w:tcBorders>
               <w:top w:val="single" w:sz="4" w:space="0" w:color="1A365D"/>
@@ -144,7 +144,7 @@
         </w:tc>
         <w:tc>
           <w:tcPr>
-            <w:tcW w:type="dxa" w:w="6192"/>
+            <w:tcW w:type="dxa" w:w="5904"/>
             <w:tcBorders>
               <w:top w:val="single" w:sz="4" w:space="0" w:color="CBD5E1"/>
               <w:left w:val="single" w:sz="4" w:space="0" w:color="CBD5E1"/>
@@ -175,7 +175,7 @@
       <w:tr>
         <w:tc>
           <w:tcPr>
-            <w:tcW w:type="dxa" w:w="3168"/>
+            <w:tcW w:type="dxa" w:w="3456"/>
             <w:shd w:fill="1A365D" w:val="clear"/>
             <w:tcBorders>
               <w:top w:val="single" w:sz="4" w:space="0" w:color="1A365D"/>
@@ -204,7 +204,7 @@
         </w:tc>
         <w:tc>
           <w:tcPr>
-            <w:tcW w:type="dxa" w:w="6192"/>
+            <w:tcW w:type="dxa" w:w="5904"/>
             <w:tcBorders>
               <w:top w:val="single" w:sz="4" w:space="0" w:color="CBD5E1"/>
               <w:left w:val="single" w:sz="4" w:space="0" w:color="CBD5E1"/>
@@ -235,7 +235,187 @@
       <w:tr>
         <w:tc>
           <w:tcPr>
-            <w:tcW w:type="dxa" w:w="3168"/>
+            <w:tcW w:type="dxa" w:w="3456"/>
+            <w:shd w:fill="1A365D" w:val="clear"/>
+            <w:tcBorders>
+              <w:top w:val="single" w:sz="4" w:space="0" w:color="1A365D"/>
+              <w:left w:val="single" w:sz="4" w:space="0" w:color="1A365D"/>
+              <w:bottom w:val="single" w:sz="4" w:space="0" w:color="1A365D"/>
+              <w:right w:val="single" w:sz="4" w:space="0" w:color="1A365D"/>
+            </w:tcBorders>
+          </w:tcPr>
+          <w:p>
+            <w:pPr>
+              <w:spacing w:before="40" w:after="40" w:lineRule="auto" w:line="240"/>
+              <w:jc w:val="left"/>
+            </w:pPr>
+            <w:r/>
+            <w:r>
+              <w:rPr>
+                <w:rFonts w:ascii="Calibri" w:hAnsi="Calibri" w:eastAsia="Calibri"/>
+                <w:b/>
+                <w:i w:val="0"/>
+                <w:color w:val="FFFFFF"/>
+                <w:sz w:val="22"/>
+              </w:rPr>
+              <w:t>Cycle Length</w:t>
+            </w:r>
+          </w:p>
+        </w:tc>
+        <w:tc>
+          <w:tcPr>
+            <w:tcW w:type="dxa" w:w="5904"/>
+            <w:tcBorders>
+              <w:top w:val="single" w:sz="4" w:space="0" w:color="CBD5E1"/>
+              <w:left w:val="single" w:sz="4" w:space="0" w:color="CBD5E1"/>
+              <w:bottom w:val="single" w:sz="4" w:space="0" w:color="CBD5E1"/>
+              <w:right w:val="single" w:sz="4" w:space="0" w:color="CBD5E1"/>
+            </w:tcBorders>
+            <w:shd w:fill="F7FAFC" w:val="clear"/>
+          </w:tcPr>
+          <w:p>
+            <w:pPr>
+              <w:spacing w:before="40" w:after="40" w:lineRule="auto" w:line="240"/>
+              <w:jc w:val="left"/>
+            </w:pPr>
+            <w:r/>
+            <w:r>
+              <w:rPr>
+                <w:rFonts w:ascii="Calibri" w:hAnsi="Calibri" w:eastAsia="Calibri"/>
+                <w:b w:val="0"/>
+                <w:i w:val="0"/>
+                <w:color w:val="1F2937"/>
+                <w:sz w:val="22"/>
+              </w:rPr>
+              <w:t>2 weeks</w:t>
+            </w:r>
+          </w:p>
+        </w:tc>
+      </w:tr>
+      <w:tr>
+        <w:tc>
+          <w:tcPr>
+            <w:tcW w:type="dxa" w:w="3456"/>
+            <w:shd w:fill="1A365D" w:val="clear"/>
+            <w:tcBorders>
+              <w:top w:val="single" w:sz="4" w:space="0" w:color="1A365D"/>
+              <w:left w:val="single" w:sz="4" w:space="0" w:color="1A365D"/>
+              <w:bottom w:val="single" w:sz="4" w:space="0" w:color="1A365D"/>
+              <w:right w:val="single" w:sz="4" w:space="0" w:color="1A365D"/>
+            </w:tcBorders>
+          </w:tcPr>
+          <w:p>
+            <w:pPr>
+              <w:spacing w:before="40" w:after="40" w:lineRule="auto" w:line="240"/>
+              <w:jc w:val="left"/>
+            </w:pPr>
+            <w:r/>
+            <w:r>
+              <w:rPr>
+                <w:rFonts w:ascii="Calibri" w:hAnsi="Calibri" w:eastAsia="Calibri"/>
+                <w:b/>
+                <w:i w:val="0"/>
+                <w:color w:val="FFFFFF"/>
+                <w:sz w:val="22"/>
+              </w:rPr>
+              <w:t>Pots per Cycle</w:t>
+            </w:r>
+          </w:p>
+        </w:tc>
+        <w:tc>
+          <w:tcPr>
+            <w:tcW w:type="dxa" w:w="5904"/>
+            <w:tcBorders>
+              <w:top w:val="single" w:sz="4" w:space="0" w:color="CBD5E1"/>
+              <w:left w:val="single" w:sz="4" w:space="0" w:color="CBD5E1"/>
+              <w:bottom w:val="single" w:sz="4" w:space="0" w:color="CBD5E1"/>
+              <w:right w:val="single" w:sz="4" w:space="0" w:color="CBD5E1"/>
+            </w:tcBorders>
+            <w:shd w:fill="FFFFFF" w:val="clear"/>
+          </w:tcPr>
+          <w:p>
+            <w:pPr>
+              <w:spacing w:before="40" w:after="40" w:lineRule="auto" w:line="240"/>
+              <w:jc w:val="left"/>
+            </w:pPr>
+            <w:r/>
+            <w:r>
+              <w:rPr>
+                <w:rFonts w:ascii="Calibri" w:hAnsi="Calibri" w:eastAsia="Calibri"/>
+                <w:b w:val="0"/>
+                <w:i w:val="0"/>
+                <w:color w:val="1F2937"/>
+                <w:sz w:val="22"/>
+              </w:rPr>
+              <w:t>8</w:t>
+            </w:r>
+          </w:p>
+        </w:tc>
+      </w:tr>
+      <w:tr>
+        <w:tc>
+          <w:tcPr>
+            <w:tcW w:type="dxa" w:w="3456"/>
+            <w:shd w:fill="1A365D" w:val="clear"/>
+            <w:tcBorders>
+              <w:top w:val="single" w:sz="4" w:space="0" w:color="1A365D"/>
+              <w:left w:val="single" w:sz="4" w:space="0" w:color="1A365D"/>
+              <w:bottom w:val="single" w:sz="4" w:space="0" w:color="1A365D"/>
+              <w:right w:val="single" w:sz="4" w:space="0" w:color="1A365D"/>
+            </w:tcBorders>
+          </w:tcPr>
+          <w:p>
+            <w:pPr>
+              <w:spacing w:before="40" w:after="40" w:lineRule="auto" w:line="240"/>
+              <w:jc w:val="left"/>
+            </w:pPr>
+            <w:r/>
+            <w:r>
+              <w:rPr>
+                <w:rFonts w:ascii="Calibri" w:hAnsi="Calibri" w:eastAsia="Calibri"/>
+                <w:b/>
+                <w:i w:val="0"/>
+                <w:color w:val="FFFFFF"/>
+                <w:sz w:val="22"/>
+              </w:rPr>
+              <w:t>Pots per Month</w:t>
+            </w:r>
+          </w:p>
+        </w:tc>
+        <w:tc>
+          <w:tcPr>
+            <w:tcW w:type="dxa" w:w="5904"/>
+            <w:tcBorders>
+              <w:top w:val="single" w:sz="4" w:space="0" w:color="CBD5E1"/>
+              <w:left w:val="single" w:sz="4" w:space="0" w:color="CBD5E1"/>
+              <w:bottom w:val="single" w:sz="4" w:space="0" w:color="CBD5E1"/>
+              <w:right w:val="single" w:sz="4" w:space="0" w:color="CBD5E1"/>
+            </w:tcBorders>
+            <w:shd w:fill="F7FAFC" w:val="clear"/>
+          </w:tcPr>
+          <w:p>
+            <w:pPr>
+              <w:spacing w:before="40" w:after="40" w:lineRule="auto" w:line="240"/>
+              <w:jc w:val="left"/>
+            </w:pPr>
+            <w:r/>
+            <w:r>
+              <w:rPr>
+                <w:rFonts w:ascii="Calibri" w:hAnsi="Calibri" w:eastAsia="Calibri"/>
+                <w:b w:val="0"/>
+                <w:i w:val="0"/>
+                <w:color w:val="1F2937"/>
+                <w:sz w:val="22"/>
+              </w:rPr>
+              <w:t>16 (2 cycles)</w:t>
+            </w:r>
+          </w:p>
+        </w:tc>
+      </w:tr>
+      <w:tr>
+        <w:tc>
+          <w:tcPr>
+            <w:tcW w:type="dxa" w:w="3456"/>
             <w:shd w:fill="1A365D" w:val="clear"/>
             <w:tcBorders>
               <w:top w:val="single" w:sz="4" w:space="0" w:color="1A365D"/>
@@ -264,14 +444,14 @@
         </w:tc>
         <w:tc>
           <w:tcPr>
-            <w:tcW w:type="dxa" w:w="6192"/>
+            <w:tcW w:type="dxa" w:w="5904"/>
             <w:tcBorders>
               <w:top w:val="single" w:sz="4" w:space="0" w:color="CBD5E1"/>
               <w:left w:val="single" w:sz="4" w:space="0" w:color="CBD5E1"/>
               <w:bottom w:val="single" w:sz="4" w:space="0" w:color="CBD5E1"/>
               <w:right w:val="single" w:sz="4" w:space="0" w:color="CBD5E1"/>
             </w:tcBorders>
-            <w:shd w:fill="F7FAFC" w:val="clear"/>
+            <w:shd w:fill="FFFFFF" w:val="clear"/>
           </w:tcPr>
           <w:p>
             <w:pPr>
@@ -287,7 +467,7 @@
                 <w:color w:val="1F2937"/>
                 <w:sz w:val="22"/>
               </w:rPr>
-              <w:t>~300,000 STX</w:t>
+              <w:t>~3,000,000 STX</w:t>
             </w:r>
           </w:p>
         </w:tc>
@@ -295,7 +475,7 @@
       <w:tr>
         <w:tc>
           <w:tcPr>
-            <w:tcW w:type="dxa" w:w="3168"/>
+            <w:tcW w:type="dxa" w:w="3456"/>
             <w:shd w:fill="1A365D" w:val="clear"/>
             <w:tcBorders>
               <w:top w:val="single" w:sz="4" w:space="0" w:color="1A365D"/>
@@ -324,14 +504,14 @@
         </w:tc>
         <w:tc>
           <w:tcPr>
-            <w:tcW w:type="dxa" w:w="6192"/>
+            <w:tcW w:type="dxa" w:w="5904"/>
             <w:tcBorders>
               <w:top w:val="single" w:sz="4" w:space="0" w:color="CBD5E1"/>
               <w:left w:val="single" w:sz="4" w:space="0" w:color="CBD5E1"/>
               <w:bottom w:val="single" w:sz="4" w:space="0" w:color="CBD5E1"/>
               <w:right w:val="single" w:sz="4" w:space="0" w:color="CBD5E1"/>
             </w:tcBorders>
-            <w:shd w:fill="FFFFFF" w:val="clear"/>
+            <w:shd w:fill="F7FAFC" w:val="clear"/>
           </w:tcPr>
           <w:p>
             <w:pPr>
@@ -520,8 +700,394 @@
           <w:color w:val="1F2937"/>
           <w:sz w:val="22"/>
         </w:rPr>
-        <w:t xml:space="preserve"> campaign cycle designed to boost community pots with additional sBTC rewards, strengthen participation incentives, encourage more pot deployments, and increase overall ecosystem activity.</w:t>
+        <w:t xml:space="preserve"> initiative designed to boost community pots with additional sBTC rewards, strengthen participation incentives, encourage more pot deployments, and increase overall ecosystem activity.</w:t>
       </w:r>
+    </w:p>
+    <w:p>
+      <w:pPr>
+        <w:spacing w:before="240" w:after="120" w:lineRule="auto" w:line="276"/>
+      </w:pPr>
+      <w:r>
+        <w:rPr>
+          <w:rFonts w:ascii="Calibri" w:hAnsi="Calibri" w:eastAsia="Calibri"/>
+          <w:b/>
+          <w:i w:val="0"/>
+          <w:color w:val="2B6CB0"/>
+          <w:sz w:val="26"/>
+        </w:rPr>
+        <w:t>Operating Model at a Glance</w:t>
+      </w:r>
+    </w:p>
+    <w:tbl>
+      <w:tblPr>
+        <w:tblW w:type="auto" w:w="0"/>
+        <w:jc w:val="center"/>
+        <w:tblLayout w:type="autofit"/>
+        <w:tblLook w:firstColumn="1" w:firstRow="1" w:lastColumn="0" w:lastRow="0" w:noHBand="0" w:noVBand="1" w:val="04A0"/>
+      </w:tblPr>
+      <w:tblGrid>
+        <w:gridCol w:w="3120"/>
+        <w:gridCol w:w="3120"/>
+        <w:gridCol w:w="3120"/>
+      </w:tblGrid>
+      <w:tr>
+        <w:tc>
+          <w:tcPr>
+            <w:tcW w:type="dxa" w:w="2160"/>
+            <w:shd w:fill="1A365D" w:val="clear"/>
+            <w:tcBorders>
+              <w:top w:val="single" w:sz="4" w:space="0" w:color="1A365D"/>
+              <w:left w:val="single" w:sz="4" w:space="0" w:color="1A365D"/>
+              <w:bottom w:val="single" w:sz="4" w:space="0" w:color="1A365D"/>
+              <w:right w:val="single" w:sz="4" w:space="0" w:color="1A365D"/>
+            </w:tcBorders>
+          </w:tcPr>
+          <w:p>
+            <w:pPr>
+              <w:spacing w:before="40" w:after="40" w:lineRule="auto" w:line="240"/>
+              <w:jc w:val="center"/>
+            </w:pPr>
+            <w:r/>
+            <w:r>
+              <w:rPr>
+                <w:rFonts w:ascii="Calibri" w:hAnsi="Calibri" w:eastAsia="Calibri"/>
+                <w:b/>
+                <w:i w:val="0"/>
+                <w:color w:val="FFFFFF"/>
+                <w:sz w:val="20"/>
+              </w:rPr>
+              <w:t>Unit</w:t>
+            </w:r>
+          </w:p>
+        </w:tc>
+        <w:tc>
+          <w:tcPr>
+            <w:tcW w:type="dxa" w:w="4608"/>
+            <w:shd w:fill="1A365D" w:val="clear"/>
+            <w:tcBorders>
+              <w:top w:val="single" w:sz="4" w:space="0" w:color="1A365D"/>
+              <w:left w:val="single" w:sz="4" w:space="0" w:color="1A365D"/>
+              <w:bottom w:val="single" w:sz="4" w:space="0" w:color="1A365D"/>
+              <w:right w:val="single" w:sz="4" w:space="0" w:color="1A365D"/>
+            </w:tcBorders>
+          </w:tcPr>
+          <w:p>
+            <w:pPr>
+              <w:spacing w:before="40" w:after="40" w:lineRule="auto" w:line="240"/>
+              <w:jc w:val="center"/>
+            </w:pPr>
+            <w:r/>
+            <w:r>
+              <w:rPr>
+                <w:rFonts w:ascii="Calibri" w:hAnsi="Calibri" w:eastAsia="Calibri"/>
+                <w:b/>
+                <w:i w:val="0"/>
+                <w:color w:val="FFFFFF"/>
+                <w:sz w:val="20"/>
+              </w:rPr>
+              <w:t>Duration / Count</w:t>
+            </w:r>
+          </w:p>
+        </w:tc>
+        <w:tc>
+          <w:tcPr>
+            <w:tcW w:type="dxa" w:w="2592"/>
+            <w:shd w:fill="1A365D" w:val="clear"/>
+            <w:tcBorders>
+              <w:top w:val="single" w:sz="4" w:space="0" w:color="1A365D"/>
+              <w:left w:val="single" w:sz="4" w:space="0" w:color="1A365D"/>
+              <w:bottom w:val="single" w:sz="4" w:space="0" w:color="1A365D"/>
+              <w:right w:val="single" w:sz="4" w:space="0" w:color="1A365D"/>
+            </w:tcBorders>
+          </w:tcPr>
+          <w:p>
+            <w:pPr>
+              <w:spacing w:before="40" w:after="40" w:lineRule="auto" w:line="240"/>
+              <w:jc w:val="center"/>
+            </w:pPr>
+            <w:r/>
+            <w:r>
+              <w:rPr>
+                <w:rFonts w:ascii="Calibri" w:hAnsi="Calibri" w:eastAsia="Calibri"/>
+                <w:b/>
+                <w:i w:val="0"/>
+                <w:color w:val="FFFFFF"/>
+                <w:sz w:val="20"/>
+              </w:rPr>
+              <w:t>Sponsored Boost</w:t>
+            </w:r>
+          </w:p>
+        </w:tc>
+      </w:tr>
+      <w:tr>
+        <w:tc>
+          <w:tcPr>
+            <w:tcW w:type="dxa" w:w="2160"/>
+            <w:tcBorders>
+              <w:top w:val="single" w:sz="4" w:space="0" w:color="CBD5E1"/>
+              <w:left w:val="single" w:sz="4" w:space="0" w:color="CBD5E1"/>
+              <w:bottom w:val="single" w:sz="4" w:space="0" w:color="CBD5E1"/>
+              <w:right w:val="single" w:sz="4" w:space="0" w:color="CBD5E1"/>
+            </w:tcBorders>
+          </w:tcPr>
+          <w:p>
+            <w:pPr>
+              <w:spacing w:before="40" w:after="40" w:lineRule="auto" w:line="240"/>
+              <w:jc w:val="center"/>
+            </w:pPr>
+            <w:r/>
+            <w:r>
+              <w:rPr>
+                <w:rFonts w:ascii="Calibri" w:hAnsi="Calibri" w:eastAsia="Calibri"/>
+                <w:b w:val="0"/>
+                <w:i w:val="0"/>
+                <w:color w:val="1F2937"/>
+                <w:sz w:val="20"/>
+              </w:rPr>
+              <w:t>1 cycle</w:t>
+            </w:r>
+          </w:p>
+        </w:tc>
+        <w:tc>
+          <w:tcPr>
+            <w:tcW w:type="dxa" w:w="4608"/>
+            <w:tcBorders>
+              <w:top w:val="single" w:sz="4" w:space="0" w:color="CBD5E1"/>
+              <w:left w:val="single" w:sz="4" w:space="0" w:color="CBD5E1"/>
+              <w:bottom w:val="single" w:sz="4" w:space="0" w:color="CBD5E1"/>
+              <w:right w:val="single" w:sz="4" w:space="0" w:color="CBD5E1"/>
+            </w:tcBorders>
+          </w:tcPr>
+          <w:p>
+            <w:pPr>
+              <w:spacing w:before="40" w:after="40" w:lineRule="auto" w:line="240"/>
+              <w:jc w:val="left"/>
+            </w:pPr>
+            <w:r/>
+            <w:r>
+              <w:rPr>
+                <w:rFonts w:ascii="Calibri" w:hAnsi="Calibri" w:eastAsia="Calibri"/>
+                <w:b w:val="0"/>
+                <w:i w:val="0"/>
+                <w:color w:val="1F2937"/>
+                <w:sz w:val="20"/>
+              </w:rPr>
+              <w:t>2 weeks · 8 pots</w:t>
+            </w:r>
+          </w:p>
+        </w:tc>
+        <w:tc>
+          <w:tcPr>
+            <w:tcW w:type="dxa" w:w="2592"/>
+            <w:tcBorders>
+              <w:top w:val="single" w:sz="4" w:space="0" w:color="CBD5E1"/>
+              <w:left w:val="single" w:sz="4" w:space="0" w:color="CBD5E1"/>
+              <w:bottom w:val="single" w:sz="4" w:space="0" w:color="CBD5E1"/>
+              <w:right w:val="single" w:sz="4" w:space="0" w:color="CBD5E1"/>
+            </w:tcBorders>
+          </w:tcPr>
+          <w:p>
+            <w:pPr>
+              <w:spacing w:before="40" w:after="40" w:lineRule="auto" w:line="240"/>
+              <w:jc w:val="right"/>
+            </w:pPr>
+            <w:r/>
+            <w:r>
+              <w:rPr>
+                <w:rFonts w:ascii="Calibri" w:hAnsi="Calibri" w:eastAsia="Calibri"/>
+                <w:b w:val="0"/>
+                <w:i w:val="0"/>
+                <w:color w:val="1F2937"/>
+                <w:sz w:val="20"/>
+              </w:rPr>
+              <w:t>300,000 STX</w:t>
+            </w:r>
+          </w:p>
+        </w:tc>
+      </w:tr>
+      <w:tr>
+        <w:tc>
+          <w:tcPr>
+            <w:tcW w:type="dxa" w:w="2160"/>
+            <w:shd w:fill="F7FAFC" w:val="clear"/>
+            <w:tcBorders>
+              <w:top w:val="single" w:sz="4" w:space="0" w:color="CBD5E1"/>
+              <w:left w:val="single" w:sz="4" w:space="0" w:color="CBD5E1"/>
+              <w:bottom w:val="single" w:sz="4" w:space="0" w:color="CBD5E1"/>
+              <w:right w:val="single" w:sz="4" w:space="0" w:color="CBD5E1"/>
+            </w:tcBorders>
+          </w:tcPr>
+          <w:p>
+            <w:pPr>
+              <w:spacing w:before="40" w:after="40" w:lineRule="auto" w:line="240"/>
+              <w:jc w:val="center"/>
+            </w:pPr>
+            <w:r/>
+            <w:r>
+              <w:rPr>
+                <w:rFonts w:ascii="Calibri" w:hAnsi="Calibri" w:eastAsia="Calibri"/>
+                <w:b w:val="0"/>
+                <w:i w:val="0"/>
+                <w:color w:val="1F2937"/>
+                <w:sz w:val="20"/>
+              </w:rPr>
+              <w:t>1 month</w:t>
+            </w:r>
+          </w:p>
+        </w:tc>
+        <w:tc>
+          <w:tcPr>
+            <w:tcW w:type="dxa" w:w="4608"/>
+            <w:shd w:fill="F7FAFC" w:val="clear"/>
+            <w:tcBorders>
+              <w:top w:val="single" w:sz="4" w:space="0" w:color="CBD5E1"/>
+              <w:left w:val="single" w:sz="4" w:space="0" w:color="CBD5E1"/>
+              <w:bottom w:val="single" w:sz="4" w:space="0" w:color="CBD5E1"/>
+              <w:right w:val="single" w:sz="4" w:space="0" w:color="CBD5E1"/>
+            </w:tcBorders>
+          </w:tcPr>
+          <w:p>
+            <w:pPr>
+              <w:spacing w:before="40" w:after="40" w:lineRule="auto" w:line="240"/>
+              <w:jc w:val="left"/>
+            </w:pPr>
+            <w:r/>
+            <w:r>
+              <w:rPr>
+                <w:rFonts w:ascii="Calibri" w:hAnsi="Calibri" w:eastAsia="Calibri"/>
+                <w:b w:val="0"/>
+                <w:i w:val="0"/>
+                <w:color w:val="1F2937"/>
+                <w:sz w:val="20"/>
+              </w:rPr>
+              <w:t>2 cycles · 16 pots</w:t>
+            </w:r>
+          </w:p>
+        </w:tc>
+        <w:tc>
+          <w:tcPr>
+            <w:tcW w:type="dxa" w:w="2592"/>
+            <w:shd w:fill="F7FAFC" w:val="clear"/>
+            <w:tcBorders>
+              <w:top w:val="single" w:sz="4" w:space="0" w:color="CBD5E1"/>
+              <w:left w:val="single" w:sz="4" w:space="0" w:color="CBD5E1"/>
+              <w:bottom w:val="single" w:sz="4" w:space="0" w:color="CBD5E1"/>
+              <w:right w:val="single" w:sz="4" w:space="0" w:color="CBD5E1"/>
+            </w:tcBorders>
+          </w:tcPr>
+          <w:p>
+            <w:pPr>
+              <w:spacing w:before="40" w:after="40" w:lineRule="auto" w:line="240"/>
+              <w:jc w:val="right"/>
+            </w:pPr>
+            <w:r/>
+            <w:r>
+              <w:rPr>
+                <w:rFonts w:ascii="Calibri" w:hAnsi="Calibri" w:eastAsia="Calibri"/>
+                <w:b w:val="0"/>
+                <w:i w:val="0"/>
+                <w:color w:val="1F2937"/>
+                <w:sz w:val="20"/>
+              </w:rPr>
+              <w:t>600,000 STX</w:t>
+            </w:r>
+          </w:p>
+        </w:tc>
+      </w:tr>
+      <w:tr>
+        <w:tc>
+          <w:tcPr>
+            <w:tcW w:type="dxa" w:w="2160"/>
+            <w:shd w:fill="EEF2F7" w:val="clear"/>
+            <w:tcBorders>
+              <w:top w:val="single" w:sz="4" w:space="0" w:color="CBD5E1"/>
+              <w:left w:val="single" w:sz="4" w:space="0" w:color="CBD5E1"/>
+              <w:bottom w:val="single" w:sz="4" w:space="0" w:color="CBD5E1"/>
+              <w:right w:val="single" w:sz="4" w:space="0" w:color="CBD5E1"/>
+            </w:tcBorders>
+          </w:tcPr>
+          <w:p>
+            <w:pPr>
+              <w:spacing w:before="40" w:after="40" w:lineRule="auto" w:line="240"/>
+              <w:jc w:val="center"/>
+            </w:pPr>
+            <w:r/>
+            <w:r>
+              <w:rPr>
+                <w:rFonts w:ascii="Calibri" w:hAnsi="Calibri" w:eastAsia="Calibri"/>
+                <w:b/>
+                <w:i w:val="0"/>
+                <w:color w:val="1A365D"/>
+                <w:sz w:val="20"/>
+              </w:rPr>
+              <w:t>Full program</w:t>
+            </w:r>
+          </w:p>
+        </w:tc>
+        <w:tc>
+          <w:tcPr>
+            <w:tcW w:type="dxa" w:w="4608"/>
+            <w:shd w:fill="EEF2F7" w:val="clear"/>
+            <w:tcBorders>
+              <w:top w:val="single" w:sz="4" w:space="0" w:color="CBD5E1"/>
+              <w:left w:val="single" w:sz="4" w:space="0" w:color="CBD5E1"/>
+              <w:bottom w:val="single" w:sz="4" w:space="0" w:color="CBD5E1"/>
+              <w:right w:val="single" w:sz="4" w:space="0" w:color="CBD5E1"/>
+            </w:tcBorders>
+          </w:tcPr>
+          <w:p>
+            <w:pPr>
+              <w:spacing w:before="40" w:after="40" w:lineRule="auto" w:line="240"/>
+              <w:jc w:val="left"/>
+            </w:pPr>
+            <w:r/>
+            <w:r>
+              <w:rPr>
+                <w:rFonts w:ascii="Calibri" w:hAnsi="Calibri" w:eastAsia="Calibri"/>
+                <w:b/>
+                <w:i w:val="0"/>
+                <w:color w:val="1A365D"/>
+                <w:sz w:val="20"/>
+              </w:rPr>
+              <w:t>5 months · 10 cycles · 80 pots</w:t>
+            </w:r>
+          </w:p>
+        </w:tc>
+        <w:tc>
+          <w:tcPr>
+            <w:tcW w:type="dxa" w:w="2592"/>
+            <w:shd w:fill="EEF2F7" w:val="clear"/>
+            <w:tcBorders>
+              <w:top w:val="single" w:sz="4" w:space="0" w:color="CBD5E1"/>
+              <w:left w:val="single" w:sz="4" w:space="0" w:color="CBD5E1"/>
+              <w:bottom w:val="single" w:sz="4" w:space="0" w:color="CBD5E1"/>
+              <w:right w:val="single" w:sz="4" w:space="0" w:color="CBD5E1"/>
+            </w:tcBorders>
+          </w:tcPr>
+          <w:p>
+            <w:pPr>
+              <w:spacing w:before="40" w:after="40" w:lineRule="auto" w:line="240"/>
+              <w:jc w:val="right"/>
+            </w:pPr>
+            <w:r/>
+            <w:r>
+              <w:rPr>
+                <w:rFonts w:ascii="Calibri" w:hAnsi="Calibri" w:eastAsia="Calibri"/>
+                <w:b/>
+                <w:i w:val="0"/>
+                <w:color w:val="1A365D"/>
+                <w:sz w:val="20"/>
+              </w:rPr>
+              <w:t>~3,000,000 STX</w:t>
+            </w:r>
+          </w:p>
+        </w:tc>
+      </w:tr>
+    </w:tbl>
+    <w:p>
+      <w:pPr>
+        <w:spacing w:before="0" w:after="120" w:lineRule="auto" w:line="240"/>
+      </w:pPr>
     </w:p>
     <w:p>
       <w:pPr>
@@ -545,7 +1111,7 @@
           <w:color w:val="1F2937"/>
           <w:sz w:val="22"/>
         </w:rPr>
-        <w:t>300,000 STX</w:t>
+        <w:t>3,000,000 STX</w:t>
       </w:r>
       <w:r>
         <w:rPr>
@@ -555,7 +1121,7 @@
           <w:color w:val="1F2937"/>
           <w:sz w:val="22"/>
         </w:rPr>
-        <w:t xml:space="preserve"> to fund sponsored pot campaigns across this 5-month period, with the goal of accelerating adoption and building sustainable user growth.</w:t>
+        <w:t xml:space="preserve"> to fund these sponsored pot campaigns across the 5-month period, with the goal of accelerating adoption and building sustainable user growth.</w:t>
       </w:r>
     </w:p>
     <w:p>
@@ -749,7 +1315,27 @@
           <w:color w:val="1F2937"/>
           <w:sz w:val="22"/>
         </w:rPr>
-        <w:t xml:space="preserve"> provides that catalyst with clear milestones, measurable outcomes, and a defined end state for evaluation.</w:t>
+        <w:t xml:space="preserve">—running </w:t>
+      </w:r>
+      <w:r>
+        <w:rPr>
+          <w:rFonts w:ascii="Calibri" w:hAnsi="Calibri" w:eastAsia="Calibri"/>
+          <w:b/>
+          <w:i w:val="0"/>
+          <w:color w:val="1F2937"/>
+          <w:sz w:val="22"/>
+        </w:rPr>
+        <w:t>8 pots every 2-week cycle</w:t>
+      </w:r>
+      <w:r>
+        <w:rPr>
+          <w:rFonts w:ascii="Calibri" w:hAnsi="Calibri" w:eastAsia="Calibri"/>
+          <w:b w:val="0"/>
+          <w:i w:val="0"/>
+          <w:color w:val="1F2937"/>
+          <w:sz w:val="22"/>
+        </w:rPr>
+        <w:t>—provides that catalyst with clear milestones, measurable outcomes, and a defined end state for evaluation.</w:t>
       </w:r>
     </w:p>
     <w:p>
@@ -960,7 +1546,7 @@
           <w:p>
             <w:pPr>
               <w:spacing w:before="40" w:after="40" w:lineRule="auto" w:line="240"/>
-              <w:jc w:val="left"/>
+              <w:jc w:val="right"/>
             </w:pPr>
             <w:r/>
             <w:r>
@@ -980,13 +1566,13 @@
         <w:tc>
           <w:tcPr>
             <w:tcW w:type="dxa" w:w="6480"/>
+            <w:shd w:fill="F7FAFC" w:val="clear"/>
             <w:tcBorders>
               <w:top w:val="single" w:sz="4" w:space="0" w:color="CBD5E1"/>
               <w:left w:val="single" w:sz="4" w:space="0" w:color="CBD5E1"/>
               <w:bottom w:val="single" w:sz="4" w:space="0" w:color="CBD5E1"/>
               <w:right w:val="single" w:sz="4" w:space="0" w:color="CBD5E1"/>
             </w:tcBorders>
-            <w:shd w:fill="F7FAFC" w:val="clear"/>
           </w:tcPr>
           <w:p>
             <w:pPr>
@@ -1009,18 +1595,18 @@
         <w:tc>
           <w:tcPr>
             <w:tcW w:type="dxa" w:w="2880"/>
+            <w:shd w:fill="F7FAFC" w:val="clear"/>
             <w:tcBorders>
               <w:top w:val="single" w:sz="4" w:space="0" w:color="CBD5E1"/>
               <w:left w:val="single" w:sz="4" w:space="0" w:color="CBD5E1"/>
               <w:bottom w:val="single" w:sz="4" w:space="0" w:color="CBD5E1"/>
               <w:right w:val="single" w:sz="4" w:space="0" w:color="CBD5E1"/>
             </w:tcBorders>
-            <w:shd w:fill="F7FAFC" w:val="clear"/>
           </w:tcPr>
           <w:p>
             <w:pPr>
               <w:spacing w:before="40" w:after="40" w:lineRule="auto" w:line="240"/>
-              <w:jc w:val="left"/>
+              <w:jc w:val="right"/>
             </w:pPr>
             <w:r/>
             <w:r>
@@ -1078,7 +1664,7 @@
           <w:p>
             <w:pPr>
               <w:spacing w:before="40" w:after="40" w:lineRule="auto" w:line="240"/>
-              <w:jc w:val="left"/>
+              <w:jc w:val="right"/>
             </w:pPr>
             <w:r/>
             <w:r>
@@ -1127,12 +1713,458 @@
           <w:color w:val="2B6CB0"/>
           <w:sz w:val="26"/>
         </w:rPr>
+        <w:t>Cycle Cadence</w:t>
+      </w:r>
+    </w:p>
+    <w:tbl>
+      <w:tblPr>
+        <w:tblW w:type="auto" w:w="0"/>
+        <w:jc w:val="center"/>
+        <w:tblLayout w:type="autofit"/>
+        <w:tblLook w:firstColumn="1" w:firstRow="1" w:lastColumn="0" w:lastRow="0" w:noHBand="0" w:noVBand="1" w:val="04A0"/>
+      </w:tblPr>
+      <w:tblGrid>
+        <w:gridCol w:w="4680"/>
+        <w:gridCol w:w="4680"/>
+      </w:tblGrid>
+      <w:tr>
+        <w:tc>
+          <w:tcPr>
+            <w:tcW w:type="dxa" w:w="4320"/>
+            <w:shd w:fill="1A365D" w:val="clear"/>
+            <w:tcBorders>
+              <w:top w:val="single" w:sz="4" w:space="0" w:color="1A365D"/>
+              <w:left w:val="single" w:sz="4" w:space="0" w:color="1A365D"/>
+              <w:bottom w:val="single" w:sz="4" w:space="0" w:color="1A365D"/>
+              <w:right w:val="single" w:sz="4" w:space="0" w:color="1A365D"/>
+            </w:tcBorders>
+          </w:tcPr>
+          <w:p>
+            <w:pPr>
+              <w:spacing w:before="40" w:after="40" w:lineRule="auto" w:line="240"/>
+              <w:jc w:val="center"/>
+            </w:pPr>
+            <w:r/>
+            <w:r>
+              <w:rPr>
+                <w:rFonts w:ascii="Calibri" w:hAnsi="Calibri" w:eastAsia="Calibri"/>
+                <w:b/>
+                <w:i w:val="0"/>
+                <w:color w:val="FFFFFF"/>
+                <w:sz w:val="20"/>
+              </w:rPr>
+              <w:t>Parameter</w:t>
+            </w:r>
+          </w:p>
+        </w:tc>
+        <w:tc>
+          <w:tcPr>
+            <w:tcW w:type="dxa" w:w="5040"/>
+            <w:shd w:fill="1A365D" w:val="clear"/>
+            <w:tcBorders>
+              <w:top w:val="single" w:sz="4" w:space="0" w:color="1A365D"/>
+              <w:left w:val="single" w:sz="4" w:space="0" w:color="1A365D"/>
+              <w:bottom w:val="single" w:sz="4" w:space="0" w:color="1A365D"/>
+              <w:right w:val="single" w:sz="4" w:space="0" w:color="1A365D"/>
+            </w:tcBorders>
+          </w:tcPr>
+          <w:p>
+            <w:pPr>
+              <w:spacing w:before="40" w:after="40" w:lineRule="auto" w:line="240"/>
+              <w:jc w:val="center"/>
+            </w:pPr>
+            <w:r/>
+            <w:r>
+              <w:rPr>
+                <w:rFonts w:ascii="Calibri" w:hAnsi="Calibri" w:eastAsia="Calibri"/>
+                <w:b/>
+                <w:i w:val="0"/>
+                <w:color w:val="FFFFFF"/>
+                <w:sz w:val="20"/>
+              </w:rPr>
+              <w:t>Value</w:t>
+            </w:r>
+          </w:p>
+        </w:tc>
+      </w:tr>
+      <w:tr>
+        <w:tc>
+          <w:tcPr>
+            <w:tcW w:type="dxa" w:w="4320"/>
+            <w:tcBorders>
+              <w:top w:val="single" w:sz="4" w:space="0" w:color="CBD5E1"/>
+              <w:left w:val="single" w:sz="4" w:space="0" w:color="CBD5E1"/>
+              <w:bottom w:val="single" w:sz="4" w:space="0" w:color="CBD5E1"/>
+              <w:right w:val="single" w:sz="4" w:space="0" w:color="CBD5E1"/>
+            </w:tcBorders>
+          </w:tcPr>
+          <w:p>
+            <w:pPr>
+              <w:spacing w:before="40" w:after="40" w:lineRule="auto" w:line="240"/>
+              <w:jc w:val="left"/>
+            </w:pPr>
+            <w:r/>
+            <w:r>
+              <w:rPr>
+                <w:rFonts w:ascii="Calibri" w:hAnsi="Calibri" w:eastAsia="Calibri"/>
+                <w:b w:val="0"/>
+                <w:i w:val="0"/>
+                <w:color w:val="1F2937"/>
+                <w:sz w:val="20"/>
+              </w:rPr>
+              <w:t>Pot / cycle length</w:t>
+            </w:r>
+          </w:p>
+        </w:tc>
+        <w:tc>
+          <w:tcPr>
+            <w:tcW w:type="dxa" w:w="5040"/>
+            <w:tcBorders>
+              <w:top w:val="single" w:sz="4" w:space="0" w:color="CBD5E1"/>
+              <w:left w:val="single" w:sz="4" w:space="0" w:color="CBD5E1"/>
+              <w:bottom w:val="single" w:sz="4" w:space="0" w:color="CBD5E1"/>
+              <w:right w:val="single" w:sz="4" w:space="0" w:color="CBD5E1"/>
+            </w:tcBorders>
+          </w:tcPr>
+          <w:p>
+            <w:pPr>
+              <w:spacing w:before="40" w:after="40" w:lineRule="auto" w:line="240"/>
+              <w:jc w:val="right"/>
+            </w:pPr>
+            <w:r/>
+            <w:r>
+              <w:rPr>
+                <w:rFonts w:ascii="Calibri" w:hAnsi="Calibri" w:eastAsia="Calibri"/>
+                <w:b w:val="0"/>
+                <w:i w:val="0"/>
+                <w:color w:val="1F2937"/>
+                <w:sz w:val="20"/>
+              </w:rPr>
+              <w:t>2 weeks</w:t>
+            </w:r>
+          </w:p>
+        </w:tc>
+      </w:tr>
+      <w:tr>
+        <w:tc>
+          <w:tcPr>
+            <w:tcW w:type="dxa" w:w="4320"/>
+            <w:shd w:fill="F7FAFC" w:val="clear"/>
+            <w:tcBorders>
+              <w:top w:val="single" w:sz="4" w:space="0" w:color="CBD5E1"/>
+              <w:left w:val="single" w:sz="4" w:space="0" w:color="CBD5E1"/>
+              <w:bottom w:val="single" w:sz="4" w:space="0" w:color="CBD5E1"/>
+              <w:right w:val="single" w:sz="4" w:space="0" w:color="CBD5E1"/>
+            </w:tcBorders>
+          </w:tcPr>
+          <w:p>
+            <w:pPr>
+              <w:spacing w:before="40" w:after="40" w:lineRule="auto" w:line="240"/>
+              <w:jc w:val="left"/>
+            </w:pPr>
+            <w:r/>
+            <w:r>
+              <w:rPr>
+                <w:rFonts w:ascii="Calibri" w:hAnsi="Calibri" w:eastAsia="Calibri"/>
+                <w:b w:val="0"/>
+                <w:i w:val="0"/>
+                <w:color w:val="1F2937"/>
+                <w:sz w:val="20"/>
+              </w:rPr>
+              <w:t>Sponsored pots per cycle</w:t>
+            </w:r>
+          </w:p>
+        </w:tc>
+        <w:tc>
+          <w:tcPr>
+            <w:tcW w:type="dxa" w:w="5040"/>
+            <w:shd w:fill="F7FAFC" w:val="clear"/>
+            <w:tcBorders>
+              <w:top w:val="single" w:sz="4" w:space="0" w:color="CBD5E1"/>
+              <w:left w:val="single" w:sz="4" w:space="0" w:color="CBD5E1"/>
+              <w:bottom w:val="single" w:sz="4" w:space="0" w:color="CBD5E1"/>
+              <w:right w:val="single" w:sz="4" w:space="0" w:color="CBD5E1"/>
+            </w:tcBorders>
+          </w:tcPr>
+          <w:p>
+            <w:pPr>
+              <w:spacing w:before="40" w:after="40" w:lineRule="auto" w:line="240"/>
+              <w:jc w:val="right"/>
+            </w:pPr>
+            <w:r/>
+            <w:r>
+              <w:rPr>
+                <w:rFonts w:ascii="Calibri" w:hAnsi="Calibri" w:eastAsia="Calibri"/>
+                <w:b w:val="0"/>
+                <w:i w:val="0"/>
+                <w:color w:val="1F2937"/>
+                <w:sz w:val="20"/>
+              </w:rPr>
+              <w:t>8 (full tier mix)</w:t>
+            </w:r>
+          </w:p>
+        </w:tc>
+      </w:tr>
+      <w:tr>
+        <w:tc>
+          <w:tcPr>
+            <w:tcW w:type="dxa" w:w="4320"/>
+            <w:tcBorders>
+              <w:top w:val="single" w:sz="4" w:space="0" w:color="CBD5E1"/>
+              <w:left w:val="single" w:sz="4" w:space="0" w:color="CBD5E1"/>
+              <w:bottom w:val="single" w:sz="4" w:space="0" w:color="CBD5E1"/>
+              <w:right w:val="single" w:sz="4" w:space="0" w:color="CBD5E1"/>
+            </w:tcBorders>
+          </w:tcPr>
+          <w:p>
+            <w:pPr>
+              <w:spacing w:before="40" w:after="40" w:lineRule="auto" w:line="240"/>
+              <w:jc w:val="left"/>
+            </w:pPr>
+            <w:r/>
+            <w:r>
+              <w:rPr>
+                <w:rFonts w:ascii="Calibri" w:hAnsi="Calibri" w:eastAsia="Calibri"/>
+                <w:b w:val="0"/>
+                <w:i w:val="0"/>
+                <w:color w:val="1F2937"/>
+                <w:sz w:val="20"/>
+              </w:rPr>
+              <w:t>Cycles per month</w:t>
+            </w:r>
+          </w:p>
+        </w:tc>
+        <w:tc>
+          <w:tcPr>
+            <w:tcW w:type="dxa" w:w="5040"/>
+            <w:tcBorders>
+              <w:top w:val="single" w:sz="4" w:space="0" w:color="CBD5E1"/>
+              <w:left w:val="single" w:sz="4" w:space="0" w:color="CBD5E1"/>
+              <w:bottom w:val="single" w:sz="4" w:space="0" w:color="CBD5E1"/>
+              <w:right w:val="single" w:sz="4" w:space="0" w:color="CBD5E1"/>
+            </w:tcBorders>
+          </w:tcPr>
+          <w:p>
+            <w:pPr>
+              <w:spacing w:before="40" w:after="40" w:lineRule="auto" w:line="240"/>
+              <w:jc w:val="right"/>
+            </w:pPr>
+            <w:r/>
+            <w:r>
+              <w:rPr>
+                <w:rFonts w:ascii="Calibri" w:hAnsi="Calibri" w:eastAsia="Calibri"/>
+                <w:b w:val="0"/>
+                <w:i w:val="0"/>
+                <w:color w:val="1F2937"/>
+                <w:sz w:val="20"/>
+              </w:rPr>
+              <w:t>2</w:t>
+            </w:r>
+          </w:p>
+        </w:tc>
+      </w:tr>
+      <w:tr>
+        <w:tc>
+          <w:tcPr>
+            <w:tcW w:type="dxa" w:w="4320"/>
+            <w:shd w:fill="F7FAFC" w:val="clear"/>
+            <w:tcBorders>
+              <w:top w:val="single" w:sz="4" w:space="0" w:color="CBD5E1"/>
+              <w:left w:val="single" w:sz="4" w:space="0" w:color="CBD5E1"/>
+              <w:bottom w:val="single" w:sz="4" w:space="0" w:color="CBD5E1"/>
+              <w:right w:val="single" w:sz="4" w:space="0" w:color="CBD5E1"/>
+            </w:tcBorders>
+          </w:tcPr>
+          <w:p>
+            <w:pPr>
+              <w:spacing w:before="40" w:after="40" w:lineRule="auto" w:line="240"/>
+              <w:jc w:val="left"/>
+            </w:pPr>
+            <w:r/>
+            <w:r>
+              <w:rPr>
+                <w:rFonts w:ascii="Calibri" w:hAnsi="Calibri" w:eastAsia="Calibri"/>
+                <w:b w:val="0"/>
+                <w:i w:val="0"/>
+                <w:color w:val="1F2937"/>
+                <w:sz w:val="20"/>
+              </w:rPr>
+              <w:t>Sponsored pots per month</w:t>
+            </w:r>
+          </w:p>
+        </w:tc>
+        <w:tc>
+          <w:tcPr>
+            <w:tcW w:type="dxa" w:w="5040"/>
+            <w:shd w:fill="F7FAFC" w:val="clear"/>
+            <w:tcBorders>
+              <w:top w:val="single" w:sz="4" w:space="0" w:color="CBD5E1"/>
+              <w:left w:val="single" w:sz="4" w:space="0" w:color="CBD5E1"/>
+              <w:bottom w:val="single" w:sz="4" w:space="0" w:color="CBD5E1"/>
+              <w:right w:val="single" w:sz="4" w:space="0" w:color="CBD5E1"/>
+            </w:tcBorders>
+          </w:tcPr>
+          <w:p>
+            <w:pPr>
+              <w:spacing w:before="40" w:after="40" w:lineRule="auto" w:line="240"/>
+              <w:jc w:val="right"/>
+            </w:pPr>
+            <w:r/>
+            <w:r>
+              <w:rPr>
+                <w:rFonts w:ascii="Calibri" w:hAnsi="Calibri" w:eastAsia="Calibri"/>
+                <w:b w:val="0"/>
+                <w:i w:val="0"/>
+                <w:color w:val="1F2937"/>
+                <w:sz w:val="20"/>
+              </w:rPr>
+              <w:t>16</w:t>
+            </w:r>
+          </w:p>
+        </w:tc>
+      </w:tr>
+      <w:tr>
+        <w:tc>
+          <w:tcPr>
+            <w:tcW w:type="dxa" w:w="4320"/>
+            <w:tcBorders>
+              <w:top w:val="single" w:sz="4" w:space="0" w:color="CBD5E1"/>
+              <w:left w:val="single" w:sz="4" w:space="0" w:color="CBD5E1"/>
+              <w:bottom w:val="single" w:sz="4" w:space="0" w:color="CBD5E1"/>
+              <w:right w:val="single" w:sz="4" w:space="0" w:color="CBD5E1"/>
+            </w:tcBorders>
+          </w:tcPr>
+          <w:p>
+            <w:pPr>
+              <w:spacing w:before="40" w:after="40" w:lineRule="auto" w:line="240"/>
+              <w:jc w:val="left"/>
+            </w:pPr>
+            <w:r/>
+            <w:r>
+              <w:rPr>
+                <w:rFonts w:ascii="Calibri" w:hAnsi="Calibri" w:eastAsia="Calibri"/>
+                <w:b w:val="0"/>
+                <w:i w:val="0"/>
+                <w:color w:val="1F2937"/>
+                <w:sz w:val="20"/>
+              </w:rPr>
+              <w:t>Program length</w:t>
+            </w:r>
+          </w:p>
+        </w:tc>
+        <w:tc>
+          <w:tcPr>
+            <w:tcW w:type="dxa" w:w="5040"/>
+            <w:tcBorders>
+              <w:top w:val="single" w:sz="4" w:space="0" w:color="CBD5E1"/>
+              <w:left w:val="single" w:sz="4" w:space="0" w:color="CBD5E1"/>
+              <w:bottom w:val="single" w:sz="4" w:space="0" w:color="CBD5E1"/>
+              <w:right w:val="single" w:sz="4" w:space="0" w:color="CBD5E1"/>
+            </w:tcBorders>
+          </w:tcPr>
+          <w:p>
+            <w:pPr>
+              <w:spacing w:before="40" w:after="40" w:lineRule="auto" w:line="240"/>
+              <w:jc w:val="right"/>
+            </w:pPr>
+            <w:r/>
+            <w:r>
+              <w:rPr>
+                <w:rFonts w:ascii="Calibri" w:hAnsi="Calibri" w:eastAsia="Calibri"/>
+                <w:b w:val="0"/>
+                <w:i w:val="0"/>
+                <w:color w:val="1F2937"/>
+                <w:sz w:val="20"/>
+              </w:rPr>
+              <w:t>5 months (~10 cycles)</w:t>
+            </w:r>
+          </w:p>
+        </w:tc>
+      </w:tr>
+      <w:tr>
+        <w:tc>
+          <w:tcPr>
+            <w:tcW w:type="dxa" w:w="4320"/>
+            <w:shd w:fill="EEF2F7" w:val="clear"/>
+            <w:tcBorders>
+              <w:top w:val="single" w:sz="4" w:space="0" w:color="CBD5E1"/>
+              <w:left w:val="single" w:sz="4" w:space="0" w:color="CBD5E1"/>
+              <w:bottom w:val="single" w:sz="4" w:space="0" w:color="CBD5E1"/>
+              <w:right w:val="single" w:sz="4" w:space="0" w:color="CBD5E1"/>
+            </w:tcBorders>
+          </w:tcPr>
+          <w:p>
+            <w:pPr>
+              <w:spacing w:before="40" w:after="40" w:lineRule="auto" w:line="240"/>
+              <w:jc w:val="left"/>
+            </w:pPr>
+            <w:r/>
+            <w:r>
+              <w:rPr>
+                <w:rFonts w:ascii="Calibri" w:hAnsi="Calibri" w:eastAsia="Calibri"/>
+                <w:b/>
+                <w:i w:val="0"/>
+                <w:color w:val="1A365D"/>
+                <w:sz w:val="20"/>
+              </w:rPr>
+              <w:t>Total sponsored pots</w:t>
+            </w:r>
+          </w:p>
+        </w:tc>
+        <w:tc>
+          <w:tcPr>
+            <w:tcW w:type="dxa" w:w="5040"/>
+            <w:shd w:fill="EEF2F7" w:val="clear"/>
+            <w:tcBorders>
+              <w:top w:val="single" w:sz="4" w:space="0" w:color="CBD5E1"/>
+              <w:left w:val="single" w:sz="4" w:space="0" w:color="CBD5E1"/>
+              <w:bottom w:val="single" w:sz="4" w:space="0" w:color="CBD5E1"/>
+              <w:right w:val="single" w:sz="4" w:space="0" w:color="CBD5E1"/>
+            </w:tcBorders>
+          </w:tcPr>
+          <w:p>
+            <w:pPr>
+              <w:spacing w:before="40" w:after="40" w:lineRule="auto" w:line="240"/>
+              <w:jc w:val="right"/>
+            </w:pPr>
+            <w:r/>
+            <w:r>
+              <w:rPr>
+                <w:rFonts w:ascii="Calibri" w:hAnsi="Calibri" w:eastAsia="Calibri"/>
+                <w:b/>
+                <w:i w:val="0"/>
+                <w:color w:val="1A365D"/>
+                <w:sz w:val="20"/>
+              </w:rPr>
+              <w:t>80</w:t>
+            </w:r>
+          </w:p>
+        </w:tc>
+      </w:tr>
+    </w:tbl>
+    <w:p>
+      <w:pPr>
+        <w:spacing w:before="0" w:after="120" w:lineRule="auto" w:line="240"/>
+      </w:pPr>
+    </w:p>
+    <w:p>
+      <w:pPr>
+        <w:spacing w:before="240" w:after="120" w:lineRule="auto" w:line="276"/>
+      </w:pPr>
+      <w:r>
+        <w:rPr>
+          <w:rFonts w:ascii="Calibri" w:hAnsi="Calibri" w:eastAsia="Calibri"/>
+          <w:b/>
+          <w:i w:val="0"/>
+          <w:color w:val="2B6CB0"/>
+          <w:sz w:val="26"/>
+        </w:rPr>
         <w:t>5-Month Campaign Window</w:t>
       </w:r>
     </w:p>
     <w:p>
       <w:pPr>
-        <w:spacing w:before="0" w:after="80" w:lineRule="auto" w:line="276"/>
+        <w:spacing w:before="0" w:after="160" w:lineRule="auto" w:line="276"/>
       </w:pPr>
       <w:r>
         <w:rPr>
@@ -1162,7 +2194,82 @@
           <w:color w:val="1F2937"/>
           <w:sz w:val="22"/>
         </w:rPr>
-        <w:t>, structured to:</w:t>
+        <w:t xml:space="preserve">. Every </w:t>
+      </w:r>
+      <w:r>
+        <w:rPr>
+          <w:rFonts w:ascii="Calibri" w:hAnsi="Calibri" w:eastAsia="Calibri"/>
+          <w:b/>
+          <w:i w:val="0"/>
+          <w:color w:val="1F2937"/>
+          <w:sz w:val="22"/>
+        </w:rPr>
+        <w:t>2-week cycle</w:t>
+      </w:r>
+      <w:r>
+        <w:rPr>
+          <w:rFonts w:ascii="Calibri" w:hAnsi="Calibri" w:eastAsia="Calibri"/>
+          <w:b w:val="0"/>
+          <w:i w:val="0"/>
+          <w:color w:val="1F2937"/>
+          <w:sz w:val="22"/>
+        </w:rPr>
+        <w:t xml:space="preserve"> deploys the full </w:t>
+      </w:r>
+      <w:r>
+        <w:rPr>
+          <w:rFonts w:ascii="Calibri" w:hAnsi="Calibri" w:eastAsia="Calibri"/>
+          <w:b/>
+          <w:i w:val="0"/>
+          <w:color w:val="1F2937"/>
+          <w:sz w:val="22"/>
+        </w:rPr>
+        <w:t>8-pot</w:t>
+      </w:r>
+      <w:r>
+        <w:rPr>
+          <w:rFonts w:ascii="Calibri" w:hAnsi="Calibri" w:eastAsia="Calibri"/>
+          <w:b w:val="0"/>
+          <w:i w:val="0"/>
+          <w:color w:val="1F2937"/>
+          <w:sz w:val="22"/>
+        </w:rPr>
+        <w:t xml:space="preserve"> sponsorship mix. Because a month contains two cycles, StacksPot will run </w:t>
+      </w:r>
+      <w:r>
+        <w:rPr>
+          <w:rFonts w:ascii="Calibri" w:hAnsi="Calibri" w:eastAsia="Calibri"/>
+          <w:b/>
+          <w:i w:val="0"/>
+          <w:color w:val="1F2937"/>
+          <w:sz w:val="22"/>
+        </w:rPr>
+        <w:t>16 sponsored pots per month</w:t>
+      </w:r>
+      <w:r>
+        <w:rPr>
+          <w:rFonts w:ascii="Calibri" w:hAnsi="Calibri" w:eastAsia="Calibri"/>
+          <w:b w:val="0"/>
+          <w:i w:val="0"/>
+          <w:color w:val="1F2937"/>
+          <w:sz w:val="22"/>
+        </w:rPr>
+        <w:t>.</w:t>
+      </w:r>
+    </w:p>
+    <w:p>
+      <w:pPr>
+        <w:spacing w:before="0" w:after="80" w:lineRule="auto" w:line="276"/>
+      </w:pPr>
+      <w:r>
+        <w:rPr>
+          <w:rFonts w:ascii="Calibri" w:hAnsi="Calibri" w:eastAsia="Calibri"/>
+          <w:b w:val="0"/>
+          <w:i w:val="0"/>
+          <w:color w:val="1F2937"/>
+          <w:sz w:val="22"/>
+        </w:rPr>
+        <w:t>The program is structured to:</w:t>
       </w:r>
     </w:p>
     <w:p>
@@ -1178,7 +2285,7 @@
           <w:color w:val="1F2937"/>
           <w:sz w:val="22"/>
         </w:rPr>
-        <w:t>Ramp adoption</w:t>
+        <w:t>Launch at full cadence</w:t>
       </w:r>
       <w:r>
         <w:rPr>
@@ -1188,7 +2295,7 @@
           <w:color w:val="1F2937"/>
           <w:sz w:val="22"/>
         </w:rPr>
-        <w:t xml:space="preserve"> with smaller, accessible pots early in the program</w:t>
+        <w:t xml:space="preserve"> — establish the 8-pot / 2-week rhythm from Month 1</w:t>
       </w:r>
     </w:p>
     <w:p>
@@ -1204,7 +2311,7 @@
           <w:color w:val="1F2937"/>
           <w:sz w:val="22"/>
         </w:rPr>
-        <w:t>Sustain momentum</w:t>
+        <w:t>Sustain high participation</w:t>
       </w:r>
       <w:r>
         <w:rPr>
@@ -1214,7 +2321,7 @@
           <w:color w:val="1F2937"/>
           <w:sz w:val="22"/>
         </w:rPr>
-        <w:t xml:space="preserve"> with mid-tier campaigns through the middle months</w:t>
+        <w:t xml:space="preserve"> — keep all entry tiers live each cycle so users at every commitment level can join</w:t>
       </w:r>
     </w:p>
     <w:p>
@@ -1230,7 +2337,7 @@
           <w:color w:val="1F2937"/>
           <w:sz w:val="22"/>
         </w:rPr>
-        <w:t>Concentrate demand</w:t>
+        <w:t>Compound network effects</w:t>
       </w:r>
       <w:r>
         <w:rPr>
@@ -1240,7 +2347,7 @@
           <w:color w:val="1F2937"/>
           <w:sz w:val="22"/>
         </w:rPr>
-        <w:t xml:space="preserve"> with larger flagship pots toward the end of the cycle</w:t>
+        <w:t xml:space="preserve"> — 16 pots/month creates repeated touchpoints for wallets, communities, and builders</w:t>
       </w:r>
     </w:p>
     <w:p>
@@ -1266,7 +2373,7 @@
           <w:color w:val="1F2937"/>
           <w:sz w:val="22"/>
         </w:rPr>
-        <w:t xml:space="preserve"> across a long enough window to distinguish campaign spikes from lasting engagement</w:t>
+        <w:t xml:space="preserve"> — a 5-month window is long enough to distinguish campaign spikes from lasting engagement</w:t>
       </w:r>
     </w:p>
     <w:p>
@@ -1281,7 +2388,7 @@
           <w:color w:val="1F2937"/>
           <w:sz w:val="22"/>
         </w:rPr>
-        <w:t>A 5-month runway is long enough to:</w:t>
+        <w:t>A 5-month runway (~20 weeks / 10 bi-weekly cycles) is long enough to:</w:t>
       </w:r>
     </w:p>
     <w:p>
@@ -1297,7 +2404,7 @@
           <w:color w:val="1F2937"/>
           <w:sz w:val="22"/>
         </w:rPr>
-        <w:t>Run multiple campaign tiers without overcrowding the market</w:t>
+        <w:t>Run 80 sponsored pots without thinning the per-cycle incentive design</w:t>
       </w:r>
     </w:p>
     <w:p>
@@ -1313,7 +2420,7 @@
           <w:color w:val="1F2937"/>
           <w:sz w:val="22"/>
         </w:rPr>
-        <w:t>Allow communities and builders to plan and deploy their own pots</w:t>
+        <w:t>Give communities and builders a predictable bi-weekly cadence to plan around</w:t>
       </w:r>
     </w:p>
     <w:p>
@@ -1329,7 +2436,7 @@
           <w:color w:val="1F2937"/>
           <w:sz w:val="22"/>
         </w:rPr>
-        <w:t>Collect meaningful retention and repeat-participation data</w:t>
+        <w:t>Collect meaningful retention and repeat-participation data across 10 cycles</w:t>
       </w:r>
     </w:p>
     <w:p>
@@ -1345,7 +2452,7 @@
           <w:color w:val="1F2937"/>
           <w:sz w:val="22"/>
         </w:rPr>
-        <w:t>Provide the Endowment with clear monthly visibility into impact</w:t>
+        <w:t>Provide the Endowment with clear monthly visibility into impact (16 pots / 600,000 STX per month)</w:t>
       </w:r>
     </w:p>
     <w:p>
@@ -1435,7 +2542,7 @@
           <w:color w:val="2B6CB0"/>
           <w:sz w:val="26"/>
         </w:rPr>
-        <w:t>Proposed Allocation</w:t>
+        <w:t>Per-Cycle Allocation (8 Pots · 300,000 STX)</w:t>
       </w:r>
     </w:p>
     <w:p>
@@ -1450,7 +2557,7 @@
           <w:color w:val="1F2937"/>
           <w:sz w:val="22"/>
         </w:rPr>
-        <w:t xml:space="preserve">The </w:t>
+        <w:t xml:space="preserve">Each </w:t>
       </w:r>
       <w:r>
         <w:rPr>
@@ -1460,7 +2567,7 @@
           <w:color w:val="1F2937"/>
           <w:sz w:val="22"/>
         </w:rPr>
-        <w:t>~300,000 STX</w:t>
+        <w:t>2-week cycle</w:t>
       </w:r>
       <w:r>
         <w:rPr>
@@ -1470,7 +2577,47 @@
           <w:color w:val="1F2937"/>
           <w:sz w:val="22"/>
         </w:rPr>
-        <w:t xml:space="preserve"> sponsorship budget will be distributed across StacksPot campaigns of varying entry sizes to maximize participation, accelerate pot growth, and generate sustainable sBTC rewards.</w:t>
+        <w:t xml:space="preserve"> deploys the following </w:t>
+      </w:r>
+      <w:r>
+        <w:rPr>
+          <w:rFonts w:ascii="Calibri" w:hAnsi="Calibri" w:eastAsia="Calibri"/>
+          <w:b/>
+          <w:i w:val="0"/>
+          <w:color w:val="1F2937"/>
+          <w:sz w:val="22"/>
+        </w:rPr>
+        <w:t>8 sponsored pots</w:t>
+      </w:r>
+      <w:r>
+        <w:rPr>
+          <w:rFonts w:ascii="Calibri" w:hAnsi="Calibri" w:eastAsia="Calibri"/>
+          <w:b w:val="0"/>
+          <w:i w:val="0"/>
+          <w:color w:val="1F2937"/>
+          <w:sz w:val="22"/>
+        </w:rPr>
+        <w:t xml:space="preserve">. The sponsorship budget for one cycle is </w:t>
+      </w:r>
+      <w:r>
+        <w:rPr>
+          <w:rFonts w:ascii="Calibri" w:hAnsi="Calibri" w:eastAsia="Calibri"/>
+          <w:b/>
+          <w:i w:val="0"/>
+          <w:color w:val="1F2937"/>
+          <w:sz w:val="22"/>
+        </w:rPr>
+        <w:t>300,000 STX</w:t>
+      </w:r>
+      <w:r>
+        <w:rPr>
+          <w:rFonts w:ascii="Calibri" w:hAnsi="Calibri" w:eastAsia="Calibri"/>
+          <w:b w:val="0"/>
+          <w:i w:val="0"/>
+          <w:color w:val="1F2937"/>
+          <w:sz w:val="22"/>
+        </w:rPr>
+        <w:t>, distributed across entry sizes to maximize participation, accelerate pot growth, and generate sustainable sBTC rewards.</w:t>
       </w:r>
     </w:p>
     <w:tbl>
@@ -1607,7 +2754,7 @@
         </w:tc>
         <w:tc>
           <w:tcPr>
-            <w:tcW w:type="dxa" w:w="1728"/>
+            <w:tcW w:type="dxa" w:w="2016"/>
             <w:shd w:fill="1A365D" w:val="clear"/>
             <w:tcBorders>
               <w:top w:val="single" w:sz="4" w:space="0" w:color="1A365D"/>
@@ -1636,7 +2783,7 @@
         </w:tc>
         <w:tc>
           <w:tcPr>
-            <w:tcW w:type="dxa" w:w="1728"/>
+            <w:tcW w:type="dxa" w:w="1584"/>
             <w:shd w:fill="1A365D" w:val="clear"/>
             <w:tcBorders>
               <w:top w:val="single" w:sz="4" w:space="0" w:color="1A365D"/>
@@ -1762,7 +2909,7 @@
           <w:p>
             <w:pPr>
               <w:spacing w:before="40" w:after="40" w:lineRule="auto" w:line="240"/>
-              <w:jc w:val="right"/>
+              <w:jc w:val="left"/>
             </w:pPr>
             <w:r/>
             <w:r>
@@ -1779,7 +2926,7 @@
         </w:tc>
         <w:tc>
           <w:tcPr>
-            <w:tcW w:type="dxa" w:w="1728"/>
+            <w:tcW w:type="dxa" w:w="2016"/>
             <w:tcBorders>
               <w:top w:val="single" w:sz="4" w:space="0" w:color="CBD5E1"/>
               <w:left w:val="single" w:sz="4" w:space="0" w:color="CBD5E1"/>
@@ -1790,7 +2937,7 @@
           <w:p>
             <w:pPr>
               <w:spacing w:before="40" w:after="40" w:lineRule="auto" w:line="240"/>
-              <w:jc w:val="right"/>
+              <w:jc w:val="left"/>
             </w:pPr>
             <w:r/>
             <w:r>
@@ -1807,7 +2954,7 @@
         </w:tc>
         <w:tc>
           <w:tcPr>
-            <w:tcW w:type="dxa" w:w="1728"/>
+            <w:tcW w:type="dxa" w:w="1584"/>
             <w:tcBorders>
               <w:top w:val="single" w:sz="4" w:space="0" w:color="CBD5E1"/>
               <w:left w:val="single" w:sz="4" w:space="0" w:color="CBD5E1"/>
@@ -1818,7 +2965,7 @@
           <w:p>
             <w:pPr>
               <w:spacing w:before="40" w:after="40" w:lineRule="auto" w:line="240"/>
-              <w:jc w:val="right"/>
+              <w:jc w:val="left"/>
             </w:pPr>
             <w:r/>
             <w:r>
@@ -1838,13 +2985,13 @@
         <w:tc>
           <w:tcPr>
             <w:tcW w:type="dxa" w:w="1008"/>
+            <w:shd w:fill="F7FAFC" w:val="clear"/>
             <w:tcBorders>
               <w:top w:val="single" w:sz="4" w:space="0" w:color="CBD5E1"/>
               <w:left w:val="single" w:sz="4" w:space="0" w:color="CBD5E1"/>
               <w:bottom w:val="single" w:sz="4" w:space="0" w:color="CBD5E1"/>
               <w:right w:val="single" w:sz="4" w:space="0" w:color="CBD5E1"/>
             </w:tcBorders>
-            <w:shd w:fill="F7FAFC" w:val="clear"/>
           </w:tcPr>
           <w:p>
             <w:pPr>
@@ -1867,13 +3014,13 @@
         <w:tc>
           <w:tcPr>
             <w:tcW w:type="dxa" w:w="1440"/>
+            <w:shd w:fill="F7FAFC" w:val="clear"/>
             <w:tcBorders>
               <w:top w:val="single" w:sz="4" w:space="0" w:color="CBD5E1"/>
               <w:left w:val="single" w:sz="4" w:space="0" w:color="CBD5E1"/>
               <w:bottom w:val="single" w:sz="4" w:space="0" w:color="CBD5E1"/>
               <w:right w:val="single" w:sz="4" w:space="0" w:color="CBD5E1"/>
             </w:tcBorders>
-            <w:shd w:fill="F7FAFC" w:val="clear"/>
           </w:tcPr>
           <w:p>
             <w:pPr>
@@ -1896,13 +3043,13 @@
         <w:tc>
           <w:tcPr>
             <w:tcW w:type="dxa" w:w="1872"/>
+            <w:shd w:fill="F7FAFC" w:val="clear"/>
             <w:tcBorders>
               <w:top w:val="single" w:sz="4" w:space="0" w:color="CBD5E1"/>
               <w:left w:val="single" w:sz="4" w:space="0" w:color="CBD5E1"/>
               <w:bottom w:val="single" w:sz="4" w:space="0" w:color="CBD5E1"/>
               <w:right w:val="single" w:sz="4" w:space="0" w:color="CBD5E1"/>
             </w:tcBorders>
-            <w:shd w:fill="F7FAFC" w:val="clear"/>
           </w:tcPr>
           <w:p>
             <w:pPr>
@@ -1925,18 +3072,18 @@
         <w:tc>
           <w:tcPr>
             <w:tcW w:type="dxa" w:w="1584"/>
+            <w:shd w:fill="F7FAFC" w:val="clear"/>
             <w:tcBorders>
               <w:top w:val="single" w:sz="4" w:space="0" w:color="CBD5E1"/>
               <w:left w:val="single" w:sz="4" w:space="0" w:color="CBD5E1"/>
               <w:bottom w:val="single" w:sz="4" w:space="0" w:color="CBD5E1"/>
               <w:right w:val="single" w:sz="4" w:space="0" w:color="CBD5E1"/>
             </w:tcBorders>
-            <w:shd w:fill="F7FAFC" w:val="clear"/>
           </w:tcPr>
           <w:p>
             <w:pPr>
               <w:spacing w:before="40" w:after="40" w:lineRule="auto" w:line="240"/>
-              <w:jc w:val="right"/>
+              <w:jc w:val="left"/>
             </w:pPr>
             <w:r/>
             <w:r>
@@ -1953,19 +3100,19 @@
         </w:tc>
         <w:tc>
           <w:tcPr>
-            <w:tcW w:type="dxa" w:w="1728"/>
+            <w:tcW w:type="dxa" w:w="2016"/>
+            <w:shd w:fill="F7FAFC" w:val="clear"/>
             <w:tcBorders>
               <w:top w:val="single" w:sz="4" w:space="0" w:color="CBD5E1"/>
               <w:left w:val="single" w:sz="4" w:space="0" w:color="CBD5E1"/>
               <w:bottom w:val="single" w:sz="4" w:space="0" w:color="CBD5E1"/>
               <w:right w:val="single" w:sz="4" w:space="0" w:color="CBD5E1"/>
             </w:tcBorders>
-            <w:shd w:fill="F7FAFC" w:val="clear"/>
           </w:tcPr>
           <w:p>
             <w:pPr>
               <w:spacing w:before="40" w:after="40" w:lineRule="auto" w:line="240"/>
-              <w:jc w:val="right"/>
+              <w:jc w:val="left"/>
             </w:pPr>
             <w:r/>
             <w:r>
@@ -1982,19 +3129,19 @@
         </w:tc>
         <w:tc>
           <w:tcPr>
-            <w:tcW w:type="dxa" w:w="1728"/>
+            <w:tcW w:type="dxa" w:w="1584"/>
+            <w:shd w:fill="F7FAFC" w:val="clear"/>
             <w:tcBorders>
               <w:top w:val="single" w:sz="4" w:space="0" w:color="CBD5E1"/>
               <w:left w:val="single" w:sz="4" w:space="0" w:color="CBD5E1"/>
               <w:bottom w:val="single" w:sz="4" w:space="0" w:color="CBD5E1"/>
               <w:right w:val="single" w:sz="4" w:space="0" w:color="CBD5E1"/>
             </w:tcBorders>
-            <w:shd w:fill="F7FAFC" w:val="clear"/>
           </w:tcPr>
           <w:p>
             <w:pPr>
               <w:spacing w:before="40" w:after="40" w:lineRule="auto" w:line="240"/>
-              <w:jc w:val="right"/>
+              <w:jc w:val="left"/>
             </w:pPr>
             <w:r/>
             <w:r>
@@ -2108,7 +3255,7 @@
           <w:p>
             <w:pPr>
               <w:spacing w:before="40" w:after="40" w:lineRule="auto" w:line="240"/>
-              <w:jc w:val="right"/>
+              <w:jc w:val="left"/>
             </w:pPr>
             <w:r/>
             <w:r>
@@ -2125,7 +3272,7 @@
         </w:tc>
         <w:tc>
           <w:tcPr>
-            <w:tcW w:type="dxa" w:w="1728"/>
+            <w:tcW w:type="dxa" w:w="2016"/>
             <w:tcBorders>
               <w:top w:val="single" w:sz="4" w:space="0" w:color="CBD5E1"/>
               <w:left w:val="single" w:sz="4" w:space="0" w:color="CBD5E1"/>
@@ -2136,7 +3283,7 @@
           <w:p>
             <w:pPr>
               <w:spacing w:before="40" w:after="40" w:lineRule="auto" w:line="240"/>
-              <w:jc w:val="right"/>
+              <w:jc w:val="left"/>
             </w:pPr>
             <w:r/>
             <w:r>
@@ -2153,7 +3300,7 @@
         </w:tc>
         <w:tc>
           <w:tcPr>
-            <w:tcW w:type="dxa" w:w="1728"/>
+            <w:tcW w:type="dxa" w:w="1584"/>
             <w:tcBorders>
               <w:top w:val="single" w:sz="4" w:space="0" w:color="CBD5E1"/>
               <w:left w:val="single" w:sz="4" w:space="0" w:color="CBD5E1"/>
@@ -2164,7 +3311,7 @@
           <w:p>
             <w:pPr>
               <w:spacing w:before="40" w:after="40" w:lineRule="auto" w:line="240"/>
-              <w:jc w:val="right"/>
+              <w:jc w:val="left"/>
             </w:pPr>
             <w:r/>
             <w:r>
@@ -2184,13 +3331,13 @@
         <w:tc>
           <w:tcPr>
             <w:tcW w:type="dxa" w:w="1008"/>
+            <w:shd w:fill="F7FAFC" w:val="clear"/>
             <w:tcBorders>
               <w:top w:val="single" w:sz="4" w:space="0" w:color="CBD5E1"/>
               <w:left w:val="single" w:sz="4" w:space="0" w:color="CBD5E1"/>
               <w:bottom w:val="single" w:sz="4" w:space="0" w:color="CBD5E1"/>
               <w:right w:val="single" w:sz="4" w:space="0" w:color="CBD5E1"/>
             </w:tcBorders>
-            <w:shd w:fill="F7FAFC" w:val="clear"/>
           </w:tcPr>
           <w:p>
             <w:pPr>
@@ -2213,13 +3360,13 @@
         <w:tc>
           <w:tcPr>
             <w:tcW w:type="dxa" w:w="1440"/>
+            <w:shd w:fill="F7FAFC" w:val="clear"/>
             <w:tcBorders>
               <w:top w:val="single" w:sz="4" w:space="0" w:color="CBD5E1"/>
               <w:left w:val="single" w:sz="4" w:space="0" w:color="CBD5E1"/>
               <w:bottom w:val="single" w:sz="4" w:space="0" w:color="CBD5E1"/>
               <w:right w:val="single" w:sz="4" w:space="0" w:color="CBD5E1"/>
             </w:tcBorders>
-            <w:shd w:fill="F7FAFC" w:val="clear"/>
           </w:tcPr>
           <w:p>
             <w:pPr>
@@ -2242,13 +3389,13 @@
         <w:tc>
           <w:tcPr>
             <w:tcW w:type="dxa" w:w="1872"/>
+            <w:shd w:fill="F7FAFC" w:val="clear"/>
             <w:tcBorders>
               <w:top w:val="single" w:sz="4" w:space="0" w:color="CBD5E1"/>
               <w:left w:val="single" w:sz="4" w:space="0" w:color="CBD5E1"/>
               <w:bottom w:val="single" w:sz="4" w:space="0" w:color="CBD5E1"/>
               <w:right w:val="single" w:sz="4" w:space="0" w:color="CBD5E1"/>
             </w:tcBorders>
-            <w:shd w:fill="F7FAFC" w:val="clear"/>
           </w:tcPr>
           <w:p>
             <w:pPr>
@@ -2271,18 +3418,18 @@
         <w:tc>
           <w:tcPr>
             <w:tcW w:type="dxa" w:w="1584"/>
+            <w:shd w:fill="F7FAFC" w:val="clear"/>
             <w:tcBorders>
               <w:top w:val="single" w:sz="4" w:space="0" w:color="CBD5E1"/>
               <w:left w:val="single" w:sz="4" w:space="0" w:color="CBD5E1"/>
               <w:bottom w:val="single" w:sz="4" w:space="0" w:color="CBD5E1"/>
               <w:right w:val="single" w:sz="4" w:space="0" w:color="CBD5E1"/>
             </w:tcBorders>
-            <w:shd w:fill="F7FAFC" w:val="clear"/>
           </w:tcPr>
           <w:p>
             <w:pPr>
               <w:spacing w:before="40" w:after="40" w:lineRule="auto" w:line="240"/>
-              <w:jc w:val="right"/>
+              <w:jc w:val="left"/>
             </w:pPr>
             <w:r/>
             <w:r>
@@ -2299,19 +3446,19 @@
         </w:tc>
         <w:tc>
           <w:tcPr>
-            <w:tcW w:type="dxa" w:w="1728"/>
+            <w:tcW w:type="dxa" w:w="2016"/>
+            <w:shd w:fill="F7FAFC" w:val="clear"/>
             <w:tcBorders>
               <w:top w:val="single" w:sz="4" w:space="0" w:color="CBD5E1"/>
               <w:left w:val="single" w:sz="4" w:space="0" w:color="CBD5E1"/>
               <w:bottom w:val="single" w:sz="4" w:space="0" w:color="CBD5E1"/>
               <w:right w:val="single" w:sz="4" w:space="0" w:color="CBD5E1"/>
             </w:tcBorders>
-            <w:shd w:fill="F7FAFC" w:val="clear"/>
           </w:tcPr>
           <w:p>
             <w:pPr>
               <w:spacing w:before="40" w:after="40" w:lineRule="auto" w:line="240"/>
-              <w:jc w:val="right"/>
+              <w:jc w:val="left"/>
             </w:pPr>
             <w:r/>
             <w:r>
@@ -2328,19 +3475,19 @@
         </w:tc>
         <w:tc>
           <w:tcPr>
-            <w:tcW w:type="dxa" w:w="1728"/>
+            <w:tcW w:type="dxa" w:w="1584"/>
+            <w:shd w:fill="F7FAFC" w:val="clear"/>
             <w:tcBorders>
               <w:top w:val="single" w:sz="4" w:space="0" w:color="CBD5E1"/>
               <w:left w:val="single" w:sz="4" w:space="0" w:color="CBD5E1"/>
               <w:bottom w:val="single" w:sz="4" w:space="0" w:color="CBD5E1"/>
               <w:right w:val="single" w:sz="4" w:space="0" w:color="CBD5E1"/>
             </w:tcBorders>
-            <w:shd w:fill="F7FAFC" w:val="clear"/>
           </w:tcPr>
           <w:p>
             <w:pPr>
               <w:spacing w:before="40" w:after="40" w:lineRule="auto" w:line="240"/>
-              <w:jc w:val="right"/>
+              <w:jc w:val="left"/>
             </w:pPr>
             <w:r/>
             <w:r>
@@ -2454,7 +3601,7 @@
           <w:p>
             <w:pPr>
               <w:spacing w:before="40" w:after="40" w:lineRule="auto" w:line="240"/>
-              <w:jc w:val="right"/>
+              <w:jc w:val="left"/>
             </w:pPr>
             <w:r/>
             <w:r>
@@ -2471,7 +3618,7 @@
         </w:tc>
         <w:tc>
           <w:tcPr>
-            <w:tcW w:type="dxa" w:w="1728"/>
+            <w:tcW w:type="dxa" w:w="2016"/>
             <w:tcBorders>
               <w:top w:val="single" w:sz="4" w:space="0" w:color="CBD5E1"/>
               <w:left w:val="single" w:sz="4" w:space="0" w:color="CBD5E1"/>
@@ -2482,7 +3629,7 @@
           <w:p>
             <w:pPr>
               <w:spacing w:before="40" w:after="40" w:lineRule="auto" w:line="240"/>
-              <w:jc w:val="right"/>
+              <w:jc w:val="left"/>
             </w:pPr>
             <w:r/>
             <w:r>
@@ -2499,7 +3646,7 @@
         </w:tc>
         <w:tc>
           <w:tcPr>
-            <w:tcW w:type="dxa" w:w="1728"/>
+            <w:tcW w:type="dxa" w:w="1584"/>
             <w:tcBorders>
               <w:top w:val="single" w:sz="4" w:space="0" w:color="CBD5E1"/>
               <w:left w:val="single" w:sz="4" w:space="0" w:color="CBD5E1"/>
@@ -2510,7 +3657,7 @@
           <w:p>
             <w:pPr>
               <w:spacing w:before="40" w:after="40" w:lineRule="auto" w:line="240"/>
-              <w:jc w:val="right"/>
+              <w:jc w:val="left"/>
             </w:pPr>
             <w:r/>
             <w:r>
@@ -2530,13 +3677,13 @@
         <w:tc>
           <w:tcPr>
             <w:tcW w:type="dxa" w:w="1008"/>
+            <w:shd w:fill="F7FAFC" w:val="clear"/>
             <w:tcBorders>
               <w:top w:val="single" w:sz="4" w:space="0" w:color="CBD5E1"/>
               <w:left w:val="single" w:sz="4" w:space="0" w:color="CBD5E1"/>
               <w:bottom w:val="single" w:sz="4" w:space="0" w:color="CBD5E1"/>
               <w:right w:val="single" w:sz="4" w:space="0" w:color="CBD5E1"/>
             </w:tcBorders>
-            <w:shd w:fill="F7FAFC" w:val="clear"/>
           </w:tcPr>
           <w:p>
             <w:pPr>
@@ -2559,13 +3706,13 @@
         <w:tc>
           <w:tcPr>
             <w:tcW w:type="dxa" w:w="1440"/>
+            <w:shd w:fill="F7FAFC" w:val="clear"/>
             <w:tcBorders>
               <w:top w:val="single" w:sz="4" w:space="0" w:color="CBD5E1"/>
               <w:left w:val="single" w:sz="4" w:space="0" w:color="CBD5E1"/>
               <w:bottom w:val="single" w:sz="4" w:space="0" w:color="CBD5E1"/>
               <w:right w:val="single" w:sz="4" w:space="0" w:color="CBD5E1"/>
             </w:tcBorders>
-            <w:shd w:fill="F7FAFC" w:val="clear"/>
           </w:tcPr>
           <w:p>
             <w:pPr>
@@ -2588,13 +3735,13 @@
         <w:tc>
           <w:tcPr>
             <w:tcW w:type="dxa" w:w="1872"/>
+            <w:shd w:fill="F7FAFC" w:val="clear"/>
             <w:tcBorders>
               <w:top w:val="single" w:sz="4" w:space="0" w:color="CBD5E1"/>
               <w:left w:val="single" w:sz="4" w:space="0" w:color="CBD5E1"/>
               <w:bottom w:val="single" w:sz="4" w:space="0" w:color="CBD5E1"/>
               <w:right w:val="single" w:sz="4" w:space="0" w:color="CBD5E1"/>
             </w:tcBorders>
-            <w:shd w:fill="F7FAFC" w:val="clear"/>
           </w:tcPr>
           <w:p>
             <w:pPr>
@@ -2617,18 +3764,18 @@
         <w:tc>
           <w:tcPr>
             <w:tcW w:type="dxa" w:w="1584"/>
+            <w:shd w:fill="F7FAFC" w:val="clear"/>
             <w:tcBorders>
               <w:top w:val="single" w:sz="4" w:space="0" w:color="CBD5E1"/>
               <w:left w:val="single" w:sz="4" w:space="0" w:color="CBD5E1"/>
               <w:bottom w:val="single" w:sz="4" w:space="0" w:color="CBD5E1"/>
               <w:right w:val="single" w:sz="4" w:space="0" w:color="CBD5E1"/>
             </w:tcBorders>
-            <w:shd w:fill="F7FAFC" w:val="clear"/>
           </w:tcPr>
           <w:p>
             <w:pPr>
               <w:spacing w:before="40" w:after="40" w:lineRule="auto" w:line="240"/>
-              <w:jc w:val="right"/>
+              <w:jc w:val="left"/>
             </w:pPr>
             <w:r/>
             <w:r>
@@ -2645,19 +3792,19 @@
         </w:tc>
         <w:tc>
           <w:tcPr>
-            <w:tcW w:type="dxa" w:w="1728"/>
+            <w:tcW w:type="dxa" w:w="2016"/>
+            <w:shd w:fill="F7FAFC" w:val="clear"/>
             <w:tcBorders>
               <w:top w:val="single" w:sz="4" w:space="0" w:color="CBD5E1"/>
               <w:left w:val="single" w:sz="4" w:space="0" w:color="CBD5E1"/>
               <w:bottom w:val="single" w:sz="4" w:space="0" w:color="CBD5E1"/>
               <w:right w:val="single" w:sz="4" w:space="0" w:color="CBD5E1"/>
             </w:tcBorders>
-            <w:shd w:fill="F7FAFC" w:val="clear"/>
           </w:tcPr>
           <w:p>
             <w:pPr>
               <w:spacing w:before="40" w:after="40" w:lineRule="auto" w:line="240"/>
-              <w:jc w:val="right"/>
+              <w:jc w:val="left"/>
             </w:pPr>
             <w:r/>
             <w:r>
@@ -2674,19 +3821,19 @@
         </w:tc>
         <w:tc>
           <w:tcPr>
-            <w:tcW w:type="dxa" w:w="1728"/>
+            <w:tcW w:type="dxa" w:w="1584"/>
+            <w:shd w:fill="F7FAFC" w:val="clear"/>
             <w:tcBorders>
               <w:top w:val="single" w:sz="4" w:space="0" w:color="CBD5E1"/>
               <w:left w:val="single" w:sz="4" w:space="0" w:color="CBD5E1"/>
               <w:bottom w:val="single" w:sz="4" w:space="0" w:color="CBD5E1"/>
               <w:right w:val="single" w:sz="4" w:space="0" w:color="CBD5E1"/>
             </w:tcBorders>
-            <w:shd w:fill="F7FAFC" w:val="clear"/>
           </w:tcPr>
           <w:p>
             <w:pPr>
               <w:spacing w:before="40" w:after="40" w:lineRule="auto" w:line="240"/>
-              <w:jc w:val="right"/>
+              <w:jc w:val="left"/>
             </w:pPr>
             <w:r/>
             <w:r>
@@ -2800,7 +3947,7 @@
           <w:p>
             <w:pPr>
               <w:spacing w:before="40" w:after="40" w:lineRule="auto" w:line="240"/>
-              <w:jc w:val="right"/>
+              <w:jc w:val="left"/>
             </w:pPr>
             <w:r/>
             <w:r>
@@ -2817,7 +3964,7 @@
         </w:tc>
         <w:tc>
           <w:tcPr>
-            <w:tcW w:type="dxa" w:w="1728"/>
+            <w:tcW w:type="dxa" w:w="2016"/>
             <w:tcBorders>
               <w:top w:val="single" w:sz="4" w:space="0" w:color="CBD5E1"/>
               <w:left w:val="single" w:sz="4" w:space="0" w:color="CBD5E1"/>
@@ -2828,7 +3975,7 @@
           <w:p>
             <w:pPr>
               <w:spacing w:before="40" w:after="40" w:lineRule="auto" w:line="240"/>
-              <w:jc w:val="right"/>
+              <w:jc w:val="left"/>
             </w:pPr>
             <w:r/>
             <w:r>
@@ -2845,7 +3992,7 @@
         </w:tc>
         <w:tc>
           <w:tcPr>
-            <w:tcW w:type="dxa" w:w="1728"/>
+            <w:tcW w:type="dxa" w:w="1584"/>
             <w:tcBorders>
               <w:top w:val="single" w:sz="4" w:space="0" w:color="CBD5E1"/>
               <w:left w:val="single" w:sz="4" w:space="0" w:color="CBD5E1"/>
@@ -2856,7 +4003,7 @@
           <w:p>
             <w:pPr>
               <w:spacing w:before="40" w:after="40" w:lineRule="auto" w:line="240"/>
-              <w:jc w:val="right"/>
+              <w:jc w:val="left"/>
             </w:pPr>
             <w:r/>
             <w:r>
@@ -2876,14 +4023,13 @@
         <w:tc>
           <w:tcPr>
             <w:tcW w:type="dxa" w:w="1008"/>
+            <w:shd w:fill="EEF2F7" w:val="clear"/>
             <w:tcBorders>
               <w:top w:val="single" w:sz="4" w:space="0" w:color="CBD5E1"/>
               <w:left w:val="single" w:sz="4" w:space="0" w:color="CBD5E1"/>
               <w:bottom w:val="single" w:sz="4" w:space="0" w:color="CBD5E1"/>
               <w:right w:val="single" w:sz="4" w:space="0" w:color="CBD5E1"/>
             </w:tcBorders>
-            <w:shd w:fill="F7FAFC" w:val="clear"/>
-            <w:shd w:fill="EEF2F7" w:val="clear"/>
           </w:tcPr>
           <w:p>
             <w:pPr>
@@ -2906,14 +4052,13 @@
         <w:tc>
           <w:tcPr>
             <w:tcW w:type="dxa" w:w="1440"/>
+            <w:shd w:fill="EEF2F7" w:val="clear"/>
             <w:tcBorders>
               <w:top w:val="single" w:sz="4" w:space="0" w:color="CBD5E1"/>
               <w:left w:val="single" w:sz="4" w:space="0" w:color="CBD5E1"/>
               <w:bottom w:val="single" w:sz="4" w:space="0" w:color="CBD5E1"/>
               <w:right w:val="single" w:sz="4" w:space="0" w:color="CBD5E1"/>
             </w:tcBorders>
-            <w:shd w:fill="F7FAFC" w:val="clear"/>
-            <w:shd w:fill="EEF2F7" w:val="clear"/>
           </w:tcPr>
           <w:p>
             <w:pPr>
@@ -2936,14 +4081,13 @@
         <w:tc>
           <w:tcPr>
             <w:tcW w:type="dxa" w:w="1872"/>
+            <w:shd w:fill="EEF2F7" w:val="clear"/>
             <w:tcBorders>
               <w:top w:val="single" w:sz="4" w:space="0" w:color="CBD5E1"/>
               <w:left w:val="single" w:sz="4" w:space="0" w:color="CBD5E1"/>
               <w:bottom w:val="single" w:sz="4" w:space="0" w:color="CBD5E1"/>
               <w:right w:val="single" w:sz="4" w:space="0" w:color="CBD5E1"/>
             </w:tcBorders>
-            <w:shd w:fill="F7FAFC" w:val="clear"/>
-            <w:shd w:fill="EEF2F7" w:val="clear"/>
           </w:tcPr>
           <w:p>
             <w:pPr>
@@ -2966,19 +4110,18 @@
         <w:tc>
           <w:tcPr>
             <w:tcW w:type="dxa" w:w="1584"/>
+            <w:shd w:fill="EEF2F7" w:val="clear"/>
             <w:tcBorders>
               <w:top w:val="single" w:sz="4" w:space="0" w:color="CBD5E1"/>
               <w:left w:val="single" w:sz="4" w:space="0" w:color="CBD5E1"/>
               <w:bottom w:val="single" w:sz="4" w:space="0" w:color="CBD5E1"/>
               <w:right w:val="single" w:sz="4" w:space="0" w:color="CBD5E1"/>
             </w:tcBorders>
-            <w:shd w:fill="F7FAFC" w:val="clear"/>
-            <w:shd w:fill="EEF2F7" w:val="clear"/>
           </w:tcPr>
           <w:p>
             <w:pPr>
               <w:spacing w:before="40" w:after="40" w:lineRule="auto" w:line="240"/>
-              <w:jc w:val="right"/>
+              <w:jc w:val="left"/>
             </w:pPr>
             <w:r/>
             <w:r>
@@ -2995,20 +4138,19 @@
         </w:tc>
         <w:tc>
           <w:tcPr>
-            <w:tcW w:type="dxa" w:w="1728"/>
+            <w:tcW w:type="dxa" w:w="2016"/>
+            <w:shd w:fill="EEF2F7" w:val="clear"/>
             <w:tcBorders>
               <w:top w:val="single" w:sz="4" w:space="0" w:color="CBD5E1"/>
               <w:left w:val="single" w:sz="4" w:space="0" w:color="CBD5E1"/>
               <w:bottom w:val="single" w:sz="4" w:space="0" w:color="CBD5E1"/>
               <w:right w:val="single" w:sz="4" w:space="0" w:color="CBD5E1"/>
             </w:tcBorders>
-            <w:shd w:fill="F7FAFC" w:val="clear"/>
-            <w:shd w:fill="EEF2F7" w:val="clear"/>
           </w:tcPr>
           <w:p>
             <w:pPr>
               <w:spacing w:before="40" w:after="40" w:lineRule="auto" w:line="240"/>
-              <w:jc w:val="right"/>
+              <w:jc w:val="left"/>
             </w:pPr>
             <w:r/>
             <w:r>
@@ -3019,26 +4161,25 @@
                 <w:color w:val="1A365D"/>
                 <w:sz w:val="20"/>
               </w:rPr>
-              <w:t>300,000 STX</w:t>
+              <w:t>300,000 STX / cycle</w:t>
             </w:r>
           </w:p>
         </w:tc>
         <w:tc>
           <w:tcPr>
-            <w:tcW w:type="dxa" w:w="1728"/>
+            <w:tcW w:type="dxa" w:w="1584"/>
+            <w:shd w:fill="EEF2F7" w:val="clear"/>
             <w:tcBorders>
               <w:top w:val="single" w:sz="4" w:space="0" w:color="CBD5E1"/>
               <w:left w:val="single" w:sz="4" w:space="0" w:color="CBD5E1"/>
               <w:bottom w:val="single" w:sz="4" w:space="0" w:color="CBD5E1"/>
               <w:right w:val="single" w:sz="4" w:space="0" w:color="CBD5E1"/>
             </w:tcBorders>
-            <w:shd w:fill="F7FAFC" w:val="clear"/>
-            <w:shd w:fill="EEF2F7" w:val="clear"/>
           </w:tcPr>
           <w:p>
             <w:pPr>
               <w:spacing w:before="40" w:after="40" w:lineRule="auto" w:line="240"/>
-              <w:jc w:val="right"/>
+              <w:jc w:val="left"/>
             </w:pPr>
             <w:r/>
             <w:r>
@@ -3082,7 +4223,7 @@
           <w:color w:val="4A5568"/>
           <w:sz w:val="20"/>
         </w:rPr>
-        <w:t>Estimated sBTC reward figures are approximate and subject to market conditions and yield performance at campaign time.</w:t>
+        <w:t>Estimated sBTC reward figures are approximate and subject to market conditions and yield performance at campaign time. Awarded boost amounts above are per cycle; the same mix repeats each cycle.</w:t>
       </w:r>
     </w:p>
     <w:p>
@@ -3097,132 +4238,7 @@
           <w:color w:val="2B6CB0"/>
           <w:sz w:val="26"/>
         </w:rPr>
-        <w:t>Pot Cycle Length</w:t>
-      </w:r>
-    </w:p>
-    <w:p>
-      <w:pPr>
-        <w:spacing w:before="0" w:after="160" w:lineRule="auto" w:line="276"/>
-      </w:pPr>
-      <w:r>
-        <w:rPr>
-          <w:rFonts w:ascii="Calibri" w:hAnsi="Calibri" w:eastAsia="Calibri"/>
-          <w:b w:val="0"/>
-          <w:i w:val="0"/>
-          <w:color w:val="1F2937"/>
-          <w:sz w:val="22"/>
-        </w:rPr>
-        <w:t xml:space="preserve">Each sponsored pot runs on a </w:t>
-      </w:r>
-      <w:r>
-        <w:rPr>
-          <w:rFonts w:ascii="Calibri" w:hAnsi="Calibri" w:eastAsia="Calibri"/>
-          <w:b/>
-          <w:i w:val="0"/>
-          <w:color w:val="1F2937"/>
-          <w:sz w:val="22"/>
-        </w:rPr>
-        <w:t>2-week cycle</w:t>
-      </w:r>
-      <w:r>
-        <w:rPr>
-          <w:rFonts w:ascii="Calibri" w:hAnsi="Calibri" w:eastAsia="Calibri"/>
-          <w:b w:val="0"/>
-          <w:i w:val="0"/>
-          <w:color w:val="1F2937"/>
-          <w:sz w:val="22"/>
-        </w:rPr>
-        <w:t xml:space="preserve">. Over a 5-month program (~20 weeks), that provides capacity for about </w:t>
-      </w:r>
-      <w:r>
-        <w:rPr>
-          <w:rFonts w:ascii="Calibri" w:hAnsi="Calibri" w:eastAsia="Calibri"/>
-          <w:b/>
-          <w:i w:val="0"/>
-          <w:color w:val="1F2937"/>
-          <w:sz w:val="22"/>
-        </w:rPr>
-        <w:t>10 bi-weekly cycles</w:t>
-      </w:r>
-      <w:r>
-        <w:rPr>
-          <w:rFonts w:ascii="Calibri" w:hAnsi="Calibri" w:eastAsia="Calibri"/>
-          <w:b w:val="0"/>
-          <w:i w:val="0"/>
-          <w:color w:val="1F2937"/>
-          <w:sz w:val="22"/>
-        </w:rPr>
-        <w:t xml:space="preserve">. The </w:t>
-      </w:r>
-      <w:r>
-        <w:rPr>
-          <w:rFonts w:ascii="Calibri" w:hAnsi="Calibri" w:eastAsia="Calibri"/>
-          <w:b/>
-          <w:i w:val="0"/>
-          <w:color w:val="1F2937"/>
-          <w:sz w:val="22"/>
-        </w:rPr>
-        <w:t>8 sponsored pots</w:t>
-      </w:r>
-      <w:r>
-        <w:rPr>
-          <w:rFonts w:ascii="Calibri" w:hAnsi="Calibri" w:eastAsia="Calibri"/>
-          <w:b w:val="0"/>
-          <w:i w:val="0"/>
-          <w:color w:val="1F2937"/>
-          <w:sz w:val="22"/>
-        </w:rPr>
-        <w:t xml:space="preserve"> therefore occupy </w:t>
-      </w:r>
-      <w:r>
-        <w:rPr>
-          <w:rFonts w:ascii="Calibri" w:hAnsi="Calibri" w:eastAsia="Calibri"/>
-          <w:b/>
-          <w:i w:val="0"/>
-          <w:color w:val="1F2937"/>
-          <w:sz w:val="22"/>
-        </w:rPr>
-        <w:t>16 weeks</w:t>
-      </w:r>
-      <w:r>
-        <w:rPr>
-          <w:rFonts w:ascii="Calibri" w:hAnsi="Calibri" w:eastAsia="Calibri"/>
-          <w:b w:val="0"/>
-          <w:i w:val="0"/>
-          <w:color w:val="1F2937"/>
-          <w:sz w:val="22"/>
-        </w:rPr>
-        <w:t xml:space="preserve"> of active campaigns, with remaining weeks used for pacing, community-led pots, and program wrap-up.</w:t>
-      </w:r>
-    </w:p>
-    <w:p>
-      <w:pPr>
-        <w:spacing w:before="240" w:after="120" w:lineRule="auto" w:line="276"/>
-      </w:pPr>
-      <w:r>
-        <w:rPr>
-          <w:rFonts w:ascii="Calibri" w:hAnsi="Calibri" w:eastAsia="Calibri"/>
-          <w:b/>
-          <w:i w:val="0"/>
-          <w:color w:val="2B6CB0"/>
-          <w:sz w:val="26"/>
-        </w:rPr>
-        <w:t>Indicative 5-Month Rollout</w:t>
-      </w:r>
-    </w:p>
-    <w:p>
-      <w:pPr>
-        <w:spacing w:before="0" w:after="120" w:lineRule="auto" w:line="276"/>
-      </w:pPr>
-      <w:r>
-        <w:rPr>
-          <w:rFonts w:ascii="Calibri" w:hAnsi="Calibri" w:eastAsia="Calibri"/>
-          <w:b w:val="0"/>
-          <w:i w:val="0"/>
-          <w:color w:val="1F2937"/>
-          <w:sz w:val="22"/>
-        </w:rPr>
-        <w:t>Campaigns are sequenced one pot per 2-week cycle—about two pots per month—to build familiarity, then scale commitment:</w:t>
+        <w:t>Program Scale</w:t>
       </w:r>
     </w:p>
     <w:tbl>
@@ -3233,16 +4249,15 @@
         <w:tblLook w:firstColumn="1" w:firstRow="1" w:lastColumn="0" w:lastRow="0" w:noHBand="0" w:noVBand="1" w:val="04A0"/>
       </w:tblPr>
       <w:tblGrid>
-        <w:gridCol w:w="1872"/>
-        <w:gridCol w:w="1872"/>
-        <w:gridCol w:w="1872"/>
-        <w:gridCol w:w="1872"/>
-        <w:gridCol w:w="1872"/>
+        <w:gridCol w:w="2340"/>
+        <w:gridCol w:w="2340"/>
+        <w:gridCol w:w="2340"/>
+        <w:gridCol w:w="2340"/>
       </w:tblGrid>
       <w:tr>
         <w:tc>
           <w:tcPr>
-            <w:tcW w:type="dxa" w:w="864"/>
+            <w:tcW w:type="dxa" w:w="2880"/>
             <w:shd w:fill="1A365D" w:val="clear"/>
             <w:tcBorders>
               <w:top w:val="single" w:sz="4" w:space="0" w:color="1A365D"/>
@@ -3265,71 +4280,13 @@
                 <w:color w:val="FFFFFF"/>
                 <w:sz w:val="20"/>
               </w:rPr>
-              <w:t>Month</w:t>
+              <w:t>Scope</w:t>
             </w:r>
           </w:p>
         </w:tc>
         <w:tc>
           <w:tcPr>
-            <w:tcW w:type="dxa" w:w="3744"/>
-            <w:shd w:fill="1A365D" w:val="clear"/>
-            <w:tcBorders>
-              <w:top w:val="single" w:sz="4" w:space="0" w:color="1A365D"/>
-              <w:left w:val="single" w:sz="4" w:space="0" w:color="1A365D"/>
-              <w:bottom w:val="single" w:sz="4" w:space="0" w:color="1A365D"/>
-              <w:right w:val="single" w:sz="4" w:space="0" w:color="1A365D"/>
-            </w:tcBorders>
-          </w:tcPr>
-          <w:p>
-            <w:pPr>
-              <w:spacing w:before="40" w:after="40" w:lineRule="auto" w:line="240"/>
-              <w:jc w:val="center"/>
-            </w:pPr>
-            <w:r/>
-            <w:r>
-              <w:rPr>
-                <w:rFonts w:ascii="Calibri" w:hAnsi="Calibri" w:eastAsia="Calibri"/>
-                <w:b/>
-                <w:i w:val="0"/>
-                <w:color w:val="FFFFFF"/>
-                <w:sz w:val="20"/>
-              </w:rPr>
-              <w:t>Focus</w:t>
-            </w:r>
-          </w:p>
-        </w:tc>
-        <w:tc>
-          <w:tcPr>
-            <w:tcW w:type="dxa" w:w="2592"/>
-            <w:shd w:fill="1A365D" w:val="clear"/>
-            <w:tcBorders>
-              <w:top w:val="single" w:sz="4" w:space="0" w:color="1A365D"/>
-              <w:left w:val="single" w:sz="4" w:space="0" w:color="1A365D"/>
-              <w:bottom w:val="single" w:sz="4" w:space="0" w:color="1A365D"/>
-              <w:right w:val="single" w:sz="4" w:space="0" w:color="1A365D"/>
-            </w:tcBorders>
-          </w:tcPr>
-          <w:p>
-            <w:pPr>
-              <w:spacing w:before="40" w:after="40" w:lineRule="auto" w:line="240"/>
-              <w:jc w:val="center"/>
-            </w:pPr>
-            <w:r/>
-            <w:r>
-              <w:rPr>
-                <w:rFonts w:ascii="Calibri" w:hAnsi="Calibri" w:eastAsia="Calibri"/>
-                <w:b/>
-                <w:i w:val="0"/>
-                <w:color w:val="FFFFFF"/>
-                <w:sz w:val="20"/>
-              </w:rPr>
-              <w:t>Campaign Tiers (Entry Min.)</w:t>
-            </w:r>
-          </w:p>
-        </w:tc>
-        <w:tc>
-          <w:tcPr>
-            <w:tcW w:type="dxa" w:w="1008"/>
+            <w:tcW w:type="dxa" w:w="1728"/>
             <w:shd w:fill="1A365D" w:val="clear"/>
             <w:tcBorders>
               <w:top w:val="single" w:sz="4" w:space="0" w:color="1A365D"/>
@@ -3381,6 +4338,582 @@
                 <w:color w:val="FFFFFF"/>
                 <w:sz w:val="20"/>
               </w:rPr>
+              <w:t>Pots</w:t>
+            </w:r>
+          </w:p>
+        </w:tc>
+        <w:tc>
+          <w:tcPr>
+            <w:tcW w:type="dxa" w:w="2880"/>
+            <w:shd w:fill="1A365D" w:val="clear"/>
+            <w:tcBorders>
+              <w:top w:val="single" w:sz="4" w:space="0" w:color="1A365D"/>
+              <w:left w:val="single" w:sz="4" w:space="0" w:color="1A365D"/>
+              <w:bottom w:val="single" w:sz="4" w:space="0" w:color="1A365D"/>
+              <w:right w:val="single" w:sz="4" w:space="0" w:color="1A365D"/>
+            </w:tcBorders>
+          </w:tcPr>
+          <w:p>
+            <w:pPr>
+              <w:spacing w:before="40" w:after="40" w:lineRule="auto" w:line="240"/>
+              <w:jc w:val="center"/>
+            </w:pPr>
+            <w:r/>
+            <w:r>
+              <w:rPr>
+                <w:rFonts w:ascii="Calibri" w:hAnsi="Calibri" w:eastAsia="Calibri"/>
+                <w:b/>
+                <w:i w:val="0"/>
+                <w:color w:val="FFFFFF"/>
+                <w:sz w:val="20"/>
+              </w:rPr>
+              <w:t>Sponsored Boost</w:t>
+            </w:r>
+          </w:p>
+        </w:tc>
+      </w:tr>
+      <w:tr>
+        <w:tc>
+          <w:tcPr>
+            <w:tcW w:type="dxa" w:w="2880"/>
+            <w:tcBorders>
+              <w:top w:val="single" w:sz="4" w:space="0" w:color="CBD5E1"/>
+              <w:left w:val="single" w:sz="4" w:space="0" w:color="CBD5E1"/>
+              <w:bottom w:val="single" w:sz="4" w:space="0" w:color="CBD5E1"/>
+              <w:right w:val="single" w:sz="4" w:space="0" w:color="CBD5E1"/>
+            </w:tcBorders>
+          </w:tcPr>
+          <w:p>
+            <w:pPr>
+              <w:spacing w:before="40" w:after="40" w:lineRule="auto" w:line="240"/>
+              <w:jc w:val="center"/>
+            </w:pPr>
+            <w:r/>
+            <w:r>
+              <w:rPr>
+                <w:rFonts w:ascii="Calibri" w:hAnsi="Calibri" w:eastAsia="Calibri"/>
+                <w:b w:val="0"/>
+                <w:i w:val="0"/>
+                <w:color w:val="1F2937"/>
+                <w:sz w:val="20"/>
+              </w:rPr>
+              <w:t>Per cycle</w:t>
+            </w:r>
+          </w:p>
+        </w:tc>
+        <w:tc>
+          <w:tcPr>
+            <w:tcW w:type="dxa" w:w="1728"/>
+            <w:tcBorders>
+              <w:top w:val="single" w:sz="4" w:space="0" w:color="CBD5E1"/>
+              <w:left w:val="single" w:sz="4" w:space="0" w:color="CBD5E1"/>
+              <w:bottom w:val="single" w:sz="4" w:space="0" w:color="CBD5E1"/>
+              <w:right w:val="single" w:sz="4" w:space="0" w:color="CBD5E1"/>
+            </w:tcBorders>
+          </w:tcPr>
+          <w:p>
+            <w:pPr>
+              <w:spacing w:before="40" w:after="40" w:lineRule="auto" w:line="240"/>
+              <w:jc w:val="left"/>
+            </w:pPr>
+            <w:r/>
+            <w:r>
+              <w:rPr>
+                <w:rFonts w:ascii="Calibri" w:hAnsi="Calibri" w:eastAsia="Calibri"/>
+                <w:b w:val="0"/>
+                <w:i w:val="0"/>
+                <w:color w:val="1F2937"/>
+                <w:sz w:val="20"/>
+              </w:rPr>
+              <w:t>1</w:t>
+            </w:r>
+          </w:p>
+        </w:tc>
+        <w:tc>
+          <w:tcPr>
+            <w:tcW w:type="dxa" w:w="1728"/>
+            <w:tcBorders>
+              <w:top w:val="single" w:sz="4" w:space="0" w:color="CBD5E1"/>
+              <w:left w:val="single" w:sz="4" w:space="0" w:color="CBD5E1"/>
+              <w:bottom w:val="single" w:sz="4" w:space="0" w:color="CBD5E1"/>
+              <w:right w:val="single" w:sz="4" w:space="0" w:color="CBD5E1"/>
+            </w:tcBorders>
+          </w:tcPr>
+          <w:p>
+            <w:pPr>
+              <w:spacing w:before="40" w:after="40" w:lineRule="auto" w:line="240"/>
+              <w:jc w:val="left"/>
+            </w:pPr>
+            <w:r/>
+            <w:r>
+              <w:rPr>
+                <w:rFonts w:ascii="Calibri" w:hAnsi="Calibri" w:eastAsia="Calibri"/>
+                <w:b w:val="0"/>
+                <w:i w:val="0"/>
+                <w:color w:val="1F2937"/>
+                <w:sz w:val="20"/>
+              </w:rPr>
+              <w:t>8</w:t>
+            </w:r>
+          </w:p>
+        </w:tc>
+        <w:tc>
+          <w:tcPr>
+            <w:tcW w:type="dxa" w:w="2880"/>
+            <w:tcBorders>
+              <w:top w:val="single" w:sz="4" w:space="0" w:color="CBD5E1"/>
+              <w:left w:val="single" w:sz="4" w:space="0" w:color="CBD5E1"/>
+              <w:bottom w:val="single" w:sz="4" w:space="0" w:color="CBD5E1"/>
+              <w:right w:val="single" w:sz="4" w:space="0" w:color="CBD5E1"/>
+            </w:tcBorders>
+          </w:tcPr>
+          <w:p>
+            <w:pPr>
+              <w:spacing w:before="40" w:after="40" w:lineRule="auto" w:line="240"/>
+              <w:jc w:val="left"/>
+            </w:pPr>
+            <w:r/>
+            <w:r>
+              <w:rPr>
+                <w:rFonts w:ascii="Calibri" w:hAnsi="Calibri" w:eastAsia="Calibri"/>
+                <w:b w:val="0"/>
+                <w:i w:val="0"/>
+                <w:color w:val="1F2937"/>
+                <w:sz w:val="20"/>
+              </w:rPr>
+              <w:t>300,000 STX</w:t>
+            </w:r>
+          </w:p>
+        </w:tc>
+      </w:tr>
+      <w:tr>
+        <w:tc>
+          <w:tcPr>
+            <w:tcW w:type="dxa" w:w="2880"/>
+            <w:shd w:fill="F7FAFC" w:val="clear"/>
+            <w:tcBorders>
+              <w:top w:val="single" w:sz="4" w:space="0" w:color="CBD5E1"/>
+              <w:left w:val="single" w:sz="4" w:space="0" w:color="CBD5E1"/>
+              <w:bottom w:val="single" w:sz="4" w:space="0" w:color="CBD5E1"/>
+              <w:right w:val="single" w:sz="4" w:space="0" w:color="CBD5E1"/>
+            </w:tcBorders>
+          </w:tcPr>
+          <w:p>
+            <w:pPr>
+              <w:spacing w:before="40" w:after="40" w:lineRule="auto" w:line="240"/>
+              <w:jc w:val="center"/>
+            </w:pPr>
+            <w:r/>
+            <w:r>
+              <w:rPr>
+                <w:rFonts w:ascii="Calibri" w:hAnsi="Calibri" w:eastAsia="Calibri"/>
+                <w:b w:val="0"/>
+                <w:i w:val="0"/>
+                <w:color w:val="1F2937"/>
+                <w:sz w:val="20"/>
+              </w:rPr>
+              <w:t>Per month</w:t>
+            </w:r>
+          </w:p>
+        </w:tc>
+        <w:tc>
+          <w:tcPr>
+            <w:tcW w:type="dxa" w:w="1728"/>
+            <w:shd w:fill="F7FAFC" w:val="clear"/>
+            <w:tcBorders>
+              <w:top w:val="single" w:sz="4" w:space="0" w:color="CBD5E1"/>
+              <w:left w:val="single" w:sz="4" w:space="0" w:color="CBD5E1"/>
+              <w:bottom w:val="single" w:sz="4" w:space="0" w:color="CBD5E1"/>
+              <w:right w:val="single" w:sz="4" w:space="0" w:color="CBD5E1"/>
+            </w:tcBorders>
+          </w:tcPr>
+          <w:p>
+            <w:pPr>
+              <w:spacing w:before="40" w:after="40" w:lineRule="auto" w:line="240"/>
+              <w:jc w:val="left"/>
+            </w:pPr>
+            <w:r/>
+            <w:r>
+              <w:rPr>
+                <w:rFonts w:ascii="Calibri" w:hAnsi="Calibri" w:eastAsia="Calibri"/>
+                <w:b w:val="0"/>
+                <w:i w:val="0"/>
+                <w:color w:val="1F2937"/>
+                <w:sz w:val="20"/>
+              </w:rPr>
+              <w:t>2</w:t>
+            </w:r>
+          </w:p>
+        </w:tc>
+        <w:tc>
+          <w:tcPr>
+            <w:tcW w:type="dxa" w:w="1728"/>
+            <w:shd w:fill="F7FAFC" w:val="clear"/>
+            <w:tcBorders>
+              <w:top w:val="single" w:sz="4" w:space="0" w:color="CBD5E1"/>
+              <w:left w:val="single" w:sz="4" w:space="0" w:color="CBD5E1"/>
+              <w:bottom w:val="single" w:sz="4" w:space="0" w:color="CBD5E1"/>
+              <w:right w:val="single" w:sz="4" w:space="0" w:color="CBD5E1"/>
+            </w:tcBorders>
+          </w:tcPr>
+          <w:p>
+            <w:pPr>
+              <w:spacing w:before="40" w:after="40" w:lineRule="auto" w:line="240"/>
+              <w:jc w:val="left"/>
+            </w:pPr>
+            <w:r/>
+            <w:r>
+              <w:rPr>
+                <w:rFonts w:ascii="Calibri" w:hAnsi="Calibri" w:eastAsia="Calibri"/>
+                <w:b w:val="0"/>
+                <w:i w:val="0"/>
+                <w:color w:val="1F2937"/>
+                <w:sz w:val="20"/>
+              </w:rPr>
+              <w:t>16</w:t>
+            </w:r>
+          </w:p>
+        </w:tc>
+        <w:tc>
+          <w:tcPr>
+            <w:tcW w:type="dxa" w:w="2880"/>
+            <w:shd w:fill="F7FAFC" w:val="clear"/>
+            <w:tcBorders>
+              <w:top w:val="single" w:sz="4" w:space="0" w:color="CBD5E1"/>
+              <w:left w:val="single" w:sz="4" w:space="0" w:color="CBD5E1"/>
+              <w:bottom w:val="single" w:sz="4" w:space="0" w:color="CBD5E1"/>
+              <w:right w:val="single" w:sz="4" w:space="0" w:color="CBD5E1"/>
+            </w:tcBorders>
+          </w:tcPr>
+          <w:p>
+            <w:pPr>
+              <w:spacing w:before="40" w:after="40" w:lineRule="auto" w:line="240"/>
+              <w:jc w:val="left"/>
+            </w:pPr>
+            <w:r/>
+            <w:r>
+              <w:rPr>
+                <w:rFonts w:ascii="Calibri" w:hAnsi="Calibri" w:eastAsia="Calibri"/>
+                <w:b w:val="0"/>
+                <w:i w:val="0"/>
+                <w:color w:val="1F2937"/>
+                <w:sz w:val="20"/>
+              </w:rPr>
+              <w:t>600,000 STX</w:t>
+            </w:r>
+          </w:p>
+        </w:tc>
+      </w:tr>
+      <w:tr>
+        <w:tc>
+          <w:tcPr>
+            <w:tcW w:type="dxa" w:w="2880"/>
+            <w:shd w:fill="EEF2F7" w:val="clear"/>
+            <w:tcBorders>
+              <w:top w:val="single" w:sz="4" w:space="0" w:color="CBD5E1"/>
+              <w:left w:val="single" w:sz="4" w:space="0" w:color="CBD5E1"/>
+              <w:bottom w:val="single" w:sz="4" w:space="0" w:color="CBD5E1"/>
+              <w:right w:val="single" w:sz="4" w:space="0" w:color="CBD5E1"/>
+            </w:tcBorders>
+          </w:tcPr>
+          <w:p>
+            <w:pPr>
+              <w:spacing w:before="40" w:after="40" w:lineRule="auto" w:line="240"/>
+              <w:jc w:val="center"/>
+            </w:pPr>
+            <w:r/>
+            <w:r>
+              <w:rPr>
+                <w:rFonts w:ascii="Calibri" w:hAnsi="Calibri" w:eastAsia="Calibri"/>
+                <w:b/>
+                <w:i w:val="0"/>
+                <w:color w:val="1A365D"/>
+                <w:sz w:val="20"/>
+              </w:rPr>
+              <w:t>5-month program</w:t>
+            </w:r>
+          </w:p>
+        </w:tc>
+        <w:tc>
+          <w:tcPr>
+            <w:tcW w:type="dxa" w:w="1728"/>
+            <w:shd w:fill="EEF2F7" w:val="clear"/>
+            <w:tcBorders>
+              <w:top w:val="single" w:sz="4" w:space="0" w:color="CBD5E1"/>
+              <w:left w:val="single" w:sz="4" w:space="0" w:color="CBD5E1"/>
+              <w:bottom w:val="single" w:sz="4" w:space="0" w:color="CBD5E1"/>
+              <w:right w:val="single" w:sz="4" w:space="0" w:color="CBD5E1"/>
+            </w:tcBorders>
+          </w:tcPr>
+          <w:p>
+            <w:pPr>
+              <w:spacing w:before="40" w:after="40" w:lineRule="auto" w:line="240"/>
+              <w:jc w:val="left"/>
+            </w:pPr>
+            <w:r/>
+            <w:r>
+              <w:rPr>
+                <w:rFonts w:ascii="Calibri" w:hAnsi="Calibri" w:eastAsia="Calibri"/>
+                <w:b/>
+                <w:i w:val="0"/>
+                <w:color w:val="1A365D"/>
+                <w:sz w:val="20"/>
+              </w:rPr>
+              <w:t>10</w:t>
+            </w:r>
+          </w:p>
+        </w:tc>
+        <w:tc>
+          <w:tcPr>
+            <w:tcW w:type="dxa" w:w="1728"/>
+            <w:shd w:fill="EEF2F7" w:val="clear"/>
+            <w:tcBorders>
+              <w:top w:val="single" w:sz="4" w:space="0" w:color="CBD5E1"/>
+              <w:left w:val="single" w:sz="4" w:space="0" w:color="CBD5E1"/>
+              <w:bottom w:val="single" w:sz="4" w:space="0" w:color="CBD5E1"/>
+              <w:right w:val="single" w:sz="4" w:space="0" w:color="CBD5E1"/>
+            </w:tcBorders>
+          </w:tcPr>
+          <w:p>
+            <w:pPr>
+              <w:spacing w:before="40" w:after="40" w:lineRule="auto" w:line="240"/>
+              <w:jc w:val="left"/>
+            </w:pPr>
+            <w:r/>
+            <w:r>
+              <w:rPr>
+                <w:rFonts w:ascii="Calibri" w:hAnsi="Calibri" w:eastAsia="Calibri"/>
+                <w:b/>
+                <w:i w:val="0"/>
+                <w:color w:val="1A365D"/>
+                <w:sz w:val="20"/>
+              </w:rPr>
+              <w:t>80</w:t>
+            </w:r>
+          </w:p>
+        </w:tc>
+        <w:tc>
+          <w:tcPr>
+            <w:tcW w:type="dxa" w:w="2880"/>
+            <w:shd w:fill="EEF2F7" w:val="clear"/>
+            <w:tcBorders>
+              <w:top w:val="single" w:sz="4" w:space="0" w:color="CBD5E1"/>
+              <w:left w:val="single" w:sz="4" w:space="0" w:color="CBD5E1"/>
+              <w:bottom w:val="single" w:sz="4" w:space="0" w:color="CBD5E1"/>
+              <w:right w:val="single" w:sz="4" w:space="0" w:color="CBD5E1"/>
+            </w:tcBorders>
+          </w:tcPr>
+          <w:p>
+            <w:pPr>
+              <w:spacing w:before="40" w:after="40" w:lineRule="auto" w:line="240"/>
+              <w:jc w:val="left"/>
+            </w:pPr>
+            <w:r/>
+            <w:r>
+              <w:rPr>
+                <w:rFonts w:ascii="Calibri" w:hAnsi="Calibri" w:eastAsia="Calibri"/>
+                <w:b/>
+                <w:i w:val="0"/>
+                <w:color w:val="1A365D"/>
+                <w:sz w:val="20"/>
+              </w:rPr>
+              <w:t>3,000,000 STX</w:t>
+            </w:r>
+          </w:p>
+        </w:tc>
+      </w:tr>
+    </w:tbl>
+    <w:p>
+      <w:pPr>
+        <w:spacing w:before="0" w:after="120" w:lineRule="auto" w:line="240"/>
+      </w:pPr>
+    </w:p>
+    <w:p>
+      <w:pPr>
+        <w:spacing w:before="240" w:after="120" w:lineRule="auto" w:line="276"/>
+      </w:pPr>
+      <w:r>
+        <w:rPr>
+          <w:rFonts w:ascii="Calibri" w:hAnsi="Calibri" w:eastAsia="Calibri"/>
+          <w:b/>
+          <w:i w:val="0"/>
+          <w:color w:val="2B6CB0"/>
+          <w:sz w:val="26"/>
+        </w:rPr>
+        <w:t>Indicative 5-Month Rollout</w:t>
+      </w:r>
+    </w:p>
+    <w:p>
+      <w:pPr>
+        <w:spacing w:before="0" w:after="120" w:lineRule="auto" w:line="276"/>
+      </w:pPr>
+      <w:r>
+        <w:rPr>
+          <w:rFonts w:ascii="Calibri" w:hAnsi="Calibri" w:eastAsia="Calibri"/>
+          <w:b w:val="0"/>
+          <w:i w:val="0"/>
+          <w:color w:val="1F2937"/>
+          <w:sz w:val="22"/>
+        </w:rPr>
+        <w:t>Every month runs two full cycles of the 8-pot mix (16 pots). Boost volume stays consistent so the market can form habits around the bi-weekly cadence:</w:t>
+      </w:r>
+    </w:p>
+    <w:tbl>
+      <w:tblPr>
+        <w:tblW w:type="auto" w:w="0"/>
+        <w:jc w:val="center"/>
+        <w:tblLayout w:type="autofit"/>
+        <w:tblLook w:firstColumn="1" w:firstRow="1" w:lastColumn="0" w:lastRow="0" w:noHBand="0" w:noVBand="1" w:val="04A0"/>
+      </w:tblPr>
+      <w:tblGrid>
+        <w:gridCol w:w="1872"/>
+        <w:gridCol w:w="1872"/>
+        <w:gridCol w:w="1872"/>
+        <w:gridCol w:w="1872"/>
+        <w:gridCol w:w="1872"/>
+      </w:tblGrid>
+      <w:tr>
+        <w:tc>
+          <w:tcPr>
+            <w:tcW w:type="dxa" w:w="1008"/>
+            <w:shd w:fill="1A365D" w:val="clear"/>
+            <w:tcBorders>
+              <w:top w:val="single" w:sz="4" w:space="0" w:color="1A365D"/>
+              <w:left w:val="single" w:sz="4" w:space="0" w:color="1A365D"/>
+              <w:bottom w:val="single" w:sz="4" w:space="0" w:color="1A365D"/>
+              <w:right w:val="single" w:sz="4" w:space="0" w:color="1A365D"/>
+            </w:tcBorders>
+          </w:tcPr>
+          <w:p>
+            <w:pPr>
+              <w:spacing w:before="40" w:after="40" w:lineRule="auto" w:line="240"/>
+              <w:jc w:val="center"/>
+            </w:pPr>
+            <w:r/>
+            <w:r>
+              <w:rPr>
+                <w:rFonts w:ascii="Calibri" w:hAnsi="Calibri" w:eastAsia="Calibri"/>
+                <w:b/>
+                <w:i w:val="0"/>
+                <w:color w:val="FFFFFF"/>
+                <w:sz w:val="20"/>
+              </w:rPr>
+              <w:t>Month</w:t>
+            </w:r>
+          </w:p>
+        </w:tc>
+        <w:tc>
+          <w:tcPr>
+            <w:tcW w:type="dxa" w:w="4320"/>
+            <w:shd w:fill="1A365D" w:val="clear"/>
+            <w:tcBorders>
+              <w:top w:val="single" w:sz="4" w:space="0" w:color="1A365D"/>
+              <w:left w:val="single" w:sz="4" w:space="0" w:color="1A365D"/>
+              <w:bottom w:val="single" w:sz="4" w:space="0" w:color="1A365D"/>
+              <w:right w:val="single" w:sz="4" w:space="0" w:color="1A365D"/>
+            </w:tcBorders>
+          </w:tcPr>
+          <w:p>
+            <w:pPr>
+              <w:spacing w:before="40" w:after="40" w:lineRule="auto" w:line="240"/>
+              <w:jc w:val="center"/>
+            </w:pPr>
+            <w:r/>
+            <w:r>
+              <w:rPr>
+                <w:rFonts w:ascii="Calibri" w:hAnsi="Calibri" w:eastAsia="Calibri"/>
+                <w:b/>
+                <w:i w:val="0"/>
+                <w:color w:val="FFFFFF"/>
+                <w:sz w:val="20"/>
+              </w:rPr>
+              <w:t>Focus</w:t>
+            </w:r>
+          </w:p>
+        </w:tc>
+        <w:tc>
+          <w:tcPr>
+            <w:tcW w:type="dxa" w:w="1152"/>
+            <w:shd w:fill="1A365D" w:val="clear"/>
+            <w:tcBorders>
+              <w:top w:val="single" w:sz="4" w:space="0" w:color="1A365D"/>
+              <w:left w:val="single" w:sz="4" w:space="0" w:color="1A365D"/>
+              <w:bottom w:val="single" w:sz="4" w:space="0" w:color="1A365D"/>
+              <w:right w:val="single" w:sz="4" w:space="0" w:color="1A365D"/>
+            </w:tcBorders>
+          </w:tcPr>
+          <w:p>
+            <w:pPr>
+              <w:spacing w:before="40" w:after="40" w:lineRule="auto" w:line="240"/>
+              <w:jc w:val="center"/>
+            </w:pPr>
+            <w:r/>
+            <w:r>
+              <w:rPr>
+                <w:rFonts w:ascii="Calibri" w:hAnsi="Calibri" w:eastAsia="Calibri"/>
+                <w:b/>
+                <w:i w:val="0"/>
+                <w:color w:val="FFFFFF"/>
+                <w:sz w:val="20"/>
+              </w:rPr>
+              <w:t>Cycles</w:t>
+            </w:r>
+          </w:p>
+        </w:tc>
+        <w:tc>
+          <w:tcPr>
+            <w:tcW w:type="dxa" w:w="1008"/>
+            <w:shd w:fill="1A365D" w:val="clear"/>
+            <w:tcBorders>
+              <w:top w:val="single" w:sz="4" w:space="0" w:color="1A365D"/>
+              <w:left w:val="single" w:sz="4" w:space="0" w:color="1A365D"/>
+              <w:bottom w:val="single" w:sz="4" w:space="0" w:color="1A365D"/>
+              <w:right w:val="single" w:sz="4" w:space="0" w:color="1A365D"/>
+            </w:tcBorders>
+          </w:tcPr>
+          <w:p>
+            <w:pPr>
+              <w:spacing w:before="40" w:after="40" w:lineRule="auto" w:line="240"/>
+              <w:jc w:val="center"/>
+            </w:pPr>
+            <w:r/>
+            <w:r>
+              <w:rPr>
+                <w:rFonts w:ascii="Calibri" w:hAnsi="Calibri" w:eastAsia="Calibri"/>
+                <w:b/>
+                <w:i w:val="0"/>
+                <w:color w:val="FFFFFF"/>
+                <w:sz w:val="20"/>
+              </w:rPr>
+              <w:t>Pots</w:t>
+            </w:r>
+          </w:p>
+        </w:tc>
+        <w:tc>
+          <w:tcPr>
+            <w:tcW w:type="dxa" w:w="1872"/>
+            <w:shd w:fill="1A365D" w:val="clear"/>
+            <w:tcBorders>
+              <w:top w:val="single" w:sz="4" w:space="0" w:color="1A365D"/>
+              <w:left w:val="single" w:sz="4" w:space="0" w:color="1A365D"/>
+              <w:bottom w:val="single" w:sz="4" w:space="0" w:color="1A365D"/>
+              <w:right w:val="single" w:sz="4" w:space="0" w:color="1A365D"/>
+            </w:tcBorders>
+          </w:tcPr>
+          <w:p>
+            <w:pPr>
+              <w:spacing w:before="40" w:after="40" w:lineRule="auto" w:line="240"/>
+              <w:jc w:val="center"/>
+            </w:pPr>
+            <w:r/>
+            <w:r>
+              <w:rPr>
+                <w:rFonts w:ascii="Calibri" w:hAnsi="Calibri" w:eastAsia="Calibri"/>
+                <w:b/>
+                <w:i w:val="0"/>
+                <w:color w:val="FFFFFF"/>
+                <w:sz w:val="20"/>
+              </w:rPr>
               <w:t>Indicative Boost</w:t>
             </w:r>
           </w:p>
@@ -3389,7 +4922,7 @@
       <w:tr>
         <w:tc>
           <w:tcPr>
-            <w:tcW w:type="dxa" w:w="864"/>
+            <w:tcW w:type="dxa" w:w="1008"/>
             <w:tcBorders>
               <w:top w:val="single" w:sz="4" w:space="0" w:color="CBD5E1"/>
               <w:left w:val="single" w:sz="4" w:space="0" w:color="CBD5E1"/>
@@ -3417,7 +4950,7 @@
         </w:tc>
         <w:tc>
           <w:tcPr>
-            <w:tcW w:type="dxa" w:w="3744"/>
+            <w:tcW w:type="dxa" w:w="4320"/>
             <w:tcBorders>
               <w:top w:val="single" w:sz="4" w:space="0" w:color="CBD5E1"/>
               <w:left w:val="single" w:sz="4" w:space="0" w:color="CBD5E1"/>
@@ -3439,13 +4972,13 @@
                 <w:color w:val="1F2937"/>
                 <w:sz w:val="20"/>
               </w:rPr>
-              <w:t>Launch &amp; discovery — lower barriers, introduce sponsorship</w:t>
+              <w:t>Launch &amp; discovery — establish 8-pot / 2-week cadence</w:t>
             </w:r>
           </w:p>
         </w:tc>
         <w:tc>
           <w:tcPr>
-            <w:tcW w:type="dxa" w:w="2592"/>
+            <w:tcW w:type="dxa" w:w="1152"/>
             <w:tcBorders>
               <w:top w:val="single" w:sz="4" w:space="0" w:color="CBD5E1"/>
               <w:left w:val="single" w:sz="4" w:space="0" w:color="CBD5E1"/>
@@ -3456,7 +4989,7 @@
           <w:p>
             <w:pPr>
               <w:spacing w:before="40" w:after="40" w:lineRule="auto" w:line="240"/>
-              <w:jc w:val="right"/>
+              <w:jc w:val="left"/>
             </w:pPr>
             <w:r/>
             <w:r>
@@ -3467,7 +5000,7 @@
                 <w:color w:val="1F2937"/>
                 <w:sz w:val="20"/>
               </w:rPr>
-              <w:t>25 STX → 30 STX</w:t>
+              <w:t>2</w:t>
             </w:r>
           </w:p>
         </w:tc>
@@ -3484,7 +5017,7 @@
           <w:p>
             <w:pPr>
               <w:spacing w:before="40" w:after="40" w:lineRule="auto" w:line="240"/>
-              <w:jc w:val="right"/>
+              <w:jc w:val="left"/>
             </w:pPr>
             <w:r/>
             <w:r>
@@ -3495,13 +5028,13 @@
                 <w:color w:val="1F2937"/>
                 <w:sz w:val="20"/>
               </w:rPr>
-              <w:t>2</w:t>
+              <w:t>16</w:t>
             </w:r>
           </w:p>
         </w:tc>
         <w:tc>
           <w:tcPr>
-            <w:tcW w:type="dxa" w:w="1728"/>
+            <w:tcW w:type="dxa" w:w="1872"/>
             <w:tcBorders>
               <w:top w:val="single" w:sz="4" w:space="0" w:color="CBD5E1"/>
               <w:left w:val="single" w:sz="4" w:space="0" w:color="CBD5E1"/>
@@ -3512,7 +5045,7 @@
           <w:p>
             <w:pPr>
               <w:spacing w:before="40" w:after="40" w:lineRule="auto" w:line="240"/>
-              <w:jc w:val="right"/>
+              <w:jc w:val="left"/>
             </w:pPr>
             <w:r/>
             <w:r>
@@ -3523,7 +5056,7 @@
                 <w:color w:val="1F2937"/>
                 <w:sz w:val="20"/>
               </w:rPr>
-              <w:t>25,000 STX</w:t>
+              <w:t>600,000 STX</w:t>
             </w:r>
           </w:p>
         </w:tc>
@@ -3531,14 +5064,14 @@
       <w:tr>
         <w:tc>
           <w:tcPr>
-            <w:tcW w:type="dxa" w:w="864"/>
+            <w:tcW w:type="dxa" w:w="1008"/>
+            <w:shd w:fill="F7FAFC" w:val="clear"/>
             <w:tcBorders>
               <w:top w:val="single" w:sz="4" w:space="0" w:color="CBD5E1"/>
               <w:left w:val="single" w:sz="4" w:space="0" w:color="CBD5E1"/>
               <w:bottom w:val="single" w:sz="4" w:space="0" w:color="CBD5E1"/>
               <w:right w:val="single" w:sz="4" w:space="0" w:color="CBD5E1"/>
             </w:tcBorders>
-            <w:shd w:fill="F7FAFC" w:val="clear"/>
           </w:tcPr>
           <w:p>
             <w:pPr>
@@ -3560,14 +5093,14 @@
         </w:tc>
         <w:tc>
           <w:tcPr>
-            <w:tcW w:type="dxa" w:w="3744"/>
+            <w:tcW w:type="dxa" w:w="4320"/>
+            <w:shd w:fill="F7FAFC" w:val="clear"/>
             <w:tcBorders>
               <w:top w:val="single" w:sz="4" w:space="0" w:color="CBD5E1"/>
               <w:left w:val="single" w:sz="4" w:space="0" w:color="CBD5E1"/>
               <w:bottom w:val="single" w:sz="4" w:space="0" w:color="CBD5E1"/>
               <w:right w:val="single" w:sz="4" w:space="0" w:color="CBD5E1"/>
             </w:tcBorders>
-            <w:shd w:fill="F7FAFC" w:val="clear"/>
           </w:tcPr>
           <w:p>
             <w:pPr>
@@ -3583,54 +5116,25 @@
                 <w:color w:val="1F2937"/>
                 <w:sz w:val="20"/>
               </w:rPr>
-              <w:t>Expand mid-tier participation</w:t>
+              <w:t>Expand participation across all entry tiers</w:t>
             </w:r>
           </w:p>
         </w:tc>
         <w:tc>
           <w:tcPr>
-            <w:tcW w:type="dxa" w:w="2592"/>
+            <w:tcW w:type="dxa" w:w="1152"/>
+            <w:shd w:fill="F7FAFC" w:val="clear"/>
             <w:tcBorders>
               <w:top w:val="single" w:sz="4" w:space="0" w:color="CBD5E1"/>
               <w:left w:val="single" w:sz="4" w:space="0" w:color="CBD5E1"/>
               <w:bottom w:val="single" w:sz="4" w:space="0" w:color="CBD5E1"/>
               <w:right w:val="single" w:sz="4" w:space="0" w:color="CBD5E1"/>
             </w:tcBorders>
-            <w:shd w:fill="F7FAFC" w:val="clear"/>
           </w:tcPr>
           <w:p>
             <w:pPr>
               <w:spacing w:before="40" w:after="40" w:lineRule="auto" w:line="240"/>
-              <w:jc w:val="right"/>
-            </w:pPr>
-            <w:r/>
-            <w:r>
-              <w:rPr>
-                <w:rFonts w:ascii="Calibri" w:hAnsi="Calibri" w:eastAsia="Calibri"/>
-                <w:b w:val="0"/>
-                <w:i w:val="0"/>
-                <w:color w:val="1F2937"/>
-                <w:sz w:val="20"/>
-              </w:rPr>
-              <w:t>35 STX → 40 STX</w:t>
-            </w:r>
-          </w:p>
-        </w:tc>
-        <w:tc>
-          <w:tcPr>
-            <w:tcW w:type="dxa" w:w="1008"/>
-            <w:tcBorders>
-              <w:top w:val="single" w:sz="4" w:space="0" w:color="CBD5E1"/>
-              <w:left w:val="single" w:sz="4" w:space="0" w:color="CBD5E1"/>
-              <w:bottom w:val="single" w:sz="4" w:space="0" w:color="CBD5E1"/>
-              <w:right w:val="single" w:sz="4" w:space="0" w:color="CBD5E1"/>
-            </w:tcBorders>
-            <w:shd w:fill="F7FAFC" w:val="clear"/>
-          </w:tcPr>
-          <w:p>
-            <w:pPr>
-              <w:spacing w:before="40" w:after="40" w:lineRule="auto" w:line="240"/>
-              <w:jc w:val="right"/>
+              <w:jc w:val="left"/>
             </w:pPr>
             <w:r/>
             <w:r>
@@ -3647,19 +5151,19 @@
         </w:tc>
         <w:tc>
           <w:tcPr>
-            <w:tcW w:type="dxa" w:w="1728"/>
+            <w:tcW w:type="dxa" w:w="1008"/>
+            <w:shd w:fill="F7FAFC" w:val="clear"/>
             <w:tcBorders>
               <w:top w:val="single" w:sz="4" w:space="0" w:color="CBD5E1"/>
               <w:left w:val="single" w:sz="4" w:space="0" w:color="CBD5E1"/>
               <w:bottom w:val="single" w:sz="4" w:space="0" w:color="CBD5E1"/>
               <w:right w:val="single" w:sz="4" w:space="0" w:color="CBD5E1"/>
             </w:tcBorders>
-            <w:shd w:fill="F7FAFC" w:val="clear"/>
           </w:tcPr>
           <w:p>
             <w:pPr>
               <w:spacing w:before="40" w:after="40" w:lineRule="auto" w:line="240"/>
-              <w:jc w:val="right"/>
+              <w:jc w:val="left"/>
             </w:pPr>
             <w:r/>
             <w:r>
@@ -3670,7 +5174,36 @@
                 <w:color w:val="1F2937"/>
                 <w:sz w:val="20"/>
               </w:rPr>
-              <w:t>45,000 STX</w:t>
+              <w:t>16</w:t>
+            </w:r>
+          </w:p>
+        </w:tc>
+        <w:tc>
+          <w:tcPr>
+            <w:tcW w:type="dxa" w:w="1872"/>
+            <w:shd w:fill="F7FAFC" w:val="clear"/>
+            <w:tcBorders>
+              <w:top w:val="single" w:sz="4" w:space="0" w:color="CBD5E1"/>
+              <w:left w:val="single" w:sz="4" w:space="0" w:color="CBD5E1"/>
+              <w:bottom w:val="single" w:sz="4" w:space="0" w:color="CBD5E1"/>
+              <w:right w:val="single" w:sz="4" w:space="0" w:color="CBD5E1"/>
+            </w:tcBorders>
+          </w:tcPr>
+          <w:p>
+            <w:pPr>
+              <w:spacing w:before="40" w:after="40" w:lineRule="auto" w:line="240"/>
+              <w:jc w:val="left"/>
+            </w:pPr>
+            <w:r/>
+            <w:r>
+              <w:rPr>
+                <w:rFonts w:ascii="Calibri" w:hAnsi="Calibri" w:eastAsia="Calibri"/>
+                <w:b w:val="0"/>
+                <w:i w:val="0"/>
+                <w:color w:val="1F2937"/>
+                <w:sz w:val="20"/>
+              </w:rPr>
+              <w:t>600,000 STX</w:t>
             </w:r>
           </w:p>
         </w:tc>
@@ -3678,7 +5211,7 @@
       <w:tr>
         <w:tc>
           <w:tcPr>
-            <w:tcW w:type="dxa" w:w="864"/>
+            <w:tcW w:type="dxa" w:w="1008"/>
             <w:tcBorders>
               <w:top w:val="single" w:sz="4" w:space="0" w:color="CBD5E1"/>
               <w:left w:val="single" w:sz="4" w:space="0" w:color="CBD5E1"/>
@@ -3706,7 +5239,7 @@
         </w:tc>
         <w:tc>
           <w:tcPr>
-            <w:tcW w:type="dxa" w:w="3744"/>
+            <w:tcW w:type="dxa" w:w="4320"/>
             <w:tcBorders>
               <w:top w:val="single" w:sz="4" w:space="0" w:color="CBD5E1"/>
               <w:left w:val="single" w:sz="4" w:space="0" w:color="CBD5E1"/>
@@ -3728,13 +5261,13 @@
                 <w:color w:val="1F2937"/>
                 <w:sz w:val="20"/>
               </w:rPr>
-              <w:t>Scale community pots</w:t>
+              <w:t>Deepen community and builder pot engagement</w:t>
             </w:r>
           </w:p>
         </w:tc>
         <w:tc>
           <w:tcPr>
-            <w:tcW w:type="dxa" w:w="2592"/>
+            <w:tcW w:type="dxa" w:w="1152"/>
             <w:tcBorders>
               <w:top w:val="single" w:sz="4" w:space="0" w:color="CBD5E1"/>
               <w:left w:val="single" w:sz="4" w:space="0" w:color="CBD5E1"/>
@@ -3745,7 +5278,7 @@
           <w:p>
             <w:pPr>
               <w:spacing w:before="40" w:after="40" w:lineRule="auto" w:line="240"/>
-              <w:jc w:val="right"/>
+              <w:jc w:val="left"/>
             </w:pPr>
             <w:r/>
             <w:r>
@@ -3756,7 +5289,7 @@
                 <w:color w:val="1F2937"/>
                 <w:sz w:val="20"/>
               </w:rPr>
-              <w:t>45 STX → 50 STX (1 of 2)</w:t>
+              <w:t>2</w:t>
             </w:r>
           </w:p>
         </w:tc>
@@ -3773,7 +5306,7 @@
           <w:p>
             <w:pPr>
               <w:spacing w:before="40" w:after="40" w:lineRule="auto" w:line="240"/>
-              <w:jc w:val="right"/>
+              <w:jc w:val="left"/>
             </w:pPr>
             <w:r/>
             <w:r>
@@ -3784,13 +5317,13 @@
                 <w:color w:val="1F2937"/>
                 <w:sz w:val="20"/>
               </w:rPr>
-              <w:t>2</w:t>
+              <w:t>16</w:t>
             </w:r>
           </w:p>
         </w:tc>
         <w:tc>
           <w:tcPr>
-            <w:tcW w:type="dxa" w:w="1728"/>
+            <w:tcW w:type="dxa" w:w="1872"/>
             <w:tcBorders>
               <w:top w:val="single" w:sz="4" w:space="0" w:color="CBD5E1"/>
               <w:left w:val="single" w:sz="4" w:space="0" w:color="CBD5E1"/>
@@ -3801,7 +5334,7 @@
           <w:p>
             <w:pPr>
               <w:spacing w:before="40" w:after="40" w:lineRule="auto" w:line="240"/>
-              <w:jc w:val="right"/>
+              <w:jc w:val="left"/>
             </w:pPr>
             <w:r/>
             <w:r>
@@ -3812,7 +5345,7 @@
                 <w:color w:val="1F2937"/>
                 <w:sz w:val="20"/>
               </w:rPr>
-              <w:t>80,000 STX</w:t>
+              <w:t>600,000 STX</w:t>
             </w:r>
           </w:p>
         </w:tc>
@@ -3820,14 +5353,14 @@
       <w:tr>
         <w:tc>
           <w:tcPr>
-            <w:tcW w:type="dxa" w:w="864"/>
+            <w:tcW w:type="dxa" w:w="1008"/>
+            <w:shd w:fill="F7FAFC" w:val="clear"/>
             <w:tcBorders>
               <w:top w:val="single" w:sz="4" w:space="0" w:color="CBD5E1"/>
               <w:left w:val="single" w:sz="4" w:space="0" w:color="CBD5E1"/>
               <w:bottom w:val="single" w:sz="4" w:space="0" w:color="CBD5E1"/>
               <w:right w:val="single" w:sz="4" w:space="0" w:color="CBD5E1"/>
             </w:tcBorders>
-            <w:shd w:fill="F7FAFC" w:val="clear"/>
           </w:tcPr>
           <w:p>
             <w:pPr>
@@ -3849,14 +5382,14 @@
         </w:tc>
         <w:tc>
           <w:tcPr>
-            <w:tcW w:type="dxa" w:w="3744"/>
+            <w:tcW w:type="dxa" w:w="4320"/>
+            <w:shd w:fill="F7FAFC" w:val="clear"/>
             <w:tcBorders>
               <w:top w:val="single" w:sz="4" w:space="0" w:color="CBD5E1"/>
               <w:left w:val="single" w:sz="4" w:space="0" w:color="CBD5E1"/>
               <w:bottom w:val="single" w:sz="4" w:space="0" w:color="CBD5E1"/>
               <w:right w:val="single" w:sz="4" w:space="0" w:color="CBD5E1"/>
             </w:tcBorders>
-            <w:shd w:fill="F7FAFC" w:val="clear"/>
           </w:tcPr>
           <w:p>
             <w:pPr>
@@ -3872,25 +5405,25 @@
                 <w:color w:val="1F2937"/>
                 <w:sz w:val="20"/>
               </w:rPr>
-              <w:t>Sustain engagement &amp; retention</w:t>
+              <w:t>Sustain engagement &amp; measure early retention</w:t>
             </w:r>
           </w:p>
         </w:tc>
         <w:tc>
           <w:tcPr>
-            <w:tcW w:type="dxa" w:w="2592"/>
+            <w:tcW w:type="dxa" w:w="1152"/>
+            <w:shd w:fill="F7FAFC" w:val="clear"/>
             <w:tcBorders>
               <w:top w:val="single" w:sz="4" w:space="0" w:color="CBD5E1"/>
               <w:left w:val="single" w:sz="4" w:space="0" w:color="CBD5E1"/>
               <w:bottom w:val="single" w:sz="4" w:space="0" w:color="CBD5E1"/>
               <w:right w:val="single" w:sz="4" w:space="0" w:color="CBD5E1"/>
             </w:tcBorders>
-            <w:shd w:fill="F7FAFC" w:val="clear"/>
           </w:tcPr>
           <w:p>
             <w:pPr>
               <w:spacing w:before="40" w:after="40" w:lineRule="auto" w:line="240"/>
-              <w:jc w:val="right"/>
+              <w:jc w:val="left"/>
             </w:pPr>
             <w:r/>
             <w:r>
@@ -3901,25 +5434,25 @@
                 <w:color w:val="1F2937"/>
                 <w:sz w:val="20"/>
               </w:rPr>
-              <w:t>50 STX (2 of 2)</w:t>
+              <w:t>2</w:t>
             </w:r>
           </w:p>
         </w:tc>
         <w:tc>
           <w:tcPr>
             <w:tcW w:type="dxa" w:w="1008"/>
+            <w:shd w:fill="F7FAFC" w:val="clear"/>
             <w:tcBorders>
               <w:top w:val="single" w:sz="4" w:space="0" w:color="CBD5E1"/>
               <w:left w:val="single" w:sz="4" w:space="0" w:color="CBD5E1"/>
               <w:bottom w:val="single" w:sz="4" w:space="0" w:color="CBD5E1"/>
               <w:right w:val="single" w:sz="4" w:space="0" w:color="CBD5E1"/>
             </w:tcBorders>
-            <w:shd w:fill="F7FAFC" w:val="clear"/>
           </w:tcPr>
           <w:p>
             <w:pPr>
               <w:spacing w:before="40" w:after="40" w:lineRule="auto" w:line="240"/>
-              <w:jc w:val="right"/>
+              <w:jc w:val="left"/>
             </w:pPr>
             <w:r/>
             <w:r>
@@ -3930,25 +5463,25 @@
                 <w:color w:val="1F2937"/>
                 <w:sz w:val="20"/>
               </w:rPr>
-              <w:t>1</w:t>
+              <w:t>16</w:t>
             </w:r>
           </w:p>
         </w:tc>
         <w:tc>
           <w:tcPr>
-            <w:tcW w:type="dxa" w:w="1728"/>
+            <w:tcW w:type="dxa" w:w="1872"/>
+            <w:shd w:fill="F7FAFC" w:val="clear"/>
             <w:tcBorders>
               <w:top w:val="single" w:sz="4" w:space="0" w:color="CBD5E1"/>
               <w:left w:val="single" w:sz="4" w:space="0" w:color="CBD5E1"/>
               <w:bottom w:val="single" w:sz="4" w:space="0" w:color="CBD5E1"/>
               <w:right w:val="single" w:sz="4" w:space="0" w:color="CBD5E1"/>
             </w:tcBorders>
-            <w:shd w:fill="F7FAFC" w:val="clear"/>
           </w:tcPr>
           <w:p>
             <w:pPr>
               <w:spacing w:before="40" w:after="40" w:lineRule="auto" w:line="240"/>
-              <w:jc w:val="right"/>
+              <w:jc w:val="left"/>
             </w:pPr>
             <w:r/>
             <w:r>
@@ -3959,7 +5492,7 @@
                 <w:color w:val="1F2937"/>
                 <w:sz w:val="20"/>
               </w:rPr>
-              <w:t>50,000 STX</w:t>
+              <w:t>600,000 STX</w:t>
             </w:r>
           </w:p>
         </w:tc>
@@ -3967,7 +5500,7 @@
       <w:tr>
         <w:tc>
           <w:tcPr>
-            <w:tcW w:type="dxa" w:w="864"/>
+            <w:tcW w:type="dxa" w:w="1008"/>
             <w:tcBorders>
               <w:top w:val="single" w:sz="4" w:space="0" w:color="CBD5E1"/>
               <w:left w:val="single" w:sz="4" w:space="0" w:color="CBD5E1"/>
@@ -3995,7 +5528,7 @@
         </w:tc>
         <w:tc>
           <w:tcPr>
-            <w:tcW w:type="dxa" w:w="3744"/>
+            <w:tcW w:type="dxa" w:w="4320"/>
             <w:tcBorders>
               <w:top w:val="single" w:sz="4" w:space="0" w:color="CBD5E1"/>
               <w:left w:val="single" w:sz="4" w:space="0" w:color="CBD5E1"/>
@@ -4017,13 +5550,13 @@
                 <w:color w:val="1F2937"/>
                 <w:sz w:val="20"/>
               </w:rPr>
-              <w:t>Flagship campaign &amp; program close</w:t>
+              <w:t>Maintain cadence, flagship visibility &amp; program close</w:t>
             </w:r>
           </w:p>
         </w:tc>
         <w:tc>
           <w:tcPr>
-            <w:tcW w:type="dxa" w:w="2592"/>
+            <w:tcW w:type="dxa" w:w="1152"/>
             <w:tcBorders>
               <w:top w:val="single" w:sz="4" w:space="0" w:color="CBD5E1"/>
               <w:left w:val="single" w:sz="4" w:space="0" w:color="CBD5E1"/>
@@ -4034,7 +5567,7 @@
           <w:p>
             <w:pPr>
               <w:spacing w:before="40" w:after="40" w:lineRule="auto" w:line="240"/>
-              <w:jc w:val="right"/>
+              <w:jc w:val="left"/>
             </w:pPr>
             <w:r/>
             <w:r>
@@ -4045,7 +5578,7 @@
                 <w:color w:val="1F2937"/>
                 <w:sz w:val="20"/>
               </w:rPr>
-              <w:t>100 STX</w:t>
+              <w:t>2</w:t>
             </w:r>
           </w:p>
         </w:tc>
@@ -4062,7 +5595,7 @@
           <w:p>
             <w:pPr>
               <w:spacing w:before="40" w:after="40" w:lineRule="auto" w:line="240"/>
-              <w:jc w:val="right"/>
+              <w:jc w:val="left"/>
             </w:pPr>
             <w:r/>
             <w:r>
@@ -4073,13 +5606,13 @@
                 <w:color w:val="1F2937"/>
                 <w:sz w:val="20"/>
               </w:rPr>
-              <w:t>1</w:t>
+              <w:t>16</w:t>
             </w:r>
           </w:p>
         </w:tc>
         <w:tc>
           <w:tcPr>
-            <w:tcW w:type="dxa" w:w="1728"/>
+            <w:tcW w:type="dxa" w:w="1872"/>
             <w:tcBorders>
               <w:top w:val="single" w:sz="4" w:space="0" w:color="CBD5E1"/>
               <w:left w:val="single" w:sz="4" w:space="0" w:color="CBD5E1"/>
@@ -4090,7 +5623,7 @@
           <w:p>
             <w:pPr>
               <w:spacing w:before="40" w:after="40" w:lineRule="auto" w:line="240"/>
-              <w:jc w:val="right"/>
+              <w:jc w:val="left"/>
             </w:pPr>
             <w:r/>
             <w:r>
@@ -4101,7 +5634,7 @@
                 <w:color w:val="1F2937"/>
                 <w:sz w:val="20"/>
               </w:rPr>
-              <w:t>100,000 STX</w:t>
+              <w:t>600,000 STX</w:t>
             </w:r>
           </w:p>
         </w:tc>
@@ -4109,15 +5642,14 @@
       <w:tr>
         <w:tc>
           <w:tcPr>
-            <w:tcW w:type="dxa" w:w="864"/>
+            <w:tcW w:type="dxa" w:w="1008"/>
+            <w:shd w:fill="EEF2F7" w:val="clear"/>
             <w:tcBorders>
               <w:top w:val="single" w:sz="4" w:space="0" w:color="CBD5E1"/>
               <w:left w:val="single" w:sz="4" w:space="0" w:color="CBD5E1"/>
               <w:bottom w:val="single" w:sz="4" w:space="0" w:color="CBD5E1"/>
               <w:right w:val="single" w:sz="4" w:space="0" w:color="CBD5E1"/>
             </w:tcBorders>
-            <w:shd w:fill="F7FAFC" w:val="clear"/>
-            <w:shd w:fill="EEF2F7" w:val="clear"/>
           </w:tcPr>
           <w:p>
             <w:pPr>
@@ -4138,15 +5670,14 @@
         </w:tc>
         <w:tc>
           <w:tcPr>
-            <w:tcW w:type="dxa" w:w="3744"/>
+            <w:tcW w:type="dxa" w:w="4320"/>
+            <w:shd w:fill="EEF2F7" w:val="clear"/>
             <w:tcBorders>
               <w:top w:val="single" w:sz="4" w:space="0" w:color="CBD5E1"/>
               <w:left w:val="single" w:sz="4" w:space="0" w:color="CBD5E1"/>
               <w:bottom w:val="single" w:sz="4" w:space="0" w:color="CBD5E1"/>
               <w:right w:val="single" w:sz="4" w:space="0" w:color="CBD5E1"/>
             </w:tcBorders>
-            <w:shd w:fill="F7FAFC" w:val="clear"/>
-            <w:shd w:fill="EEF2F7" w:val="clear"/>
           </w:tcPr>
           <w:p>
             <w:pPr>
@@ -4168,20 +5699,19 @@
         </w:tc>
         <w:tc>
           <w:tcPr>
-            <w:tcW w:type="dxa" w:w="2592"/>
+            <w:tcW w:type="dxa" w:w="1152"/>
+            <w:shd w:fill="EEF2F7" w:val="clear"/>
             <w:tcBorders>
               <w:top w:val="single" w:sz="4" w:space="0" w:color="CBD5E1"/>
               <w:left w:val="single" w:sz="4" w:space="0" w:color="CBD5E1"/>
               <w:bottom w:val="single" w:sz="4" w:space="0" w:color="CBD5E1"/>
               <w:right w:val="single" w:sz="4" w:space="0" w:color="CBD5E1"/>
             </w:tcBorders>
-            <w:shd w:fill="F7FAFC" w:val="clear"/>
-            <w:shd w:fill="EEF2F7" w:val="clear"/>
           </w:tcPr>
           <w:p>
             <w:pPr>
               <w:spacing w:before="40" w:after="40" w:lineRule="auto" w:line="240"/>
-              <w:jc w:val="right"/>
+              <w:jc w:val="left"/>
             </w:pPr>
             <w:r/>
             <w:r>
@@ -4192,26 +5722,25 @@
                 <w:color w:val="1A365D"/>
                 <w:sz w:val="20"/>
               </w:rPr>
-              <w:t>8 sponsored pots</w:t>
+              <w:t>10</w:t>
             </w:r>
           </w:p>
         </w:tc>
         <w:tc>
           <w:tcPr>
             <w:tcW w:type="dxa" w:w="1008"/>
+            <w:shd w:fill="EEF2F7" w:val="clear"/>
             <w:tcBorders>
               <w:top w:val="single" w:sz="4" w:space="0" w:color="CBD5E1"/>
               <w:left w:val="single" w:sz="4" w:space="0" w:color="CBD5E1"/>
               <w:bottom w:val="single" w:sz="4" w:space="0" w:color="CBD5E1"/>
               <w:right w:val="single" w:sz="4" w:space="0" w:color="CBD5E1"/>
             </w:tcBorders>
-            <w:shd w:fill="F7FAFC" w:val="clear"/>
-            <w:shd w:fill="EEF2F7" w:val="clear"/>
           </w:tcPr>
           <w:p>
             <w:pPr>
               <w:spacing w:before="40" w:after="40" w:lineRule="auto" w:line="240"/>
-              <w:jc w:val="right"/>
+              <w:jc w:val="left"/>
             </w:pPr>
             <w:r/>
             <w:r>
@@ -4222,26 +5751,25 @@
                 <w:color w:val="1A365D"/>
                 <w:sz w:val="20"/>
               </w:rPr>
-              <w:t>8</w:t>
+              <w:t>80</w:t>
             </w:r>
           </w:p>
         </w:tc>
         <w:tc>
           <w:tcPr>
-            <w:tcW w:type="dxa" w:w="1728"/>
+            <w:tcW w:type="dxa" w:w="1872"/>
+            <w:shd w:fill="EEF2F7" w:val="clear"/>
             <w:tcBorders>
               <w:top w:val="single" w:sz="4" w:space="0" w:color="CBD5E1"/>
               <w:left w:val="single" w:sz="4" w:space="0" w:color="CBD5E1"/>
               <w:bottom w:val="single" w:sz="4" w:space="0" w:color="CBD5E1"/>
               <w:right w:val="single" w:sz="4" w:space="0" w:color="CBD5E1"/>
             </w:tcBorders>
-            <w:shd w:fill="F7FAFC" w:val="clear"/>
-            <w:shd w:fill="EEF2F7" w:val="clear"/>
           </w:tcPr>
           <w:p>
             <w:pPr>
               <w:spacing w:before="40" w:after="40" w:lineRule="auto" w:line="240"/>
-              <w:jc w:val="right"/>
+              <w:jc w:val="left"/>
             </w:pPr>
             <w:r/>
             <w:r>
@@ -4252,7 +5780,7 @@
                 <w:color w:val="1A365D"/>
                 <w:sz w:val="20"/>
               </w:rPr>
-              <w:t>300,000 STX</w:t>
+              <w:t>3,000,000 STX</w:t>
             </w:r>
           </w:p>
         </w:tc>
@@ -4262,81 +5790,6 @@
       <w:pPr>
         <w:spacing w:before="0" w:after="120" w:lineRule="auto" w:line="240"/>
       </w:pPr>
-    </w:p>
-    <w:p>
-      <w:pPr>
-        <w:spacing w:before="0" w:after="160" w:lineRule="auto" w:line="264"/>
-      </w:pPr>
-      <w:r>
-        <w:rPr>
-          <w:rFonts w:ascii="Calibri" w:hAnsi="Calibri" w:eastAsia="Calibri"/>
-          <w:b w:val="0"/>
-          <w:i/>
-          <w:color w:val="4A5568"/>
-          <w:sz w:val="20"/>
-        </w:rPr>
-        <w:t xml:space="preserve">Month 1 boost: </w:t>
-      </w:r>
-      <w:r>
-        <w:rPr>
-          <w:rFonts w:ascii="Calibri" w:hAnsi="Calibri" w:eastAsia="Calibri"/>
-          <w:b/>
-          <w:i/>
-          <w:color w:val="4A5568"/>
-          <w:sz w:val="20"/>
-        </w:rPr>
-        <w:t>10,000 + 15,000 = 25,000 STX</w:t>
-      </w:r>
-      <w:r>
-        <w:rPr>
-          <w:rFonts w:ascii="Calibri" w:hAnsi="Calibri" w:eastAsia="Calibri"/>
-          <w:b w:val="0"/>
-          <w:i/>
-          <w:color w:val="4A5568"/>
-          <w:sz w:val="20"/>
-        </w:rPr>
-        <w:t xml:space="preserve">  ·  Month 2: </w:t>
-      </w:r>
-      <w:r>
-        <w:rPr>
-          <w:rFonts w:ascii="Calibri" w:hAnsi="Calibri" w:eastAsia="Calibri"/>
-          <w:b/>
-          <w:i/>
-          <w:color w:val="4A5568"/>
-          <w:sz w:val="20"/>
-        </w:rPr>
-        <w:t>20,000 + 25,000 = 45,000 STX</w:t>
-      </w:r>
-      <w:r>
-        <w:rPr>
-          <w:rFonts w:ascii="Calibri" w:hAnsi="Calibri" w:eastAsia="Calibri"/>
-          <w:b w:val="0"/>
-          <w:i/>
-          <w:color w:val="4A5568"/>
-          <w:sz w:val="20"/>
-        </w:rPr>
-        <w:t xml:space="preserve">  ·  Month 3: </w:t>
-      </w:r>
-      <w:r>
-        <w:rPr>
-          <w:rFonts w:ascii="Calibri" w:hAnsi="Calibri" w:eastAsia="Calibri"/>
-          <w:b/>
-          <w:i/>
-          <w:color w:val="4A5568"/>
-          <w:sz w:val="20"/>
-        </w:rPr>
-        <w:t>30,000 + 50,000 = 80,000 STX</w:t>
-      </w:r>
-      <w:r>
-        <w:rPr>
-          <w:rFonts w:ascii="Calibri" w:hAnsi="Calibri" w:eastAsia="Calibri"/>
-          <w:b w:val="0"/>
-          <w:i/>
-          <w:color w:val="4A5568"/>
-          <w:sz w:val="20"/>
-        </w:rPr>
-        <w:t>.</w:t>
-      </w:r>
     </w:p>
     <w:p>
       <w:pPr>
@@ -4350,7 +5803,7 @@
           <w:color w:val="1F2937"/>
           <w:sz w:val="22"/>
         </w:rPr>
-        <w:t>Timing may be adjusted slightly based on fill rates, community readiness, and observed demand, while remaining within the 5-month window, 2-week cycle length, and total allocation.</w:t>
+        <w:t>Timing of individual pot fills within a cycle may vary based on demand, while remaining within the 2-week cycle length, 8-pots-per-cycle design, and total program allocation.</w:t>
       </w:r>
     </w:p>
     <w:p>
@@ -4395,7 +5848,27 @@
           <w:color w:val="1F2937"/>
           <w:sz w:val="22"/>
         </w:rPr>
-        <w:t>Sponsored rewards lower the initial barrier for users and encourage more participants to interact with Stacks DeFi.</w:t>
+        <w:t>Sponsored rewards lower the initial barrier for users and encourage more participants to interact with Stacks DeFi—</w:t>
+      </w:r>
+      <w:r>
+        <w:rPr>
+          <w:rFonts w:ascii="Calibri" w:hAnsi="Calibri" w:eastAsia="Calibri"/>
+          <w:b/>
+          <w:i w:val="0"/>
+          <w:color w:val="1F2937"/>
+          <w:sz w:val="22"/>
+        </w:rPr>
+        <w:t>16 sponsored pots every month</w:t>
+      </w:r>
+      <w:r>
+        <w:rPr>
+          <w:rFonts w:ascii="Calibri" w:hAnsi="Calibri" w:eastAsia="Calibri"/>
+          <w:b w:val="0"/>
+          <w:i w:val="0"/>
+          <w:color w:val="1F2937"/>
+          <w:sz w:val="22"/>
+        </w:rPr>
+        <w:t xml:space="preserve"> create frequent, accessible entry points.</w:t>
       </w:r>
     </w:p>
     <w:p>
@@ -4533,7 +6006,27 @@
           <w:color w:val="1F2937"/>
           <w:sz w:val="22"/>
         </w:rPr>
-        <w:t>Each sponsored pot introduces new users to Bitcoin-secured yield opportunities available through Stacks.</w:t>
+        <w:t xml:space="preserve">Each sponsored pot introduces new users to Bitcoin-secured yield opportunities available through Stacks. Across </w:t>
+      </w:r>
+      <w:r>
+        <w:rPr>
+          <w:rFonts w:ascii="Calibri" w:hAnsi="Calibri" w:eastAsia="Calibri"/>
+          <w:b/>
+          <w:i w:val="0"/>
+          <w:color w:val="1F2937"/>
+          <w:sz w:val="22"/>
+        </w:rPr>
+        <w:t>80 pots</w:t>
+      </w:r>
+      <w:r>
+        <w:rPr>
+          <w:rFonts w:ascii="Calibri" w:hAnsi="Calibri" w:eastAsia="Calibri"/>
+          <w:b w:val="0"/>
+          <w:i w:val="0"/>
+          <w:color w:val="1F2937"/>
+          <w:sz w:val="22"/>
+        </w:rPr>
+        <w:t xml:space="preserve"> in five months, that awareness compounds.</w:t>
       </w:r>
     </w:p>
     <w:p>
@@ -4679,7 +6172,7 @@
           <w:p>
             <w:pPr>
               <w:spacing w:before="40" w:after="40" w:lineRule="auto" w:line="240"/>
-              <w:jc w:val="left"/>
+              <w:jc w:val="right"/>
             </w:pPr>
             <w:r/>
             <w:r>
@@ -4690,7 +6183,7 @@
                 <w:color w:val="1F2937"/>
                 <w:sz w:val="20"/>
               </w:rPr>
-              <w:t>Increase active participants through attractive reward campaigns</w:t>
+              <w:t>Increase active participants through 10 cycles of attractive reward campaigns</w:t>
             </w:r>
           </w:p>
         </w:tc>
@@ -4699,13 +6192,13 @@
         <w:tc>
           <w:tcPr>
             <w:tcW w:type="dxa" w:w="3168"/>
+            <w:shd w:fill="F7FAFC" w:val="clear"/>
             <w:tcBorders>
               <w:top w:val="single" w:sz="4" w:space="0" w:color="CBD5E1"/>
               <w:left w:val="single" w:sz="4" w:space="0" w:color="CBD5E1"/>
               <w:bottom w:val="single" w:sz="4" w:space="0" w:color="CBD5E1"/>
               <w:right w:val="single" w:sz="4" w:space="0" w:color="CBD5E1"/>
             </w:tcBorders>
-            <w:shd w:fill="F7FAFC" w:val="clear"/>
           </w:tcPr>
           <w:p>
             <w:pPr>
@@ -4728,18 +6221,18 @@
         <w:tc>
           <w:tcPr>
             <w:tcW w:type="dxa" w:w="6192"/>
+            <w:shd w:fill="F7FAFC" w:val="clear"/>
             <w:tcBorders>
               <w:top w:val="single" w:sz="4" w:space="0" w:color="CBD5E1"/>
               <w:left w:val="single" w:sz="4" w:space="0" w:color="CBD5E1"/>
               <w:bottom w:val="single" w:sz="4" w:space="0" w:color="CBD5E1"/>
               <w:right w:val="single" w:sz="4" w:space="0" w:color="CBD5E1"/>
             </w:tcBorders>
-            <w:shd w:fill="F7FAFC" w:val="clear"/>
           </w:tcPr>
           <w:p>
             <w:pPr>
               <w:spacing w:before="40" w:after="40" w:lineRule="auto" w:line="240"/>
-              <w:jc w:val="left"/>
+              <w:jc w:val="right"/>
             </w:pPr>
             <w:r/>
             <w:r>
@@ -4750,7 +6243,7 @@
                 <w:color w:val="1F2937"/>
                 <w:sz w:val="20"/>
               </w:rPr>
-              <w:t>Encourage community members and projects to create their own reward pools</w:t>
+              <w:t>Deliver 80 sponsored pots while encouraging community members and projects to create their own pools</w:t>
             </w:r>
           </w:p>
         </w:tc>
@@ -4797,7 +6290,7 @@
           <w:p>
             <w:pPr>
               <w:spacing w:before="40" w:after="40" w:lineRule="auto" w:line="240"/>
-              <w:jc w:val="left"/>
+              <w:jc w:val="right"/>
             </w:pPr>
             <w:r/>
             <w:r>
@@ -4808,7 +6301,7 @@
                 <w:color w:val="1F2937"/>
                 <w:sz w:val="20"/>
               </w:rPr>
-              <w:t>Increase STX utilization and wallet interactions</w:t>
+              <w:t>Increase STX utilization and wallet interactions via 16 pots/month</w:t>
             </w:r>
           </w:p>
         </w:tc>
@@ -4817,13 +6310,13 @@
         <w:tc>
           <w:tcPr>
             <w:tcW w:type="dxa" w:w="3168"/>
+            <w:shd w:fill="F7FAFC" w:val="clear"/>
             <w:tcBorders>
               <w:top w:val="single" w:sz="4" w:space="0" w:color="CBD5E1"/>
               <w:left w:val="single" w:sz="4" w:space="0" w:color="CBD5E1"/>
               <w:bottom w:val="single" w:sz="4" w:space="0" w:color="CBD5E1"/>
               <w:right w:val="single" w:sz="4" w:space="0" w:color="CBD5E1"/>
             </w:tcBorders>
-            <w:shd w:fill="F7FAFC" w:val="clear"/>
           </w:tcPr>
           <w:p>
             <w:pPr>
@@ -4846,18 +6339,18 @@
         <w:tc>
           <w:tcPr>
             <w:tcW w:type="dxa" w:w="6192"/>
+            <w:shd w:fill="F7FAFC" w:val="clear"/>
             <w:tcBorders>
               <w:top w:val="single" w:sz="4" w:space="0" w:color="CBD5E1"/>
               <w:left w:val="single" w:sz="4" w:space="0" w:color="CBD5E1"/>
               <w:bottom w:val="single" w:sz="4" w:space="0" w:color="CBD5E1"/>
               <w:right w:val="single" w:sz="4" w:space="0" w:color="CBD5E1"/>
             </w:tcBorders>
-            <w:shd w:fill="F7FAFC" w:val="clear"/>
           </w:tcPr>
           <w:p>
             <w:pPr>
               <w:spacing w:before="40" w:after="40" w:lineRule="auto" w:line="240"/>
-              <w:jc w:val="left"/>
+              <w:jc w:val="right"/>
             </w:pPr>
             <w:r/>
             <w:r>
@@ -4868,7 +6361,7 @@
                 <w:color w:val="1F2937"/>
                 <w:sz w:val="20"/>
               </w:rPr>
-              <w:t>Convert campaign participants into recurring StacksPot users, measurable across the full 5-month window</w:t>
+              <w:t>Convert campaign participants into recurring StacksPot users, measurable across the full 5-month / 10-cycle window</w:t>
             </w:r>
           </w:p>
         </w:tc>
@@ -4936,7 +6429,7 @@
           <w:color w:val="1F2937"/>
           <w:sz w:val="22"/>
         </w:rPr>
-        <w:t>Delivered at the end of each program month, covering:</w:t>
+        <w:t>Delivered at the end of each program month (covering both 2-week cycles), including:</w:t>
       </w:r>
     </w:p>
     <w:p>
@@ -4984,7 +6477,7 @@
           <w:color w:val="1F2937"/>
           <w:sz w:val="22"/>
         </w:rPr>
-        <w:t>Number of pots created</w:t>
+        <w:t>Number of pots created (target: 16 sponsored pots/month)</w:t>
       </w:r>
     </w:p>
     <w:p>
@@ -5000,7 +6493,7 @@
           <w:color w:val="1F2937"/>
           <w:sz w:val="22"/>
         </w:rPr>
-        <w:t>Sponsored reward distribution for that month</w:t>
+        <w:t>Sponsored reward distribution for that month (target: 600,000 STX)</w:t>
       </w:r>
     </w:p>
     <w:p>
@@ -5062,7 +6555,7 @@
           <w:color w:val="1F2937"/>
           <w:sz w:val="22"/>
         </w:rPr>
-        <w:t>Full campaign performance analysis</w:t>
+        <w:t>Full campaign performance analysis across 10 cycles / 80 pots</w:t>
       </w:r>
     </w:p>
     <w:p>
@@ -5190,7 +6683,67 @@
           <w:color w:val="1F2937"/>
           <w:sz w:val="22"/>
         </w:rPr>
-        <w:t xml:space="preserve"> can become a powerful ecosystem growth mechanism—attracting users, supporting builders, increasing STX activity, and introducing more participants to Bitcoin DeFi.</w:t>
+        <w:t xml:space="preserve">—running </w:t>
+      </w:r>
+      <w:r>
+        <w:rPr>
+          <w:rFonts w:ascii="Calibri" w:hAnsi="Calibri" w:eastAsia="Calibri"/>
+          <w:b/>
+          <w:i w:val="0"/>
+          <w:color w:val="1F2937"/>
+          <w:sz w:val="22"/>
+        </w:rPr>
+        <w:t>8 pots every 2-week cycle</w:t>
+      </w:r>
+      <w:r>
+        <w:rPr>
+          <w:rFonts w:ascii="Calibri" w:hAnsi="Calibri" w:eastAsia="Calibri"/>
+          <w:b w:val="0"/>
+          <w:i w:val="0"/>
+          <w:color w:val="1F2937"/>
+          <w:sz w:val="22"/>
+        </w:rPr>
+        <w:t xml:space="preserve"> (</w:t>
+      </w:r>
+      <w:r>
+        <w:rPr>
+          <w:rFonts w:ascii="Calibri" w:hAnsi="Calibri" w:eastAsia="Calibri"/>
+          <w:b/>
+          <w:i w:val="0"/>
+          <w:color w:val="1F2937"/>
+          <w:sz w:val="22"/>
+        </w:rPr>
+        <w:t>16 pots/month</w:t>
+      </w:r>
+      <w:r>
+        <w:rPr>
+          <w:rFonts w:ascii="Calibri" w:hAnsi="Calibri" w:eastAsia="Calibri"/>
+          <w:b w:val="0"/>
+          <w:i w:val="0"/>
+          <w:color w:val="1F2937"/>
+          <w:sz w:val="22"/>
+        </w:rPr>
+        <w:t xml:space="preserve">, </w:t>
+      </w:r>
+      <w:r>
+        <w:rPr>
+          <w:rFonts w:ascii="Calibri" w:hAnsi="Calibri" w:eastAsia="Calibri"/>
+          <w:b/>
+          <w:i w:val="0"/>
+          <w:color w:val="1F2937"/>
+          <w:sz w:val="22"/>
+        </w:rPr>
+        <w:t>80 pots</w:t>
+      </w:r>
+      <w:r>
+        <w:rPr>
+          <w:rFonts w:ascii="Calibri" w:hAnsi="Calibri" w:eastAsia="Calibri"/>
+          <w:b w:val="0"/>
+          <w:i w:val="0"/>
+          <w:color w:val="1F2937"/>
+          <w:sz w:val="22"/>
+        </w:rPr>
+        <w:t xml:space="preserve"> program-wide)—can become a powerful ecosystem growth mechanism: attracting users, supporting builders, increasing STX activity, and introducing more participants to Bitcoin DeFi.</w:t>
       </w:r>
     </w:p>
     <w:p>
@@ -5234,6 +6787,7 @@
     <w:tbl>
       <w:tblPr>
         <w:tblW w:type="auto" w:w="0"/>
+        <w:jc w:val="center"/>
         <w:tblLook w:firstColumn="1" w:firstRow="1" w:lastColumn="0" w:lastRow="0" w:noHBand="0" w:noVBand="1" w:val="04A0"/>
       </w:tblPr>
       <w:tblGrid>
@@ -5243,7 +6797,7 @@
       <w:tr>
         <w:tc>
           <w:tcPr>
-            <w:tcW w:type="dxa" w:w="3168"/>
+            <w:tcW w:type="dxa" w:w="3456"/>
             <w:shd w:fill="1A365D" w:val="clear"/>
             <w:tcBorders>
               <w:top w:val="single" w:sz="4" w:space="0" w:color="1A365D"/>
@@ -5272,7 +6826,7 @@
         </w:tc>
         <w:tc>
           <w:tcPr>
-            <w:tcW w:type="dxa" w:w="6192"/>
+            <w:tcW w:type="dxa" w:w="5904"/>
             <w:tcBorders>
               <w:top w:val="single" w:sz="4" w:space="0" w:color="CBD5E1"/>
               <w:left w:val="single" w:sz="4" w:space="0" w:color="CBD5E1"/>
@@ -5303,7 +6857,7 @@
       <w:tr>
         <w:tc>
           <w:tcPr>
-            <w:tcW w:type="dxa" w:w="3168"/>
+            <w:tcW w:type="dxa" w:w="3456"/>
             <w:shd w:fill="1A365D" w:val="clear"/>
             <w:tcBorders>
               <w:top w:val="single" w:sz="4" w:space="0" w:color="1A365D"/>
@@ -5332,7 +6886,7 @@
         </w:tc>
         <w:tc>
           <w:tcPr>
-            <w:tcW w:type="dxa" w:w="6192"/>
+            <w:tcW w:type="dxa" w:w="5904"/>
             <w:tcBorders>
               <w:top w:val="single" w:sz="4" w:space="0" w:color="CBD5E1"/>
               <w:left w:val="single" w:sz="4" w:space="0" w:color="CBD5E1"/>
@@ -5363,7 +6917,7 @@
       <w:tr>
         <w:tc>
           <w:tcPr>
-            <w:tcW w:type="dxa" w:w="3168"/>
+            <w:tcW w:type="dxa" w:w="3456"/>
             <w:shd w:fill="1A365D" w:val="clear"/>
             <w:tcBorders>
               <w:top w:val="single" w:sz="4" w:space="0" w:color="1A365D"/>
@@ -5392,7 +6946,7 @@
         </w:tc>
         <w:tc>
           <w:tcPr>
-            <w:tcW w:type="dxa" w:w="6192"/>
+            <w:tcW w:type="dxa" w:w="5904"/>
             <w:tcBorders>
               <w:top w:val="single" w:sz="4" w:space="0" w:color="CBD5E1"/>
               <w:left w:val="single" w:sz="4" w:space="0" w:color="CBD5E1"/>
@@ -5423,7 +6977,67 @@
       <w:tr>
         <w:tc>
           <w:tcPr>
-            <w:tcW w:type="dxa" w:w="3168"/>
+            <w:tcW w:type="dxa" w:w="3456"/>
+            <w:shd w:fill="1A365D" w:val="clear"/>
+            <w:tcBorders>
+              <w:top w:val="single" w:sz="4" w:space="0" w:color="1A365D"/>
+              <w:left w:val="single" w:sz="4" w:space="0" w:color="1A365D"/>
+              <w:bottom w:val="single" w:sz="4" w:space="0" w:color="1A365D"/>
+              <w:right w:val="single" w:sz="4" w:space="0" w:color="1A365D"/>
+            </w:tcBorders>
+          </w:tcPr>
+          <w:p>
+            <w:pPr>
+              <w:spacing w:before="40" w:after="40" w:lineRule="auto" w:line="240"/>
+              <w:jc w:val="left"/>
+            </w:pPr>
+            <w:r/>
+            <w:r>
+              <w:rPr>
+                <w:rFonts w:ascii="Calibri" w:hAnsi="Calibri" w:eastAsia="Calibri"/>
+                <w:b/>
+                <w:i w:val="0"/>
+                <w:color w:val="FFFFFF"/>
+                <w:sz w:val="22"/>
+              </w:rPr>
+              <w:t>Cycle design</w:t>
+            </w:r>
+          </w:p>
+        </w:tc>
+        <w:tc>
+          <w:tcPr>
+            <w:tcW w:type="dxa" w:w="5904"/>
+            <w:tcBorders>
+              <w:top w:val="single" w:sz="4" w:space="0" w:color="CBD5E1"/>
+              <w:left w:val="single" w:sz="4" w:space="0" w:color="CBD5E1"/>
+              <w:bottom w:val="single" w:sz="4" w:space="0" w:color="CBD5E1"/>
+              <w:right w:val="single" w:sz="4" w:space="0" w:color="CBD5E1"/>
+            </w:tcBorders>
+            <w:shd w:fill="F7FAFC" w:val="clear"/>
+          </w:tcPr>
+          <w:p>
+            <w:pPr>
+              <w:spacing w:before="40" w:after="40" w:lineRule="auto" w:line="240"/>
+              <w:jc w:val="left"/>
+            </w:pPr>
+            <w:r/>
+            <w:r>
+              <w:rPr>
+                <w:rFonts w:ascii="Calibri" w:hAnsi="Calibri" w:eastAsia="Calibri"/>
+                <w:b w:val="0"/>
+                <w:i w:val="0"/>
+                <w:color w:val="1F2937"/>
+                <w:sz w:val="22"/>
+              </w:rPr>
+              <w:t>8 pots / 2 weeks · 16 pots / month</w:t>
+            </w:r>
+          </w:p>
+        </w:tc>
+      </w:tr>
+      <w:tr>
+        <w:tc>
+          <w:tcPr>
+            <w:tcW w:type="dxa" w:w="3456"/>
             <w:shd w:fill="1A365D" w:val="clear"/>
             <w:tcBorders>
               <w:top w:val="single" w:sz="4" w:space="0" w:color="1A365D"/>
@@ -5452,14 +7066,14 @@
         </w:tc>
         <w:tc>
           <w:tcPr>
-            <w:tcW w:type="dxa" w:w="6192"/>
+            <w:tcW w:type="dxa" w:w="5904"/>
             <w:tcBorders>
               <w:top w:val="single" w:sz="4" w:space="0" w:color="CBD5E1"/>
               <w:left w:val="single" w:sz="4" w:space="0" w:color="CBD5E1"/>
               <w:bottom w:val="single" w:sz="4" w:space="0" w:color="CBD5E1"/>
               <w:right w:val="single" w:sz="4" w:space="0" w:color="CBD5E1"/>
             </w:tcBorders>
-            <w:shd w:fill="F7FAFC" w:val="clear"/>
+            <w:shd w:fill="FFFFFF" w:val="clear"/>
           </w:tcPr>
           <w:p>
             <w:pPr>
@@ -5475,7 +7089,7 @@
                 <w:color w:val="1F2937"/>
                 <w:sz w:val="22"/>
               </w:rPr>
-              <w:t>~300,000 STX</w:t>
+              <w:t>~3,000,000 STX (300,000 STX × 10 cycles)</w:t>
             </w:r>
           </w:p>
         </w:tc>

</xml_diff>

<commit_message>
Clarify reusable 300k STX sponsorship capital
Delegated amounts return to the sponsor after each cycle, so the
same ~300,000 STX funds all 10 cycles / 80 pots without increasing
the Endowment ask.

Co-authored-by: cryptosmith.btc <Zeus-Adin@users.noreply.github.com>
</commit_message>
<xml_diff>
--- a/StacksPot-Growth-Acceleration-Proposal.docx
+++ b/StacksPot-Growth-Acceleration-Proposal.docx
@@ -55,7 +55,7 @@
       <w:tr>
         <w:tc>
           <w:tcPr>
-            <w:tcW w:type="dxa" w:w="3456"/>
+            <w:tcW w:type="dxa" w:w="3600"/>
             <w:shd w:fill="1A365D" w:val="clear"/>
             <w:tcBorders>
               <w:top w:val="single" w:sz="4" w:space="0" w:color="1A365D"/>
@@ -84,7 +84,7 @@
         </w:tc>
         <w:tc>
           <w:tcPr>
-            <w:tcW w:type="dxa" w:w="5904"/>
+            <w:tcW w:type="dxa" w:w="5760"/>
             <w:tcBorders>
               <w:top w:val="single" w:sz="4" w:space="0" w:color="CBD5E1"/>
               <w:left w:val="single" w:sz="4" w:space="0" w:color="CBD5E1"/>
@@ -115,7 +115,7 @@
       <w:tr>
         <w:tc>
           <w:tcPr>
-            <w:tcW w:type="dxa" w:w="3456"/>
+            <w:tcW w:type="dxa" w:w="3600"/>
             <w:shd w:fill="1A365D" w:val="clear"/>
             <w:tcBorders>
               <w:top w:val="single" w:sz="4" w:space="0" w:color="1A365D"/>
@@ -144,7 +144,7 @@
         </w:tc>
         <w:tc>
           <w:tcPr>
-            <w:tcW w:type="dxa" w:w="5904"/>
+            <w:tcW w:type="dxa" w:w="5760"/>
             <w:tcBorders>
               <w:top w:val="single" w:sz="4" w:space="0" w:color="CBD5E1"/>
               <w:left w:val="single" w:sz="4" w:space="0" w:color="CBD5E1"/>
@@ -175,7 +175,7 @@
       <w:tr>
         <w:tc>
           <w:tcPr>
-            <w:tcW w:type="dxa" w:w="3456"/>
+            <w:tcW w:type="dxa" w:w="3600"/>
             <w:shd w:fill="1A365D" w:val="clear"/>
             <w:tcBorders>
               <w:top w:val="single" w:sz="4" w:space="0" w:color="1A365D"/>
@@ -204,7 +204,7 @@
         </w:tc>
         <w:tc>
           <w:tcPr>
-            <w:tcW w:type="dxa" w:w="5904"/>
+            <w:tcW w:type="dxa" w:w="5760"/>
             <w:tcBorders>
               <w:top w:val="single" w:sz="4" w:space="0" w:color="CBD5E1"/>
               <w:left w:val="single" w:sz="4" w:space="0" w:color="CBD5E1"/>
@@ -235,7 +235,7 @@
       <w:tr>
         <w:tc>
           <w:tcPr>
-            <w:tcW w:type="dxa" w:w="3456"/>
+            <w:tcW w:type="dxa" w:w="3600"/>
             <w:shd w:fill="1A365D" w:val="clear"/>
             <w:tcBorders>
               <w:top w:val="single" w:sz="4" w:space="0" w:color="1A365D"/>
@@ -264,7 +264,7 @@
         </w:tc>
         <w:tc>
           <w:tcPr>
-            <w:tcW w:type="dxa" w:w="5904"/>
+            <w:tcW w:type="dxa" w:w="5760"/>
             <w:tcBorders>
               <w:top w:val="single" w:sz="4" w:space="0" w:color="CBD5E1"/>
               <w:left w:val="single" w:sz="4" w:space="0" w:color="CBD5E1"/>
@@ -295,7 +295,7 @@
       <w:tr>
         <w:tc>
           <w:tcPr>
-            <w:tcW w:type="dxa" w:w="3456"/>
+            <w:tcW w:type="dxa" w:w="3600"/>
             <w:shd w:fill="1A365D" w:val="clear"/>
             <w:tcBorders>
               <w:top w:val="single" w:sz="4" w:space="0" w:color="1A365D"/>
@@ -324,7 +324,7 @@
         </w:tc>
         <w:tc>
           <w:tcPr>
-            <w:tcW w:type="dxa" w:w="5904"/>
+            <w:tcW w:type="dxa" w:w="5760"/>
             <w:tcBorders>
               <w:top w:val="single" w:sz="4" w:space="0" w:color="CBD5E1"/>
               <w:left w:val="single" w:sz="4" w:space="0" w:color="CBD5E1"/>
@@ -355,7 +355,7 @@
       <w:tr>
         <w:tc>
           <w:tcPr>
-            <w:tcW w:type="dxa" w:w="3456"/>
+            <w:tcW w:type="dxa" w:w="3600"/>
             <w:shd w:fill="1A365D" w:val="clear"/>
             <w:tcBorders>
               <w:top w:val="single" w:sz="4" w:space="0" w:color="1A365D"/>
@@ -384,7 +384,7 @@
         </w:tc>
         <w:tc>
           <w:tcPr>
-            <w:tcW w:type="dxa" w:w="5904"/>
+            <w:tcW w:type="dxa" w:w="5760"/>
             <w:tcBorders>
               <w:top w:val="single" w:sz="4" w:space="0" w:color="CBD5E1"/>
               <w:left w:val="single" w:sz="4" w:space="0" w:color="CBD5E1"/>
@@ -415,7 +415,7 @@
       <w:tr>
         <w:tc>
           <w:tcPr>
-            <w:tcW w:type="dxa" w:w="3456"/>
+            <w:tcW w:type="dxa" w:w="3600"/>
             <w:shd w:fill="1A365D" w:val="clear"/>
             <w:tcBorders>
               <w:top w:val="single" w:sz="4" w:space="0" w:color="1A365D"/>
@@ -444,7 +444,7 @@
         </w:tc>
         <w:tc>
           <w:tcPr>
-            <w:tcW w:type="dxa" w:w="5904"/>
+            <w:tcW w:type="dxa" w:w="5760"/>
             <w:tcBorders>
               <w:top w:val="single" w:sz="4" w:space="0" w:color="CBD5E1"/>
               <w:left w:val="single" w:sz="4" w:space="0" w:color="CBD5E1"/>
@@ -467,7 +467,7 @@
                 <w:color w:val="1F2937"/>
                 <w:sz w:val="22"/>
               </w:rPr>
-              <w:t>~3,000,000 STX</w:t>
+              <w:t>~300,000 STX</w:t>
             </w:r>
           </w:p>
         </w:tc>
@@ -475,7 +475,67 @@
       <w:tr>
         <w:tc>
           <w:tcPr>
-            <w:tcW w:type="dxa" w:w="3456"/>
+            <w:tcW w:type="dxa" w:w="3600"/>
+            <w:shd w:fill="1A365D" w:val="clear"/>
+            <w:tcBorders>
+              <w:top w:val="single" w:sz="4" w:space="0" w:color="1A365D"/>
+              <w:left w:val="single" w:sz="4" w:space="0" w:color="1A365D"/>
+              <w:bottom w:val="single" w:sz="4" w:space="0" w:color="1A365D"/>
+              <w:right w:val="single" w:sz="4" w:space="0" w:color="1A365D"/>
+            </w:tcBorders>
+          </w:tcPr>
+          <w:p>
+            <w:pPr>
+              <w:spacing w:before="40" w:after="40" w:lineRule="auto" w:line="240"/>
+              <w:jc w:val="left"/>
+            </w:pPr>
+            <w:r/>
+            <w:r>
+              <w:rPr>
+                <w:rFonts w:ascii="Calibri" w:hAnsi="Calibri" w:eastAsia="Calibri"/>
+                <w:b/>
+                <w:i w:val="0"/>
+                <w:color w:val="FFFFFF"/>
+                <w:sz w:val="22"/>
+              </w:rPr>
+              <w:t>Capital Model</w:t>
+            </w:r>
+          </w:p>
+        </w:tc>
+        <w:tc>
+          <w:tcPr>
+            <w:tcW w:type="dxa" w:w="5760"/>
+            <w:tcBorders>
+              <w:top w:val="single" w:sz="4" w:space="0" w:color="CBD5E1"/>
+              <w:left w:val="single" w:sz="4" w:space="0" w:color="CBD5E1"/>
+              <w:bottom w:val="single" w:sz="4" w:space="0" w:color="CBD5E1"/>
+              <w:right w:val="single" w:sz="4" w:space="0" w:color="CBD5E1"/>
+            </w:tcBorders>
+            <w:shd w:fill="F7FAFC" w:val="clear"/>
+          </w:tcPr>
+          <w:p>
+            <w:pPr>
+              <w:spacing w:before="40" w:after="40" w:lineRule="auto" w:line="240"/>
+              <w:jc w:val="left"/>
+            </w:pPr>
+            <w:r/>
+            <w:r>
+              <w:rPr>
+                <w:rFonts w:ascii="Calibri" w:hAnsi="Calibri" w:eastAsia="Calibri"/>
+                <w:b w:val="0"/>
+                <w:i w:val="0"/>
+                <w:color w:val="1F2937"/>
+                <w:sz w:val="22"/>
+              </w:rPr>
+              <w:t>Reusable — returned to sponsor after each cycle</w:t>
+            </w:r>
+          </w:p>
+        </w:tc>
+      </w:tr>
+      <w:tr>
+        <w:tc>
+          <w:tcPr>
+            <w:tcW w:type="dxa" w:w="3600"/>
             <w:shd w:fill="1A365D" w:val="clear"/>
             <w:tcBorders>
               <w:top w:val="single" w:sz="4" w:space="0" w:color="1A365D"/>
@@ -504,14 +564,14 @@
         </w:tc>
         <w:tc>
           <w:tcPr>
-            <w:tcW w:type="dxa" w:w="5904"/>
+            <w:tcW w:type="dxa" w:w="5760"/>
             <w:tcBorders>
               <w:top w:val="single" w:sz="4" w:space="0" w:color="CBD5E1"/>
               <w:left w:val="single" w:sz="4" w:space="0" w:color="CBD5E1"/>
               <w:bottom w:val="single" w:sz="4" w:space="0" w:color="CBD5E1"/>
               <w:right w:val="single" w:sz="4" w:space="0" w:color="CBD5E1"/>
             </w:tcBorders>
-            <w:shd w:fill="F7FAFC" w:val="clear"/>
+            <w:shd w:fill="FFFFFF" w:val="clear"/>
           </w:tcPr>
           <w:p>
             <w:pPr>
@@ -733,7 +793,7 @@
       <w:tr>
         <w:tc>
           <w:tcPr>
-            <w:tcW w:type="dxa" w:w="2160"/>
+            <w:tcW w:type="dxa" w:w="2016"/>
             <w:shd w:fill="1A365D" w:val="clear"/>
             <w:tcBorders>
               <w:top w:val="single" w:sz="4" w:space="0" w:color="1A365D"/>
@@ -762,7 +822,7 @@
         </w:tc>
         <w:tc>
           <w:tcPr>
-            <w:tcW w:type="dxa" w:w="4608"/>
+            <w:tcW w:type="dxa" w:w="4032"/>
             <w:shd w:fill="1A365D" w:val="clear"/>
             <w:tcBorders>
               <w:top w:val="single" w:sz="4" w:space="0" w:color="1A365D"/>
@@ -791,7 +851,7 @@
         </w:tc>
         <w:tc>
           <w:tcPr>
-            <w:tcW w:type="dxa" w:w="2592"/>
+            <w:tcW w:type="dxa" w:w="3456"/>
             <w:shd w:fill="1A365D" w:val="clear"/>
             <w:tcBorders>
               <w:top w:val="single" w:sz="4" w:space="0" w:color="1A365D"/>
@@ -814,7 +874,7 @@
                 <w:color w:val="FFFFFF"/>
                 <w:sz w:val="20"/>
               </w:rPr>
-              <w:t>Sponsored Boost</w:t>
+              <w:t>Capital Required</w:t>
             </w:r>
           </w:p>
         </w:tc>
@@ -822,7 +882,7 @@
       <w:tr>
         <w:tc>
           <w:tcPr>
-            <w:tcW w:type="dxa" w:w="2160"/>
+            <w:tcW w:type="dxa" w:w="2016"/>
             <w:tcBorders>
               <w:top w:val="single" w:sz="4" w:space="0" w:color="CBD5E1"/>
               <w:left w:val="single" w:sz="4" w:space="0" w:color="CBD5E1"/>
@@ -850,7 +910,7 @@
         </w:tc>
         <w:tc>
           <w:tcPr>
-            <w:tcW w:type="dxa" w:w="4608"/>
+            <w:tcW w:type="dxa" w:w="4032"/>
             <w:tcBorders>
               <w:top w:val="single" w:sz="4" w:space="0" w:color="CBD5E1"/>
               <w:left w:val="single" w:sz="4" w:space="0" w:color="CBD5E1"/>
@@ -878,7 +938,7 @@
         </w:tc>
         <w:tc>
           <w:tcPr>
-            <w:tcW w:type="dxa" w:w="2592"/>
+            <w:tcW w:type="dxa" w:w="3456"/>
             <w:tcBorders>
               <w:top w:val="single" w:sz="4" w:space="0" w:color="CBD5E1"/>
               <w:left w:val="single" w:sz="4" w:space="0" w:color="CBD5E1"/>
@@ -900,7 +960,7 @@
                 <w:color w:val="1F2937"/>
                 <w:sz w:val="20"/>
               </w:rPr>
-              <w:t>300,000 STX</w:t>
+              <w:t>300,000 STX (delegated)</w:t>
             </w:r>
           </w:p>
         </w:tc>
@@ -908,7 +968,7 @@
       <w:tr>
         <w:tc>
           <w:tcPr>
-            <w:tcW w:type="dxa" w:w="2160"/>
+            <w:tcW w:type="dxa" w:w="2016"/>
             <w:shd w:fill="F7FAFC" w:val="clear"/>
             <w:tcBorders>
               <w:top w:val="single" w:sz="4" w:space="0" w:color="CBD5E1"/>
@@ -937,7 +997,7 @@
         </w:tc>
         <w:tc>
           <w:tcPr>
-            <w:tcW w:type="dxa" w:w="4608"/>
+            <w:tcW w:type="dxa" w:w="4032"/>
             <w:shd w:fill="F7FAFC" w:val="clear"/>
             <w:tcBorders>
               <w:top w:val="single" w:sz="4" w:space="0" w:color="CBD5E1"/>
@@ -966,7 +1026,7 @@
         </w:tc>
         <w:tc>
           <w:tcPr>
-            <w:tcW w:type="dxa" w:w="2592"/>
+            <w:tcW w:type="dxa" w:w="3456"/>
             <w:shd w:fill="F7FAFC" w:val="clear"/>
             <w:tcBorders>
               <w:top w:val="single" w:sz="4" w:space="0" w:color="CBD5E1"/>
@@ -989,7 +1049,7 @@
                 <w:color w:val="1F2937"/>
                 <w:sz w:val="20"/>
               </w:rPr>
-              <w:t>600,000 STX</w:t>
+              <w:t>300,000 STX (same capital, reused)</w:t>
             </w:r>
           </w:p>
         </w:tc>
@@ -997,7 +1057,7 @@
       <w:tr>
         <w:tc>
           <w:tcPr>
-            <w:tcW w:type="dxa" w:w="2160"/>
+            <w:tcW w:type="dxa" w:w="2016"/>
             <w:shd w:fill="EEF2F7" w:val="clear"/>
             <w:tcBorders>
               <w:top w:val="single" w:sz="4" w:space="0" w:color="CBD5E1"/>
@@ -1026,7 +1086,7 @@
         </w:tc>
         <w:tc>
           <w:tcPr>
-            <w:tcW w:type="dxa" w:w="4608"/>
+            <w:tcW w:type="dxa" w:w="4032"/>
             <w:shd w:fill="EEF2F7" w:val="clear"/>
             <w:tcBorders>
               <w:top w:val="single" w:sz="4" w:space="0" w:color="CBD5E1"/>
@@ -1055,7 +1115,7 @@
         </w:tc>
         <w:tc>
           <w:tcPr>
-            <w:tcW w:type="dxa" w:w="2592"/>
+            <w:tcW w:type="dxa" w:w="3456"/>
             <w:shd w:fill="EEF2F7" w:val="clear"/>
             <w:tcBorders>
               <w:top w:val="single" w:sz="4" w:space="0" w:color="CBD5E1"/>
@@ -1078,7 +1138,7 @@
                 <w:color w:val="1A365D"/>
                 <w:sz w:val="20"/>
               </w:rPr>
-              <w:t>~3,000,000 STX</w:t>
+              <w:t>~300,000 STX (same capital, reused)</w:t>
             </w:r>
           </w:p>
         </w:tc>
@@ -1088,6 +1148,91 @@
       <w:pPr>
         <w:spacing w:before="0" w:after="120" w:lineRule="auto" w:line="240"/>
       </w:pPr>
+    </w:p>
+    <w:p>
+      <w:pPr>
+        <w:spacing w:before="0" w:after="160" w:lineRule="auto" w:line="276"/>
+      </w:pPr>
+      <w:r>
+        <w:rPr>
+          <w:rFonts w:ascii="Calibri" w:hAnsi="Calibri" w:eastAsia="Calibri"/>
+          <w:b/>
+          <w:i w:val="0"/>
+          <w:color w:val="1F2937"/>
+          <w:sz w:val="22"/>
+        </w:rPr>
+        <w:t xml:space="preserve">Important: </w:t>
+      </w:r>
+      <w:r>
+        <w:rPr>
+          <w:rFonts w:ascii="Calibri" w:hAnsi="Calibri" w:eastAsia="Calibri"/>
+          <w:b w:val="0"/>
+          <w:i w:val="0"/>
+          <w:color w:val="1F2937"/>
+          <w:sz w:val="22"/>
+        </w:rPr>
+        <w:t xml:space="preserve">After every cycle, delegated sponsorship amounts are </w:t>
+      </w:r>
+      <w:r>
+        <w:rPr>
+          <w:rFonts w:ascii="Calibri" w:hAnsi="Calibri" w:eastAsia="Calibri"/>
+          <w:b/>
+          <w:i w:val="0"/>
+          <w:color w:val="1F2937"/>
+          <w:sz w:val="22"/>
+        </w:rPr>
+        <w:t>returned to the sponsor’s address</w:t>
+      </w:r>
+      <w:r>
+        <w:rPr>
+          <w:rFonts w:ascii="Calibri" w:hAnsi="Calibri" w:eastAsia="Calibri"/>
+          <w:b w:val="0"/>
+          <w:i w:val="0"/>
+          <w:color w:val="1F2937"/>
+          <w:sz w:val="22"/>
+        </w:rPr>
+        <w:t xml:space="preserve">. The same </w:t>
+      </w:r>
+      <w:r>
+        <w:rPr>
+          <w:rFonts w:ascii="Calibri" w:hAnsi="Calibri" w:eastAsia="Calibri"/>
+          <w:b/>
+          <w:i w:val="0"/>
+          <w:color w:val="1F2937"/>
+          <w:sz w:val="22"/>
+        </w:rPr>
+        <w:t>300,000 STX</w:t>
+      </w:r>
+      <w:r>
+        <w:rPr>
+          <w:rFonts w:ascii="Calibri" w:hAnsi="Calibri" w:eastAsia="Calibri"/>
+          <w:b w:val="0"/>
+          <w:i w:val="0"/>
+          <w:color w:val="1F2937"/>
+          <w:sz w:val="22"/>
+        </w:rPr>
+        <w:t xml:space="preserve"> is then redeployed into the next cycle’s 8 pots. The Endowment does </w:t>
+      </w:r>
+      <w:r>
+        <w:rPr>
+          <w:rFonts w:ascii="Calibri" w:hAnsi="Calibri" w:eastAsia="Calibri"/>
+          <w:b/>
+          <w:i w:val="0"/>
+          <w:color w:val="1F2937"/>
+          <w:sz w:val="22"/>
+        </w:rPr>
+        <w:t>not</w:t>
+      </w:r>
+      <w:r>
+        <w:rPr>
+          <w:rFonts w:ascii="Calibri" w:hAnsi="Calibri" w:eastAsia="Calibri"/>
+          <w:b w:val="0"/>
+          <w:i w:val="0"/>
+          <w:color w:val="1F2937"/>
+          <w:sz w:val="22"/>
+        </w:rPr>
+        <w:t xml:space="preserve"> need new capital each cycle—only a single reusable allocation.</w:t>
+      </w:r>
     </w:p>
     <w:p>
       <w:pPr>
@@ -1111,7 +1256,7 @@
           <w:color w:val="1F2937"/>
           <w:sz w:val="22"/>
         </w:rPr>
-        <w:t>3,000,000 STX</w:t>
+        <w:t>300,000 STX</w:t>
       </w:r>
       <w:r>
         <w:rPr>
@@ -1121,7 +1266,7 @@
           <w:color w:val="1F2937"/>
           <w:sz w:val="22"/>
         </w:rPr>
-        <w:t xml:space="preserve"> to fund these sponsored pot campaigns across the 5-month period, with the goal of accelerating adoption and building sustainable user growth.</w:t>
+        <w:t xml:space="preserve"> to fund sponsored pot campaigns across this 5-month period, with the goal of accelerating adoption and building sustainable user growth.</w:t>
       </w:r>
     </w:p>
     <w:p>
@@ -1335,6 +1480,26 @@
           <w:color w:val="1F2937"/>
           <w:sz w:val="22"/>
         </w:rPr>
+        <w:t xml:space="preserve">, funded by a </w:t>
+      </w:r>
+      <w:r>
+        <w:rPr>
+          <w:rFonts w:ascii="Calibri" w:hAnsi="Calibri" w:eastAsia="Calibri"/>
+          <w:b/>
+          <w:i w:val="0"/>
+          <w:color w:val="1F2937"/>
+          <w:sz w:val="22"/>
+        </w:rPr>
+        <w:t>single reusable 300,000 STX allocation</w:t>
+      </w:r>
+      <w:r>
+        <w:rPr>
+          <w:rFonts w:ascii="Calibri" w:hAnsi="Calibri" w:eastAsia="Calibri"/>
+          <w:b w:val="0"/>
+          <w:i w:val="0"/>
+          <w:color w:val="1F2937"/>
+          <w:sz w:val="22"/>
+        </w:rPr>
         <w:t>—provides that catalyst with clear milestones, measurable outcomes, and a defined end state for evaluation.</w:t>
       </w:r>
     </w:p>
@@ -1416,6 +1581,131 @@
           <w:sz w:val="22"/>
         </w:rPr>
         <w:t>Through Stacks Endowment sponsorship, selected pots can receive reward boosts—making campaigns more attractive and transforming StacksPot from a passive yield product into an active ecosystem engagement tool.</w:t>
+      </w:r>
+    </w:p>
+    <w:p>
+      <w:pPr>
+        <w:spacing w:before="240" w:after="120" w:lineRule="auto" w:line="276"/>
+      </w:pPr>
+      <w:r>
+        <w:rPr>
+          <w:rFonts w:ascii="Calibri" w:hAnsi="Calibri" w:eastAsia="Calibri"/>
+          <w:b/>
+          <w:i w:val="0"/>
+          <w:color w:val="2B6CB0"/>
+          <w:sz w:val="26"/>
+        </w:rPr>
+        <w:t>Capital Efficiency: Reusable Sponsorship</w:t>
+      </w:r>
+    </w:p>
+    <w:p>
+      <w:pPr>
+        <w:spacing w:before="0" w:after="80" w:lineRule="auto" w:line="276"/>
+      </w:pPr>
+      <w:r>
+        <w:rPr>
+          <w:rFonts w:ascii="Calibri" w:hAnsi="Calibri" w:eastAsia="Calibri"/>
+          <w:b w:val="0"/>
+          <w:i w:val="0"/>
+          <w:color w:val="1F2937"/>
+          <w:sz w:val="22"/>
+        </w:rPr>
+        <w:t>Sponsorship on StacksPot is delegated, not spent down as a grant burn each cycle:</w:t>
+      </w:r>
+    </w:p>
+    <w:p>
+      <w:pPr>
+        <w:pStyle w:val="ListNumber"/>
+        <w:spacing w:before="0" w:after="60" w:lineRule="auto" w:line="264"/>
+      </w:pPr>
+      <w:r>
+        <w:rPr>
+          <w:rFonts w:ascii="Calibri" w:hAnsi="Calibri" w:eastAsia="Calibri"/>
+          <w:b w:val="0"/>
+          <w:i w:val="0"/>
+          <w:color w:val="1F2937"/>
+          <w:sz w:val="22"/>
+        </w:rPr>
+        <w:t xml:space="preserve"> Endowment allocates ~300,000 STX to the sponsor address</w:t>
+      </w:r>
+    </w:p>
+    <w:p>
+      <w:pPr>
+        <w:pStyle w:val="ListNumber"/>
+        <w:spacing w:before="0" w:after="60" w:lineRule="auto" w:line="264"/>
+      </w:pPr>
+      <w:r>
+        <w:rPr>
+          <w:rFonts w:ascii="Calibri" w:hAnsi="Calibri" w:eastAsia="Calibri"/>
+          <w:b w:val="0"/>
+          <w:i w:val="0"/>
+          <w:color w:val="1F2937"/>
+          <w:sz w:val="22"/>
+        </w:rPr>
+        <w:t xml:space="preserve"> That STX is delegated across the 8 pots in the active 2-week cycle</w:t>
+      </w:r>
+    </w:p>
+    <w:p>
+      <w:pPr>
+        <w:pStyle w:val="ListNumber"/>
+        <w:spacing w:before="0" w:after="60" w:lineRule="auto" w:line="264"/>
+      </w:pPr>
+      <w:r>
+        <w:rPr>
+          <w:rFonts w:ascii="Calibri" w:hAnsi="Calibri" w:eastAsia="Calibri"/>
+          <w:b w:val="0"/>
+          <w:i w:val="0"/>
+          <w:color w:val="1F2937"/>
+          <w:sz w:val="22"/>
+        </w:rPr>
+        <w:t xml:space="preserve"> When the cycle ends, delegated amounts are returned to the sponsor’s address</w:t>
+      </w:r>
+    </w:p>
+    <w:p>
+      <w:pPr>
+        <w:pStyle w:val="ListNumber"/>
+        <w:spacing w:before="0" w:after="60" w:lineRule="auto" w:line="264"/>
+      </w:pPr>
+      <w:r>
+        <w:rPr>
+          <w:rFonts w:ascii="Calibri" w:hAnsi="Calibri" w:eastAsia="Calibri"/>
+          <w:b w:val="0"/>
+          <w:i w:val="0"/>
+          <w:color w:val="1F2937"/>
+          <w:sz w:val="22"/>
+        </w:rPr>
+        <w:t xml:space="preserve"> The same STX is redeployed into the next cycle’s 8 pots</w:t>
+      </w:r>
+    </w:p>
+    <w:p>
+      <w:pPr>
+        <w:pStyle w:val="ListNumber"/>
+        <w:spacing w:before="0" w:after="60" w:lineRule="auto" w:line="264"/>
+      </w:pPr>
+      <w:r>
+        <w:rPr>
+          <w:rFonts w:ascii="Calibri" w:hAnsi="Calibri" w:eastAsia="Calibri"/>
+          <w:b w:val="0"/>
+          <w:i w:val="0"/>
+          <w:color w:val="1F2937"/>
+          <w:sz w:val="22"/>
+        </w:rPr>
+        <w:t xml:space="preserve"> This repeats across all 10 cycles in the 5-month program</w:t>
+      </w:r>
+    </w:p>
+    <w:p>
+      <w:pPr>
+        <w:spacing w:before="0" w:after="160" w:lineRule="auto" w:line="276"/>
+      </w:pPr>
+      <w:r>
+        <w:rPr>
+          <w:rFonts w:ascii="Calibri" w:hAnsi="Calibri" w:eastAsia="Calibri"/>
+          <w:b w:val="0"/>
+          <w:i w:val="0"/>
+          <w:color w:val="1F2937"/>
+          <w:sz w:val="22"/>
+        </w:rPr>
+        <w:t>This model lets one allocation power 80 sponsored pots over five months without multiplying the capital ask.</w:t>
       </w:r>
     </w:p>
     <w:p>
@@ -2085,7 +2375,7 @@
         <w:tc>
           <w:tcPr>
             <w:tcW w:type="dxa" w:w="4320"/>
-            <w:shd w:fill="EEF2F7" w:val="clear"/>
+            <w:shd w:fill="F7FAFC" w:val="clear"/>
             <w:tcBorders>
               <w:top w:val="single" w:sz="4" w:space="0" w:color="CBD5E1"/>
               <w:left w:val="single" w:sz="4" w:space="0" w:color="CBD5E1"/>
@@ -2102,9 +2392,9 @@
             <w:r>
               <w:rPr>
                 <w:rFonts w:ascii="Calibri" w:hAnsi="Calibri" w:eastAsia="Calibri"/>
-                <w:b/>
+                <w:b w:val="0"/>
                 <w:i w:val="0"/>
-                <w:color w:val="1A365D"/>
+                <w:color w:val="1F2937"/>
                 <w:sz w:val="20"/>
               </w:rPr>
               <w:t>Total sponsored pots</w:t>
@@ -2114,7 +2404,7 @@
         <w:tc>
           <w:tcPr>
             <w:tcW w:type="dxa" w:w="5040"/>
-            <w:shd w:fill="EEF2F7" w:val="clear"/>
+            <w:shd w:fill="F7FAFC" w:val="clear"/>
             <w:tcBorders>
               <w:top w:val="single" w:sz="4" w:space="0" w:color="CBD5E1"/>
               <w:left w:val="single" w:sz="4" w:space="0" w:color="CBD5E1"/>
@@ -2131,12 +2421,70 @@
             <w:r>
               <w:rPr>
                 <w:rFonts w:ascii="Calibri" w:hAnsi="Calibri" w:eastAsia="Calibri"/>
-                <w:b/>
+                <w:b w:val="0"/>
                 <w:i w:val="0"/>
-                <w:color w:val="1A365D"/>
+                <w:color w:val="1F2937"/>
                 <w:sz w:val="20"/>
               </w:rPr>
               <w:t>80</w:t>
+            </w:r>
+          </w:p>
+        </w:tc>
+      </w:tr>
+      <w:tr>
+        <w:tc>
+          <w:tcPr>
+            <w:tcW w:type="dxa" w:w="4320"/>
+            <w:tcBorders>
+              <w:top w:val="single" w:sz="4" w:space="0" w:color="CBD5E1"/>
+              <w:left w:val="single" w:sz="4" w:space="0" w:color="CBD5E1"/>
+              <w:bottom w:val="single" w:sz="4" w:space="0" w:color="CBD5E1"/>
+              <w:right w:val="single" w:sz="4" w:space="0" w:color="CBD5E1"/>
+            </w:tcBorders>
+          </w:tcPr>
+          <w:p>
+            <w:pPr>
+              <w:spacing w:before="40" w:after="40" w:lineRule="auto" w:line="240"/>
+              <w:jc w:val="left"/>
+            </w:pPr>
+            <w:r/>
+            <w:r>
+              <w:rPr>
+                <w:rFonts w:ascii="Calibri" w:hAnsi="Calibri" w:eastAsia="Calibri"/>
+                <w:b w:val="0"/>
+                <w:i w:val="0"/>
+                <w:color w:val="1F2937"/>
+                <w:sz w:val="20"/>
+              </w:rPr>
+              <w:t>Capital committed</w:t>
+            </w:r>
+          </w:p>
+        </w:tc>
+        <w:tc>
+          <w:tcPr>
+            <w:tcW w:type="dxa" w:w="5040"/>
+            <w:tcBorders>
+              <w:top w:val="single" w:sz="4" w:space="0" w:color="CBD5E1"/>
+              <w:left w:val="single" w:sz="4" w:space="0" w:color="CBD5E1"/>
+              <w:bottom w:val="single" w:sz="4" w:space="0" w:color="CBD5E1"/>
+              <w:right w:val="single" w:sz="4" w:space="0" w:color="CBD5E1"/>
+            </w:tcBorders>
+          </w:tcPr>
+          <w:p>
+            <w:pPr>
+              <w:spacing w:before="40" w:after="40" w:lineRule="auto" w:line="240"/>
+              <w:jc w:val="right"/>
+            </w:pPr>
+            <w:r/>
+            <w:r>
+              <w:rPr>
+                <w:rFonts w:ascii="Calibri" w:hAnsi="Calibri" w:eastAsia="Calibri"/>
+                <w:b w:val="0"/>
+                <w:i w:val="0"/>
+                <w:color w:val="1F2937"/>
+                <w:sz w:val="20"/>
+              </w:rPr>
+              <w:t>~300,000 STX (returned &amp; reused each cycle)</w:t>
             </w:r>
           </w:p>
         </w:tc>
@@ -2234,7 +2582,27 @@
           <w:color w:val="1F2937"/>
           <w:sz w:val="22"/>
         </w:rPr>
-        <w:t xml:space="preserve"> sponsorship mix. Because a month contains two cycles, StacksPot will run </w:t>
+        <w:t xml:space="preserve"> sponsorship mix using the same </w:t>
+      </w:r>
+      <w:r>
+        <w:rPr>
+          <w:rFonts w:ascii="Calibri" w:hAnsi="Calibri" w:eastAsia="Calibri"/>
+          <w:b/>
+          <w:i w:val="0"/>
+          <w:color w:val="1F2937"/>
+          <w:sz w:val="22"/>
+        </w:rPr>
+        <w:t>300,000 STX</w:t>
+      </w:r>
+      <w:r>
+        <w:rPr>
+          <w:rFonts w:ascii="Calibri" w:hAnsi="Calibri" w:eastAsia="Calibri"/>
+          <w:b w:val="0"/>
+          <w:i w:val="0"/>
+          <w:color w:val="1F2937"/>
+          <w:sz w:val="22"/>
+        </w:rPr>
+        <w:t xml:space="preserve">. Because a month contains two cycles, StacksPot will run </w:t>
       </w:r>
       <w:r>
         <w:rPr>
@@ -2254,7 +2622,7 @@
           <w:color w:val="1F2937"/>
           <w:sz w:val="22"/>
         </w:rPr>
-        <w:t>.</w:t>
+        <w:t>, with capital returning to the sponsor between cycles.</w:t>
       </w:r>
     </w:p>
     <w:p>
@@ -2404,7 +2772,7 @@
           <w:color w:val="1F2937"/>
           <w:sz w:val="22"/>
         </w:rPr>
-        <w:t>Run 80 sponsored pots without thinning the per-cycle incentive design</w:t>
+        <w:t>Run 80 sponsored pots from a single reusable 300,000 STX allocation</w:t>
       </w:r>
     </w:p>
     <w:p>
@@ -2452,7 +2820,7 @@
           <w:color w:val="1F2937"/>
           <w:sz w:val="22"/>
         </w:rPr>
-        <w:t>Provide the Endowment with clear monthly visibility into impact (16 pots / 600,000 STX per month)</w:t>
+        <w:t>Provide the Endowment with clear monthly visibility into impact (16 pots/month; capital returned each cycle)</w:t>
       </w:r>
     </w:p>
     <w:p>
@@ -2467,7 +2835,7 @@
           <w:color w:val="1F2937"/>
           <w:sz w:val="22"/>
         </w:rPr>
-        <w:t>At the end of Month 5, StacksPot will deliver a full program retrospective covering participation, STX utilization, pot creation, sponsored reward distribution, and retention—supporting a data-driven decision on any future continuation.</w:t>
+        <w:t>At the end of Month 5, StacksPot will deliver a full program retrospective covering participation, STX utilization, pot creation, sponsored reward distribution, and retention—supporting a data-driven decision on any future continuation. Upon program close, the reusable allocation remains available to return fully to the Endowment / sponsor address per the agreed custody arrangement.</w:t>
       </w:r>
     </w:p>
     <w:p>
@@ -2597,7 +2965,7 @@
           <w:color w:val="1F2937"/>
           <w:sz w:val="22"/>
         </w:rPr>
-        <w:t xml:space="preserve">. The sponsorship budget for one cycle is </w:t>
+        <w:t xml:space="preserve">, funded by </w:t>
       </w:r>
       <w:r>
         <w:rPr>
@@ -2617,7 +2985,7 @@
           <w:color w:val="1F2937"/>
           <w:sz w:val="22"/>
         </w:rPr>
-        <w:t>, distributed across entry sizes to maximize participation, accelerate pot growth, and generate sustainable sBTC rewards.</w:t>
+        <w:t xml:space="preserve"> of reusable sponsorship capital. After the cycle, that capital is returned to the sponsor and reused for the next cycle.</w:t>
       </w:r>
     </w:p>
     <w:tbl>
@@ -4223,7 +4591,7 @@
           <w:color w:val="4A5568"/>
           <w:sz w:val="20"/>
         </w:rPr>
-        <w:t>Estimated sBTC reward figures are approximate and subject to market conditions and yield performance at campaign time. Awarded boost amounts above are per cycle; the same mix repeats each cycle.</w:t>
+        <w:t>Estimated sBTC reward figures are approximate and subject to market conditions and yield performance at campaign time. Boost amounts above describe the per-cycle deployment mix. The Endowment’s capital commitment remains ~300,000 STX for the full program because funds are returned and reused.</w:t>
       </w:r>
     </w:p>
     <w:p>
@@ -4257,7 +4625,7 @@
       <w:tr>
         <w:tc>
           <w:tcPr>
-            <w:tcW w:type="dxa" w:w="2880"/>
+            <w:tcW w:type="dxa" w:w="2592"/>
             <w:shd w:fill="1A365D" w:val="clear"/>
             <w:tcBorders>
               <w:top w:val="single" w:sz="4" w:space="0" w:color="1A365D"/>
@@ -4286,7 +4654,7 @@
         </w:tc>
         <w:tc>
           <w:tcPr>
-            <w:tcW w:type="dxa" w:w="1728"/>
+            <w:tcW w:type="dxa" w:w="1440"/>
             <w:shd w:fill="1A365D" w:val="clear"/>
             <w:tcBorders>
               <w:top w:val="single" w:sz="4" w:space="0" w:color="1A365D"/>
@@ -4315,7 +4683,7 @@
         </w:tc>
         <w:tc>
           <w:tcPr>
-            <w:tcW w:type="dxa" w:w="1728"/>
+            <w:tcW w:type="dxa" w:w="1440"/>
             <w:shd w:fill="1A365D" w:val="clear"/>
             <w:tcBorders>
               <w:top w:val="single" w:sz="4" w:space="0" w:color="1A365D"/>
@@ -4344,7 +4712,7 @@
         </w:tc>
         <w:tc>
           <w:tcPr>
-            <w:tcW w:type="dxa" w:w="2880"/>
+            <w:tcW w:type="dxa" w:w="4032"/>
             <w:shd w:fill="1A365D" w:val="clear"/>
             <w:tcBorders>
               <w:top w:val="single" w:sz="4" w:space="0" w:color="1A365D"/>
@@ -4367,7 +4735,7 @@
                 <w:color w:val="FFFFFF"/>
                 <w:sz w:val="20"/>
               </w:rPr>
-              <w:t>Sponsored Boost</w:t>
+              <w:t>Capital Required</w:t>
             </w:r>
           </w:p>
         </w:tc>
@@ -4375,7 +4743,7 @@
       <w:tr>
         <w:tc>
           <w:tcPr>
-            <w:tcW w:type="dxa" w:w="2880"/>
+            <w:tcW w:type="dxa" w:w="2592"/>
             <w:tcBorders>
               <w:top w:val="single" w:sz="4" w:space="0" w:color="CBD5E1"/>
               <w:left w:val="single" w:sz="4" w:space="0" w:color="CBD5E1"/>
@@ -4403,7 +4771,7 @@
         </w:tc>
         <w:tc>
           <w:tcPr>
-            <w:tcW w:type="dxa" w:w="1728"/>
+            <w:tcW w:type="dxa" w:w="1440"/>
             <w:tcBorders>
               <w:top w:val="single" w:sz="4" w:space="0" w:color="CBD5E1"/>
               <w:left w:val="single" w:sz="4" w:space="0" w:color="CBD5E1"/>
@@ -4431,7 +4799,7 @@
         </w:tc>
         <w:tc>
           <w:tcPr>
-            <w:tcW w:type="dxa" w:w="1728"/>
+            <w:tcW w:type="dxa" w:w="1440"/>
             <w:tcBorders>
               <w:top w:val="single" w:sz="4" w:space="0" w:color="CBD5E1"/>
               <w:left w:val="single" w:sz="4" w:space="0" w:color="CBD5E1"/>
@@ -4459,7 +4827,7 @@
         </w:tc>
         <w:tc>
           <w:tcPr>
-            <w:tcW w:type="dxa" w:w="2880"/>
+            <w:tcW w:type="dxa" w:w="4032"/>
             <w:tcBorders>
               <w:top w:val="single" w:sz="4" w:space="0" w:color="CBD5E1"/>
               <w:left w:val="single" w:sz="4" w:space="0" w:color="CBD5E1"/>
@@ -4481,7 +4849,7 @@
                 <w:color w:val="1F2937"/>
                 <w:sz w:val="20"/>
               </w:rPr>
-              <w:t>300,000 STX</w:t>
+              <w:t>300,000 STX (delegated)</w:t>
             </w:r>
           </w:p>
         </w:tc>
@@ -4489,7 +4857,7 @@
       <w:tr>
         <w:tc>
           <w:tcPr>
-            <w:tcW w:type="dxa" w:w="2880"/>
+            <w:tcW w:type="dxa" w:w="2592"/>
             <w:shd w:fill="F7FAFC" w:val="clear"/>
             <w:tcBorders>
               <w:top w:val="single" w:sz="4" w:space="0" w:color="CBD5E1"/>
@@ -4518,7 +4886,7 @@
         </w:tc>
         <w:tc>
           <w:tcPr>
-            <w:tcW w:type="dxa" w:w="1728"/>
+            <w:tcW w:type="dxa" w:w="1440"/>
             <w:shd w:fill="F7FAFC" w:val="clear"/>
             <w:tcBorders>
               <w:top w:val="single" w:sz="4" w:space="0" w:color="CBD5E1"/>
@@ -4547,7 +4915,7 @@
         </w:tc>
         <w:tc>
           <w:tcPr>
-            <w:tcW w:type="dxa" w:w="1728"/>
+            <w:tcW w:type="dxa" w:w="1440"/>
             <w:shd w:fill="F7FAFC" w:val="clear"/>
             <w:tcBorders>
               <w:top w:val="single" w:sz="4" w:space="0" w:color="CBD5E1"/>
@@ -4576,7 +4944,7 @@
         </w:tc>
         <w:tc>
           <w:tcPr>
-            <w:tcW w:type="dxa" w:w="2880"/>
+            <w:tcW w:type="dxa" w:w="4032"/>
             <w:shd w:fill="F7FAFC" w:val="clear"/>
             <w:tcBorders>
               <w:top w:val="single" w:sz="4" w:space="0" w:color="CBD5E1"/>
@@ -4599,7 +4967,7 @@
                 <w:color w:val="1F2937"/>
                 <w:sz w:val="20"/>
               </w:rPr>
-              <w:t>600,000 STX</w:t>
+              <w:t>300,000 STX (same capital, reused)</w:t>
             </w:r>
           </w:p>
         </w:tc>
@@ -4607,7 +4975,7 @@
       <w:tr>
         <w:tc>
           <w:tcPr>
-            <w:tcW w:type="dxa" w:w="2880"/>
+            <w:tcW w:type="dxa" w:w="2592"/>
             <w:shd w:fill="EEF2F7" w:val="clear"/>
             <w:tcBorders>
               <w:top w:val="single" w:sz="4" w:space="0" w:color="CBD5E1"/>
@@ -4636,7 +5004,7 @@
         </w:tc>
         <w:tc>
           <w:tcPr>
-            <w:tcW w:type="dxa" w:w="1728"/>
+            <w:tcW w:type="dxa" w:w="1440"/>
             <w:shd w:fill="EEF2F7" w:val="clear"/>
             <w:tcBorders>
               <w:top w:val="single" w:sz="4" w:space="0" w:color="CBD5E1"/>
@@ -4665,7 +5033,7 @@
         </w:tc>
         <w:tc>
           <w:tcPr>
-            <w:tcW w:type="dxa" w:w="1728"/>
+            <w:tcW w:type="dxa" w:w="1440"/>
             <w:shd w:fill="EEF2F7" w:val="clear"/>
             <w:tcBorders>
               <w:top w:val="single" w:sz="4" w:space="0" w:color="CBD5E1"/>
@@ -4694,7 +5062,7 @@
         </w:tc>
         <w:tc>
           <w:tcPr>
-            <w:tcW w:type="dxa" w:w="2880"/>
+            <w:tcW w:type="dxa" w:w="4032"/>
             <w:shd w:fill="EEF2F7" w:val="clear"/>
             <w:tcBorders>
               <w:top w:val="single" w:sz="4" w:space="0" w:color="CBD5E1"/>
@@ -4717,7 +5085,7 @@
                 <w:color w:val="1A365D"/>
                 <w:sz w:val="20"/>
               </w:rPr>
-              <w:t>3,000,000 STX</w:t>
+              <w:t>~300,000 STX (same capital, reused)</w:t>
             </w:r>
           </w:p>
         </w:tc>
@@ -4755,7 +5123,7 @@
           <w:color w:val="1F2937"/>
           <w:sz w:val="22"/>
         </w:rPr>
-        <w:t>Every month runs two full cycles of the 8-pot mix (16 pots). Boost volume stays consistent so the market can form habits around the bi-weekly cadence:</w:t>
+        <w:t>Every month runs two full cycles of the 8-pot mix (16 pots). The same 300,000 STX is redeployed each cycle after returning to the sponsor address:</w:t>
       </w:r>
     </w:p>
     <w:tbl>
@@ -4804,7 +5172,7 @@
         </w:tc>
         <w:tc>
           <w:tcPr>
-            <w:tcW w:type="dxa" w:w="4320"/>
+            <w:tcW w:type="dxa" w:w="4032"/>
             <w:shd w:fill="1A365D" w:val="clear"/>
             <w:tcBorders>
               <w:top w:val="single" w:sz="4" w:space="0" w:color="1A365D"/>
@@ -4891,7 +5259,7 @@
         </w:tc>
         <w:tc>
           <w:tcPr>
-            <w:tcW w:type="dxa" w:w="1872"/>
+            <w:tcW w:type="dxa" w:w="2304"/>
             <w:shd w:fill="1A365D" w:val="clear"/>
             <w:tcBorders>
               <w:top w:val="single" w:sz="4" w:space="0" w:color="1A365D"/>
@@ -4914,7 +5282,7 @@
                 <w:color w:val="FFFFFF"/>
                 <w:sz w:val="20"/>
               </w:rPr>
-              <w:t>Indicative Boost</w:t>
+              <w:t>Capital in Use</w:t>
             </w:r>
           </w:p>
         </w:tc>
@@ -4950,7 +5318,7 @@
         </w:tc>
         <w:tc>
           <w:tcPr>
-            <w:tcW w:type="dxa" w:w="4320"/>
+            <w:tcW w:type="dxa" w:w="4032"/>
             <w:tcBorders>
               <w:top w:val="single" w:sz="4" w:space="0" w:color="CBD5E1"/>
               <w:left w:val="single" w:sz="4" w:space="0" w:color="CBD5E1"/>
@@ -5034,7 +5402,7 @@
         </w:tc>
         <w:tc>
           <w:tcPr>
-            <w:tcW w:type="dxa" w:w="1872"/>
+            <w:tcW w:type="dxa" w:w="2304"/>
             <w:tcBorders>
               <w:top w:val="single" w:sz="4" w:space="0" w:color="CBD5E1"/>
               <w:left w:val="single" w:sz="4" w:space="0" w:color="CBD5E1"/>
@@ -5056,7 +5424,7 @@
                 <w:color w:val="1F2937"/>
                 <w:sz w:val="20"/>
               </w:rPr>
-              <w:t>600,000 STX</w:t>
+              <w:t>300,000 STX (reused)</w:t>
             </w:r>
           </w:p>
         </w:tc>
@@ -5093,7 +5461,7 @@
         </w:tc>
         <w:tc>
           <w:tcPr>
-            <w:tcW w:type="dxa" w:w="4320"/>
+            <w:tcW w:type="dxa" w:w="4032"/>
             <w:shd w:fill="F7FAFC" w:val="clear"/>
             <w:tcBorders>
               <w:top w:val="single" w:sz="4" w:space="0" w:color="CBD5E1"/>
@@ -5180,7 +5548,7 @@
         </w:tc>
         <w:tc>
           <w:tcPr>
-            <w:tcW w:type="dxa" w:w="1872"/>
+            <w:tcW w:type="dxa" w:w="2304"/>
             <w:shd w:fill="F7FAFC" w:val="clear"/>
             <w:tcBorders>
               <w:top w:val="single" w:sz="4" w:space="0" w:color="CBD5E1"/>
@@ -5203,7 +5571,7 @@
                 <w:color w:val="1F2937"/>
                 <w:sz w:val="20"/>
               </w:rPr>
-              <w:t>600,000 STX</w:t>
+              <w:t>300,000 STX (reused)</w:t>
             </w:r>
           </w:p>
         </w:tc>
@@ -5239,7 +5607,7 @@
         </w:tc>
         <w:tc>
           <w:tcPr>
-            <w:tcW w:type="dxa" w:w="4320"/>
+            <w:tcW w:type="dxa" w:w="4032"/>
             <w:tcBorders>
               <w:top w:val="single" w:sz="4" w:space="0" w:color="CBD5E1"/>
               <w:left w:val="single" w:sz="4" w:space="0" w:color="CBD5E1"/>
@@ -5323,7 +5691,7 @@
         </w:tc>
         <w:tc>
           <w:tcPr>
-            <w:tcW w:type="dxa" w:w="1872"/>
+            <w:tcW w:type="dxa" w:w="2304"/>
             <w:tcBorders>
               <w:top w:val="single" w:sz="4" w:space="0" w:color="CBD5E1"/>
               <w:left w:val="single" w:sz="4" w:space="0" w:color="CBD5E1"/>
@@ -5345,7 +5713,7 @@
                 <w:color w:val="1F2937"/>
                 <w:sz w:val="20"/>
               </w:rPr>
-              <w:t>600,000 STX</w:t>
+              <w:t>300,000 STX (reused)</w:t>
             </w:r>
           </w:p>
         </w:tc>
@@ -5382,7 +5750,7 @@
         </w:tc>
         <w:tc>
           <w:tcPr>
-            <w:tcW w:type="dxa" w:w="4320"/>
+            <w:tcW w:type="dxa" w:w="4032"/>
             <w:shd w:fill="F7FAFC" w:val="clear"/>
             <w:tcBorders>
               <w:top w:val="single" w:sz="4" w:space="0" w:color="CBD5E1"/>
@@ -5469,7 +5837,7 @@
         </w:tc>
         <w:tc>
           <w:tcPr>
-            <w:tcW w:type="dxa" w:w="1872"/>
+            <w:tcW w:type="dxa" w:w="2304"/>
             <w:shd w:fill="F7FAFC" w:val="clear"/>
             <w:tcBorders>
               <w:top w:val="single" w:sz="4" w:space="0" w:color="CBD5E1"/>
@@ -5492,7 +5860,7 @@
                 <w:color w:val="1F2937"/>
                 <w:sz w:val="20"/>
               </w:rPr>
-              <w:t>600,000 STX</w:t>
+              <w:t>300,000 STX (reused)</w:t>
             </w:r>
           </w:p>
         </w:tc>
@@ -5528,7 +5896,7 @@
         </w:tc>
         <w:tc>
           <w:tcPr>
-            <w:tcW w:type="dxa" w:w="4320"/>
+            <w:tcW w:type="dxa" w:w="4032"/>
             <w:tcBorders>
               <w:top w:val="single" w:sz="4" w:space="0" w:color="CBD5E1"/>
               <w:left w:val="single" w:sz="4" w:space="0" w:color="CBD5E1"/>
@@ -5612,7 +5980,7 @@
         </w:tc>
         <w:tc>
           <w:tcPr>
-            <w:tcW w:type="dxa" w:w="1872"/>
+            <w:tcW w:type="dxa" w:w="2304"/>
             <w:tcBorders>
               <w:top w:val="single" w:sz="4" w:space="0" w:color="CBD5E1"/>
               <w:left w:val="single" w:sz="4" w:space="0" w:color="CBD5E1"/>
@@ -5634,7 +6002,7 @@
                 <w:color w:val="1F2937"/>
                 <w:sz w:val="20"/>
               </w:rPr>
-              <w:t>600,000 STX</w:t>
+              <w:t>300,000 STX (reused)</w:t>
             </w:r>
           </w:p>
         </w:tc>
@@ -5670,7 +6038,7 @@
         </w:tc>
         <w:tc>
           <w:tcPr>
-            <w:tcW w:type="dxa" w:w="4320"/>
+            <w:tcW w:type="dxa" w:w="4032"/>
             <w:shd w:fill="EEF2F7" w:val="clear"/>
             <w:tcBorders>
               <w:top w:val="single" w:sz="4" w:space="0" w:color="CBD5E1"/>
@@ -5757,7 +6125,7 @@
         </w:tc>
         <w:tc>
           <w:tcPr>
-            <w:tcW w:type="dxa" w:w="1872"/>
+            <w:tcW w:type="dxa" w:w="2304"/>
             <w:shd w:fill="EEF2F7" w:val="clear"/>
             <w:tcBorders>
               <w:top w:val="single" w:sz="4" w:space="0" w:color="CBD5E1"/>
@@ -5780,7 +6148,7 @@
                 <w:color w:val="1A365D"/>
                 <w:sz w:val="20"/>
               </w:rPr>
-              <w:t>3,000,000 STX</w:t>
+              <w:t>~300,000 STX committed</w:t>
             </w:r>
           </w:p>
         </w:tc>
@@ -5803,7 +6171,7 @@
           <w:color w:val="1F2937"/>
           <w:sz w:val="22"/>
         </w:rPr>
-        <w:t>Timing of individual pot fills within a cycle may vary based on demand, while remaining within the 2-week cycle length, 8-pots-per-cycle design, and total program allocation.</w:t>
+        <w:t>Timing of individual pot fills within a cycle may vary based on demand, while remaining within the 2-week cycle length, 8-pots-per-cycle design, and the reusable 300,000 STX allocation.</w:t>
       </w:r>
     </w:p>
     <w:p>
@@ -5869,6 +6237,76 @@
           <w:sz w:val="22"/>
         </w:rPr>
         <w:t xml:space="preserve"> create frequent, accessible entry points.</w:t>
+      </w:r>
+    </w:p>
+    <w:p>
+      <w:pPr>
+        <w:spacing w:before="240" w:after="120" w:lineRule="auto" w:line="276"/>
+      </w:pPr>
+      <w:r>
+        <w:rPr>
+          <w:rFonts w:ascii="Calibri" w:hAnsi="Calibri" w:eastAsia="Calibri"/>
+          <w:b/>
+          <w:i w:val="0"/>
+          <w:color w:val="2B6CB0"/>
+          <w:sz w:val="26"/>
+        </w:rPr>
+        <w:t>Capital-Efficient Growth</w:t>
+      </w:r>
+    </w:p>
+    <w:p>
+      <w:pPr>
+        <w:spacing w:before="0" w:after="160" w:lineRule="auto" w:line="276"/>
+      </w:pPr>
+      <w:r>
+        <w:rPr>
+          <w:rFonts w:ascii="Calibri" w:hAnsi="Calibri" w:eastAsia="Calibri"/>
+          <w:b w:val="0"/>
+          <w:i w:val="0"/>
+          <w:color w:val="1F2937"/>
+          <w:sz w:val="22"/>
+        </w:rPr>
+        <w:t xml:space="preserve">Because delegated sponsorship returns to the sponsor after each cycle, the Endowment can power </w:t>
+      </w:r>
+      <w:r>
+        <w:rPr>
+          <w:rFonts w:ascii="Calibri" w:hAnsi="Calibri" w:eastAsia="Calibri"/>
+          <w:b/>
+          <w:i w:val="0"/>
+          <w:color w:val="1F2937"/>
+          <w:sz w:val="22"/>
+        </w:rPr>
+        <w:t>80 pots over 5 months</w:t>
+      </w:r>
+      <w:r>
+        <w:rPr>
+          <w:rFonts w:ascii="Calibri" w:hAnsi="Calibri" w:eastAsia="Calibri"/>
+          <w:b w:val="0"/>
+          <w:i w:val="0"/>
+          <w:color w:val="1F2937"/>
+          <w:sz w:val="22"/>
+        </w:rPr>
+        <w:t xml:space="preserve"> with a single </w:t>
+      </w:r>
+      <w:r>
+        <w:rPr>
+          <w:rFonts w:ascii="Calibri" w:hAnsi="Calibri" w:eastAsia="Calibri"/>
+          <w:b/>
+          <w:i w:val="0"/>
+          <w:color w:val="1F2937"/>
+          <w:sz w:val="22"/>
+        </w:rPr>
+        <w:t>~300,000 STX</w:t>
+      </w:r>
+      <w:r>
+        <w:rPr>
+          <w:rFonts w:ascii="Calibri" w:hAnsi="Calibri" w:eastAsia="Calibri"/>
+          <w:b w:val="0"/>
+          <w:i w:val="0"/>
+          <w:color w:val="1F2937"/>
+          <w:sz w:val="22"/>
+        </w:rPr>
+        <w:t xml:space="preserve"> commitment rather than multiplying capital per cycle.</w:t>
       </w:r>
     </w:p>
     <w:p>
@@ -6243,7 +6681,7 @@
                 <w:color w:val="1F2937"/>
                 <w:sz w:val="20"/>
               </w:rPr>
-              <w:t>Deliver 80 sponsored pots while encouraging community members and projects to create their own pools</w:t>
+              <w:t>Deliver 80 sponsored pots from one reusable allocation while encouraging community-created pools</w:t>
             </w:r>
           </w:p>
         </w:tc>
@@ -6310,7 +6748,66 @@
         <w:tc>
           <w:tcPr>
             <w:tcW w:type="dxa" w:w="3168"/>
-            <w:shd w:fill="F7FAFC" w:val="clear"/>
+            <w:shd w:fill="EEF2F7" w:val="clear"/>
+            <w:tcBorders>
+              <w:top w:val="single" w:sz="4" w:space="0" w:color="CBD5E1"/>
+              <w:left w:val="single" w:sz="4" w:space="0" w:color="CBD5E1"/>
+              <w:bottom w:val="single" w:sz="4" w:space="0" w:color="CBD5E1"/>
+              <w:right w:val="single" w:sz="4" w:space="0" w:color="CBD5E1"/>
+            </w:tcBorders>
+          </w:tcPr>
+          <w:p>
+            <w:pPr>
+              <w:spacing w:before="40" w:after="40" w:lineRule="auto" w:line="240"/>
+              <w:jc w:val="left"/>
+            </w:pPr>
+            <w:r/>
+            <w:r>
+              <w:rPr>
+                <w:rFonts w:ascii="Calibri" w:hAnsi="Calibri" w:eastAsia="Calibri"/>
+                <w:b/>
+                <w:i w:val="0"/>
+                <w:color w:val="1A365D"/>
+                <w:sz w:val="20"/>
+              </w:rPr>
+              <w:t>Capital efficiency</w:t>
+            </w:r>
+          </w:p>
+        </w:tc>
+        <w:tc>
+          <w:tcPr>
+            <w:tcW w:type="dxa" w:w="6192"/>
+            <w:shd w:fill="EEF2F7" w:val="clear"/>
+            <w:tcBorders>
+              <w:top w:val="single" w:sz="4" w:space="0" w:color="CBD5E1"/>
+              <w:left w:val="single" w:sz="4" w:space="0" w:color="CBD5E1"/>
+              <w:bottom w:val="single" w:sz="4" w:space="0" w:color="CBD5E1"/>
+              <w:right w:val="single" w:sz="4" w:space="0" w:color="CBD5E1"/>
+            </w:tcBorders>
+          </w:tcPr>
+          <w:p>
+            <w:pPr>
+              <w:spacing w:before="40" w:after="40" w:lineRule="auto" w:line="240"/>
+              <w:jc w:val="right"/>
+            </w:pPr>
+            <w:r/>
+            <w:r>
+              <w:rPr>
+                <w:rFonts w:ascii="Calibri" w:hAnsi="Calibri" w:eastAsia="Calibri"/>
+                <w:b/>
+                <w:i w:val="0"/>
+                <w:color w:val="1A365D"/>
+                <w:sz w:val="20"/>
+              </w:rPr>
+              <w:t>Demonstrate reusable sponsorship: ~300,000 STX committed, returned after each cycle, redeployed for the next</w:t>
+            </w:r>
+          </w:p>
+        </w:tc>
+      </w:tr>
+      <w:tr>
+        <w:tc>
+          <w:tcPr>
+            <w:tcW w:type="dxa" w:w="3168"/>
             <w:tcBorders>
               <w:top w:val="single" w:sz="4" w:space="0" w:color="CBD5E1"/>
               <w:left w:val="single" w:sz="4" w:space="0" w:color="CBD5E1"/>
@@ -6339,7 +6836,6 @@
         <w:tc>
           <w:tcPr>
             <w:tcW w:type="dxa" w:w="6192"/>
-            <w:shd w:fill="F7FAFC" w:val="clear"/>
             <w:tcBorders>
               <w:top w:val="single" w:sz="4" w:space="0" w:color="CBD5E1"/>
               <w:left w:val="single" w:sz="4" w:space="0" w:color="CBD5E1"/>
@@ -6493,7 +6989,7 @@
           <w:color w:val="1F2937"/>
           <w:sz w:val="22"/>
         </w:rPr>
-        <w:t>Sponsored reward distribution for that month (target: 600,000 STX)</w:t>
+        <w:t>Sponsored capital deployed per cycle (300,000 STX) and confirmation of return to sponsor address after each cycle</w:t>
       </w:r>
     </w:p>
     <w:p>
@@ -6588,6 +7084,22 @@
           <w:sz w:val="22"/>
         </w:rPr>
         <w:t>Cumulative STX utilization and wallet activity</w:t>
+      </w:r>
+    </w:p>
+    <w:p>
+      <w:pPr>
+        <w:pStyle w:val="ListBullet"/>
+        <w:spacing w:before="0" w:after="60" w:lineRule="auto" w:line="264"/>
+      </w:pPr>
+      <w:r>
+        <w:rPr>
+          <w:rFonts w:ascii="Calibri" w:hAnsi="Calibri" w:eastAsia="Calibri"/>
+          <w:b w:val="0"/>
+          <w:i w:val="0"/>
+          <w:color w:val="1F2937"/>
+          <w:sz w:val="22"/>
+        </w:rPr>
+        <w:t>Capital custody summary (allocation in, cycle redeployments, final return)</w:t>
       </w:r>
     </w:p>
     <w:p>
@@ -6743,7 +7255,27 @@
           <w:color w:val="1F2937"/>
           <w:sz w:val="22"/>
         </w:rPr>
-        <w:t xml:space="preserve"> program-wide)—can become a powerful ecosystem growth mechanism: attracting users, supporting builders, increasing STX activity, and introducing more participants to Bitcoin DeFi.</w:t>
+        <w:t xml:space="preserve"> program-wide)—can become a powerful ecosystem growth mechanism. Because delegated amounts return to the sponsor after each cycle, a single </w:t>
+      </w:r>
+      <w:r>
+        <w:rPr>
+          <w:rFonts w:ascii="Calibri" w:hAnsi="Calibri" w:eastAsia="Calibri"/>
+          <w:b/>
+          <w:i w:val="0"/>
+          <w:color w:val="1F2937"/>
+          <w:sz w:val="22"/>
+        </w:rPr>
+        <w:t>~300,000 STX</w:t>
+      </w:r>
+      <w:r>
+        <w:rPr>
+          <w:rFonts w:ascii="Calibri" w:hAnsi="Calibri" w:eastAsia="Calibri"/>
+          <w:b w:val="0"/>
+          <w:i w:val="0"/>
+          <w:color w:val="1F2937"/>
+          <w:sz w:val="22"/>
+        </w:rPr>
+        <w:t xml:space="preserve"> allocation is sufficient to fund the full program.</w:t>
       </w:r>
     </w:p>
     <w:p>
@@ -6758,7 +7290,7 @@
           <w:color w:val="1F2937"/>
           <w:sz w:val="22"/>
         </w:rPr>
-        <w:t>This partnership is an opportunity to create a scalable incentive layer that benefits not only StacksPot, but the wider Stacks ecosystem.</w:t>
+        <w:t>This partnership is an opportunity to create a scalable, capital-efficient incentive layer that benefits not only StacksPot, but the wider Stacks ecosystem.</w:t>
       </w:r>
     </w:p>
     <w:p>
@@ -6797,7 +7329,7 @@
       <w:tr>
         <w:tc>
           <w:tcPr>
-            <w:tcW w:type="dxa" w:w="3456"/>
+            <w:tcW w:type="dxa" w:w="3600"/>
             <w:shd w:fill="1A365D" w:val="clear"/>
             <w:tcBorders>
               <w:top w:val="single" w:sz="4" w:space="0" w:color="1A365D"/>
@@ -6826,7 +7358,7 @@
         </w:tc>
         <w:tc>
           <w:tcPr>
-            <w:tcW w:type="dxa" w:w="5904"/>
+            <w:tcW w:type="dxa" w:w="5760"/>
             <w:tcBorders>
               <w:top w:val="single" w:sz="4" w:space="0" w:color="CBD5E1"/>
               <w:left w:val="single" w:sz="4" w:space="0" w:color="CBD5E1"/>
@@ -6857,7 +7389,7 @@
       <w:tr>
         <w:tc>
           <w:tcPr>
-            <w:tcW w:type="dxa" w:w="3456"/>
+            <w:tcW w:type="dxa" w:w="3600"/>
             <w:shd w:fill="1A365D" w:val="clear"/>
             <w:tcBorders>
               <w:top w:val="single" w:sz="4" w:space="0" w:color="1A365D"/>
@@ -6886,7 +7418,7 @@
         </w:tc>
         <w:tc>
           <w:tcPr>
-            <w:tcW w:type="dxa" w:w="5904"/>
+            <w:tcW w:type="dxa" w:w="5760"/>
             <w:tcBorders>
               <w:top w:val="single" w:sz="4" w:space="0" w:color="CBD5E1"/>
               <w:left w:val="single" w:sz="4" w:space="0" w:color="CBD5E1"/>
@@ -6917,7 +7449,7 @@
       <w:tr>
         <w:tc>
           <w:tcPr>
-            <w:tcW w:type="dxa" w:w="3456"/>
+            <w:tcW w:type="dxa" w:w="3600"/>
             <w:shd w:fill="1A365D" w:val="clear"/>
             <w:tcBorders>
               <w:top w:val="single" w:sz="4" w:space="0" w:color="1A365D"/>
@@ -6946,7 +7478,7 @@
         </w:tc>
         <w:tc>
           <w:tcPr>
-            <w:tcW w:type="dxa" w:w="5904"/>
+            <w:tcW w:type="dxa" w:w="5760"/>
             <w:tcBorders>
               <w:top w:val="single" w:sz="4" w:space="0" w:color="CBD5E1"/>
               <w:left w:val="single" w:sz="4" w:space="0" w:color="CBD5E1"/>
@@ -6977,7 +7509,7 @@
       <w:tr>
         <w:tc>
           <w:tcPr>
-            <w:tcW w:type="dxa" w:w="3456"/>
+            <w:tcW w:type="dxa" w:w="3600"/>
             <w:shd w:fill="1A365D" w:val="clear"/>
             <w:tcBorders>
               <w:top w:val="single" w:sz="4" w:space="0" w:color="1A365D"/>
@@ -7006,7 +7538,7 @@
         </w:tc>
         <w:tc>
           <w:tcPr>
-            <w:tcW w:type="dxa" w:w="5904"/>
+            <w:tcW w:type="dxa" w:w="5760"/>
             <w:tcBorders>
               <w:top w:val="single" w:sz="4" w:space="0" w:color="CBD5E1"/>
               <w:left w:val="single" w:sz="4" w:space="0" w:color="CBD5E1"/>
@@ -7029,7 +7561,7 @@
                 <w:color w:val="1F2937"/>
                 <w:sz w:val="22"/>
               </w:rPr>
-              <w:t>8 pots / 2 weeks · 16 pots / month</w:t>
+              <w:t>8 pots / 2 weeks · 16 pots / month · 80 pots total</w:t>
             </w:r>
           </w:p>
         </w:tc>
@@ -7037,7 +7569,7 @@
       <w:tr>
         <w:tc>
           <w:tcPr>
-            <w:tcW w:type="dxa" w:w="3456"/>
+            <w:tcW w:type="dxa" w:w="3600"/>
             <w:shd w:fill="1A365D" w:val="clear"/>
             <w:tcBorders>
               <w:top w:val="single" w:sz="4" w:space="0" w:color="1A365D"/>
@@ -7066,7 +7598,7 @@
         </w:tc>
         <w:tc>
           <w:tcPr>
-            <w:tcW w:type="dxa" w:w="5904"/>
+            <w:tcW w:type="dxa" w:w="5760"/>
             <w:tcBorders>
               <w:top w:val="single" w:sz="4" w:space="0" w:color="CBD5E1"/>
               <w:left w:val="single" w:sz="4" w:space="0" w:color="CBD5E1"/>
@@ -7089,7 +7621,7 @@
                 <w:color w:val="1F2937"/>
                 <w:sz w:val="22"/>
               </w:rPr>
-              <w:t>~3,000,000 STX (300,000 STX × 10 cycles)</w:t>
+              <w:t>~300,000 STX (reusable — returned to sponsor after each cycle)</w:t>
             </w:r>
           </w:p>
         </w:tc>

</xml_diff>

<commit_message>
Add expected on-chain transaction breakdown
Detail pot deploy, activate, start, close, and participant-join
transaction counts per cycle, month, and full 5-month program.

Co-authored-by: cryptosmith.btc <Zeus-Adin@users.noreply.github.com>
</commit_message>
<xml_diff>
--- a/StacksPot-Growth-Acceleration-Proposal.docx
+++ b/StacksPot-Growth-Acceleration-Proposal.docx
@@ -6484,7 +6484,7 @@
     </w:p>
     <w:p>
       <w:pPr>
-        <w:spacing w:before="0" w:after="120" w:lineRule="auto" w:line="276"/>
+        <w:spacing w:before="0" w:after="160" w:lineRule="auto" w:line="276"/>
       </w:pPr>
       <w:r>
         <w:rPr>
@@ -6494,7 +6494,22 @@
           <w:color w:val="1F2937"/>
           <w:sz w:val="22"/>
         </w:rPr>
-        <w:t>With Stacks Endowment support over the 5-month program, StacksPot expects to achieve:</w:t>
+        <w:t>With Stacks Endowment support over the 5-month program, StacksPot expects to achieve measurable on-chain activity across pot lifecycle operations and participant joins. Each of the following is a distinct Stacks transaction.</w:t>
+      </w:r>
+    </w:p>
+    <w:p>
+      <w:pPr>
+        <w:spacing w:before="240" w:after="120" w:lineRule="auto" w:line="276"/>
+      </w:pPr>
+      <w:r>
+        <w:rPr>
+          <w:rFonts w:ascii="Calibri" w:hAnsi="Calibri" w:eastAsia="Calibri"/>
+          <w:b/>
+          <w:i w:val="0"/>
+          <w:color w:val="2B6CB0"/>
+          <w:sz w:val="26"/>
+        </w:rPr>
+        <w:t>Qualitative Outcomes</w:t>
       </w:r>
     </w:p>
     <w:tbl>
@@ -6870,6 +6885,3159 @@
     </w:p>
     <w:p>
       <w:pPr>
+        <w:spacing w:before="240" w:after="120" w:lineRule="auto" w:line="276"/>
+      </w:pPr>
+      <w:r>
+        <w:rPr>
+          <w:rFonts w:ascii="Calibri" w:hAnsi="Calibri" w:eastAsia="Calibri"/>
+          <w:b/>
+          <w:i w:val="0"/>
+          <w:color w:val="2B6CB0"/>
+          <w:sz w:val="26"/>
+        </w:rPr>
+        <w:t>Transaction Baseline (How Counts Are Derived)</w:t>
+      </w:r>
+    </w:p>
+    <w:p>
+      <w:pPr>
+        <w:spacing w:before="0" w:after="120" w:lineRule="auto" w:line="276"/>
+      </w:pPr>
+      <w:r>
+        <w:rPr>
+          <w:rFonts w:ascii="Calibri" w:hAnsi="Calibri" w:eastAsia="Calibri"/>
+          <w:b w:val="0"/>
+          <w:i w:val="0"/>
+          <w:color w:val="1F2937"/>
+          <w:sz w:val="22"/>
+        </w:rPr>
+        <w:t>Pot lifecycle transactions — each sponsored pot generates 4 transactions:</w:t>
+      </w:r>
+    </w:p>
+    <w:tbl>
+      <w:tblPr>
+        <w:tblW w:type="auto" w:w="0"/>
+        <w:jc w:val="center"/>
+        <w:tblLayout w:type="autofit"/>
+        <w:tblLook w:firstColumn="1" w:firstRow="1" w:lastColumn="0" w:lastRow="0" w:noHBand="0" w:noVBand="1" w:val="04A0"/>
+      </w:tblPr>
+      <w:tblGrid>
+        <w:gridCol w:w="3120"/>
+        <w:gridCol w:w="3120"/>
+        <w:gridCol w:w="3120"/>
+      </w:tblGrid>
+      <w:tr>
+        <w:tc>
+          <w:tcPr>
+            <w:tcW w:type="dxa" w:w="2592"/>
+            <w:shd w:fill="1A365D" w:val="clear"/>
+            <w:tcBorders>
+              <w:top w:val="single" w:sz="4" w:space="0" w:color="1A365D"/>
+              <w:left w:val="single" w:sz="4" w:space="0" w:color="1A365D"/>
+              <w:bottom w:val="single" w:sz="4" w:space="0" w:color="1A365D"/>
+              <w:right w:val="single" w:sz="4" w:space="0" w:color="1A365D"/>
+            </w:tcBorders>
+          </w:tcPr>
+          <w:p>
+            <w:pPr>
+              <w:spacing w:before="40" w:after="40" w:lineRule="auto" w:line="240"/>
+              <w:jc w:val="center"/>
+            </w:pPr>
+            <w:r/>
+            <w:r>
+              <w:rPr>
+                <w:rFonts w:ascii="Calibri" w:hAnsi="Calibri" w:eastAsia="Calibri"/>
+                <w:b/>
+                <w:i w:val="0"/>
+                <w:color w:val="FFFFFF"/>
+                <w:sz w:val="20"/>
+              </w:rPr>
+              <w:t>Transaction</w:t>
+            </w:r>
+          </w:p>
+        </w:tc>
+        <w:tc>
+          <w:tcPr>
+            <w:tcW w:type="dxa" w:w="1440"/>
+            <w:shd w:fill="1A365D" w:val="clear"/>
+            <w:tcBorders>
+              <w:top w:val="single" w:sz="4" w:space="0" w:color="1A365D"/>
+              <w:left w:val="single" w:sz="4" w:space="0" w:color="1A365D"/>
+              <w:bottom w:val="single" w:sz="4" w:space="0" w:color="1A365D"/>
+              <w:right w:val="single" w:sz="4" w:space="0" w:color="1A365D"/>
+            </w:tcBorders>
+          </w:tcPr>
+          <w:p>
+            <w:pPr>
+              <w:spacing w:before="40" w:after="40" w:lineRule="auto" w:line="240"/>
+              <w:jc w:val="center"/>
+            </w:pPr>
+            <w:r/>
+            <w:r>
+              <w:rPr>
+                <w:rFonts w:ascii="Calibri" w:hAnsi="Calibri" w:eastAsia="Calibri"/>
+                <w:b/>
+                <w:i w:val="0"/>
+                <w:color w:val="FFFFFF"/>
+                <w:sz w:val="20"/>
+              </w:rPr>
+              <w:t>Per Pot</w:t>
+            </w:r>
+          </w:p>
+        </w:tc>
+        <w:tc>
+          <w:tcPr>
+            <w:tcW w:type="dxa" w:w="5328"/>
+            <w:shd w:fill="1A365D" w:val="clear"/>
+            <w:tcBorders>
+              <w:top w:val="single" w:sz="4" w:space="0" w:color="1A365D"/>
+              <w:left w:val="single" w:sz="4" w:space="0" w:color="1A365D"/>
+              <w:bottom w:val="single" w:sz="4" w:space="0" w:color="1A365D"/>
+              <w:right w:val="single" w:sz="4" w:space="0" w:color="1A365D"/>
+            </w:tcBorders>
+          </w:tcPr>
+          <w:p>
+            <w:pPr>
+              <w:spacing w:before="40" w:after="40" w:lineRule="auto" w:line="240"/>
+              <w:jc w:val="center"/>
+            </w:pPr>
+            <w:r/>
+            <w:r>
+              <w:rPr>
+                <w:rFonts w:ascii="Calibri" w:hAnsi="Calibri" w:eastAsia="Calibri"/>
+                <w:b/>
+                <w:i w:val="0"/>
+                <w:color w:val="FFFFFF"/>
+                <w:sz w:val="20"/>
+              </w:rPr>
+              <w:t>Notes</w:t>
+            </w:r>
+          </w:p>
+        </w:tc>
+      </w:tr>
+      <w:tr>
+        <w:tc>
+          <w:tcPr>
+            <w:tcW w:type="dxa" w:w="2592"/>
+            <w:tcBorders>
+              <w:top w:val="single" w:sz="4" w:space="0" w:color="CBD5E1"/>
+              <w:left w:val="single" w:sz="4" w:space="0" w:color="CBD5E1"/>
+              <w:bottom w:val="single" w:sz="4" w:space="0" w:color="CBD5E1"/>
+              <w:right w:val="single" w:sz="4" w:space="0" w:color="CBD5E1"/>
+            </w:tcBorders>
+          </w:tcPr>
+          <w:p>
+            <w:pPr>
+              <w:spacing w:before="40" w:after="40" w:lineRule="auto" w:line="240"/>
+              <w:jc w:val="center"/>
+            </w:pPr>
+            <w:r/>
+            <w:r>
+              <w:rPr>
+                <w:rFonts w:ascii="Calibri" w:hAnsi="Calibri" w:eastAsia="Calibri"/>
+                <w:b w:val="0"/>
+                <w:i w:val="0"/>
+                <w:color w:val="1F2937"/>
+                <w:sz w:val="20"/>
+              </w:rPr>
+              <w:t>Pot deploy</w:t>
+            </w:r>
+          </w:p>
+        </w:tc>
+        <w:tc>
+          <w:tcPr>
+            <w:tcW w:type="dxa" w:w="1440"/>
+            <w:tcBorders>
+              <w:top w:val="single" w:sz="4" w:space="0" w:color="CBD5E1"/>
+              <w:left w:val="single" w:sz="4" w:space="0" w:color="CBD5E1"/>
+              <w:bottom w:val="single" w:sz="4" w:space="0" w:color="CBD5E1"/>
+              <w:right w:val="single" w:sz="4" w:space="0" w:color="CBD5E1"/>
+            </w:tcBorders>
+          </w:tcPr>
+          <w:p>
+            <w:pPr>
+              <w:spacing w:before="40" w:after="40" w:lineRule="auto" w:line="240"/>
+              <w:jc w:val="left"/>
+            </w:pPr>
+            <w:r/>
+            <w:r>
+              <w:rPr>
+                <w:rFonts w:ascii="Calibri" w:hAnsi="Calibri" w:eastAsia="Calibri"/>
+                <w:b w:val="0"/>
+                <w:i w:val="0"/>
+                <w:color w:val="1F2937"/>
+                <w:sz w:val="20"/>
+              </w:rPr>
+              <w:t>1</w:t>
+            </w:r>
+          </w:p>
+        </w:tc>
+        <w:tc>
+          <w:tcPr>
+            <w:tcW w:type="dxa" w:w="5328"/>
+            <w:tcBorders>
+              <w:top w:val="single" w:sz="4" w:space="0" w:color="CBD5E1"/>
+              <w:left w:val="single" w:sz="4" w:space="0" w:color="CBD5E1"/>
+              <w:bottom w:val="single" w:sz="4" w:space="0" w:color="CBD5E1"/>
+              <w:right w:val="single" w:sz="4" w:space="0" w:color="CBD5E1"/>
+            </w:tcBorders>
+          </w:tcPr>
+          <w:p>
+            <w:pPr>
+              <w:spacing w:before="40" w:after="40" w:lineRule="auto" w:line="240"/>
+              <w:jc w:val="right"/>
+            </w:pPr>
+            <w:r/>
+            <w:r>
+              <w:rPr>
+                <w:rFonts w:ascii="Calibri" w:hAnsi="Calibri" w:eastAsia="Calibri"/>
+                <w:b w:val="0"/>
+                <w:i w:val="0"/>
+                <w:color w:val="1F2937"/>
+                <w:sz w:val="20"/>
+              </w:rPr>
+              <w:t>Creates the pot contract / instance</w:t>
+            </w:r>
+          </w:p>
+        </w:tc>
+      </w:tr>
+      <w:tr>
+        <w:tc>
+          <w:tcPr>
+            <w:tcW w:type="dxa" w:w="2592"/>
+            <w:shd w:fill="F7FAFC" w:val="clear"/>
+            <w:tcBorders>
+              <w:top w:val="single" w:sz="4" w:space="0" w:color="CBD5E1"/>
+              <w:left w:val="single" w:sz="4" w:space="0" w:color="CBD5E1"/>
+              <w:bottom w:val="single" w:sz="4" w:space="0" w:color="CBD5E1"/>
+              <w:right w:val="single" w:sz="4" w:space="0" w:color="CBD5E1"/>
+            </w:tcBorders>
+          </w:tcPr>
+          <w:p>
+            <w:pPr>
+              <w:spacing w:before="40" w:after="40" w:lineRule="auto" w:line="240"/>
+              <w:jc w:val="center"/>
+            </w:pPr>
+            <w:r/>
+            <w:r>
+              <w:rPr>
+                <w:rFonts w:ascii="Calibri" w:hAnsi="Calibri" w:eastAsia="Calibri"/>
+                <w:b w:val="0"/>
+                <w:i w:val="0"/>
+                <w:color w:val="1F2937"/>
+                <w:sz w:val="20"/>
+              </w:rPr>
+              <w:t>Pot activate</w:t>
+            </w:r>
+          </w:p>
+        </w:tc>
+        <w:tc>
+          <w:tcPr>
+            <w:tcW w:type="dxa" w:w="1440"/>
+            <w:shd w:fill="F7FAFC" w:val="clear"/>
+            <w:tcBorders>
+              <w:top w:val="single" w:sz="4" w:space="0" w:color="CBD5E1"/>
+              <w:left w:val="single" w:sz="4" w:space="0" w:color="CBD5E1"/>
+              <w:bottom w:val="single" w:sz="4" w:space="0" w:color="CBD5E1"/>
+              <w:right w:val="single" w:sz="4" w:space="0" w:color="CBD5E1"/>
+            </w:tcBorders>
+          </w:tcPr>
+          <w:p>
+            <w:pPr>
+              <w:spacing w:before="40" w:after="40" w:lineRule="auto" w:line="240"/>
+              <w:jc w:val="left"/>
+            </w:pPr>
+            <w:r/>
+            <w:r>
+              <w:rPr>
+                <w:rFonts w:ascii="Calibri" w:hAnsi="Calibri" w:eastAsia="Calibri"/>
+                <w:b w:val="0"/>
+                <w:i w:val="0"/>
+                <w:color w:val="1F2937"/>
+                <w:sz w:val="20"/>
+              </w:rPr>
+              <w:t>1</w:t>
+            </w:r>
+          </w:p>
+        </w:tc>
+        <w:tc>
+          <w:tcPr>
+            <w:tcW w:type="dxa" w:w="5328"/>
+            <w:shd w:fill="F7FAFC" w:val="clear"/>
+            <w:tcBorders>
+              <w:top w:val="single" w:sz="4" w:space="0" w:color="CBD5E1"/>
+              <w:left w:val="single" w:sz="4" w:space="0" w:color="CBD5E1"/>
+              <w:bottom w:val="single" w:sz="4" w:space="0" w:color="CBD5E1"/>
+              <w:right w:val="single" w:sz="4" w:space="0" w:color="CBD5E1"/>
+            </w:tcBorders>
+          </w:tcPr>
+          <w:p>
+            <w:pPr>
+              <w:spacing w:before="40" w:after="40" w:lineRule="auto" w:line="240"/>
+              <w:jc w:val="right"/>
+            </w:pPr>
+            <w:r/>
+            <w:r>
+              <w:rPr>
+                <w:rFonts w:ascii="Calibri" w:hAnsi="Calibri" w:eastAsia="Calibri"/>
+                <w:b w:val="0"/>
+                <w:i w:val="0"/>
+                <w:color w:val="1F2937"/>
+                <w:sz w:val="20"/>
+              </w:rPr>
+              <w:t>Enables the pot for the cycle</w:t>
+            </w:r>
+          </w:p>
+        </w:tc>
+      </w:tr>
+      <w:tr>
+        <w:tc>
+          <w:tcPr>
+            <w:tcW w:type="dxa" w:w="2592"/>
+            <w:tcBorders>
+              <w:top w:val="single" w:sz="4" w:space="0" w:color="CBD5E1"/>
+              <w:left w:val="single" w:sz="4" w:space="0" w:color="CBD5E1"/>
+              <w:bottom w:val="single" w:sz="4" w:space="0" w:color="CBD5E1"/>
+              <w:right w:val="single" w:sz="4" w:space="0" w:color="CBD5E1"/>
+            </w:tcBorders>
+          </w:tcPr>
+          <w:p>
+            <w:pPr>
+              <w:spacing w:before="40" w:after="40" w:lineRule="auto" w:line="240"/>
+              <w:jc w:val="center"/>
+            </w:pPr>
+            <w:r/>
+            <w:r>
+              <w:rPr>
+                <w:rFonts w:ascii="Calibri" w:hAnsi="Calibri" w:eastAsia="Calibri"/>
+                <w:b w:val="0"/>
+                <w:i w:val="0"/>
+                <w:color w:val="1F2937"/>
+                <w:sz w:val="20"/>
+              </w:rPr>
+              <w:t>Pot start</w:t>
+            </w:r>
+          </w:p>
+        </w:tc>
+        <w:tc>
+          <w:tcPr>
+            <w:tcW w:type="dxa" w:w="1440"/>
+            <w:tcBorders>
+              <w:top w:val="single" w:sz="4" w:space="0" w:color="CBD5E1"/>
+              <w:left w:val="single" w:sz="4" w:space="0" w:color="CBD5E1"/>
+              <w:bottom w:val="single" w:sz="4" w:space="0" w:color="CBD5E1"/>
+              <w:right w:val="single" w:sz="4" w:space="0" w:color="CBD5E1"/>
+            </w:tcBorders>
+          </w:tcPr>
+          <w:p>
+            <w:pPr>
+              <w:spacing w:before="40" w:after="40" w:lineRule="auto" w:line="240"/>
+              <w:jc w:val="left"/>
+            </w:pPr>
+            <w:r/>
+            <w:r>
+              <w:rPr>
+                <w:rFonts w:ascii="Calibri" w:hAnsi="Calibri" w:eastAsia="Calibri"/>
+                <w:b w:val="0"/>
+                <w:i w:val="0"/>
+                <w:color w:val="1F2937"/>
+                <w:sz w:val="20"/>
+              </w:rPr>
+              <w:t>1</w:t>
+            </w:r>
+          </w:p>
+        </w:tc>
+        <w:tc>
+          <w:tcPr>
+            <w:tcW w:type="dxa" w:w="5328"/>
+            <w:tcBorders>
+              <w:top w:val="single" w:sz="4" w:space="0" w:color="CBD5E1"/>
+              <w:left w:val="single" w:sz="4" w:space="0" w:color="CBD5E1"/>
+              <w:bottom w:val="single" w:sz="4" w:space="0" w:color="CBD5E1"/>
+              <w:right w:val="single" w:sz="4" w:space="0" w:color="CBD5E1"/>
+            </w:tcBorders>
+          </w:tcPr>
+          <w:p>
+            <w:pPr>
+              <w:spacing w:before="40" w:after="40" w:lineRule="auto" w:line="240"/>
+              <w:jc w:val="right"/>
+            </w:pPr>
+            <w:r/>
+            <w:r>
+              <w:rPr>
+                <w:rFonts w:ascii="Calibri" w:hAnsi="Calibri" w:eastAsia="Calibri"/>
+                <w:b w:val="0"/>
+                <w:i w:val="0"/>
+                <w:color w:val="1F2937"/>
+                <w:sz w:val="20"/>
+              </w:rPr>
+              <w:t>Opens the pot for participation</w:t>
+            </w:r>
+          </w:p>
+        </w:tc>
+      </w:tr>
+      <w:tr>
+        <w:tc>
+          <w:tcPr>
+            <w:tcW w:type="dxa" w:w="2592"/>
+            <w:shd w:fill="F7FAFC" w:val="clear"/>
+            <w:tcBorders>
+              <w:top w:val="single" w:sz="4" w:space="0" w:color="CBD5E1"/>
+              <w:left w:val="single" w:sz="4" w:space="0" w:color="CBD5E1"/>
+              <w:bottom w:val="single" w:sz="4" w:space="0" w:color="CBD5E1"/>
+              <w:right w:val="single" w:sz="4" w:space="0" w:color="CBD5E1"/>
+            </w:tcBorders>
+          </w:tcPr>
+          <w:p>
+            <w:pPr>
+              <w:spacing w:before="40" w:after="40" w:lineRule="auto" w:line="240"/>
+              <w:jc w:val="center"/>
+            </w:pPr>
+            <w:r/>
+            <w:r>
+              <w:rPr>
+                <w:rFonts w:ascii="Calibri" w:hAnsi="Calibri" w:eastAsia="Calibri"/>
+                <w:b w:val="0"/>
+                <w:i w:val="0"/>
+                <w:color w:val="1F2937"/>
+                <w:sz w:val="20"/>
+              </w:rPr>
+              <w:t>Pot close</w:t>
+            </w:r>
+          </w:p>
+        </w:tc>
+        <w:tc>
+          <w:tcPr>
+            <w:tcW w:type="dxa" w:w="1440"/>
+            <w:shd w:fill="F7FAFC" w:val="clear"/>
+            <w:tcBorders>
+              <w:top w:val="single" w:sz="4" w:space="0" w:color="CBD5E1"/>
+              <w:left w:val="single" w:sz="4" w:space="0" w:color="CBD5E1"/>
+              <w:bottom w:val="single" w:sz="4" w:space="0" w:color="CBD5E1"/>
+              <w:right w:val="single" w:sz="4" w:space="0" w:color="CBD5E1"/>
+            </w:tcBorders>
+          </w:tcPr>
+          <w:p>
+            <w:pPr>
+              <w:spacing w:before="40" w:after="40" w:lineRule="auto" w:line="240"/>
+              <w:jc w:val="left"/>
+            </w:pPr>
+            <w:r/>
+            <w:r>
+              <w:rPr>
+                <w:rFonts w:ascii="Calibri" w:hAnsi="Calibri" w:eastAsia="Calibri"/>
+                <w:b w:val="0"/>
+                <w:i w:val="0"/>
+                <w:color w:val="1F2937"/>
+                <w:sz w:val="20"/>
+              </w:rPr>
+              <w:t>1</w:t>
+            </w:r>
+          </w:p>
+        </w:tc>
+        <w:tc>
+          <w:tcPr>
+            <w:tcW w:type="dxa" w:w="5328"/>
+            <w:shd w:fill="F7FAFC" w:val="clear"/>
+            <w:tcBorders>
+              <w:top w:val="single" w:sz="4" w:space="0" w:color="CBD5E1"/>
+              <w:left w:val="single" w:sz="4" w:space="0" w:color="CBD5E1"/>
+              <w:bottom w:val="single" w:sz="4" w:space="0" w:color="CBD5E1"/>
+              <w:right w:val="single" w:sz="4" w:space="0" w:color="CBD5E1"/>
+            </w:tcBorders>
+          </w:tcPr>
+          <w:p>
+            <w:pPr>
+              <w:spacing w:before="40" w:after="40" w:lineRule="auto" w:line="240"/>
+              <w:jc w:val="right"/>
+            </w:pPr>
+            <w:r/>
+            <w:r>
+              <w:rPr>
+                <w:rFonts w:ascii="Calibri" w:hAnsi="Calibri" w:eastAsia="Calibri"/>
+                <w:b w:val="0"/>
+                <w:i w:val="0"/>
+                <w:color w:val="1F2937"/>
+                <w:sz w:val="20"/>
+              </w:rPr>
+              <w:t>Closes the pot at cycle end</w:t>
+            </w:r>
+          </w:p>
+        </w:tc>
+      </w:tr>
+      <w:tr>
+        <w:tc>
+          <w:tcPr>
+            <w:tcW w:type="dxa" w:w="2592"/>
+            <w:shd w:fill="EEF2F7" w:val="clear"/>
+            <w:tcBorders>
+              <w:top w:val="single" w:sz="4" w:space="0" w:color="CBD5E1"/>
+              <w:left w:val="single" w:sz="4" w:space="0" w:color="CBD5E1"/>
+              <w:bottom w:val="single" w:sz="4" w:space="0" w:color="CBD5E1"/>
+              <w:right w:val="single" w:sz="4" w:space="0" w:color="CBD5E1"/>
+            </w:tcBorders>
+          </w:tcPr>
+          <w:p>
+            <w:pPr>
+              <w:spacing w:before="40" w:after="40" w:lineRule="auto" w:line="240"/>
+              <w:jc w:val="center"/>
+            </w:pPr>
+            <w:r/>
+            <w:r>
+              <w:rPr>
+                <w:rFonts w:ascii="Calibri" w:hAnsi="Calibri" w:eastAsia="Calibri"/>
+                <w:b/>
+                <w:i w:val="0"/>
+                <w:color w:val="1A365D"/>
+                <w:sz w:val="20"/>
+              </w:rPr>
+              <w:t>Lifecycle subtotal</w:t>
+            </w:r>
+          </w:p>
+        </w:tc>
+        <w:tc>
+          <w:tcPr>
+            <w:tcW w:type="dxa" w:w="1440"/>
+            <w:shd w:fill="EEF2F7" w:val="clear"/>
+            <w:tcBorders>
+              <w:top w:val="single" w:sz="4" w:space="0" w:color="CBD5E1"/>
+              <w:left w:val="single" w:sz="4" w:space="0" w:color="CBD5E1"/>
+              <w:bottom w:val="single" w:sz="4" w:space="0" w:color="CBD5E1"/>
+              <w:right w:val="single" w:sz="4" w:space="0" w:color="CBD5E1"/>
+            </w:tcBorders>
+          </w:tcPr>
+          <w:p>
+            <w:pPr>
+              <w:spacing w:before="40" w:after="40" w:lineRule="auto" w:line="240"/>
+              <w:jc w:val="left"/>
+            </w:pPr>
+            <w:r/>
+            <w:r>
+              <w:rPr>
+                <w:rFonts w:ascii="Calibri" w:hAnsi="Calibri" w:eastAsia="Calibri"/>
+                <w:b/>
+                <w:i w:val="0"/>
+                <w:color w:val="1A365D"/>
+                <w:sz w:val="20"/>
+              </w:rPr>
+              <w:t>4</w:t>
+            </w:r>
+          </w:p>
+        </w:tc>
+        <w:tc>
+          <w:tcPr>
+            <w:tcW w:type="dxa" w:w="5328"/>
+            <w:shd w:fill="EEF2F7" w:val="clear"/>
+            <w:tcBorders>
+              <w:top w:val="single" w:sz="4" w:space="0" w:color="CBD5E1"/>
+              <w:left w:val="single" w:sz="4" w:space="0" w:color="CBD5E1"/>
+              <w:bottom w:val="single" w:sz="4" w:space="0" w:color="CBD5E1"/>
+              <w:right w:val="single" w:sz="4" w:space="0" w:color="CBD5E1"/>
+            </w:tcBorders>
+          </w:tcPr>
+          <w:p>
+            <w:pPr>
+              <w:spacing w:before="40" w:after="40" w:lineRule="auto" w:line="240"/>
+              <w:jc w:val="right"/>
+            </w:pPr>
+            <w:r/>
+            <w:r>
+              <w:rPr>
+                <w:rFonts w:ascii="Calibri" w:hAnsi="Calibri" w:eastAsia="Calibri"/>
+                <w:b/>
+                <w:i w:val="0"/>
+                <w:color w:val="1A365D"/>
+                <w:sz w:val="20"/>
+              </w:rPr>
+              <w:t>Per pot, every cycle</w:t>
+            </w:r>
+          </w:p>
+        </w:tc>
+      </w:tr>
+    </w:tbl>
+    <w:p>
+      <w:pPr>
+        <w:spacing w:before="0" w:after="120" w:lineRule="auto" w:line="240"/>
+      </w:pPr>
+    </w:p>
+    <w:p>
+      <w:pPr>
+        <w:spacing w:before="0" w:after="120" w:lineRule="auto" w:line="276"/>
+      </w:pPr>
+      <w:r>
+        <w:rPr>
+          <w:rFonts w:ascii="Calibri" w:hAnsi="Calibri" w:eastAsia="Calibri"/>
+          <w:b w:val="0"/>
+          <w:i w:val="0"/>
+          <w:color w:val="1F2937"/>
+          <w:sz w:val="22"/>
+        </w:rPr>
+        <w:t>Participant join transactions — each joined participant is 1 transaction. Minimum joins use the per-tier Min. Participants from the cycle allocation table:</w:t>
+      </w:r>
+    </w:p>
+    <w:tbl>
+      <w:tblPr>
+        <w:tblW w:type="auto" w:w="0"/>
+        <w:jc w:val="center"/>
+        <w:tblLayout w:type="autofit"/>
+        <w:tblLook w:firstColumn="1" w:firstRow="1" w:lastColumn="0" w:lastRow="0" w:noHBand="0" w:noVBand="1" w:val="04A0"/>
+      </w:tblPr>
+      <w:tblGrid>
+        <w:gridCol w:w="2340"/>
+        <w:gridCol w:w="2340"/>
+        <w:gridCol w:w="2340"/>
+        <w:gridCol w:w="2340"/>
+      </w:tblGrid>
+      <w:tr>
+        <w:tc>
+          <w:tcPr>
+            <w:tcW w:type="dxa" w:w="2016"/>
+            <w:shd w:fill="1A365D" w:val="clear"/>
+            <w:tcBorders>
+              <w:top w:val="single" w:sz="4" w:space="0" w:color="1A365D"/>
+              <w:left w:val="single" w:sz="4" w:space="0" w:color="1A365D"/>
+              <w:bottom w:val="single" w:sz="4" w:space="0" w:color="1A365D"/>
+              <w:right w:val="single" w:sz="4" w:space="0" w:color="1A365D"/>
+            </w:tcBorders>
+          </w:tcPr>
+          <w:p>
+            <w:pPr>
+              <w:spacing w:before="40" w:after="40" w:lineRule="auto" w:line="240"/>
+              <w:jc w:val="center"/>
+            </w:pPr>
+            <w:r/>
+            <w:r>
+              <w:rPr>
+                <w:rFonts w:ascii="Calibri" w:hAnsi="Calibri" w:eastAsia="Calibri"/>
+                <w:b/>
+                <w:i w:val="0"/>
+                <w:color w:val="FFFFFF"/>
+                <w:sz w:val="20"/>
+              </w:rPr>
+              <w:t>Entry Min.</w:t>
+            </w:r>
+          </w:p>
+        </w:tc>
+        <w:tc>
+          <w:tcPr>
+            <w:tcW w:type="dxa" w:w="1872"/>
+            <w:shd w:fill="1A365D" w:val="clear"/>
+            <w:tcBorders>
+              <w:top w:val="single" w:sz="4" w:space="0" w:color="1A365D"/>
+              <w:left w:val="single" w:sz="4" w:space="0" w:color="1A365D"/>
+              <w:bottom w:val="single" w:sz="4" w:space="0" w:color="1A365D"/>
+              <w:right w:val="single" w:sz="4" w:space="0" w:color="1A365D"/>
+            </w:tcBorders>
+          </w:tcPr>
+          <w:p>
+            <w:pPr>
+              <w:spacing w:before="40" w:after="40" w:lineRule="auto" w:line="240"/>
+              <w:jc w:val="center"/>
+            </w:pPr>
+            <w:r/>
+            <w:r>
+              <w:rPr>
+                <w:rFonts w:ascii="Calibri" w:hAnsi="Calibri" w:eastAsia="Calibri"/>
+                <w:b/>
+                <w:i w:val="0"/>
+                <w:color w:val="FFFFFF"/>
+                <w:sz w:val="20"/>
+              </w:rPr>
+              <w:t>Qty / Cycle</w:t>
+            </w:r>
+          </w:p>
+        </w:tc>
+        <w:tc>
+          <w:tcPr>
+            <w:tcW w:type="dxa" w:w="2880"/>
+            <w:shd w:fill="1A365D" w:val="clear"/>
+            <w:tcBorders>
+              <w:top w:val="single" w:sz="4" w:space="0" w:color="1A365D"/>
+              <w:left w:val="single" w:sz="4" w:space="0" w:color="1A365D"/>
+              <w:bottom w:val="single" w:sz="4" w:space="0" w:color="1A365D"/>
+              <w:right w:val="single" w:sz="4" w:space="0" w:color="1A365D"/>
+            </w:tcBorders>
+          </w:tcPr>
+          <w:p>
+            <w:pPr>
+              <w:spacing w:before="40" w:after="40" w:lineRule="auto" w:line="240"/>
+              <w:jc w:val="center"/>
+            </w:pPr>
+            <w:r/>
+            <w:r>
+              <w:rPr>
+                <w:rFonts w:ascii="Calibri" w:hAnsi="Calibri" w:eastAsia="Calibri"/>
+                <w:b/>
+                <w:i w:val="0"/>
+                <w:color w:val="FFFFFF"/>
+                <w:sz w:val="20"/>
+              </w:rPr>
+              <w:t>Min. Participants / Pot</w:t>
+            </w:r>
+          </w:p>
+        </w:tc>
+        <w:tc>
+          <w:tcPr>
+            <w:tcW w:type="dxa" w:w="2592"/>
+            <w:shd w:fill="1A365D" w:val="clear"/>
+            <w:tcBorders>
+              <w:top w:val="single" w:sz="4" w:space="0" w:color="1A365D"/>
+              <w:left w:val="single" w:sz="4" w:space="0" w:color="1A365D"/>
+              <w:bottom w:val="single" w:sz="4" w:space="0" w:color="1A365D"/>
+              <w:right w:val="single" w:sz="4" w:space="0" w:color="1A365D"/>
+            </w:tcBorders>
+          </w:tcPr>
+          <w:p>
+            <w:pPr>
+              <w:spacing w:before="40" w:after="40" w:lineRule="auto" w:line="240"/>
+              <w:jc w:val="center"/>
+            </w:pPr>
+            <w:r/>
+            <w:r>
+              <w:rPr>
+                <w:rFonts w:ascii="Calibri" w:hAnsi="Calibri" w:eastAsia="Calibri"/>
+                <w:b/>
+                <w:i w:val="0"/>
+                <w:color w:val="FFFFFF"/>
+                <w:sz w:val="20"/>
+              </w:rPr>
+              <w:t>Join Txs / Cycle</w:t>
+            </w:r>
+          </w:p>
+        </w:tc>
+      </w:tr>
+      <w:tr>
+        <w:tc>
+          <w:tcPr>
+            <w:tcW w:type="dxa" w:w="2016"/>
+            <w:tcBorders>
+              <w:top w:val="single" w:sz="4" w:space="0" w:color="CBD5E1"/>
+              <w:left w:val="single" w:sz="4" w:space="0" w:color="CBD5E1"/>
+              <w:bottom w:val="single" w:sz="4" w:space="0" w:color="CBD5E1"/>
+              <w:right w:val="single" w:sz="4" w:space="0" w:color="CBD5E1"/>
+            </w:tcBorders>
+          </w:tcPr>
+          <w:p>
+            <w:pPr>
+              <w:spacing w:before="40" w:after="40" w:lineRule="auto" w:line="240"/>
+              <w:jc w:val="center"/>
+            </w:pPr>
+            <w:r/>
+            <w:r>
+              <w:rPr>
+                <w:rFonts w:ascii="Calibri" w:hAnsi="Calibri" w:eastAsia="Calibri"/>
+                <w:b w:val="0"/>
+                <w:i w:val="0"/>
+                <w:color w:val="1F2937"/>
+                <w:sz w:val="20"/>
+              </w:rPr>
+              <w:t>25 STX</w:t>
+            </w:r>
+          </w:p>
+        </w:tc>
+        <w:tc>
+          <w:tcPr>
+            <w:tcW w:type="dxa" w:w="1872"/>
+            <w:tcBorders>
+              <w:top w:val="single" w:sz="4" w:space="0" w:color="CBD5E1"/>
+              <w:left w:val="single" w:sz="4" w:space="0" w:color="CBD5E1"/>
+              <w:bottom w:val="single" w:sz="4" w:space="0" w:color="CBD5E1"/>
+              <w:right w:val="single" w:sz="4" w:space="0" w:color="CBD5E1"/>
+            </w:tcBorders>
+          </w:tcPr>
+          <w:p>
+            <w:pPr>
+              <w:spacing w:before="40" w:after="40" w:lineRule="auto" w:line="240"/>
+              <w:jc w:val="left"/>
+            </w:pPr>
+            <w:r/>
+            <w:r>
+              <w:rPr>
+                <w:rFonts w:ascii="Calibri" w:hAnsi="Calibri" w:eastAsia="Calibri"/>
+                <w:b w:val="0"/>
+                <w:i w:val="0"/>
+                <w:color w:val="1F2937"/>
+                <w:sz w:val="20"/>
+              </w:rPr>
+              <w:t>1</w:t>
+            </w:r>
+          </w:p>
+        </w:tc>
+        <w:tc>
+          <w:tcPr>
+            <w:tcW w:type="dxa" w:w="2880"/>
+            <w:tcBorders>
+              <w:top w:val="single" w:sz="4" w:space="0" w:color="CBD5E1"/>
+              <w:left w:val="single" w:sz="4" w:space="0" w:color="CBD5E1"/>
+              <w:bottom w:val="single" w:sz="4" w:space="0" w:color="CBD5E1"/>
+              <w:right w:val="single" w:sz="4" w:space="0" w:color="CBD5E1"/>
+            </w:tcBorders>
+          </w:tcPr>
+          <w:p>
+            <w:pPr>
+              <w:spacing w:before="40" w:after="40" w:lineRule="auto" w:line="240"/>
+              <w:jc w:val="left"/>
+            </w:pPr>
+            <w:r/>
+            <w:r>
+              <w:rPr>
+                <w:rFonts w:ascii="Calibri" w:hAnsi="Calibri" w:eastAsia="Calibri"/>
+                <w:b w:val="0"/>
+                <w:i w:val="0"/>
+                <w:color w:val="1F2937"/>
+                <w:sz w:val="20"/>
+              </w:rPr>
+              <w:t>10</w:t>
+            </w:r>
+          </w:p>
+        </w:tc>
+        <w:tc>
+          <w:tcPr>
+            <w:tcW w:type="dxa" w:w="2592"/>
+            <w:tcBorders>
+              <w:top w:val="single" w:sz="4" w:space="0" w:color="CBD5E1"/>
+              <w:left w:val="single" w:sz="4" w:space="0" w:color="CBD5E1"/>
+              <w:bottom w:val="single" w:sz="4" w:space="0" w:color="CBD5E1"/>
+              <w:right w:val="single" w:sz="4" w:space="0" w:color="CBD5E1"/>
+            </w:tcBorders>
+          </w:tcPr>
+          <w:p>
+            <w:pPr>
+              <w:spacing w:before="40" w:after="40" w:lineRule="auto" w:line="240"/>
+              <w:jc w:val="left"/>
+            </w:pPr>
+            <w:r/>
+            <w:r>
+              <w:rPr>
+                <w:rFonts w:ascii="Calibri" w:hAnsi="Calibri" w:eastAsia="Calibri"/>
+                <w:b w:val="0"/>
+                <w:i w:val="0"/>
+                <w:color w:val="1F2937"/>
+                <w:sz w:val="20"/>
+              </w:rPr>
+              <w:t>10</w:t>
+            </w:r>
+          </w:p>
+        </w:tc>
+      </w:tr>
+      <w:tr>
+        <w:tc>
+          <w:tcPr>
+            <w:tcW w:type="dxa" w:w="2016"/>
+            <w:shd w:fill="F7FAFC" w:val="clear"/>
+            <w:tcBorders>
+              <w:top w:val="single" w:sz="4" w:space="0" w:color="CBD5E1"/>
+              <w:left w:val="single" w:sz="4" w:space="0" w:color="CBD5E1"/>
+              <w:bottom w:val="single" w:sz="4" w:space="0" w:color="CBD5E1"/>
+              <w:right w:val="single" w:sz="4" w:space="0" w:color="CBD5E1"/>
+            </w:tcBorders>
+          </w:tcPr>
+          <w:p>
+            <w:pPr>
+              <w:spacing w:before="40" w:after="40" w:lineRule="auto" w:line="240"/>
+              <w:jc w:val="center"/>
+            </w:pPr>
+            <w:r/>
+            <w:r>
+              <w:rPr>
+                <w:rFonts w:ascii="Calibri" w:hAnsi="Calibri" w:eastAsia="Calibri"/>
+                <w:b w:val="0"/>
+                <w:i w:val="0"/>
+                <w:color w:val="1F2937"/>
+                <w:sz w:val="20"/>
+              </w:rPr>
+              <w:t>30 STX</w:t>
+            </w:r>
+          </w:p>
+        </w:tc>
+        <w:tc>
+          <w:tcPr>
+            <w:tcW w:type="dxa" w:w="1872"/>
+            <w:shd w:fill="F7FAFC" w:val="clear"/>
+            <w:tcBorders>
+              <w:top w:val="single" w:sz="4" w:space="0" w:color="CBD5E1"/>
+              <w:left w:val="single" w:sz="4" w:space="0" w:color="CBD5E1"/>
+              <w:bottom w:val="single" w:sz="4" w:space="0" w:color="CBD5E1"/>
+              <w:right w:val="single" w:sz="4" w:space="0" w:color="CBD5E1"/>
+            </w:tcBorders>
+          </w:tcPr>
+          <w:p>
+            <w:pPr>
+              <w:spacing w:before="40" w:after="40" w:lineRule="auto" w:line="240"/>
+              <w:jc w:val="left"/>
+            </w:pPr>
+            <w:r/>
+            <w:r>
+              <w:rPr>
+                <w:rFonts w:ascii="Calibri" w:hAnsi="Calibri" w:eastAsia="Calibri"/>
+                <w:b w:val="0"/>
+                <w:i w:val="0"/>
+                <w:color w:val="1F2937"/>
+                <w:sz w:val="20"/>
+              </w:rPr>
+              <w:t>1</w:t>
+            </w:r>
+          </w:p>
+        </w:tc>
+        <w:tc>
+          <w:tcPr>
+            <w:tcW w:type="dxa" w:w="2880"/>
+            <w:shd w:fill="F7FAFC" w:val="clear"/>
+            <w:tcBorders>
+              <w:top w:val="single" w:sz="4" w:space="0" w:color="CBD5E1"/>
+              <w:left w:val="single" w:sz="4" w:space="0" w:color="CBD5E1"/>
+              <w:bottom w:val="single" w:sz="4" w:space="0" w:color="CBD5E1"/>
+              <w:right w:val="single" w:sz="4" w:space="0" w:color="CBD5E1"/>
+            </w:tcBorders>
+          </w:tcPr>
+          <w:p>
+            <w:pPr>
+              <w:spacing w:before="40" w:after="40" w:lineRule="auto" w:line="240"/>
+              <w:jc w:val="left"/>
+            </w:pPr>
+            <w:r/>
+            <w:r>
+              <w:rPr>
+                <w:rFonts w:ascii="Calibri" w:hAnsi="Calibri" w:eastAsia="Calibri"/>
+                <w:b w:val="0"/>
+                <w:i w:val="0"/>
+                <w:color w:val="1F2937"/>
+                <w:sz w:val="20"/>
+              </w:rPr>
+              <w:t>15</w:t>
+            </w:r>
+          </w:p>
+        </w:tc>
+        <w:tc>
+          <w:tcPr>
+            <w:tcW w:type="dxa" w:w="2592"/>
+            <w:shd w:fill="F7FAFC" w:val="clear"/>
+            <w:tcBorders>
+              <w:top w:val="single" w:sz="4" w:space="0" w:color="CBD5E1"/>
+              <w:left w:val="single" w:sz="4" w:space="0" w:color="CBD5E1"/>
+              <w:bottom w:val="single" w:sz="4" w:space="0" w:color="CBD5E1"/>
+              <w:right w:val="single" w:sz="4" w:space="0" w:color="CBD5E1"/>
+            </w:tcBorders>
+          </w:tcPr>
+          <w:p>
+            <w:pPr>
+              <w:spacing w:before="40" w:after="40" w:lineRule="auto" w:line="240"/>
+              <w:jc w:val="left"/>
+            </w:pPr>
+            <w:r/>
+            <w:r>
+              <w:rPr>
+                <w:rFonts w:ascii="Calibri" w:hAnsi="Calibri" w:eastAsia="Calibri"/>
+                <w:b w:val="0"/>
+                <w:i w:val="0"/>
+                <w:color w:val="1F2937"/>
+                <w:sz w:val="20"/>
+              </w:rPr>
+              <w:t>15</w:t>
+            </w:r>
+          </w:p>
+        </w:tc>
+      </w:tr>
+      <w:tr>
+        <w:tc>
+          <w:tcPr>
+            <w:tcW w:type="dxa" w:w="2016"/>
+            <w:tcBorders>
+              <w:top w:val="single" w:sz="4" w:space="0" w:color="CBD5E1"/>
+              <w:left w:val="single" w:sz="4" w:space="0" w:color="CBD5E1"/>
+              <w:bottom w:val="single" w:sz="4" w:space="0" w:color="CBD5E1"/>
+              <w:right w:val="single" w:sz="4" w:space="0" w:color="CBD5E1"/>
+            </w:tcBorders>
+          </w:tcPr>
+          <w:p>
+            <w:pPr>
+              <w:spacing w:before="40" w:after="40" w:lineRule="auto" w:line="240"/>
+              <w:jc w:val="center"/>
+            </w:pPr>
+            <w:r/>
+            <w:r>
+              <w:rPr>
+                <w:rFonts w:ascii="Calibri" w:hAnsi="Calibri" w:eastAsia="Calibri"/>
+                <w:b w:val="0"/>
+                <w:i w:val="0"/>
+                <w:color w:val="1F2937"/>
+                <w:sz w:val="20"/>
+              </w:rPr>
+              <w:t>35 STX</w:t>
+            </w:r>
+          </w:p>
+        </w:tc>
+        <w:tc>
+          <w:tcPr>
+            <w:tcW w:type="dxa" w:w="1872"/>
+            <w:tcBorders>
+              <w:top w:val="single" w:sz="4" w:space="0" w:color="CBD5E1"/>
+              <w:left w:val="single" w:sz="4" w:space="0" w:color="CBD5E1"/>
+              <w:bottom w:val="single" w:sz="4" w:space="0" w:color="CBD5E1"/>
+              <w:right w:val="single" w:sz="4" w:space="0" w:color="CBD5E1"/>
+            </w:tcBorders>
+          </w:tcPr>
+          <w:p>
+            <w:pPr>
+              <w:spacing w:before="40" w:after="40" w:lineRule="auto" w:line="240"/>
+              <w:jc w:val="left"/>
+            </w:pPr>
+            <w:r/>
+            <w:r>
+              <w:rPr>
+                <w:rFonts w:ascii="Calibri" w:hAnsi="Calibri" w:eastAsia="Calibri"/>
+                <w:b w:val="0"/>
+                <w:i w:val="0"/>
+                <w:color w:val="1F2937"/>
+                <w:sz w:val="20"/>
+              </w:rPr>
+              <w:t>1</w:t>
+            </w:r>
+          </w:p>
+        </w:tc>
+        <w:tc>
+          <w:tcPr>
+            <w:tcW w:type="dxa" w:w="2880"/>
+            <w:tcBorders>
+              <w:top w:val="single" w:sz="4" w:space="0" w:color="CBD5E1"/>
+              <w:left w:val="single" w:sz="4" w:space="0" w:color="CBD5E1"/>
+              <w:bottom w:val="single" w:sz="4" w:space="0" w:color="CBD5E1"/>
+              <w:right w:val="single" w:sz="4" w:space="0" w:color="CBD5E1"/>
+            </w:tcBorders>
+          </w:tcPr>
+          <w:p>
+            <w:pPr>
+              <w:spacing w:before="40" w:after="40" w:lineRule="auto" w:line="240"/>
+              <w:jc w:val="left"/>
+            </w:pPr>
+            <w:r/>
+            <w:r>
+              <w:rPr>
+                <w:rFonts w:ascii="Calibri" w:hAnsi="Calibri" w:eastAsia="Calibri"/>
+                <w:b w:val="0"/>
+                <w:i w:val="0"/>
+                <w:color w:val="1F2937"/>
+                <w:sz w:val="20"/>
+              </w:rPr>
+              <w:t>20</w:t>
+            </w:r>
+          </w:p>
+        </w:tc>
+        <w:tc>
+          <w:tcPr>
+            <w:tcW w:type="dxa" w:w="2592"/>
+            <w:tcBorders>
+              <w:top w:val="single" w:sz="4" w:space="0" w:color="CBD5E1"/>
+              <w:left w:val="single" w:sz="4" w:space="0" w:color="CBD5E1"/>
+              <w:bottom w:val="single" w:sz="4" w:space="0" w:color="CBD5E1"/>
+              <w:right w:val="single" w:sz="4" w:space="0" w:color="CBD5E1"/>
+            </w:tcBorders>
+          </w:tcPr>
+          <w:p>
+            <w:pPr>
+              <w:spacing w:before="40" w:after="40" w:lineRule="auto" w:line="240"/>
+              <w:jc w:val="left"/>
+            </w:pPr>
+            <w:r/>
+            <w:r>
+              <w:rPr>
+                <w:rFonts w:ascii="Calibri" w:hAnsi="Calibri" w:eastAsia="Calibri"/>
+                <w:b w:val="0"/>
+                <w:i w:val="0"/>
+                <w:color w:val="1F2937"/>
+                <w:sz w:val="20"/>
+              </w:rPr>
+              <w:t>20</w:t>
+            </w:r>
+          </w:p>
+        </w:tc>
+      </w:tr>
+      <w:tr>
+        <w:tc>
+          <w:tcPr>
+            <w:tcW w:type="dxa" w:w="2016"/>
+            <w:shd w:fill="F7FAFC" w:val="clear"/>
+            <w:tcBorders>
+              <w:top w:val="single" w:sz="4" w:space="0" w:color="CBD5E1"/>
+              <w:left w:val="single" w:sz="4" w:space="0" w:color="CBD5E1"/>
+              <w:bottom w:val="single" w:sz="4" w:space="0" w:color="CBD5E1"/>
+              <w:right w:val="single" w:sz="4" w:space="0" w:color="CBD5E1"/>
+            </w:tcBorders>
+          </w:tcPr>
+          <w:p>
+            <w:pPr>
+              <w:spacing w:before="40" w:after="40" w:lineRule="auto" w:line="240"/>
+              <w:jc w:val="center"/>
+            </w:pPr>
+            <w:r/>
+            <w:r>
+              <w:rPr>
+                <w:rFonts w:ascii="Calibri" w:hAnsi="Calibri" w:eastAsia="Calibri"/>
+                <w:b w:val="0"/>
+                <w:i w:val="0"/>
+                <w:color w:val="1F2937"/>
+                <w:sz w:val="20"/>
+              </w:rPr>
+              <w:t>40 STX</w:t>
+            </w:r>
+          </w:p>
+        </w:tc>
+        <w:tc>
+          <w:tcPr>
+            <w:tcW w:type="dxa" w:w="1872"/>
+            <w:shd w:fill="F7FAFC" w:val="clear"/>
+            <w:tcBorders>
+              <w:top w:val="single" w:sz="4" w:space="0" w:color="CBD5E1"/>
+              <w:left w:val="single" w:sz="4" w:space="0" w:color="CBD5E1"/>
+              <w:bottom w:val="single" w:sz="4" w:space="0" w:color="CBD5E1"/>
+              <w:right w:val="single" w:sz="4" w:space="0" w:color="CBD5E1"/>
+            </w:tcBorders>
+          </w:tcPr>
+          <w:p>
+            <w:pPr>
+              <w:spacing w:before="40" w:after="40" w:lineRule="auto" w:line="240"/>
+              <w:jc w:val="left"/>
+            </w:pPr>
+            <w:r/>
+            <w:r>
+              <w:rPr>
+                <w:rFonts w:ascii="Calibri" w:hAnsi="Calibri" w:eastAsia="Calibri"/>
+                <w:b w:val="0"/>
+                <w:i w:val="0"/>
+                <w:color w:val="1F2937"/>
+                <w:sz w:val="20"/>
+              </w:rPr>
+              <w:t>1</w:t>
+            </w:r>
+          </w:p>
+        </w:tc>
+        <w:tc>
+          <w:tcPr>
+            <w:tcW w:type="dxa" w:w="2880"/>
+            <w:shd w:fill="F7FAFC" w:val="clear"/>
+            <w:tcBorders>
+              <w:top w:val="single" w:sz="4" w:space="0" w:color="CBD5E1"/>
+              <w:left w:val="single" w:sz="4" w:space="0" w:color="CBD5E1"/>
+              <w:bottom w:val="single" w:sz="4" w:space="0" w:color="CBD5E1"/>
+              <w:right w:val="single" w:sz="4" w:space="0" w:color="CBD5E1"/>
+            </w:tcBorders>
+          </w:tcPr>
+          <w:p>
+            <w:pPr>
+              <w:spacing w:before="40" w:after="40" w:lineRule="auto" w:line="240"/>
+              <w:jc w:val="left"/>
+            </w:pPr>
+            <w:r/>
+            <w:r>
+              <w:rPr>
+                <w:rFonts w:ascii="Calibri" w:hAnsi="Calibri" w:eastAsia="Calibri"/>
+                <w:b w:val="0"/>
+                <w:i w:val="0"/>
+                <w:color w:val="1F2937"/>
+                <w:sz w:val="20"/>
+              </w:rPr>
+              <w:t>25</w:t>
+            </w:r>
+          </w:p>
+        </w:tc>
+        <w:tc>
+          <w:tcPr>
+            <w:tcW w:type="dxa" w:w="2592"/>
+            <w:shd w:fill="F7FAFC" w:val="clear"/>
+            <w:tcBorders>
+              <w:top w:val="single" w:sz="4" w:space="0" w:color="CBD5E1"/>
+              <w:left w:val="single" w:sz="4" w:space="0" w:color="CBD5E1"/>
+              <w:bottom w:val="single" w:sz="4" w:space="0" w:color="CBD5E1"/>
+              <w:right w:val="single" w:sz="4" w:space="0" w:color="CBD5E1"/>
+            </w:tcBorders>
+          </w:tcPr>
+          <w:p>
+            <w:pPr>
+              <w:spacing w:before="40" w:after="40" w:lineRule="auto" w:line="240"/>
+              <w:jc w:val="left"/>
+            </w:pPr>
+            <w:r/>
+            <w:r>
+              <w:rPr>
+                <w:rFonts w:ascii="Calibri" w:hAnsi="Calibri" w:eastAsia="Calibri"/>
+                <w:b w:val="0"/>
+                <w:i w:val="0"/>
+                <w:color w:val="1F2937"/>
+                <w:sz w:val="20"/>
+              </w:rPr>
+              <w:t>25</w:t>
+            </w:r>
+          </w:p>
+        </w:tc>
+      </w:tr>
+      <w:tr>
+        <w:tc>
+          <w:tcPr>
+            <w:tcW w:type="dxa" w:w="2016"/>
+            <w:tcBorders>
+              <w:top w:val="single" w:sz="4" w:space="0" w:color="CBD5E1"/>
+              <w:left w:val="single" w:sz="4" w:space="0" w:color="CBD5E1"/>
+              <w:bottom w:val="single" w:sz="4" w:space="0" w:color="CBD5E1"/>
+              <w:right w:val="single" w:sz="4" w:space="0" w:color="CBD5E1"/>
+            </w:tcBorders>
+          </w:tcPr>
+          <w:p>
+            <w:pPr>
+              <w:spacing w:before="40" w:after="40" w:lineRule="auto" w:line="240"/>
+              <w:jc w:val="center"/>
+            </w:pPr>
+            <w:r/>
+            <w:r>
+              <w:rPr>
+                <w:rFonts w:ascii="Calibri" w:hAnsi="Calibri" w:eastAsia="Calibri"/>
+                <w:b w:val="0"/>
+                <w:i w:val="0"/>
+                <w:color w:val="1F2937"/>
+                <w:sz w:val="20"/>
+              </w:rPr>
+              <w:t>45 STX</w:t>
+            </w:r>
+          </w:p>
+        </w:tc>
+        <w:tc>
+          <w:tcPr>
+            <w:tcW w:type="dxa" w:w="1872"/>
+            <w:tcBorders>
+              <w:top w:val="single" w:sz="4" w:space="0" w:color="CBD5E1"/>
+              <w:left w:val="single" w:sz="4" w:space="0" w:color="CBD5E1"/>
+              <w:bottom w:val="single" w:sz="4" w:space="0" w:color="CBD5E1"/>
+              <w:right w:val="single" w:sz="4" w:space="0" w:color="CBD5E1"/>
+            </w:tcBorders>
+          </w:tcPr>
+          <w:p>
+            <w:pPr>
+              <w:spacing w:before="40" w:after="40" w:lineRule="auto" w:line="240"/>
+              <w:jc w:val="left"/>
+            </w:pPr>
+            <w:r/>
+            <w:r>
+              <w:rPr>
+                <w:rFonts w:ascii="Calibri" w:hAnsi="Calibri" w:eastAsia="Calibri"/>
+                <w:b w:val="0"/>
+                <w:i w:val="0"/>
+                <w:color w:val="1F2937"/>
+                <w:sz w:val="20"/>
+              </w:rPr>
+              <w:t>1</w:t>
+            </w:r>
+          </w:p>
+        </w:tc>
+        <w:tc>
+          <w:tcPr>
+            <w:tcW w:type="dxa" w:w="2880"/>
+            <w:tcBorders>
+              <w:top w:val="single" w:sz="4" w:space="0" w:color="CBD5E1"/>
+              <w:left w:val="single" w:sz="4" w:space="0" w:color="CBD5E1"/>
+              <w:bottom w:val="single" w:sz="4" w:space="0" w:color="CBD5E1"/>
+              <w:right w:val="single" w:sz="4" w:space="0" w:color="CBD5E1"/>
+            </w:tcBorders>
+          </w:tcPr>
+          <w:p>
+            <w:pPr>
+              <w:spacing w:before="40" w:after="40" w:lineRule="auto" w:line="240"/>
+              <w:jc w:val="left"/>
+            </w:pPr>
+            <w:r/>
+            <w:r>
+              <w:rPr>
+                <w:rFonts w:ascii="Calibri" w:hAnsi="Calibri" w:eastAsia="Calibri"/>
+                <w:b w:val="0"/>
+                <w:i w:val="0"/>
+                <w:color w:val="1F2937"/>
+                <w:sz w:val="20"/>
+              </w:rPr>
+              <w:t>30</w:t>
+            </w:r>
+          </w:p>
+        </w:tc>
+        <w:tc>
+          <w:tcPr>
+            <w:tcW w:type="dxa" w:w="2592"/>
+            <w:tcBorders>
+              <w:top w:val="single" w:sz="4" w:space="0" w:color="CBD5E1"/>
+              <w:left w:val="single" w:sz="4" w:space="0" w:color="CBD5E1"/>
+              <w:bottom w:val="single" w:sz="4" w:space="0" w:color="CBD5E1"/>
+              <w:right w:val="single" w:sz="4" w:space="0" w:color="CBD5E1"/>
+            </w:tcBorders>
+          </w:tcPr>
+          <w:p>
+            <w:pPr>
+              <w:spacing w:before="40" w:after="40" w:lineRule="auto" w:line="240"/>
+              <w:jc w:val="left"/>
+            </w:pPr>
+            <w:r/>
+            <w:r>
+              <w:rPr>
+                <w:rFonts w:ascii="Calibri" w:hAnsi="Calibri" w:eastAsia="Calibri"/>
+                <w:b w:val="0"/>
+                <w:i w:val="0"/>
+                <w:color w:val="1F2937"/>
+                <w:sz w:val="20"/>
+              </w:rPr>
+              <w:t>30</w:t>
+            </w:r>
+          </w:p>
+        </w:tc>
+      </w:tr>
+      <w:tr>
+        <w:tc>
+          <w:tcPr>
+            <w:tcW w:type="dxa" w:w="2016"/>
+            <w:shd w:fill="F7FAFC" w:val="clear"/>
+            <w:tcBorders>
+              <w:top w:val="single" w:sz="4" w:space="0" w:color="CBD5E1"/>
+              <w:left w:val="single" w:sz="4" w:space="0" w:color="CBD5E1"/>
+              <w:bottom w:val="single" w:sz="4" w:space="0" w:color="CBD5E1"/>
+              <w:right w:val="single" w:sz="4" w:space="0" w:color="CBD5E1"/>
+            </w:tcBorders>
+          </w:tcPr>
+          <w:p>
+            <w:pPr>
+              <w:spacing w:before="40" w:after="40" w:lineRule="auto" w:line="240"/>
+              <w:jc w:val="center"/>
+            </w:pPr>
+            <w:r/>
+            <w:r>
+              <w:rPr>
+                <w:rFonts w:ascii="Calibri" w:hAnsi="Calibri" w:eastAsia="Calibri"/>
+                <w:b w:val="0"/>
+                <w:i w:val="0"/>
+                <w:color w:val="1F2937"/>
+                <w:sz w:val="20"/>
+              </w:rPr>
+              <w:t>50 STX</w:t>
+            </w:r>
+          </w:p>
+        </w:tc>
+        <w:tc>
+          <w:tcPr>
+            <w:tcW w:type="dxa" w:w="1872"/>
+            <w:shd w:fill="F7FAFC" w:val="clear"/>
+            <w:tcBorders>
+              <w:top w:val="single" w:sz="4" w:space="0" w:color="CBD5E1"/>
+              <w:left w:val="single" w:sz="4" w:space="0" w:color="CBD5E1"/>
+              <w:bottom w:val="single" w:sz="4" w:space="0" w:color="CBD5E1"/>
+              <w:right w:val="single" w:sz="4" w:space="0" w:color="CBD5E1"/>
+            </w:tcBorders>
+          </w:tcPr>
+          <w:p>
+            <w:pPr>
+              <w:spacing w:before="40" w:after="40" w:lineRule="auto" w:line="240"/>
+              <w:jc w:val="left"/>
+            </w:pPr>
+            <w:r/>
+            <w:r>
+              <w:rPr>
+                <w:rFonts w:ascii="Calibri" w:hAnsi="Calibri" w:eastAsia="Calibri"/>
+                <w:b w:val="0"/>
+                <w:i w:val="0"/>
+                <w:color w:val="1F2937"/>
+                <w:sz w:val="20"/>
+              </w:rPr>
+              <w:t>2</w:t>
+            </w:r>
+          </w:p>
+        </w:tc>
+        <w:tc>
+          <w:tcPr>
+            <w:tcW w:type="dxa" w:w="2880"/>
+            <w:shd w:fill="F7FAFC" w:val="clear"/>
+            <w:tcBorders>
+              <w:top w:val="single" w:sz="4" w:space="0" w:color="CBD5E1"/>
+              <w:left w:val="single" w:sz="4" w:space="0" w:color="CBD5E1"/>
+              <w:bottom w:val="single" w:sz="4" w:space="0" w:color="CBD5E1"/>
+              <w:right w:val="single" w:sz="4" w:space="0" w:color="CBD5E1"/>
+            </w:tcBorders>
+          </w:tcPr>
+          <w:p>
+            <w:pPr>
+              <w:spacing w:before="40" w:after="40" w:lineRule="auto" w:line="240"/>
+              <w:jc w:val="left"/>
+            </w:pPr>
+            <w:r/>
+            <w:r>
+              <w:rPr>
+                <w:rFonts w:ascii="Calibri" w:hAnsi="Calibri" w:eastAsia="Calibri"/>
+                <w:b w:val="0"/>
+                <w:i w:val="0"/>
+                <w:color w:val="1F2937"/>
+                <w:sz w:val="20"/>
+              </w:rPr>
+              <w:t>50</w:t>
+            </w:r>
+          </w:p>
+        </w:tc>
+        <w:tc>
+          <w:tcPr>
+            <w:tcW w:type="dxa" w:w="2592"/>
+            <w:shd w:fill="F7FAFC" w:val="clear"/>
+            <w:tcBorders>
+              <w:top w:val="single" w:sz="4" w:space="0" w:color="CBD5E1"/>
+              <w:left w:val="single" w:sz="4" w:space="0" w:color="CBD5E1"/>
+              <w:bottom w:val="single" w:sz="4" w:space="0" w:color="CBD5E1"/>
+              <w:right w:val="single" w:sz="4" w:space="0" w:color="CBD5E1"/>
+            </w:tcBorders>
+          </w:tcPr>
+          <w:p>
+            <w:pPr>
+              <w:spacing w:before="40" w:after="40" w:lineRule="auto" w:line="240"/>
+              <w:jc w:val="left"/>
+            </w:pPr>
+            <w:r/>
+            <w:r>
+              <w:rPr>
+                <w:rFonts w:ascii="Calibri" w:hAnsi="Calibri" w:eastAsia="Calibri"/>
+                <w:b w:val="0"/>
+                <w:i w:val="0"/>
+                <w:color w:val="1F2937"/>
+                <w:sz w:val="20"/>
+              </w:rPr>
+              <w:t>100</w:t>
+            </w:r>
+          </w:p>
+        </w:tc>
+      </w:tr>
+      <w:tr>
+        <w:tc>
+          <w:tcPr>
+            <w:tcW w:type="dxa" w:w="2016"/>
+            <w:tcBorders>
+              <w:top w:val="single" w:sz="4" w:space="0" w:color="CBD5E1"/>
+              <w:left w:val="single" w:sz="4" w:space="0" w:color="CBD5E1"/>
+              <w:bottom w:val="single" w:sz="4" w:space="0" w:color="CBD5E1"/>
+              <w:right w:val="single" w:sz="4" w:space="0" w:color="CBD5E1"/>
+            </w:tcBorders>
+          </w:tcPr>
+          <w:p>
+            <w:pPr>
+              <w:spacing w:before="40" w:after="40" w:lineRule="auto" w:line="240"/>
+              <w:jc w:val="center"/>
+            </w:pPr>
+            <w:r/>
+            <w:r>
+              <w:rPr>
+                <w:rFonts w:ascii="Calibri" w:hAnsi="Calibri" w:eastAsia="Calibri"/>
+                <w:b w:val="0"/>
+                <w:i w:val="0"/>
+                <w:color w:val="1F2937"/>
+                <w:sz w:val="20"/>
+              </w:rPr>
+              <w:t>100 STX</w:t>
+            </w:r>
+          </w:p>
+        </w:tc>
+        <w:tc>
+          <w:tcPr>
+            <w:tcW w:type="dxa" w:w="1872"/>
+            <w:tcBorders>
+              <w:top w:val="single" w:sz="4" w:space="0" w:color="CBD5E1"/>
+              <w:left w:val="single" w:sz="4" w:space="0" w:color="CBD5E1"/>
+              <w:bottom w:val="single" w:sz="4" w:space="0" w:color="CBD5E1"/>
+              <w:right w:val="single" w:sz="4" w:space="0" w:color="CBD5E1"/>
+            </w:tcBorders>
+          </w:tcPr>
+          <w:p>
+            <w:pPr>
+              <w:spacing w:before="40" w:after="40" w:lineRule="auto" w:line="240"/>
+              <w:jc w:val="left"/>
+            </w:pPr>
+            <w:r/>
+            <w:r>
+              <w:rPr>
+                <w:rFonts w:ascii="Calibri" w:hAnsi="Calibri" w:eastAsia="Calibri"/>
+                <w:b w:val="0"/>
+                <w:i w:val="0"/>
+                <w:color w:val="1F2937"/>
+                <w:sz w:val="20"/>
+              </w:rPr>
+              <w:t>1</w:t>
+            </w:r>
+          </w:p>
+        </w:tc>
+        <w:tc>
+          <w:tcPr>
+            <w:tcW w:type="dxa" w:w="2880"/>
+            <w:tcBorders>
+              <w:top w:val="single" w:sz="4" w:space="0" w:color="CBD5E1"/>
+              <w:left w:val="single" w:sz="4" w:space="0" w:color="CBD5E1"/>
+              <w:bottom w:val="single" w:sz="4" w:space="0" w:color="CBD5E1"/>
+              <w:right w:val="single" w:sz="4" w:space="0" w:color="CBD5E1"/>
+            </w:tcBorders>
+          </w:tcPr>
+          <w:p>
+            <w:pPr>
+              <w:spacing w:before="40" w:after="40" w:lineRule="auto" w:line="240"/>
+              <w:jc w:val="left"/>
+            </w:pPr>
+            <w:r/>
+            <w:r>
+              <w:rPr>
+                <w:rFonts w:ascii="Calibri" w:hAnsi="Calibri" w:eastAsia="Calibri"/>
+                <w:b w:val="0"/>
+                <w:i w:val="0"/>
+                <w:color w:val="1F2937"/>
+                <w:sz w:val="20"/>
+              </w:rPr>
+              <w:t>100</w:t>
+            </w:r>
+          </w:p>
+        </w:tc>
+        <w:tc>
+          <w:tcPr>
+            <w:tcW w:type="dxa" w:w="2592"/>
+            <w:tcBorders>
+              <w:top w:val="single" w:sz="4" w:space="0" w:color="CBD5E1"/>
+              <w:left w:val="single" w:sz="4" w:space="0" w:color="CBD5E1"/>
+              <w:bottom w:val="single" w:sz="4" w:space="0" w:color="CBD5E1"/>
+              <w:right w:val="single" w:sz="4" w:space="0" w:color="CBD5E1"/>
+            </w:tcBorders>
+          </w:tcPr>
+          <w:p>
+            <w:pPr>
+              <w:spacing w:before="40" w:after="40" w:lineRule="auto" w:line="240"/>
+              <w:jc w:val="left"/>
+            </w:pPr>
+            <w:r/>
+            <w:r>
+              <w:rPr>
+                <w:rFonts w:ascii="Calibri" w:hAnsi="Calibri" w:eastAsia="Calibri"/>
+                <w:b w:val="0"/>
+                <w:i w:val="0"/>
+                <w:color w:val="1F2937"/>
+                <w:sz w:val="20"/>
+              </w:rPr>
+              <w:t>100</w:t>
+            </w:r>
+          </w:p>
+        </w:tc>
+      </w:tr>
+      <w:tr>
+        <w:tc>
+          <w:tcPr>
+            <w:tcW w:type="dxa" w:w="2016"/>
+            <w:shd w:fill="EEF2F7" w:val="clear"/>
+            <w:tcBorders>
+              <w:top w:val="single" w:sz="4" w:space="0" w:color="CBD5E1"/>
+              <w:left w:val="single" w:sz="4" w:space="0" w:color="CBD5E1"/>
+              <w:bottom w:val="single" w:sz="4" w:space="0" w:color="CBD5E1"/>
+              <w:right w:val="single" w:sz="4" w:space="0" w:color="CBD5E1"/>
+            </w:tcBorders>
+          </w:tcPr>
+          <w:p>
+            <w:pPr>
+              <w:spacing w:before="40" w:after="40" w:lineRule="auto" w:line="240"/>
+              <w:jc w:val="center"/>
+            </w:pPr>
+            <w:r/>
+            <w:r>
+              <w:rPr>
+                <w:rFonts w:ascii="Calibri" w:hAnsi="Calibri" w:eastAsia="Calibri"/>
+                <w:b/>
+                <w:i w:val="0"/>
+                <w:color w:val="1A365D"/>
+                <w:sz w:val="20"/>
+              </w:rPr>
+              <w:t>Cycle total</w:t>
+            </w:r>
+          </w:p>
+        </w:tc>
+        <w:tc>
+          <w:tcPr>
+            <w:tcW w:type="dxa" w:w="1872"/>
+            <w:shd w:fill="EEF2F7" w:val="clear"/>
+            <w:tcBorders>
+              <w:top w:val="single" w:sz="4" w:space="0" w:color="CBD5E1"/>
+              <w:left w:val="single" w:sz="4" w:space="0" w:color="CBD5E1"/>
+              <w:bottom w:val="single" w:sz="4" w:space="0" w:color="CBD5E1"/>
+              <w:right w:val="single" w:sz="4" w:space="0" w:color="CBD5E1"/>
+            </w:tcBorders>
+          </w:tcPr>
+          <w:p>
+            <w:pPr>
+              <w:spacing w:before="40" w:after="40" w:lineRule="auto" w:line="240"/>
+              <w:jc w:val="left"/>
+            </w:pPr>
+            <w:r/>
+            <w:r>
+              <w:rPr>
+                <w:rFonts w:ascii="Calibri" w:hAnsi="Calibri" w:eastAsia="Calibri"/>
+                <w:b/>
+                <w:i w:val="0"/>
+                <w:color w:val="1A365D"/>
+                <w:sz w:val="20"/>
+              </w:rPr>
+              <w:t>8 pots</w:t>
+            </w:r>
+          </w:p>
+        </w:tc>
+        <w:tc>
+          <w:tcPr>
+            <w:tcW w:type="dxa" w:w="2880"/>
+            <w:shd w:fill="EEF2F7" w:val="clear"/>
+            <w:tcBorders>
+              <w:top w:val="single" w:sz="4" w:space="0" w:color="CBD5E1"/>
+              <w:left w:val="single" w:sz="4" w:space="0" w:color="CBD5E1"/>
+              <w:bottom w:val="single" w:sz="4" w:space="0" w:color="CBD5E1"/>
+              <w:right w:val="single" w:sz="4" w:space="0" w:color="CBD5E1"/>
+            </w:tcBorders>
+          </w:tcPr>
+          <w:p>
+            <w:pPr>
+              <w:spacing w:before="40" w:after="40" w:lineRule="auto" w:line="240"/>
+              <w:jc w:val="left"/>
+            </w:pPr>
+            <w:r/>
+            <w:r>
+              <w:rPr>
+                <w:rFonts w:ascii="Calibri" w:hAnsi="Calibri" w:eastAsia="Calibri"/>
+                <w:b/>
+                <w:i w:val="0"/>
+                <w:color w:val="1A365D"/>
+                <w:sz w:val="20"/>
+              </w:rPr>
+              <w:t>—</w:t>
+            </w:r>
+          </w:p>
+        </w:tc>
+        <w:tc>
+          <w:tcPr>
+            <w:tcW w:type="dxa" w:w="2592"/>
+            <w:shd w:fill="EEF2F7" w:val="clear"/>
+            <w:tcBorders>
+              <w:top w:val="single" w:sz="4" w:space="0" w:color="CBD5E1"/>
+              <w:left w:val="single" w:sz="4" w:space="0" w:color="CBD5E1"/>
+              <w:bottom w:val="single" w:sz="4" w:space="0" w:color="CBD5E1"/>
+              <w:right w:val="single" w:sz="4" w:space="0" w:color="CBD5E1"/>
+            </w:tcBorders>
+          </w:tcPr>
+          <w:p>
+            <w:pPr>
+              <w:spacing w:before="40" w:after="40" w:lineRule="auto" w:line="240"/>
+              <w:jc w:val="left"/>
+            </w:pPr>
+            <w:r/>
+            <w:r>
+              <w:rPr>
+                <w:rFonts w:ascii="Calibri" w:hAnsi="Calibri" w:eastAsia="Calibri"/>
+                <w:b/>
+                <w:i w:val="0"/>
+                <w:color w:val="1A365D"/>
+                <w:sz w:val="20"/>
+              </w:rPr>
+              <w:t>300 join txs</w:t>
+            </w:r>
+          </w:p>
+        </w:tc>
+      </w:tr>
+    </w:tbl>
+    <w:p>
+      <w:pPr>
+        <w:spacing w:before="0" w:after="120" w:lineRule="auto" w:line="240"/>
+      </w:pPr>
+    </w:p>
+    <w:p>
+      <w:pPr>
+        <w:spacing w:before="0" w:after="200" w:lineRule="auto" w:line="264"/>
+      </w:pPr>
+      <w:r>
+        <w:rPr>
+          <w:rFonts w:ascii="Calibri" w:hAnsi="Calibri" w:eastAsia="Calibri"/>
+          <w:b/>
+          <w:i/>
+          <w:color w:val="4A5568"/>
+          <w:sz w:val="20"/>
+        </w:rPr>
+        <w:t xml:space="preserve">Note: </w:t>
+      </w:r>
+      <w:r>
+        <w:rPr>
+          <w:rFonts w:ascii="Calibri" w:hAnsi="Calibri" w:eastAsia="Calibri"/>
+          <w:b w:val="0"/>
+          <w:i/>
+          <w:color w:val="4A5568"/>
+          <w:sz w:val="20"/>
+        </w:rPr>
+        <w:t>Figures below are minimum expected transaction counts (at min. participant fill). Actual totals may be higher if pots overfill.</w:t>
+      </w:r>
+    </w:p>
+    <w:p>
+      <w:pPr>
+        <w:spacing w:before="240" w:after="120" w:lineRule="auto" w:line="276"/>
+      </w:pPr>
+      <w:r>
+        <w:rPr>
+          <w:rFonts w:ascii="Calibri" w:hAnsi="Calibri" w:eastAsia="Calibri"/>
+          <w:b/>
+          <w:i w:val="0"/>
+          <w:color w:val="2B6CB0"/>
+          <w:sz w:val="26"/>
+        </w:rPr>
+        <w:t>Expected Transaction Breakdown</w:t>
+      </w:r>
+    </w:p>
+    <w:tbl>
+      <w:tblPr>
+        <w:tblW w:type="auto" w:w="0"/>
+        <w:jc w:val="center"/>
+        <w:tblLayout w:type="autofit"/>
+        <w:tblLook w:firstColumn="1" w:firstRow="1" w:lastColumn="0" w:lastRow="0" w:noHBand="0" w:noVBand="1" w:val="04A0"/>
+      </w:tblPr>
+      <w:tblGrid>
+        <w:gridCol w:w="2340"/>
+        <w:gridCol w:w="2340"/>
+        <w:gridCol w:w="2340"/>
+        <w:gridCol w:w="2340"/>
+      </w:tblGrid>
+      <w:tr>
+        <w:tc>
+          <w:tcPr>
+            <w:tcW w:type="dxa" w:w="3168"/>
+            <w:shd w:fill="1A365D" w:val="clear"/>
+            <w:tcBorders>
+              <w:top w:val="single" w:sz="4" w:space="0" w:color="1A365D"/>
+              <w:left w:val="single" w:sz="4" w:space="0" w:color="1A365D"/>
+              <w:bottom w:val="single" w:sz="4" w:space="0" w:color="1A365D"/>
+              <w:right w:val="single" w:sz="4" w:space="0" w:color="1A365D"/>
+            </w:tcBorders>
+          </w:tcPr>
+          <w:p>
+            <w:pPr>
+              <w:spacing w:before="40" w:after="40" w:lineRule="auto" w:line="240"/>
+              <w:jc w:val="center"/>
+            </w:pPr>
+            <w:r/>
+            <w:r>
+              <w:rPr>
+                <w:rFonts w:ascii="Calibri" w:hAnsi="Calibri" w:eastAsia="Calibri"/>
+                <w:b/>
+                <w:i w:val="0"/>
+                <w:color w:val="FFFFFF"/>
+                <w:sz w:val="20"/>
+              </w:rPr>
+              <w:t>Transaction Type</w:t>
+            </w:r>
+          </w:p>
+        </w:tc>
+        <w:tc>
+          <w:tcPr>
+            <w:tcW w:type="dxa" w:w="2016"/>
+            <w:shd w:fill="1A365D" w:val="clear"/>
+            <w:tcBorders>
+              <w:top w:val="single" w:sz="4" w:space="0" w:color="1A365D"/>
+              <w:left w:val="single" w:sz="4" w:space="0" w:color="1A365D"/>
+              <w:bottom w:val="single" w:sz="4" w:space="0" w:color="1A365D"/>
+              <w:right w:val="single" w:sz="4" w:space="0" w:color="1A365D"/>
+            </w:tcBorders>
+          </w:tcPr>
+          <w:p>
+            <w:pPr>
+              <w:spacing w:before="40" w:after="40" w:lineRule="auto" w:line="240"/>
+              <w:jc w:val="center"/>
+            </w:pPr>
+            <w:r/>
+            <w:r>
+              <w:rPr>
+                <w:rFonts w:ascii="Calibri" w:hAnsi="Calibri" w:eastAsia="Calibri"/>
+                <w:b/>
+                <w:i w:val="0"/>
+                <w:color w:val="FFFFFF"/>
+                <w:sz w:val="20"/>
+              </w:rPr>
+              <w:t>Per Cycle (8 pots)</w:t>
+            </w:r>
+          </w:p>
+        </w:tc>
+        <w:tc>
+          <w:tcPr>
+            <w:tcW w:type="dxa" w:w="2160"/>
+            <w:shd w:fill="1A365D" w:val="clear"/>
+            <w:tcBorders>
+              <w:top w:val="single" w:sz="4" w:space="0" w:color="1A365D"/>
+              <w:left w:val="single" w:sz="4" w:space="0" w:color="1A365D"/>
+              <w:bottom w:val="single" w:sz="4" w:space="0" w:color="1A365D"/>
+              <w:right w:val="single" w:sz="4" w:space="0" w:color="1A365D"/>
+            </w:tcBorders>
+          </w:tcPr>
+          <w:p>
+            <w:pPr>
+              <w:spacing w:before="40" w:after="40" w:lineRule="auto" w:line="240"/>
+              <w:jc w:val="center"/>
+            </w:pPr>
+            <w:r/>
+            <w:r>
+              <w:rPr>
+                <w:rFonts w:ascii="Calibri" w:hAnsi="Calibri" w:eastAsia="Calibri"/>
+                <w:b/>
+                <w:i w:val="0"/>
+                <w:color w:val="FFFFFF"/>
+                <w:sz w:val="20"/>
+              </w:rPr>
+              <w:t>Per Month (16 pots)</w:t>
+            </w:r>
+          </w:p>
+        </w:tc>
+        <w:tc>
+          <w:tcPr>
+            <w:tcW w:type="dxa" w:w="3456"/>
+            <w:shd w:fill="1A365D" w:val="clear"/>
+            <w:tcBorders>
+              <w:top w:val="single" w:sz="4" w:space="0" w:color="1A365D"/>
+              <w:left w:val="single" w:sz="4" w:space="0" w:color="1A365D"/>
+              <w:bottom w:val="single" w:sz="4" w:space="0" w:color="1A365D"/>
+              <w:right w:val="single" w:sz="4" w:space="0" w:color="1A365D"/>
+            </w:tcBorders>
+          </w:tcPr>
+          <w:p>
+            <w:pPr>
+              <w:spacing w:before="40" w:after="40" w:lineRule="auto" w:line="240"/>
+              <w:jc w:val="center"/>
+            </w:pPr>
+            <w:r/>
+            <w:r>
+              <w:rPr>
+                <w:rFonts w:ascii="Calibri" w:hAnsi="Calibri" w:eastAsia="Calibri"/>
+                <w:b/>
+                <w:i w:val="0"/>
+                <w:color w:val="FFFFFF"/>
+                <w:sz w:val="20"/>
+              </w:rPr>
+              <w:t>Full Program (80 pots / 10 cycles)</w:t>
+            </w:r>
+          </w:p>
+        </w:tc>
+      </w:tr>
+      <w:tr>
+        <w:tc>
+          <w:tcPr>
+            <w:tcW w:type="dxa" w:w="3168"/>
+            <w:tcBorders>
+              <w:top w:val="single" w:sz="4" w:space="0" w:color="CBD5E1"/>
+              <w:left w:val="single" w:sz="4" w:space="0" w:color="CBD5E1"/>
+              <w:bottom w:val="single" w:sz="4" w:space="0" w:color="CBD5E1"/>
+              <w:right w:val="single" w:sz="4" w:space="0" w:color="CBD5E1"/>
+            </w:tcBorders>
+          </w:tcPr>
+          <w:p>
+            <w:pPr>
+              <w:spacing w:before="40" w:after="40" w:lineRule="auto" w:line="240"/>
+              <w:jc w:val="center"/>
+            </w:pPr>
+            <w:r/>
+            <w:r>
+              <w:rPr>
+                <w:rFonts w:ascii="Calibri" w:hAnsi="Calibri" w:eastAsia="Calibri"/>
+                <w:b w:val="0"/>
+                <w:i w:val="0"/>
+                <w:color w:val="1F2937"/>
+                <w:sz w:val="20"/>
+              </w:rPr>
+              <w:t>Pot deploy</w:t>
+            </w:r>
+          </w:p>
+        </w:tc>
+        <w:tc>
+          <w:tcPr>
+            <w:tcW w:type="dxa" w:w="2016"/>
+            <w:tcBorders>
+              <w:top w:val="single" w:sz="4" w:space="0" w:color="CBD5E1"/>
+              <w:left w:val="single" w:sz="4" w:space="0" w:color="CBD5E1"/>
+              <w:bottom w:val="single" w:sz="4" w:space="0" w:color="CBD5E1"/>
+              <w:right w:val="single" w:sz="4" w:space="0" w:color="CBD5E1"/>
+            </w:tcBorders>
+          </w:tcPr>
+          <w:p>
+            <w:pPr>
+              <w:spacing w:before="40" w:after="40" w:lineRule="auto" w:line="240"/>
+              <w:jc w:val="left"/>
+            </w:pPr>
+            <w:r/>
+            <w:r>
+              <w:rPr>
+                <w:rFonts w:ascii="Calibri" w:hAnsi="Calibri" w:eastAsia="Calibri"/>
+                <w:b w:val="0"/>
+                <w:i w:val="0"/>
+                <w:color w:val="1F2937"/>
+                <w:sz w:val="20"/>
+              </w:rPr>
+              <w:t>8</w:t>
+            </w:r>
+          </w:p>
+        </w:tc>
+        <w:tc>
+          <w:tcPr>
+            <w:tcW w:type="dxa" w:w="2160"/>
+            <w:tcBorders>
+              <w:top w:val="single" w:sz="4" w:space="0" w:color="CBD5E1"/>
+              <w:left w:val="single" w:sz="4" w:space="0" w:color="CBD5E1"/>
+              <w:bottom w:val="single" w:sz="4" w:space="0" w:color="CBD5E1"/>
+              <w:right w:val="single" w:sz="4" w:space="0" w:color="CBD5E1"/>
+            </w:tcBorders>
+          </w:tcPr>
+          <w:p>
+            <w:pPr>
+              <w:spacing w:before="40" w:after="40" w:lineRule="auto" w:line="240"/>
+              <w:jc w:val="left"/>
+            </w:pPr>
+            <w:r/>
+            <w:r>
+              <w:rPr>
+                <w:rFonts w:ascii="Calibri" w:hAnsi="Calibri" w:eastAsia="Calibri"/>
+                <w:b w:val="0"/>
+                <w:i w:val="0"/>
+                <w:color w:val="1F2937"/>
+                <w:sz w:val="20"/>
+              </w:rPr>
+              <w:t>16</w:t>
+            </w:r>
+          </w:p>
+        </w:tc>
+        <w:tc>
+          <w:tcPr>
+            <w:tcW w:type="dxa" w:w="3456"/>
+            <w:tcBorders>
+              <w:top w:val="single" w:sz="4" w:space="0" w:color="CBD5E1"/>
+              <w:left w:val="single" w:sz="4" w:space="0" w:color="CBD5E1"/>
+              <w:bottom w:val="single" w:sz="4" w:space="0" w:color="CBD5E1"/>
+              <w:right w:val="single" w:sz="4" w:space="0" w:color="CBD5E1"/>
+            </w:tcBorders>
+          </w:tcPr>
+          <w:p>
+            <w:pPr>
+              <w:spacing w:before="40" w:after="40" w:lineRule="auto" w:line="240"/>
+              <w:jc w:val="left"/>
+            </w:pPr>
+            <w:r/>
+            <w:r>
+              <w:rPr>
+                <w:rFonts w:ascii="Calibri" w:hAnsi="Calibri" w:eastAsia="Calibri"/>
+                <w:b w:val="0"/>
+                <w:i w:val="0"/>
+                <w:color w:val="1F2937"/>
+                <w:sz w:val="20"/>
+              </w:rPr>
+              <w:t>80</w:t>
+            </w:r>
+          </w:p>
+        </w:tc>
+      </w:tr>
+      <w:tr>
+        <w:tc>
+          <w:tcPr>
+            <w:tcW w:type="dxa" w:w="3168"/>
+            <w:shd w:fill="F7FAFC" w:val="clear"/>
+            <w:tcBorders>
+              <w:top w:val="single" w:sz="4" w:space="0" w:color="CBD5E1"/>
+              <w:left w:val="single" w:sz="4" w:space="0" w:color="CBD5E1"/>
+              <w:bottom w:val="single" w:sz="4" w:space="0" w:color="CBD5E1"/>
+              <w:right w:val="single" w:sz="4" w:space="0" w:color="CBD5E1"/>
+            </w:tcBorders>
+          </w:tcPr>
+          <w:p>
+            <w:pPr>
+              <w:spacing w:before="40" w:after="40" w:lineRule="auto" w:line="240"/>
+              <w:jc w:val="center"/>
+            </w:pPr>
+            <w:r/>
+            <w:r>
+              <w:rPr>
+                <w:rFonts w:ascii="Calibri" w:hAnsi="Calibri" w:eastAsia="Calibri"/>
+                <w:b w:val="0"/>
+                <w:i w:val="0"/>
+                <w:color w:val="1F2937"/>
+                <w:sz w:val="20"/>
+              </w:rPr>
+              <w:t>Pot activate</w:t>
+            </w:r>
+          </w:p>
+        </w:tc>
+        <w:tc>
+          <w:tcPr>
+            <w:tcW w:type="dxa" w:w="2016"/>
+            <w:shd w:fill="F7FAFC" w:val="clear"/>
+            <w:tcBorders>
+              <w:top w:val="single" w:sz="4" w:space="0" w:color="CBD5E1"/>
+              <w:left w:val="single" w:sz="4" w:space="0" w:color="CBD5E1"/>
+              <w:bottom w:val="single" w:sz="4" w:space="0" w:color="CBD5E1"/>
+              <w:right w:val="single" w:sz="4" w:space="0" w:color="CBD5E1"/>
+            </w:tcBorders>
+          </w:tcPr>
+          <w:p>
+            <w:pPr>
+              <w:spacing w:before="40" w:after="40" w:lineRule="auto" w:line="240"/>
+              <w:jc w:val="left"/>
+            </w:pPr>
+            <w:r/>
+            <w:r>
+              <w:rPr>
+                <w:rFonts w:ascii="Calibri" w:hAnsi="Calibri" w:eastAsia="Calibri"/>
+                <w:b w:val="0"/>
+                <w:i w:val="0"/>
+                <w:color w:val="1F2937"/>
+                <w:sz w:val="20"/>
+              </w:rPr>
+              <w:t>8</w:t>
+            </w:r>
+          </w:p>
+        </w:tc>
+        <w:tc>
+          <w:tcPr>
+            <w:tcW w:type="dxa" w:w="2160"/>
+            <w:shd w:fill="F7FAFC" w:val="clear"/>
+            <w:tcBorders>
+              <w:top w:val="single" w:sz="4" w:space="0" w:color="CBD5E1"/>
+              <w:left w:val="single" w:sz="4" w:space="0" w:color="CBD5E1"/>
+              <w:bottom w:val="single" w:sz="4" w:space="0" w:color="CBD5E1"/>
+              <w:right w:val="single" w:sz="4" w:space="0" w:color="CBD5E1"/>
+            </w:tcBorders>
+          </w:tcPr>
+          <w:p>
+            <w:pPr>
+              <w:spacing w:before="40" w:after="40" w:lineRule="auto" w:line="240"/>
+              <w:jc w:val="left"/>
+            </w:pPr>
+            <w:r/>
+            <w:r>
+              <w:rPr>
+                <w:rFonts w:ascii="Calibri" w:hAnsi="Calibri" w:eastAsia="Calibri"/>
+                <w:b w:val="0"/>
+                <w:i w:val="0"/>
+                <w:color w:val="1F2937"/>
+                <w:sz w:val="20"/>
+              </w:rPr>
+              <w:t>16</w:t>
+            </w:r>
+          </w:p>
+        </w:tc>
+        <w:tc>
+          <w:tcPr>
+            <w:tcW w:type="dxa" w:w="3456"/>
+            <w:shd w:fill="F7FAFC" w:val="clear"/>
+            <w:tcBorders>
+              <w:top w:val="single" w:sz="4" w:space="0" w:color="CBD5E1"/>
+              <w:left w:val="single" w:sz="4" w:space="0" w:color="CBD5E1"/>
+              <w:bottom w:val="single" w:sz="4" w:space="0" w:color="CBD5E1"/>
+              <w:right w:val="single" w:sz="4" w:space="0" w:color="CBD5E1"/>
+            </w:tcBorders>
+          </w:tcPr>
+          <w:p>
+            <w:pPr>
+              <w:spacing w:before="40" w:after="40" w:lineRule="auto" w:line="240"/>
+              <w:jc w:val="left"/>
+            </w:pPr>
+            <w:r/>
+            <w:r>
+              <w:rPr>
+                <w:rFonts w:ascii="Calibri" w:hAnsi="Calibri" w:eastAsia="Calibri"/>
+                <w:b w:val="0"/>
+                <w:i w:val="0"/>
+                <w:color w:val="1F2937"/>
+                <w:sz w:val="20"/>
+              </w:rPr>
+              <w:t>80</w:t>
+            </w:r>
+          </w:p>
+        </w:tc>
+      </w:tr>
+      <w:tr>
+        <w:tc>
+          <w:tcPr>
+            <w:tcW w:type="dxa" w:w="3168"/>
+            <w:tcBorders>
+              <w:top w:val="single" w:sz="4" w:space="0" w:color="CBD5E1"/>
+              <w:left w:val="single" w:sz="4" w:space="0" w:color="CBD5E1"/>
+              <w:bottom w:val="single" w:sz="4" w:space="0" w:color="CBD5E1"/>
+              <w:right w:val="single" w:sz="4" w:space="0" w:color="CBD5E1"/>
+            </w:tcBorders>
+          </w:tcPr>
+          <w:p>
+            <w:pPr>
+              <w:spacing w:before="40" w:after="40" w:lineRule="auto" w:line="240"/>
+              <w:jc w:val="center"/>
+            </w:pPr>
+            <w:r/>
+            <w:r>
+              <w:rPr>
+                <w:rFonts w:ascii="Calibri" w:hAnsi="Calibri" w:eastAsia="Calibri"/>
+                <w:b w:val="0"/>
+                <w:i w:val="0"/>
+                <w:color w:val="1F2937"/>
+                <w:sz w:val="20"/>
+              </w:rPr>
+              <w:t>Pot start</w:t>
+            </w:r>
+          </w:p>
+        </w:tc>
+        <w:tc>
+          <w:tcPr>
+            <w:tcW w:type="dxa" w:w="2016"/>
+            <w:tcBorders>
+              <w:top w:val="single" w:sz="4" w:space="0" w:color="CBD5E1"/>
+              <w:left w:val="single" w:sz="4" w:space="0" w:color="CBD5E1"/>
+              <w:bottom w:val="single" w:sz="4" w:space="0" w:color="CBD5E1"/>
+              <w:right w:val="single" w:sz="4" w:space="0" w:color="CBD5E1"/>
+            </w:tcBorders>
+          </w:tcPr>
+          <w:p>
+            <w:pPr>
+              <w:spacing w:before="40" w:after="40" w:lineRule="auto" w:line="240"/>
+              <w:jc w:val="left"/>
+            </w:pPr>
+            <w:r/>
+            <w:r>
+              <w:rPr>
+                <w:rFonts w:ascii="Calibri" w:hAnsi="Calibri" w:eastAsia="Calibri"/>
+                <w:b w:val="0"/>
+                <w:i w:val="0"/>
+                <w:color w:val="1F2937"/>
+                <w:sz w:val="20"/>
+              </w:rPr>
+              <w:t>8</w:t>
+            </w:r>
+          </w:p>
+        </w:tc>
+        <w:tc>
+          <w:tcPr>
+            <w:tcW w:type="dxa" w:w="2160"/>
+            <w:tcBorders>
+              <w:top w:val="single" w:sz="4" w:space="0" w:color="CBD5E1"/>
+              <w:left w:val="single" w:sz="4" w:space="0" w:color="CBD5E1"/>
+              <w:bottom w:val="single" w:sz="4" w:space="0" w:color="CBD5E1"/>
+              <w:right w:val="single" w:sz="4" w:space="0" w:color="CBD5E1"/>
+            </w:tcBorders>
+          </w:tcPr>
+          <w:p>
+            <w:pPr>
+              <w:spacing w:before="40" w:after="40" w:lineRule="auto" w:line="240"/>
+              <w:jc w:val="left"/>
+            </w:pPr>
+            <w:r/>
+            <w:r>
+              <w:rPr>
+                <w:rFonts w:ascii="Calibri" w:hAnsi="Calibri" w:eastAsia="Calibri"/>
+                <w:b w:val="0"/>
+                <w:i w:val="0"/>
+                <w:color w:val="1F2937"/>
+                <w:sz w:val="20"/>
+              </w:rPr>
+              <w:t>16</w:t>
+            </w:r>
+          </w:p>
+        </w:tc>
+        <w:tc>
+          <w:tcPr>
+            <w:tcW w:type="dxa" w:w="3456"/>
+            <w:tcBorders>
+              <w:top w:val="single" w:sz="4" w:space="0" w:color="CBD5E1"/>
+              <w:left w:val="single" w:sz="4" w:space="0" w:color="CBD5E1"/>
+              <w:bottom w:val="single" w:sz="4" w:space="0" w:color="CBD5E1"/>
+              <w:right w:val="single" w:sz="4" w:space="0" w:color="CBD5E1"/>
+            </w:tcBorders>
+          </w:tcPr>
+          <w:p>
+            <w:pPr>
+              <w:spacing w:before="40" w:after="40" w:lineRule="auto" w:line="240"/>
+              <w:jc w:val="left"/>
+            </w:pPr>
+            <w:r/>
+            <w:r>
+              <w:rPr>
+                <w:rFonts w:ascii="Calibri" w:hAnsi="Calibri" w:eastAsia="Calibri"/>
+                <w:b w:val="0"/>
+                <w:i w:val="0"/>
+                <w:color w:val="1F2937"/>
+                <w:sz w:val="20"/>
+              </w:rPr>
+              <w:t>80</w:t>
+            </w:r>
+          </w:p>
+        </w:tc>
+      </w:tr>
+      <w:tr>
+        <w:tc>
+          <w:tcPr>
+            <w:tcW w:type="dxa" w:w="3168"/>
+            <w:shd w:fill="F7FAFC" w:val="clear"/>
+            <w:tcBorders>
+              <w:top w:val="single" w:sz="4" w:space="0" w:color="CBD5E1"/>
+              <w:left w:val="single" w:sz="4" w:space="0" w:color="CBD5E1"/>
+              <w:bottom w:val="single" w:sz="4" w:space="0" w:color="CBD5E1"/>
+              <w:right w:val="single" w:sz="4" w:space="0" w:color="CBD5E1"/>
+            </w:tcBorders>
+          </w:tcPr>
+          <w:p>
+            <w:pPr>
+              <w:spacing w:before="40" w:after="40" w:lineRule="auto" w:line="240"/>
+              <w:jc w:val="center"/>
+            </w:pPr>
+            <w:r/>
+            <w:r>
+              <w:rPr>
+                <w:rFonts w:ascii="Calibri" w:hAnsi="Calibri" w:eastAsia="Calibri"/>
+                <w:b w:val="0"/>
+                <w:i w:val="0"/>
+                <w:color w:val="1F2937"/>
+                <w:sz w:val="20"/>
+              </w:rPr>
+              <w:t>Pot close</w:t>
+            </w:r>
+          </w:p>
+        </w:tc>
+        <w:tc>
+          <w:tcPr>
+            <w:tcW w:type="dxa" w:w="2016"/>
+            <w:shd w:fill="F7FAFC" w:val="clear"/>
+            <w:tcBorders>
+              <w:top w:val="single" w:sz="4" w:space="0" w:color="CBD5E1"/>
+              <w:left w:val="single" w:sz="4" w:space="0" w:color="CBD5E1"/>
+              <w:bottom w:val="single" w:sz="4" w:space="0" w:color="CBD5E1"/>
+              <w:right w:val="single" w:sz="4" w:space="0" w:color="CBD5E1"/>
+            </w:tcBorders>
+          </w:tcPr>
+          <w:p>
+            <w:pPr>
+              <w:spacing w:before="40" w:after="40" w:lineRule="auto" w:line="240"/>
+              <w:jc w:val="left"/>
+            </w:pPr>
+            <w:r/>
+            <w:r>
+              <w:rPr>
+                <w:rFonts w:ascii="Calibri" w:hAnsi="Calibri" w:eastAsia="Calibri"/>
+                <w:b w:val="0"/>
+                <w:i w:val="0"/>
+                <w:color w:val="1F2937"/>
+                <w:sz w:val="20"/>
+              </w:rPr>
+              <w:t>8</w:t>
+            </w:r>
+          </w:p>
+        </w:tc>
+        <w:tc>
+          <w:tcPr>
+            <w:tcW w:type="dxa" w:w="2160"/>
+            <w:shd w:fill="F7FAFC" w:val="clear"/>
+            <w:tcBorders>
+              <w:top w:val="single" w:sz="4" w:space="0" w:color="CBD5E1"/>
+              <w:left w:val="single" w:sz="4" w:space="0" w:color="CBD5E1"/>
+              <w:bottom w:val="single" w:sz="4" w:space="0" w:color="CBD5E1"/>
+              <w:right w:val="single" w:sz="4" w:space="0" w:color="CBD5E1"/>
+            </w:tcBorders>
+          </w:tcPr>
+          <w:p>
+            <w:pPr>
+              <w:spacing w:before="40" w:after="40" w:lineRule="auto" w:line="240"/>
+              <w:jc w:val="left"/>
+            </w:pPr>
+            <w:r/>
+            <w:r>
+              <w:rPr>
+                <w:rFonts w:ascii="Calibri" w:hAnsi="Calibri" w:eastAsia="Calibri"/>
+                <w:b w:val="0"/>
+                <w:i w:val="0"/>
+                <w:color w:val="1F2937"/>
+                <w:sz w:val="20"/>
+              </w:rPr>
+              <w:t>16</w:t>
+            </w:r>
+          </w:p>
+        </w:tc>
+        <w:tc>
+          <w:tcPr>
+            <w:tcW w:type="dxa" w:w="3456"/>
+            <w:shd w:fill="F7FAFC" w:val="clear"/>
+            <w:tcBorders>
+              <w:top w:val="single" w:sz="4" w:space="0" w:color="CBD5E1"/>
+              <w:left w:val="single" w:sz="4" w:space="0" w:color="CBD5E1"/>
+              <w:bottom w:val="single" w:sz="4" w:space="0" w:color="CBD5E1"/>
+              <w:right w:val="single" w:sz="4" w:space="0" w:color="CBD5E1"/>
+            </w:tcBorders>
+          </w:tcPr>
+          <w:p>
+            <w:pPr>
+              <w:spacing w:before="40" w:after="40" w:lineRule="auto" w:line="240"/>
+              <w:jc w:val="left"/>
+            </w:pPr>
+            <w:r/>
+            <w:r>
+              <w:rPr>
+                <w:rFonts w:ascii="Calibri" w:hAnsi="Calibri" w:eastAsia="Calibri"/>
+                <w:b w:val="0"/>
+                <w:i w:val="0"/>
+                <w:color w:val="1F2937"/>
+                <w:sz w:val="20"/>
+              </w:rPr>
+              <w:t>80</w:t>
+            </w:r>
+          </w:p>
+        </w:tc>
+      </w:tr>
+      <w:tr>
+        <w:tc>
+          <w:tcPr>
+            <w:tcW w:type="dxa" w:w="3168"/>
+            <w:tcBorders>
+              <w:top w:val="single" w:sz="4" w:space="0" w:color="CBD5E1"/>
+              <w:left w:val="single" w:sz="4" w:space="0" w:color="CBD5E1"/>
+              <w:bottom w:val="single" w:sz="4" w:space="0" w:color="CBD5E1"/>
+              <w:right w:val="single" w:sz="4" w:space="0" w:color="CBD5E1"/>
+            </w:tcBorders>
+          </w:tcPr>
+          <w:p>
+            <w:pPr>
+              <w:spacing w:before="40" w:after="40" w:lineRule="auto" w:line="240"/>
+              <w:jc w:val="center"/>
+            </w:pPr>
+            <w:r/>
+            <w:r>
+              <w:rPr>
+                <w:rFonts w:ascii="Calibri" w:hAnsi="Calibri" w:eastAsia="Calibri"/>
+                <w:b w:val="0"/>
+                <w:i w:val="0"/>
+                <w:color w:val="1F2937"/>
+                <w:sz w:val="20"/>
+              </w:rPr>
+              <w:t>Lifecycle subtotal</w:t>
+            </w:r>
+          </w:p>
+        </w:tc>
+        <w:tc>
+          <w:tcPr>
+            <w:tcW w:type="dxa" w:w="2016"/>
+            <w:tcBorders>
+              <w:top w:val="single" w:sz="4" w:space="0" w:color="CBD5E1"/>
+              <w:left w:val="single" w:sz="4" w:space="0" w:color="CBD5E1"/>
+              <w:bottom w:val="single" w:sz="4" w:space="0" w:color="CBD5E1"/>
+              <w:right w:val="single" w:sz="4" w:space="0" w:color="CBD5E1"/>
+            </w:tcBorders>
+          </w:tcPr>
+          <w:p>
+            <w:pPr>
+              <w:spacing w:before="40" w:after="40" w:lineRule="auto" w:line="240"/>
+              <w:jc w:val="left"/>
+            </w:pPr>
+            <w:r/>
+            <w:r>
+              <w:rPr>
+                <w:rFonts w:ascii="Calibri" w:hAnsi="Calibri" w:eastAsia="Calibri"/>
+                <w:b w:val="0"/>
+                <w:i w:val="0"/>
+                <w:color w:val="1F2937"/>
+                <w:sz w:val="20"/>
+              </w:rPr>
+              <w:t>32</w:t>
+            </w:r>
+          </w:p>
+        </w:tc>
+        <w:tc>
+          <w:tcPr>
+            <w:tcW w:type="dxa" w:w="2160"/>
+            <w:tcBorders>
+              <w:top w:val="single" w:sz="4" w:space="0" w:color="CBD5E1"/>
+              <w:left w:val="single" w:sz="4" w:space="0" w:color="CBD5E1"/>
+              <w:bottom w:val="single" w:sz="4" w:space="0" w:color="CBD5E1"/>
+              <w:right w:val="single" w:sz="4" w:space="0" w:color="CBD5E1"/>
+            </w:tcBorders>
+          </w:tcPr>
+          <w:p>
+            <w:pPr>
+              <w:spacing w:before="40" w:after="40" w:lineRule="auto" w:line="240"/>
+              <w:jc w:val="left"/>
+            </w:pPr>
+            <w:r/>
+            <w:r>
+              <w:rPr>
+                <w:rFonts w:ascii="Calibri" w:hAnsi="Calibri" w:eastAsia="Calibri"/>
+                <w:b w:val="0"/>
+                <w:i w:val="0"/>
+                <w:color w:val="1F2937"/>
+                <w:sz w:val="20"/>
+              </w:rPr>
+              <w:t>64</w:t>
+            </w:r>
+          </w:p>
+        </w:tc>
+        <w:tc>
+          <w:tcPr>
+            <w:tcW w:type="dxa" w:w="3456"/>
+            <w:tcBorders>
+              <w:top w:val="single" w:sz="4" w:space="0" w:color="CBD5E1"/>
+              <w:left w:val="single" w:sz="4" w:space="0" w:color="CBD5E1"/>
+              <w:bottom w:val="single" w:sz="4" w:space="0" w:color="CBD5E1"/>
+              <w:right w:val="single" w:sz="4" w:space="0" w:color="CBD5E1"/>
+            </w:tcBorders>
+          </w:tcPr>
+          <w:p>
+            <w:pPr>
+              <w:spacing w:before="40" w:after="40" w:lineRule="auto" w:line="240"/>
+              <w:jc w:val="left"/>
+            </w:pPr>
+            <w:r/>
+            <w:r>
+              <w:rPr>
+                <w:rFonts w:ascii="Calibri" w:hAnsi="Calibri" w:eastAsia="Calibri"/>
+                <w:b w:val="0"/>
+                <w:i w:val="0"/>
+                <w:color w:val="1F2937"/>
+                <w:sz w:val="20"/>
+              </w:rPr>
+              <w:t>320</w:t>
+            </w:r>
+          </w:p>
+        </w:tc>
+      </w:tr>
+      <w:tr>
+        <w:tc>
+          <w:tcPr>
+            <w:tcW w:type="dxa" w:w="3168"/>
+            <w:shd w:fill="F7FAFC" w:val="clear"/>
+            <w:tcBorders>
+              <w:top w:val="single" w:sz="4" w:space="0" w:color="CBD5E1"/>
+              <w:left w:val="single" w:sz="4" w:space="0" w:color="CBD5E1"/>
+              <w:bottom w:val="single" w:sz="4" w:space="0" w:color="CBD5E1"/>
+              <w:right w:val="single" w:sz="4" w:space="0" w:color="CBD5E1"/>
+            </w:tcBorders>
+          </w:tcPr>
+          <w:p>
+            <w:pPr>
+              <w:spacing w:before="40" w:after="40" w:lineRule="auto" w:line="240"/>
+              <w:jc w:val="center"/>
+            </w:pPr>
+            <w:r/>
+            <w:r>
+              <w:rPr>
+                <w:rFonts w:ascii="Calibri" w:hAnsi="Calibri" w:eastAsia="Calibri"/>
+                <w:b w:val="0"/>
+                <w:i w:val="0"/>
+                <w:color w:val="1F2937"/>
+                <w:sz w:val="20"/>
+              </w:rPr>
+              <w:t>Participant joins (min.)</w:t>
+            </w:r>
+          </w:p>
+        </w:tc>
+        <w:tc>
+          <w:tcPr>
+            <w:tcW w:type="dxa" w:w="2016"/>
+            <w:shd w:fill="F7FAFC" w:val="clear"/>
+            <w:tcBorders>
+              <w:top w:val="single" w:sz="4" w:space="0" w:color="CBD5E1"/>
+              <w:left w:val="single" w:sz="4" w:space="0" w:color="CBD5E1"/>
+              <w:bottom w:val="single" w:sz="4" w:space="0" w:color="CBD5E1"/>
+              <w:right w:val="single" w:sz="4" w:space="0" w:color="CBD5E1"/>
+            </w:tcBorders>
+          </w:tcPr>
+          <w:p>
+            <w:pPr>
+              <w:spacing w:before="40" w:after="40" w:lineRule="auto" w:line="240"/>
+              <w:jc w:val="left"/>
+            </w:pPr>
+            <w:r/>
+            <w:r>
+              <w:rPr>
+                <w:rFonts w:ascii="Calibri" w:hAnsi="Calibri" w:eastAsia="Calibri"/>
+                <w:b w:val="0"/>
+                <w:i w:val="0"/>
+                <w:color w:val="1F2937"/>
+                <w:sz w:val="20"/>
+              </w:rPr>
+              <w:t>300</w:t>
+            </w:r>
+          </w:p>
+        </w:tc>
+        <w:tc>
+          <w:tcPr>
+            <w:tcW w:type="dxa" w:w="2160"/>
+            <w:shd w:fill="F7FAFC" w:val="clear"/>
+            <w:tcBorders>
+              <w:top w:val="single" w:sz="4" w:space="0" w:color="CBD5E1"/>
+              <w:left w:val="single" w:sz="4" w:space="0" w:color="CBD5E1"/>
+              <w:bottom w:val="single" w:sz="4" w:space="0" w:color="CBD5E1"/>
+              <w:right w:val="single" w:sz="4" w:space="0" w:color="CBD5E1"/>
+            </w:tcBorders>
+          </w:tcPr>
+          <w:p>
+            <w:pPr>
+              <w:spacing w:before="40" w:after="40" w:lineRule="auto" w:line="240"/>
+              <w:jc w:val="left"/>
+            </w:pPr>
+            <w:r/>
+            <w:r>
+              <w:rPr>
+                <w:rFonts w:ascii="Calibri" w:hAnsi="Calibri" w:eastAsia="Calibri"/>
+                <w:b w:val="0"/>
+                <w:i w:val="0"/>
+                <w:color w:val="1F2937"/>
+                <w:sz w:val="20"/>
+              </w:rPr>
+              <w:t>600</w:t>
+            </w:r>
+          </w:p>
+        </w:tc>
+        <w:tc>
+          <w:tcPr>
+            <w:tcW w:type="dxa" w:w="3456"/>
+            <w:shd w:fill="F7FAFC" w:val="clear"/>
+            <w:tcBorders>
+              <w:top w:val="single" w:sz="4" w:space="0" w:color="CBD5E1"/>
+              <w:left w:val="single" w:sz="4" w:space="0" w:color="CBD5E1"/>
+              <w:bottom w:val="single" w:sz="4" w:space="0" w:color="CBD5E1"/>
+              <w:right w:val="single" w:sz="4" w:space="0" w:color="CBD5E1"/>
+            </w:tcBorders>
+          </w:tcPr>
+          <w:p>
+            <w:pPr>
+              <w:spacing w:before="40" w:after="40" w:lineRule="auto" w:line="240"/>
+              <w:jc w:val="left"/>
+            </w:pPr>
+            <w:r/>
+            <w:r>
+              <w:rPr>
+                <w:rFonts w:ascii="Calibri" w:hAnsi="Calibri" w:eastAsia="Calibri"/>
+                <w:b w:val="0"/>
+                <w:i w:val="0"/>
+                <w:color w:val="1F2937"/>
+                <w:sz w:val="20"/>
+              </w:rPr>
+              <w:t>3,000</w:t>
+            </w:r>
+          </w:p>
+        </w:tc>
+      </w:tr>
+      <w:tr>
+        <w:tc>
+          <w:tcPr>
+            <w:tcW w:type="dxa" w:w="3168"/>
+            <w:shd w:fill="EEF2F7" w:val="clear"/>
+            <w:tcBorders>
+              <w:top w:val="single" w:sz="4" w:space="0" w:color="CBD5E1"/>
+              <w:left w:val="single" w:sz="4" w:space="0" w:color="CBD5E1"/>
+              <w:bottom w:val="single" w:sz="4" w:space="0" w:color="CBD5E1"/>
+              <w:right w:val="single" w:sz="4" w:space="0" w:color="CBD5E1"/>
+            </w:tcBorders>
+          </w:tcPr>
+          <w:p>
+            <w:pPr>
+              <w:spacing w:before="40" w:after="40" w:lineRule="auto" w:line="240"/>
+              <w:jc w:val="center"/>
+            </w:pPr>
+            <w:r/>
+            <w:r>
+              <w:rPr>
+                <w:rFonts w:ascii="Calibri" w:hAnsi="Calibri" w:eastAsia="Calibri"/>
+                <w:b/>
+                <w:i w:val="0"/>
+                <w:color w:val="1A365D"/>
+                <w:sz w:val="20"/>
+              </w:rPr>
+              <w:t>Total on-chain txs (min.)</w:t>
+            </w:r>
+          </w:p>
+        </w:tc>
+        <w:tc>
+          <w:tcPr>
+            <w:tcW w:type="dxa" w:w="2016"/>
+            <w:shd w:fill="EEF2F7" w:val="clear"/>
+            <w:tcBorders>
+              <w:top w:val="single" w:sz="4" w:space="0" w:color="CBD5E1"/>
+              <w:left w:val="single" w:sz="4" w:space="0" w:color="CBD5E1"/>
+              <w:bottom w:val="single" w:sz="4" w:space="0" w:color="CBD5E1"/>
+              <w:right w:val="single" w:sz="4" w:space="0" w:color="CBD5E1"/>
+            </w:tcBorders>
+          </w:tcPr>
+          <w:p>
+            <w:pPr>
+              <w:spacing w:before="40" w:after="40" w:lineRule="auto" w:line="240"/>
+              <w:jc w:val="left"/>
+            </w:pPr>
+            <w:r/>
+            <w:r>
+              <w:rPr>
+                <w:rFonts w:ascii="Calibri" w:hAnsi="Calibri" w:eastAsia="Calibri"/>
+                <w:b/>
+                <w:i w:val="0"/>
+                <w:color w:val="1A365D"/>
+                <w:sz w:val="20"/>
+              </w:rPr>
+              <w:t>332</w:t>
+            </w:r>
+          </w:p>
+        </w:tc>
+        <w:tc>
+          <w:tcPr>
+            <w:tcW w:type="dxa" w:w="2160"/>
+            <w:shd w:fill="EEF2F7" w:val="clear"/>
+            <w:tcBorders>
+              <w:top w:val="single" w:sz="4" w:space="0" w:color="CBD5E1"/>
+              <w:left w:val="single" w:sz="4" w:space="0" w:color="CBD5E1"/>
+              <w:bottom w:val="single" w:sz="4" w:space="0" w:color="CBD5E1"/>
+              <w:right w:val="single" w:sz="4" w:space="0" w:color="CBD5E1"/>
+            </w:tcBorders>
+          </w:tcPr>
+          <w:p>
+            <w:pPr>
+              <w:spacing w:before="40" w:after="40" w:lineRule="auto" w:line="240"/>
+              <w:jc w:val="left"/>
+            </w:pPr>
+            <w:r/>
+            <w:r>
+              <w:rPr>
+                <w:rFonts w:ascii="Calibri" w:hAnsi="Calibri" w:eastAsia="Calibri"/>
+                <w:b/>
+                <w:i w:val="0"/>
+                <w:color w:val="1A365D"/>
+                <w:sz w:val="20"/>
+              </w:rPr>
+              <w:t>664</w:t>
+            </w:r>
+          </w:p>
+        </w:tc>
+        <w:tc>
+          <w:tcPr>
+            <w:tcW w:type="dxa" w:w="3456"/>
+            <w:shd w:fill="EEF2F7" w:val="clear"/>
+            <w:tcBorders>
+              <w:top w:val="single" w:sz="4" w:space="0" w:color="CBD5E1"/>
+              <w:left w:val="single" w:sz="4" w:space="0" w:color="CBD5E1"/>
+              <w:bottom w:val="single" w:sz="4" w:space="0" w:color="CBD5E1"/>
+              <w:right w:val="single" w:sz="4" w:space="0" w:color="CBD5E1"/>
+            </w:tcBorders>
+          </w:tcPr>
+          <w:p>
+            <w:pPr>
+              <w:spacing w:before="40" w:after="40" w:lineRule="auto" w:line="240"/>
+              <w:jc w:val="left"/>
+            </w:pPr>
+            <w:r/>
+            <w:r>
+              <w:rPr>
+                <w:rFonts w:ascii="Calibri" w:hAnsi="Calibri" w:eastAsia="Calibri"/>
+                <w:b/>
+                <w:i w:val="0"/>
+                <w:color w:val="1A365D"/>
+                <w:sz w:val="20"/>
+              </w:rPr>
+              <w:t>3,320</w:t>
+            </w:r>
+          </w:p>
+        </w:tc>
+      </w:tr>
+    </w:tbl>
+    <w:p>
+      <w:pPr>
+        <w:spacing w:before="0" w:after="120" w:lineRule="auto" w:line="240"/>
+      </w:pPr>
+    </w:p>
+    <w:p>
+      <w:pPr>
+        <w:spacing w:before="240" w:after="120" w:lineRule="auto" w:line="276"/>
+      </w:pPr>
+      <w:r>
+        <w:rPr>
+          <w:rFonts w:ascii="Calibri" w:hAnsi="Calibri" w:eastAsia="Calibri"/>
+          <w:b/>
+          <w:i w:val="0"/>
+          <w:color w:val="2B6CB0"/>
+          <w:sz w:val="26"/>
+        </w:rPr>
+        <w:t>Program Totals at a Glance</w:t>
+      </w:r>
+    </w:p>
+    <w:tbl>
+      <w:tblPr>
+        <w:tblW w:type="auto" w:w="0"/>
+        <w:jc w:val="center"/>
+        <w:tblLayout w:type="autofit"/>
+        <w:tblLook w:firstColumn="1" w:firstRow="1" w:lastColumn="0" w:lastRow="0" w:noHBand="0" w:noVBand="1" w:val="04A0"/>
+      </w:tblPr>
+      <w:tblGrid>
+        <w:gridCol w:w="4680"/>
+        <w:gridCol w:w="4680"/>
+      </w:tblGrid>
+      <w:tr>
+        <w:tc>
+          <w:tcPr>
+            <w:tcW w:type="dxa" w:w="5040"/>
+            <w:shd w:fill="1A365D" w:val="clear"/>
+            <w:tcBorders>
+              <w:top w:val="single" w:sz="4" w:space="0" w:color="1A365D"/>
+              <w:left w:val="single" w:sz="4" w:space="0" w:color="1A365D"/>
+              <w:bottom w:val="single" w:sz="4" w:space="0" w:color="1A365D"/>
+              <w:right w:val="single" w:sz="4" w:space="0" w:color="1A365D"/>
+            </w:tcBorders>
+          </w:tcPr>
+          <w:p>
+            <w:pPr>
+              <w:spacing w:before="40" w:after="40" w:lineRule="auto" w:line="240"/>
+              <w:jc w:val="center"/>
+            </w:pPr>
+            <w:r/>
+            <w:r>
+              <w:rPr>
+                <w:rFonts w:ascii="Calibri" w:hAnsi="Calibri" w:eastAsia="Calibri"/>
+                <w:b/>
+                <w:i w:val="0"/>
+                <w:color w:val="FFFFFF"/>
+                <w:sz w:val="20"/>
+              </w:rPr>
+              <w:t>Metric</w:t>
+            </w:r>
+          </w:p>
+        </w:tc>
+        <w:tc>
+          <w:tcPr>
+            <w:tcW w:type="dxa" w:w="4320"/>
+            <w:shd w:fill="1A365D" w:val="clear"/>
+            <w:tcBorders>
+              <w:top w:val="single" w:sz="4" w:space="0" w:color="1A365D"/>
+              <w:left w:val="single" w:sz="4" w:space="0" w:color="1A365D"/>
+              <w:bottom w:val="single" w:sz="4" w:space="0" w:color="1A365D"/>
+              <w:right w:val="single" w:sz="4" w:space="0" w:color="1A365D"/>
+            </w:tcBorders>
+          </w:tcPr>
+          <w:p>
+            <w:pPr>
+              <w:spacing w:before="40" w:after="40" w:lineRule="auto" w:line="240"/>
+              <w:jc w:val="center"/>
+            </w:pPr>
+            <w:r/>
+            <w:r>
+              <w:rPr>
+                <w:rFonts w:ascii="Calibri" w:hAnsi="Calibri" w:eastAsia="Calibri"/>
+                <w:b/>
+                <w:i w:val="0"/>
+                <w:color w:val="FFFFFF"/>
+                <w:sz w:val="20"/>
+              </w:rPr>
+              <w:t>Expected Minimum</w:t>
+            </w:r>
+          </w:p>
+        </w:tc>
+      </w:tr>
+      <w:tr>
+        <w:tc>
+          <w:tcPr>
+            <w:tcW w:type="dxa" w:w="5040"/>
+            <w:tcBorders>
+              <w:top w:val="single" w:sz="4" w:space="0" w:color="CBD5E1"/>
+              <w:left w:val="single" w:sz="4" w:space="0" w:color="CBD5E1"/>
+              <w:bottom w:val="single" w:sz="4" w:space="0" w:color="CBD5E1"/>
+              <w:right w:val="single" w:sz="4" w:space="0" w:color="CBD5E1"/>
+            </w:tcBorders>
+          </w:tcPr>
+          <w:p>
+            <w:pPr>
+              <w:spacing w:before="40" w:after="40" w:lineRule="auto" w:line="240"/>
+              <w:jc w:val="left"/>
+            </w:pPr>
+            <w:r/>
+            <w:r>
+              <w:rPr>
+                <w:rFonts w:ascii="Calibri" w:hAnsi="Calibri" w:eastAsia="Calibri"/>
+                <w:b w:val="0"/>
+                <w:i w:val="0"/>
+                <w:color w:val="1F2937"/>
+                <w:sz w:val="20"/>
+              </w:rPr>
+              <w:t>Sponsored pots delivered</w:t>
+            </w:r>
+          </w:p>
+        </w:tc>
+        <w:tc>
+          <w:tcPr>
+            <w:tcW w:type="dxa" w:w="4320"/>
+            <w:tcBorders>
+              <w:top w:val="single" w:sz="4" w:space="0" w:color="CBD5E1"/>
+              <w:left w:val="single" w:sz="4" w:space="0" w:color="CBD5E1"/>
+              <w:bottom w:val="single" w:sz="4" w:space="0" w:color="CBD5E1"/>
+              <w:right w:val="single" w:sz="4" w:space="0" w:color="CBD5E1"/>
+            </w:tcBorders>
+          </w:tcPr>
+          <w:p>
+            <w:pPr>
+              <w:spacing w:before="40" w:after="40" w:lineRule="auto" w:line="240"/>
+              <w:jc w:val="right"/>
+            </w:pPr>
+            <w:r/>
+            <w:r>
+              <w:rPr>
+                <w:rFonts w:ascii="Calibri" w:hAnsi="Calibri" w:eastAsia="Calibri"/>
+                <w:b w:val="0"/>
+                <w:i w:val="0"/>
+                <w:color w:val="1F2937"/>
+                <w:sz w:val="20"/>
+              </w:rPr>
+              <w:t>80</w:t>
+            </w:r>
+          </w:p>
+        </w:tc>
+      </w:tr>
+      <w:tr>
+        <w:tc>
+          <w:tcPr>
+            <w:tcW w:type="dxa" w:w="5040"/>
+            <w:shd w:fill="F7FAFC" w:val="clear"/>
+            <w:tcBorders>
+              <w:top w:val="single" w:sz="4" w:space="0" w:color="CBD5E1"/>
+              <w:left w:val="single" w:sz="4" w:space="0" w:color="CBD5E1"/>
+              <w:bottom w:val="single" w:sz="4" w:space="0" w:color="CBD5E1"/>
+              <w:right w:val="single" w:sz="4" w:space="0" w:color="CBD5E1"/>
+            </w:tcBorders>
+          </w:tcPr>
+          <w:p>
+            <w:pPr>
+              <w:spacing w:before="40" w:after="40" w:lineRule="auto" w:line="240"/>
+              <w:jc w:val="left"/>
+            </w:pPr>
+            <w:r/>
+            <w:r>
+              <w:rPr>
+                <w:rFonts w:ascii="Calibri" w:hAnsi="Calibri" w:eastAsia="Calibri"/>
+                <w:b w:val="0"/>
+                <w:i w:val="0"/>
+                <w:color w:val="1F2937"/>
+                <w:sz w:val="20"/>
+              </w:rPr>
+              <w:t>Pot deploy transactions</w:t>
+            </w:r>
+          </w:p>
+        </w:tc>
+        <w:tc>
+          <w:tcPr>
+            <w:tcW w:type="dxa" w:w="4320"/>
+            <w:shd w:fill="F7FAFC" w:val="clear"/>
+            <w:tcBorders>
+              <w:top w:val="single" w:sz="4" w:space="0" w:color="CBD5E1"/>
+              <w:left w:val="single" w:sz="4" w:space="0" w:color="CBD5E1"/>
+              <w:bottom w:val="single" w:sz="4" w:space="0" w:color="CBD5E1"/>
+              <w:right w:val="single" w:sz="4" w:space="0" w:color="CBD5E1"/>
+            </w:tcBorders>
+          </w:tcPr>
+          <w:p>
+            <w:pPr>
+              <w:spacing w:before="40" w:after="40" w:lineRule="auto" w:line="240"/>
+              <w:jc w:val="right"/>
+            </w:pPr>
+            <w:r/>
+            <w:r>
+              <w:rPr>
+                <w:rFonts w:ascii="Calibri" w:hAnsi="Calibri" w:eastAsia="Calibri"/>
+                <w:b w:val="0"/>
+                <w:i w:val="0"/>
+                <w:color w:val="1F2937"/>
+                <w:sz w:val="20"/>
+              </w:rPr>
+              <w:t>80</w:t>
+            </w:r>
+          </w:p>
+        </w:tc>
+      </w:tr>
+      <w:tr>
+        <w:tc>
+          <w:tcPr>
+            <w:tcW w:type="dxa" w:w="5040"/>
+            <w:tcBorders>
+              <w:top w:val="single" w:sz="4" w:space="0" w:color="CBD5E1"/>
+              <w:left w:val="single" w:sz="4" w:space="0" w:color="CBD5E1"/>
+              <w:bottom w:val="single" w:sz="4" w:space="0" w:color="CBD5E1"/>
+              <w:right w:val="single" w:sz="4" w:space="0" w:color="CBD5E1"/>
+            </w:tcBorders>
+          </w:tcPr>
+          <w:p>
+            <w:pPr>
+              <w:spacing w:before="40" w:after="40" w:lineRule="auto" w:line="240"/>
+              <w:jc w:val="left"/>
+            </w:pPr>
+            <w:r/>
+            <w:r>
+              <w:rPr>
+                <w:rFonts w:ascii="Calibri" w:hAnsi="Calibri" w:eastAsia="Calibri"/>
+                <w:b w:val="0"/>
+                <w:i w:val="0"/>
+                <w:color w:val="1F2937"/>
+                <w:sz w:val="20"/>
+              </w:rPr>
+              <w:t>Pot activate transactions</w:t>
+            </w:r>
+          </w:p>
+        </w:tc>
+        <w:tc>
+          <w:tcPr>
+            <w:tcW w:type="dxa" w:w="4320"/>
+            <w:tcBorders>
+              <w:top w:val="single" w:sz="4" w:space="0" w:color="CBD5E1"/>
+              <w:left w:val="single" w:sz="4" w:space="0" w:color="CBD5E1"/>
+              <w:bottom w:val="single" w:sz="4" w:space="0" w:color="CBD5E1"/>
+              <w:right w:val="single" w:sz="4" w:space="0" w:color="CBD5E1"/>
+            </w:tcBorders>
+          </w:tcPr>
+          <w:p>
+            <w:pPr>
+              <w:spacing w:before="40" w:after="40" w:lineRule="auto" w:line="240"/>
+              <w:jc w:val="right"/>
+            </w:pPr>
+            <w:r/>
+            <w:r>
+              <w:rPr>
+                <w:rFonts w:ascii="Calibri" w:hAnsi="Calibri" w:eastAsia="Calibri"/>
+                <w:b w:val="0"/>
+                <w:i w:val="0"/>
+                <w:color w:val="1F2937"/>
+                <w:sz w:val="20"/>
+              </w:rPr>
+              <w:t>80</w:t>
+            </w:r>
+          </w:p>
+        </w:tc>
+      </w:tr>
+      <w:tr>
+        <w:tc>
+          <w:tcPr>
+            <w:tcW w:type="dxa" w:w="5040"/>
+            <w:shd w:fill="F7FAFC" w:val="clear"/>
+            <w:tcBorders>
+              <w:top w:val="single" w:sz="4" w:space="0" w:color="CBD5E1"/>
+              <w:left w:val="single" w:sz="4" w:space="0" w:color="CBD5E1"/>
+              <w:bottom w:val="single" w:sz="4" w:space="0" w:color="CBD5E1"/>
+              <w:right w:val="single" w:sz="4" w:space="0" w:color="CBD5E1"/>
+            </w:tcBorders>
+          </w:tcPr>
+          <w:p>
+            <w:pPr>
+              <w:spacing w:before="40" w:after="40" w:lineRule="auto" w:line="240"/>
+              <w:jc w:val="left"/>
+            </w:pPr>
+            <w:r/>
+            <w:r>
+              <w:rPr>
+                <w:rFonts w:ascii="Calibri" w:hAnsi="Calibri" w:eastAsia="Calibri"/>
+                <w:b w:val="0"/>
+                <w:i w:val="0"/>
+                <w:color w:val="1F2937"/>
+                <w:sz w:val="20"/>
+              </w:rPr>
+              <w:t>Pot start transactions</w:t>
+            </w:r>
+          </w:p>
+        </w:tc>
+        <w:tc>
+          <w:tcPr>
+            <w:tcW w:type="dxa" w:w="4320"/>
+            <w:shd w:fill="F7FAFC" w:val="clear"/>
+            <w:tcBorders>
+              <w:top w:val="single" w:sz="4" w:space="0" w:color="CBD5E1"/>
+              <w:left w:val="single" w:sz="4" w:space="0" w:color="CBD5E1"/>
+              <w:bottom w:val="single" w:sz="4" w:space="0" w:color="CBD5E1"/>
+              <w:right w:val="single" w:sz="4" w:space="0" w:color="CBD5E1"/>
+            </w:tcBorders>
+          </w:tcPr>
+          <w:p>
+            <w:pPr>
+              <w:spacing w:before="40" w:after="40" w:lineRule="auto" w:line="240"/>
+              <w:jc w:val="right"/>
+            </w:pPr>
+            <w:r/>
+            <w:r>
+              <w:rPr>
+                <w:rFonts w:ascii="Calibri" w:hAnsi="Calibri" w:eastAsia="Calibri"/>
+                <w:b w:val="0"/>
+                <w:i w:val="0"/>
+                <w:color w:val="1F2937"/>
+                <w:sz w:val="20"/>
+              </w:rPr>
+              <w:t>80</w:t>
+            </w:r>
+          </w:p>
+        </w:tc>
+      </w:tr>
+      <w:tr>
+        <w:tc>
+          <w:tcPr>
+            <w:tcW w:type="dxa" w:w="5040"/>
+            <w:tcBorders>
+              <w:top w:val="single" w:sz="4" w:space="0" w:color="CBD5E1"/>
+              <w:left w:val="single" w:sz="4" w:space="0" w:color="CBD5E1"/>
+              <w:bottom w:val="single" w:sz="4" w:space="0" w:color="CBD5E1"/>
+              <w:right w:val="single" w:sz="4" w:space="0" w:color="CBD5E1"/>
+            </w:tcBorders>
+          </w:tcPr>
+          <w:p>
+            <w:pPr>
+              <w:spacing w:before="40" w:after="40" w:lineRule="auto" w:line="240"/>
+              <w:jc w:val="left"/>
+            </w:pPr>
+            <w:r/>
+            <w:r>
+              <w:rPr>
+                <w:rFonts w:ascii="Calibri" w:hAnsi="Calibri" w:eastAsia="Calibri"/>
+                <w:b w:val="0"/>
+                <w:i w:val="0"/>
+                <w:color w:val="1F2937"/>
+                <w:sz w:val="20"/>
+              </w:rPr>
+              <w:t>Pot close transactions</w:t>
+            </w:r>
+          </w:p>
+        </w:tc>
+        <w:tc>
+          <w:tcPr>
+            <w:tcW w:type="dxa" w:w="4320"/>
+            <w:tcBorders>
+              <w:top w:val="single" w:sz="4" w:space="0" w:color="CBD5E1"/>
+              <w:left w:val="single" w:sz="4" w:space="0" w:color="CBD5E1"/>
+              <w:bottom w:val="single" w:sz="4" w:space="0" w:color="CBD5E1"/>
+              <w:right w:val="single" w:sz="4" w:space="0" w:color="CBD5E1"/>
+            </w:tcBorders>
+          </w:tcPr>
+          <w:p>
+            <w:pPr>
+              <w:spacing w:before="40" w:after="40" w:lineRule="auto" w:line="240"/>
+              <w:jc w:val="right"/>
+            </w:pPr>
+            <w:r/>
+            <w:r>
+              <w:rPr>
+                <w:rFonts w:ascii="Calibri" w:hAnsi="Calibri" w:eastAsia="Calibri"/>
+                <w:b w:val="0"/>
+                <w:i w:val="0"/>
+                <w:color w:val="1F2937"/>
+                <w:sz w:val="20"/>
+              </w:rPr>
+              <w:t>80</w:t>
+            </w:r>
+          </w:p>
+        </w:tc>
+      </w:tr>
+      <w:tr>
+        <w:tc>
+          <w:tcPr>
+            <w:tcW w:type="dxa" w:w="5040"/>
+            <w:shd w:fill="F7FAFC" w:val="clear"/>
+            <w:tcBorders>
+              <w:top w:val="single" w:sz="4" w:space="0" w:color="CBD5E1"/>
+              <w:left w:val="single" w:sz="4" w:space="0" w:color="CBD5E1"/>
+              <w:bottom w:val="single" w:sz="4" w:space="0" w:color="CBD5E1"/>
+              <w:right w:val="single" w:sz="4" w:space="0" w:color="CBD5E1"/>
+            </w:tcBorders>
+          </w:tcPr>
+          <w:p>
+            <w:pPr>
+              <w:spacing w:before="40" w:after="40" w:lineRule="auto" w:line="240"/>
+              <w:jc w:val="left"/>
+            </w:pPr>
+            <w:r/>
+            <w:r>
+              <w:rPr>
+                <w:rFonts w:ascii="Calibri" w:hAnsi="Calibri" w:eastAsia="Calibri"/>
+                <w:b w:val="0"/>
+                <w:i w:val="0"/>
+                <w:color w:val="1F2937"/>
+                <w:sz w:val="20"/>
+              </w:rPr>
+              <w:t>Participant join transactions</w:t>
+            </w:r>
+          </w:p>
+        </w:tc>
+        <w:tc>
+          <w:tcPr>
+            <w:tcW w:type="dxa" w:w="4320"/>
+            <w:shd w:fill="F7FAFC" w:val="clear"/>
+            <w:tcBorders>
+              <w:top w:val="single" w:sz="4" w:space="0" w:color="CBD5E1"/>
+              <w:left w:val="single" w:sz="4" w:space="0" w:color="CBD5E1"/>
+              <w:bottom w:val="single" w:sz="4" w:space="0" w:color="CBD5E1"/>
+              <w:right w:val="single" w:sz="4" w:space="0" w:color="CBD5E1"/>
+            </w:tcBorders>
+          </w:tcPr>
+          <w:p>
+            <w:pPr>
+              <w:spacing w:before="40" w:after="40" w:lineRule="auto" w:line="240"/>
+              <w:jc w:val="right"/>
+            </w:pPr>
+            <w:r/>
+            <w:r>
+              <w:rPr>
+                <w:rFonts w:ascii="Calibri" w:hAnsi="Calibri" w:eastAsia="Calibri"/>
+                <w:b w:val="0"/>
+                <w:i w:val="0"/>
+                <w:color w:val="1F2937"/>
+                <w:sz w:val="20"/>
+              </w:rPr>
+              <w:t>3,000</w:t>
+            </w:r>
+          </w:p>
+        </w:tc>
+      </w:tr>
+      <w:tr>
+        <w:tc>
+          <w:tcPr>
+            <w:tcW w:type="dxa" w:w="5040"/>
+            <w:shd w:fill="EEF2F7" w:val="clear"/>
+            <w:tcBorders>
+              <w:top w:val="single" w:sz="4" w:space="0" w:color="CBD5E1"/>
+              <w:left w:val="single" w:sz="4" w:space="0" w:color="CBD5E1"/>
+              <w:bottom w:val="single" w:sz="4" w:space="0" w:color="CBD5E1"/>
+              <w:right w:val="single" w:sz="4" w:space="0" w:color="CBD5E1"/>
+            </w:tcBorders>
+          </w:tcPr>
+          <w:p>
+            <w:pPr>
+              <w:spacing w:before="40" w:after="40" w:lineRule="auto" w:line="240"/>
+              <w:jc w:val="left"/>
+            </w:pPr>
+            <w:r/>
+            <w:r>
+              <w:rPr>
+                <w:rFonts w:ascii="Calibri" w:hAnsi="Calibri" w:eastAsia="Calibri"/>
+                <w:b/>
+                <w:i w:val="0"/>
+                <w:color w:val="1A365D"/>
+                <w:sz w:val="20"/>
+              </w:rPr>
+              <w:t>Total Stacks transactions</w:t>
+            </w:r>
+          </w:p>
+        </w:tc>
+        <w:tc>
+          <w:tcPr>
+            <w:tcW w:type="dxa" w:w="4320"/>
+            <w:shd w:fill="EEF2F7" w:val="clear"/>
+            <w:tcBorders>
+              <w:top w:val="single" w:sz="4" w:space="0" w:color="CBD5E1"/>
+              <w:left w:val="single" w:sz="4" w:space="0" w:color="CBD5E1"/>
+              <w:bottom w:val="single" w:sz="4" w:space="0" w:color="CBD5E1"/>
+              <w:right w:val="single" w:sz="4" w:space="0" w:color="CBD5E1"/>
+            </w:tcBorders>
+          </w:tcPr>
+          <w:p>
+            <w:pPr>
+              <w:spacing w:before="40" w:after="40" w:lineRule="auto" w:line="240"/>
+              <w:jc w:val="right"/>
+            </w:pPr>
+            <w:r/>
+            <w:r>
+              <w:rPr>
+                <w:rFonts w:ascii="Calibri" w:hAnsi="Calibri" w:eastAsia="Calibri"/>
+                <w:b/>
+                <w:i w:val="0"/>
+                <w:color w:val="1A365D"/>
+                <w:sz w:val="20"/>
+              </w:rPr>
+              <w:t>3,320</w:t>
+            </w:r>
+          </w:p>
+        </w:tc>
+      </w:tr>
+    </w:tbl>
+    <w:p>
+      <w:pPr>
+        <w:spacing w:before="0" w:after="120" w:lineRule="auto" w:line="240"/>
+      </w:pPr>
+    </w:p>
+    <w:p>
+      <w:pPr>
         <w:spacing w:before="360" w:after="120" w:lineRule="auto" w:line="276"/>
       </w:pPr>
       <w:r>
@@ -7005,6 +10173,22 @@
           <w:color w:val="1F2937"/>
           <w:sz w:val="22"/>
         </w:rPr>
+        <w:t>Transaction counts: pot deploy, activate, start, close, and participant joins</w:t>
+      </w:r>
+    </w:p>
+    <w:p>
+      <w:pPr>
+        <w:pStyle w:val="ListBullet"/>
+        <w:spacing w:before="0" w:after="60" w:lineRule="auto" w:line="264"/>
+      </w:pPr>
+      <w:r>
+        <w:rPr>
+          <w:rFonts w:ascii="Calibri" w:hAnsi="Calibri" w:eastAsia="Calibri"/>
+          <w:b w:val="0"/>
+          <w:i w:val="0"/>
+          <w:color w:val="1F2937"/>
+          <w:sz w:val="22"/>
+        </w:rPr>
         <w:t>Early retention / repeat participation signals</w:t>
       </w:r>
     </w:p>
@@ -7052,6 +10236,22 @@
           <w:sz w:val="22"/>
         </w:rPr>
         <w:t>Full campaign performance analysis across 10 cycles / 80 pots</w:t>
+      </w:r>
+    </w:p>
+    <w:p>
+      <w:pPr>
+        <w:pStyle w:val="ListBullet"/>
+        <w:spacing w:before="0" w:after="60" w:lineRule="auto" w:line="264"/>
+      </w:pPr>
+      <w:r>
+        <w:rPr>
+          <w:rFonts w:ascii="Calibri" w:hAnsi="Calibri" w:eastAsia="Calibri"/>
+          <w:b w:val="0"/>
+          <w:i w:val="0"/>
+          <w:color w:val="1F2937"/>
+          <w:sz w:val="22"/>
+        </w:rPr>
+        <w:t>Cumulative transaction breakdown (target minimum: 3,320 on-chain txs)</w:t>
       </w:r>
     </w:p>
     <w:p>

</xml_diff>

<commit_message>
Fill min participants and recompute campaign totals
Set min participants at 25/50/10 per pot tier and update Total
Participants (8,600), Total Tx (9,520), and related outcomes.

Co-authored-by: cryptosmith.btc <Zeus-Adin@users.noreply.github.com>
</commit_message>
<xml_diff>
--- a/StacksPot-Growth-Acceleration-Proposal.docx
+++ b/StacksPot-Growth-Acceleration-Proposal.docx
@@ -1872,7 +1872,7 @@
                 <w:color w:val="1F2937"/>
                 <w:sz w:val="16"/>
               </w:rPr>
-              <w:t>—</w:t>
+              <w:t>25</w:t>
             </w:r>
           </w:p>
         </w:tc>
@@ -1928,7 +1928,7 @@
                 <w:color w:val="1F2937"/>
                 <w:sz w:val="16"/>
               </w:rPr>
-              <w:t>400</w:t>
+              <w:t>2,900</w:t>
             </w:r>
           </w:p>
         </w:tc>
@@ -1984,7 +1984,7 @@
                 <w:color w:val="1F2937"/>
                 <w:sz w:val="16"/>
               </w:rPr>
-              <w:t>—</w:t>
+              <w:t>2,500</w:t>
             </w:r>
           </w:p>
         </w:tc>
@@ -2101,7 +2101,7 @@
                 <w:color w:val="1F2937"/>
                 <w:sz w:val="16"/>
               </w:rPr>
-              <w:t>—</w:t>
+              <w:t>50</w:t>
             </w:r>
           </w:p>
         </w:tc>
@@ -2159,7 +2159,7 @@
                 <w:color w:val="1F2937"/>
                 <w:sz w:val="16"/>
               </w:rPr>
-              <w:t>480</w:t>
+              <w:t>6,480</w:t>
             </w:r>
           </w:p>
         </w:tc>
@@ -2217,7 +2217,7 @@
                 <w:color w:val="1F2937"/>
                 <w:sz w:val="16"/>
               </w:rPr>
-              <w:t>—</w:t>
+              <w:t>6,000</w:t>
             </w:r>
           </w:p>
         </w:tc>
@@ -2332,7 +2332,7 @@
                 <w:color w:val="1F2937"/>
                 <w:sz w:val="16"/>
               </w:rPr>
-              <w:t>—</w:t>
+              <w:t>10</w:t>
             </w:r>
           </w:p>
         </w:tc>
@@ -2388,7 +2388,7 @@
                 <w:color w:val="1F2937"/>
                 <w:sz w:val="16"/>
               </w:rPr>
-              <w:t>40</w:t>
+              <w:t>140</w:t>
             </w:r>
           </w:p>
         </w:tc>
@@ -2444,7 +2444,7 @@
                 <w:color w:val="1F2937"/>
                 <w:sz w:val="16"/>
               </w:rPr>
-              <w:t>—</w:t>
+              <w:t>100</w:t>
             </w:r>
           </w:p>
         </w:tc>
@@ -2619,7 +2619,7 @@
                 <w:color w:val="1A365D"/>
                 <w:sz w:val="16"/>
               </w:rPr>
-              <w:t>920</w:t>
+              <w:t>9,520</w:t>
             </w:r>
           </w:p>
         </w:tc>
@@ -2677,7 +2677,7 @@
                 <w:color w:val="1A365D"/>
                 <w:sz w:val="16"/>
               </w:rPr>
-              <w:t>—</w:t>
+              <w:t>8,600</w:t>
             </w:r>
           </w:p>
         </w:tc>
@@ -2740,17 +2740,18 @@
         <w:tblLook w:firstColumn="1" w:firstRow="1" w:lastColumn="0" w:lastRow="0" w:noHBand="0" w:noVBand="1" w:val="04A0"/>
       </w:tblPr>
       <w:tblGrid>
-        <w:gridCol w:w="1632"/>
-        <w:gridCol w:w="1632"/>
-        <w:gridCol w:w="1632"/>
-        <w:gridCol w:w="1632"/>
-        <w:gridCol w:w="1632"/>
-        <w:gridCol w:w="1632"/>
+        <w:gridCol w:w="1399"/>
+        <w:gridCol w:w="1399"/>
+        <w:gridCol w:w="1399"/>
+        <w:gridCol w:w="1399"/>
+        <w:gridCol w:w="1399"/>
+        <w:gridCol w:w="1399"/>
+        <w:gridCol w:w="1399"/>
       </w:tblGrid>
       <w:tr>
         <w:tc>
           <w:tcPr>
-            <w:tcW w:type="dxa" w:w="1008"/>
+            <w:tcW w:type="dxa" w:w="864"/>
             <w:shd w:fill="1A365D" w:val="clear"/>
             <w:tcBorders>
               <w:top w:val="single" w:sz="4" w:space="0" w:color="1A365D"/>
@@ -2779,7 +2780,7 @@
         </w:tc>
         <w:tc>
           <w:tcPr>
-            <w:tcW w:type="dxa" w:w="1584"/>
+            <w:tcW w:type="dxa" w:w="1440"/>
             <w:shd w:fill="1A365D" w:val="clear"/>
             <w:tcBorders>
               <w:top w:val="single" w:sz="4" w:space="0" w:color="1A365D"/>
@@ -2808,7 +2809,7 @@
         </w:tc>
         <w:tc>
           <w:tcPr>
-            <w:tcW w:type="dxa" w:w="1440"/>
+            <w:tcW w:type="dxa" w:w="1296"/>
             <w:shd w:fill="1A365D" w:val="clear"/>
             <w:tcBorders>
               <w:top w:val="single" w:sz="4" w:space="0" w:color="1A365D"/>
@@ -2837,7 +2838,36 @@
         </w:tc>
         <w:tc>
           <w:tcPr>
-            <w:tcW w:type="dxa" w:w="1584"/>
+            <w:tcW w:type="dxa" w:w="1440"/>
+            <w:shd w:fill="1A365D" w:val="clear"/>
+            <w:tcBorders>
+              <w:top w:val="single" w:sz="4" w:space="0" w:color="1A365D"/>
+              <w:left w:val="single" w:sz="4" w:space="0" w:color="1A365D"/>
+              <w:bottom w:val="single" w:sz="4" w:space="0" w:color="1A365D"/>
+              <w:right w:val="single" w:sz="4" w:space="0" w:color="1A365D"/>
+            </w:tcBorders>
+          </w:tcPr>
+          <w:p>
+            <w:pPr>
+              <w:spacing w:before="40" w:after="40" w:lineRule="auto" w:line="240"/>
+              <w:jc w:val="center"/>
+            </w:pPr>
+            <w:r/>
+            <w:r>
+              <w:rPr>
+                <w:rFonts w:ascii="Calibri" w:hAnsi="Calibri" w:eastAsia="Calibri"/>
+                <w:b/>
+                <w:i w:val="0"/>
+                <w:color w:val="FFFFFF"/>
+                <w:sz w:val="18"/>
+              </w:rPr>
+              <w:t>Min. Part. / Pot</w:t>
+            </w:r>
+          </w:p>
+        </w:tc>
+        <w:tc>
+          <w:tcPr>
+            <w:tcW w:type="dxa" w:w="1440"/>
             <w:shd w:fill="1A365D" w:val="clear"/>
             <w:tcBorders>
               <w:top w:val="single" w:sz="4" w:space="0" w:color="1A365D"/>
@@ -2866,7 +2896,7 @@
         </w:tc>
         <w:tc>
           <w:tcPr>
-            <w:tcW w:type="dxa" w:w="2304"/>
+            <w:tcW w:type="dxa" w:w="2160"/>
             <w:shd w:fill="1A365D" w:val="clear"/>
             <w:tcBorders>
               <w:top w:val="single" w:sz="4" w:space="0" w:color="1A365D"/>
@@ -2895,7 +2925,7 @@
         </w:tc>
         <w:tc>
           <w:tcPr>
-            <w:tcW w:type="dxa" w:w="1872"/>
+            <w:tcW w:type="dxa" w:w="1728"/>
             <w:shd w:fill="1A365D" w:val="clear"/>
             <w:tcBorders>
               <w:top w:val="single" w:sz="4" w:space="0" w:color="1A365D"/>
@@ -2926,7 +2956,7 @@
       <w:tr>
         <w:tc>
           <w:tcPr>
-            <w:tcW w:type="dxa" w:w="1008"/>
+            <w:tcW w:type="dxa" w:w="864"/>
             <w:tcBorders>
               <w:top w:val="single" w:sz="4" w:space="0" w:color="CBD5E1"/>
               <w:left w:val="single" w:sz="4" w:space="0" w:color="CBD5E1"/>
@@ -2954,7 +2984,7 @@
         </w:tc>
         <w:tc>
           <w:tcPr>
-            <w:tcW w:type="dxa" w:w="1584"/>
+            <w:tcW w:type="dxa" w:w="1440"/>
             <w:tcBorders>
               <w:top w:val="single" w:sz="4" w:space="0" w:color="CBD5E1"/>
               <w:left w:val="single" w:sz="4" w:space="0" w:color="CBD5E1"/>
@@ -2977,6 +3007,437 @@
                 <w:sz w:val="18"/>
               </w:rPr>
               <w:t>JackPot</w:t>
+            </w:r>
+          </w:p>
+        </w:tc>
+        <w:tc>
+          <w:tcPr>
+            <w:tcW w:type="dxa" w:w="1296"/>
+            <w:tcBorders>
+              <w:top w:val="single" w:sz="4" w:space="0" w:color="CBD5E1"/>
+              <w:left w:val="single" w:sz="4" w:space="0" w:color="CBD5E1"/>
+              <w:bottom w:val="single" w:sz="4" w:space="0" w:color="CBD5E1"/>
+              <w:right w:val="single" w:sz="4" w:space="0" w:color="CBD5E1"/>
+            </w:tcBorders>
+          </w:tcPr>
+          <w:p>
+            <w:pPr>
+              <w:spacing w:before="40" w:after="40" w:lineRule="auto" w:line="240"/>
+              <w:jc w:val="left"/>
+            </w:pPr>
+            <w:r/>
+            <w:r>
+              <w:rPr>
+                <w:rFonts w:ascii="Calibri" w:hAnsi="Calibri" w:eastAsia="Calibri"/>
+                <w:b w:val="0"/>
+                <w:i w:val="0"/>
+                <w:color w:val="1F2937"/>
+                <w:sz w:val="18"/>
+              </w:rPr>
+              <w:t>10</w:t>
+            </w:r>
+          </w:p>
+        </w:tc>
+        <w:tc>
+          <w:tcPr>
+            <w:tcW w:type="dxa" w:w="1440"/>
+            <w:tcBorders>
+              <w:top w:val="single" w:sz="4" w:space="0" w:color="CBD5E1"/>
+              <w:left w:val="single" w:sz="4" w:space="0" w:color="CBD5E1"/>
+              <w:bottom w:val="single" w:sz="4" w:space="0" w:color="CBD5E1"/>
+              <w:right w:val="single" w:sz="4" w:space="0" w:color="CBD5E1"/>
+            </w:tcBorders>
+          </w:tcPr>
+          <w:p>
+            <w:pPr>
+              <w:spacing w:before="40" w:after="40" w:lineRule="auto" w:line="240"/>
+              <w:jc w:val="left"/>
+            </w:pPr>
+            <w:r/>
+            <w:r>
+              <w:rPr>
+                <w:rFonts w:ascii="Calibri" w:hAnsi="Calibri" w:eastAsia="Calibri"/>
+                <w:b w:val="0"/>
+                <w:i w:val="0"/>
+                <w:color w:val="1F2937"/>
+                <w:sz w:val="18"/>
+              </w:rPr>
+              <w:t>25</w:t>
+            </w:r>
+          </w:p>
+        </w:tc>
+        <w:tc>
+          <w:tcPr>
+            <w:tcW w:type="dxa" w:w="1440"/>
+            <w:tcBorders>
+              <w:top w:val="single" w:sz="4" w:space="0" w:color="CBD5E1"/>
+              <w:left w:val="single" w:sz="4" w:space="0" w:color="CBD5E1"/>
+              <w:bottom w:val="single" w:sz="4" w:space="0" w:color="CBD5E1"/>
+              <w:right w:val="single" w:sz="4" w:space="0" w:color="CBD5E1"/>
+            </w:tcBorders>
+          </w:tcPr>
+          <w:p>
+            <w:pPr>
+              <w:spacing w:before="40" w:after="40" w:lineRule="auto" w:line="240"/>
+              <w:jc w:val="left"/>
+            </w:pPr>
+            <w:r/>
+            <w:r>
+              <w:rPr>
+                <w:rFonts w:ascii="Calibri" w:hAnsi="Calibri" w:eastAsia="Calibri"/>
+                <w:b w:val="0"/>
+                <w:i w:val="0"/>
+                <w:color w:val="1F2937"/>
+                <w:sz w:val="18"/>
+              </w:rPr>
+              <w:t>10,000 STX</w:t>
+            </w:r>
+          </w:p>
+        </w:tc>
+        <w:tc>
+          <w:tcPr>
+            <w:tcW w:type="dxa" w:w="2160"/>
+            <w:tcBorders>
+              <w:top w:val="single" w:sz="4" w:space="0" w:color="CBD5E1"/>
+              <w:left w:val="single" w:sz="4" w:space="0" w:color="CBD5E1"/>
+              <w:bottom w:val="single" w:sz="4" w:space="0" w:color="CBD5E1"/>
+              <w:right w:val="single" w:sz="4" w:space="0" w:color="CBD5E1"/>
+            </w:tcBorders>
+          </w:tcPr>
+          <w:p>
+            <w:pPr>
+              <w:spacing w:before="40" w:after="40" w:lineRule="auto" w:line="240"/>
+              <w:jc w:val="left"/>
+            </w:pPr>
+            <w:r/>
+            <w:r>
+              <w:rPr>
+                <w:rFonts w:ascii="Calibri" w:hAnsi="Calibri" w:eastAsia="Calibri"/>
+                <w:b w:val="0"/>
+                <w:i w:val="0"/>
+                <w:color w:val="1F2937"/>
+                <w:sz w:val="18"/>
+              </w:rPr>
+              <w:t>100,000 STX</w:t>
+            </w:r>
+          </w:p>
+        </w:tc>
+        <w:tc>
+          <w:tcPr>
+            <w:tcW w:type="dxa" w:w="1728"/>
+            <w:tcBorders>
+              <w:top w:val="single" w:sz="4" w:space="0" w:color="CBD5E1"/>
+              <w:left w:val="single" w:sz="4" w:space="0" w:color="CBD5E1"/>
+              <w:bottom w:val="single" w:sz="4" w:space="0" w:color="CBD5E1"/>
+              <w:right w:val="single" w:sz="4" w:space="0" w:color="CBD5E1"/>
+            </w:tcBorders>
+          </w:tcPr>
+          <w:p>
+            <w:pPr>
+              <w:spacing w:before="40" w:after="40" w:lineRule="auto" w:line="240"/>
+              <w:jc w:val="left"/>
+            </w:pPr>
+            <w:r/>
+            <w:r>
+              <w:rPr>
+                <w:rFonts w:ascii="Calibri" w:hAnsi="Calibri" w:eastAsia="Calibri"/>
+                <w:b w:val="0"/>
+                <w:i w:val="0"/>
+                <w:color w:val="1F2937"/>
+                <w:sz w:val="18"/>
+              </w:rPr>
+              <w:t>100</w:t>
+            </w:r>
+          </w:p>
+        </w:tc>
+      </w:tr>
+      <w:tr>
+        <w:tc>
+          <w:tcPr>
+            <w:tcW w:type="dxa" w:w="864"/>
+            <w:shd w:fill="F7FAFC" w:val="clear"/>
+            <w:tcBorders>
+              <w:top w:val="single" w:sz="4" w:space="0" w:color="CBD5E1"/>
+              <w:left w:val="single" w:sz="4" w:space="0" w:color="CBD5E1"/>
+              <w:bottom w:val="single" w:sz="4" w:space="0" w:color="CBD5E1"/>
+              <w:right w:val="single" w:sz="4" w:space="0" w:color="CBD5E1"/>
+            </w:tcBorders>
+          </w:tcPr>
+          <w:p>
+            <w:pPr>
+              <w:spacing w:before="40" w:after="40" w:lineRule="auto" w:line="240"/>
+              <w:jc w:val="center"/>
+            </w:pPr>
+            <w:r/>
+            <w:r>
+              <w:rPr>
+                <w:rFonts w:ascii="Calibri" w:hAnsi="Calibri" w:eastAsia="Calibri"/>
+                <w:b w:val="0"/>
+                <w:i w:val="0"/>
+                <w:color w:val="1F2937"/>
+                <w:sz w:val="18"/>
+              </w:rPr>
+              <w:t>B</w:t>
+            </w:r>
+          </w:p>
+        </w:tc>
+        <w:tc>
+          <w:tcPr>
+            <w:tcW w:type="dxa" w:w="1440"/>
+            <w:shd w:fill="F7FAFC" w:val="clear"/>
+            <w:tcBorders>
+              <w:top w:val="single" w:sz="4" w:space="0" w:color="CBD5E1"/>
+              <w:left w:val="single" w:sz="4" w:space="0" w:color="CBD5E1"/>
+              <w:bottom w:val="single" w:sz="4" w:space="0" w:color="CBD5E1"/>
+              <w:right w:val="single" w:sz="4" w:space="0" w:color="CBD5E1"/>
+            </w:tcBorders>
+          </w:tcPr>
+          <w:p>
+            <w:pPr>
+              <w:spacing w:before="40" w:after="40" w:lineRule="auto" w:line="240"/>
+              <w:jc w:val="left"/>
+            </w:pPr>
+            <w:r/>
+            <w:r>
+              <w:rPr>
+                <w:rFonts w:ascii="Calibri" w:hAnsi="Calibri" w:eastAsia="Calibri"/>
+                <w:b w:val="0"/>
+                <w:i w:val="0"/>
+                <w:color w:val="1F2937"/>
+                <w:sz w:val="18"/>
+              </w:rPr>
+              <w:t>JackPot</w:t>
+            </w:r>
+          </w:p>
+        </w:tc>
+        <w:tc>
+          <w:tcPr>
+            <w:tcW w:type="dxa" w:w="1296"/>
+            <w:shd w:fill="F7FAFC" w:val="clear"/>
+            <w:tcBorders>
+              <w:top w:val="single" w:sz="4" w:space="0" w:color="CBD5E1"/>
+              <w:left w:val="single" w:sz="4" w:space="0" w:color="CBD5E1"/>
+              <w:bottom w:val="single" w:sz="4" w:space="0" w:color="CBD5E1"/>
+              <w:right w:val="single" w:sz="4" w:space="0" w:color="CBD5E1"/>
+            </w:tcBorders>
+          </w:tcPr>
+          <w:p>
+            <w:pPr>
+              <w:spacing w:before="40" w:after="40" w:lineRule="auto" w:line="240"/>
+              <w:jc w:val="left"/>
+            </w:pPr>
+            <w:r/>
+            <w:r>
+              <w:rPr>
+                <w:rFonts w:ascii="Calibri" w:hAnsi="Calibri" w:eastAsia="Calibri"/>
+                <w:b w:val="0"/>
+                <w:i w:val="0"/>
+                <w:color w:val="1F2937"/>
+                <w:sz w:val="18"/>
+              </w:rPr>
+              <w:t>12</w:t>
+            </w:r>
+          </w:p>
+        </w:tc>
+        <w:tc>
+          <w:tcPr>
+            <w:tcW w:type="dxa" w:w="1440"/>
+            <w:shd w:fill="F7FAFC" w:val="clear"/>
+            <w:tcBorders>
+              <w:top w:val="single" w:sz="4" w:space="0" w:color="CBD5E1"/>
+              <w:left w:val="single" w:sz="4" w:space="0" w:color="CBD5E1"/>
+              <w:bottom w:val="single" w:sz="4" w:space="0" w:color="CBD5E1"/>
+              <w:right w:val="single" w:sz="4" w:space="0" w:color="CBD5E1"/>
+            </w:tcBorders>
+          </w:tcPr>
+          <w:p>
+            <w:pPr>
+              <w:spacing w:before="40" w:after="40" w:lineRule="auto" w:line="240"/>
+              <w:jc w:val="left"/>
+            </w:pPr>
+            <w:r/>
+            <w:r>
+              <w:rPr>
+                <w:rFonts w:ascii="Calibri" w:hAnsi="Calibri" w:eastAsia="Calibri"/>
+                <w:b w:val="0"/>
+                <w:i w:val="0"/>
+                <w:color w:val="1F2937"/>
+                <w:sz w:val="18"/>
+              </w:rPr>
+              <w:t>50</w:t>
+            </w:r>
+          </w:p>
+        </w:tc>
+        <w:tc>
+          <w:tcPr>
+            <w:tcW w:type="dxa" w:w="1440"/>
+            <w:shd w:fill="F7FAFC" w:val="clear"/>
+            <w:tcBorders>
+              <w:top w:val="single" w:sz="4" w:space="0" w:color="CBD5E1"/>
+              <w:left w:val="single" w:sz="4" w:space="0" w:color="CBD5E1"/>
+              <w:bottom w:val="single" w:sz="4" w:space="0" w:color="CBD5E1"/>
+              <w:right w:val="single" w:sz="4" w:space="0" w:color="CBD5E1"/>
+            </w:tcBorders>
+          </w:tcPr>
+          <w:p>
+            <w:pPr>
+              <w:spacing w:before="40" w:after="40" w:lineRule="auto" w:line="240"/>
+              <w:jc w:val="left"/>
+            </w:pPr>
+            <w:r/>
+            <w:r>
+              <w:rPr>
+                <w:rFonts w:ascii="Calibri" w:hAnsi="Calibri" w:eastAsia="Calibri"/>
+                <w:b w:val="0"/>
+                <w:i w:val="0"/>
+                <w:color w:val="1F2937"/>
+                <w:sz w:val="18"/>
+              </w:rPr>
+              <w:t>25,000 STX</w:t>
+            </w:r>
+          </w:p>
+        </w:tc>
+        <w:tc>
+          <w:tcPr>
+            <w:tcW w:type="dxa" w:w="2160"/>
+            <w:shd w:fill="F7FAFC" w:val="clear"/>
+            <w:tcBorders>
+              <w:top w:val="single" w:sz="4" w:space="0" w:color="CBD5E1"/>
+              <w:left w:val="single" w:sz="4" w:space="0" w:color="CBD5E1"/>
+              <w:bottom w:val="single" w:sz="4" w:space="0" w:color="CBD5E1"/>
+              <w:right w:val="single" w:sz="4" w:space="0" w:color="CBD5E1"/>
+            </w:tcBorders>
+          </w:tcPr>
+          <w:p>
+            <w:pPr>
+              <w:spacing w:before="40" w:after="40" w:lineRule="auto" w:line="240"/>
+              <w:jc w:val="left"/>
+            </w:pPr>
+            <w:r/>
+            <w:r>
+              <w:rPr>
+                <w:rFonts w:ascii="Calibri" w:hAnsi="Calibri" w:eastAsia="Calibri"/>
+                <w:b w:val="0"/>
+                <w:i w:val="0"/>
+                <w:color w:val="1F2937"/>
+                <w:sz w:val="18"/>
+              </w:rPr>
+              <w:t>300,000 STX</w:t>
+            </w:r>
+          </w:p>
+        </w:tc>
+        <w:tc>
+          <w:tcPr>
+            <w:tcW w:type="dxa" w:w="1728"/>
+            <w:shd w:fill="F7FAFC" w:val="clear"/>
+            <w:tcBorders>
+              <w:top w:val="single" w:sz="4" w:space="0" w:color="CBD5E1"/>
+              <w:left w:val="single" w:sz="4" w:space="0" w:color="CBD5E1"/>
+              <w:bottom w:val="single" w:sz="4" w:space="0" w:color="CBD5E1"/>
+              <w:right w:val="single" w:sz="4" w:space="0" w:color="CBD5E1"/>
+            </w:tcBorders>
+          </w:tcPr>
+          <w:p>
+            <w:pPr>
+              <w:spacing w:before="40" w:after="40" w:lineRule="auto" w:line="240"/>
+              <w:jc w:val="left"/>
+            </w:pPr>
+            <w:r/>
+            <w:r>
+              <w:rPr>
+                <w:rFonts w:ascii="Calibri" w:hAnsi="Calibri" w:eastAsia="Calibri"/>
+                <w:b w:val="0"/>
+                <w:i w:val="0"/>
+                <w:color w:val="1F2937"/>
+                <w:sz w:val="18"/>
+              </w:rPr>
+              <w:t>120</w:t>
+            </w:r>
+          </w:p>
+        </w:tc>
+      </w:tr>
+      <w:tr>
+        <w:tc>
+          <w:tcPr>
+            <w:tcW w:type="dxa" w:w="864"/>
+            <w:tcBorders>
+              <w:top w:val="single" w:sz="4" w:space="0" w:color="CBD5E1"/>
+              <w:left w:val="single" w:sz="4" w:space="0" w:color="CBD5E1"/>
+              <w:bottom w:val="single" w:sz="4" w:space="0" w:color="CBD5E1"/>
+              <w:right w:val="single" w:sz="4" w:space="0" w:color="CBD5E1"/>
+            </w:tcBorders>
+          </w:tcPr>
+          <w:p>
+            <w:pPr>
+              <w:spacing w:before="40" w:after="40" w:lineRule="auto" w:line="240"/>
+              <w:jc w:val="center"/>
+            </w:pPr>
+            <w:r/>
+            <w:r>
+              <w:rPr>
+                <w:rFonts w:ascii="Calibri" w:hAnsi="Calibri" w:eastAsia="Calibri"/>
+                <w:b w:val="0"/>
+                <w:i w:val="0"/>
+                <w:color w:val="1F2937"/>
+                <w:sz w:val="18"/>
+              </w:rPr>
+              <w:t>C</w:t>
+            </w:r>
+          </w:p>
+        </w:tc>
+        <w:tc>
+          <w:tcPr>
+            <w:tcW w:type="dxa" w:w="1440"/>
+            <w:tcBorders>
+              <w:top w:val="single" w:sz="4" w:space="0" w:color="CBD5E1"/>
+              <w:left w:val="single" w:sz="4" w:space="0" w:color="CBD5E1"/>
+              <w:bottom w:val="single" w:sz="4" w:space="0" w:color="CBD5E1"/>
+              <w:right w:val="single" w:sz="4" w:space="0" w:color="CBD5E1"/>
+            </w:tcBorders>
+          </w:tcPr>
+          <w:p>
+            <w:pPr>
+              <w:spacing w:before="40" w:after="40" w:lineRule="auto" w:line="240"/>
+              <w:jc w:val="left"/>
+            </w:pPr>
+            <w:r/>
+            <w:r>
+              <w:rPr>
+                <w:rFonts w:ascii="Calibri" w:hAnsi="Calibri" w:eastAsia="Calibri"/>
+                <w:b w:val="0"/>
+                <w:i w:val="0"/>
+                <w:color w:val="1F2937"/>
+                <w:sz w:val="18"/>
+              </w:rPr>
+              <w:t>Sequential</w:t>
+            </w:r>
+          </w:p>
+        </w:tc>
+        <w:tc>
+          <w:tcPr>
+            <w:tcW w:type="dxa" w:w="1296"/>
+            <w:tcBorders>
+              <w:top w:val="single" w:sz="4" w:space="0" w:color="CBD5E1"/>
+              <w:left w:val="single" w:sz="4" w:space="0" w:color="CBD5E1"/>
+              <w:bottom w:val="single" w:sz="4" w:space="0" w:color="CBD5E1"/>
+              <w:right w:val="single" w:sz="4" w:space="0" w:color="CBD5E1"/>
+            </w:tcBorders>
+          </w:tcPr>
+          <w:p>
+            <w:pPr>
+              <w:spacing w:before="40" w:after="40" w:lineRule="auto" w:line="240"/>
+              <w:jc w:val="left"/>
+            </w:pPr>
+            <w:r/>
+            <w:r>
+              <w:rPr>
+                <w:rFonts w:ascii="Calibri" w:hAnsi="Calibri" w:eastAsia="Calibri"/>
+                <w:b w:val="0"/>
+                <w:i w:val="0"/>
+                <w:color w:val="1F2937"/>
+                <w:sz w:val="18"/>
+              </w:rPr>
+              <w:t>1</w:t>
             </w:r>
           </w:p>
         </w:tc>
@@ -3010,35 +3471,7 @@
         </w:tc>
         <w:tc>
           <w:tcPr>
-            <w:tcW w:type="dxa" w:w="1584"/>
-            <w:tcBorders>
-              <w:top w:val="single" w:sz="4" w:space="0" w:color="CBD5E1"/>
-              <w:left w:val="single" w:sz="4" w:space="0" w:color="CBD5E1"/>
-              <w:bottom w:val="single" w:sz="4" w:space="0" w:color="CBD5E1"/>
-              <w:right w:val="single" w:sz="4" w:space="0" w:color="CBD5E1"/>
-            </w:tcBorders>
-          </w:tcPr>
-          <w:p>
-            <w:pPr>
-              <w:spacing w:before="40" w:after="40" w:lineRule="auto" w:line="240"/>
-              <w:jc w:val="left"/>
-            </w:pPr>
-            <w:r/>
-            <w:r>
-              <w:rPr>
-                <w:rFonts w:ascii="Calibri" w:hAnsi="Calibri" w:eastAsia="Calibri"/>
-                <w:b w:val="0"/>
-                <w:i w:val="0"/>
-                <w:color w:val="1F2937"/>
-                <w:sz w:val="18"/>
-              </w:rPr>
-              <w:t>10,000 STX</w:t>
-            </w:r>
-          </w:p>
-        </w:tc>
-        <w:tc>
-          <w:tcPr>
-            <w:tcW w:type="dxa" w:w="2304"/>
+            <w:tcW w:type="dxa" w:w="1440"/>
             <w:tcBorders>
               <w:top w:val="single" w:sz="4" w:space="0" w:color="CBD5E1"/>
               <w:left w:val="single" w:sz="4" w:space="0" w:color="CBD5E1"/>
@@ -3066,297 +3499,7 @@
         </w:tc>
         <w:tc>
           <w:tcPr>
-            <w:tcW w:type="dxa" w:w="1872"/>
-            <w:tcBorders>
-              <w:top w:val="single" w:sz="4" w:space="0" w:color="CBD5E1"/>
-              <w:left w:val="single" w:sz="4" w:space="0" w:color="CBD5E1"/>
-              <w:bottom w:val="single" w:sz="4" w:space="0" w:color="CBD5E1"/>
-              <w:right w:val="single" w:sz="4" w:space="0" w:color="CBD5E1"/>
-            </w:tcBorders>
-          </w:tcPr>
-          <w:p>
-            <w:pPr>
-              <w:spacing w:before="40" w:after="40" w:lineRule="auto" w:line="240"/>
-              <w:jc w:val="left"/>
-            </w:pPr>
-            <w:r/>
-            <w:r>
-              <w:rPr>
-                <w:rFonts w:ascii="Calibri" w:hAnsi="Calibri" w:eastAsia="Calibri"/>
-                <w:b w:val="0"/>
-                <w:i w:val="0"/>
-                <w:color w:val="1F2937"/>
-                <w:sz w:val="18"/>
-              </w:rPr>
-              <w:t>100</w:t>
-            </w:r>
-          </w:p>
-        </w:tc>
-      </w:tr>
-      <w:tr>
-        <w:tc>
-          <w:tcPr>
-            <w:tcW w:type="dxa" w:w="1008"/>
-            <w:shd w:fill="F7FAFC" w:val="clear"/>
-            <w:tcBorders>
-              <w:top w:val="single" w:sz="4" w:space="0" w:color="CBD5E1"/>
-              <w:left w:val="single" w:sz="4" w:space="0" w:color="CBD5E1"/>
-              <w:bottom w:val="single" w:sz="4" w:space="0" w:color="CBD5E1"/>
-              <w:right w:val="single" w:sz="4" w:space="0" w:color="CBD5E1"/>
-            </w:tcBorders>
-          </w:tcPr>
-          <w:p>
-            <w:pPr>
-              <w:spacing w:before="40" w:after="40" w:lineRule="auto" w:line="240"/>
-              <w:jc w:val="center"/>
-            </w:pPr>
-            <w:r/>
-            <w:r>
-              <w:rPr>
-                <w:rFonts w:ascii="Calibri" w:hAnsi="Calibri" w:eastAsia="Calibri"/>
-                <w:b w:val="0"/>
-                <w:i w:val="0"/>
-                <w:color w:val="1F2937"/>
-                <w:sz w:val="18"/>
-              </w:rPr>
-              <w:t>B</w:t>
-            </w:r>
-          </w:p>
-        </w:tc>
-        <w:tc>
-          <w:tcPr>
-            <w:tcW w:type="dxa" w:w="1584"/>
-            <w:shd w:fill="F7FAFC" w:val="clear"/>
-            <w:tcBorders>
-              <w:top w:val="single" w:sz="4" w:space="0" w:color="CBD5E1"/>
-              <w:left w:val="single" w:sz="4" w:space="0" w:color="CBD5E1"/>
-              <w:bottom w:val="single" w:sz="4" w:space="0" w:color="CBD5E1"/>
-              <w:right w:val="single" w:sz="4" w:space="0" w:color="CBD5E1"/>
-            </w:tcBorders>
-          </w:tcPr>
-          <w:p>
-            <w:pPr>
-              <w:spacing w:before="40" w:after="40" w:lineRule="auto" w:line="240"/>
-              <w:jc w:val="left"/>
-            </w:pPr>
-            <w:r/>
-            <w:r>
-              <w:rPr>
-                <w:rFonts w:ascii="Calibri" w:hAnsi="Calibri" w:eastAsia="Calibri"/>
-                <w:b w:val="0"/>
-                <w:i w:val="0"/>
-                <w:color w:val="1F2937"/>
-                <w:sz w:val="18"/>
-              </w:rPr>
-              <w:t>JackPot</w:t>
-            </w:r>
-          </w:p>
-        </w:tc>
-        <w:tc>
-          <w:tcPr>
-            <w:tcW w:type="dxa" w:w="1440"/>
-            <w:shd w:fill="F7FAFC" w:val="clear"/>
-            <w:tcBorders>
-              <w:top w:val="single" w:sz="4" w:space="0" w:color="CBD5E1"/>
-              <w:left w:val="single" w:sz="4" w:space="0" w:color="CBD5E1"/>
-              <w:bottom w:val="single" w:sz="4" w:space="0" w:color="CBD5E1"/>
-              <w:right w:val="single" w:sz="4" w:space="0" w:color="CBD5E1"/>
-            </w:tcBorders>
-          </w:tcPr>
-          <w:p>
-            <w:pPr>
-              <w:spacing w:before="40" w:after="40" w:lineRule="auto" w:line="240"/>
-              <w:jc w:val="left"/>
-            </w:pPr>
-            <w:r/>
-            <w:r>
-              <w:rPr>
-                <w:rFonts w:ascii="Calibri" w:hAnsi="Calibri" w:eastAsia="Calibri"/>
-                <w:b w:val="0"/>
-                <w:i w:val="0"/>
-                <w:color w:val="1F2937"/>
-                <w:sz w:val="18"/>
-              </w:rPr>
-              <w:t>12</w:t>
-            </w:r>
-          </w:p>
-        </w:tc>
-        <w:tc>
-          <w:tcPr>
-            <w:tcW w:type="dxa" w:w="1584"/>
-            <w:shd w:fill="F7FAFC" w:val="clear"/>
-            <w:tcBorders>
-              <w:top w:val="single" w:sz="4" w:space="0" w:color="CBD5E1"/>
-              <w:left w:val="single" w:sz="4" w:space="0" w:color="CBD5E1"/>
-              <w:bottom w:val="single" w:sz="4" w:space="0" w:color="CBD5E1"/>
-              <w:right w:val="single" w:sz="4" w:space="0" w:color="CBD5E1"/>
-            </w:tcBorders>
-          </w:tcPr>
-          <w:p>
-            <w:pPr>
-              <w:spacing w:before="40" w:after="40" w:lineRule="auto" w:line="240"/>
-              <w:jc w:val="left"/>
-            </w:pPr>
-            <w:r/>
-            <w:r>
-              <w:rPr>
-                <w:rFonts w:ascii="Calibri" w:hAnsi="Calibri" w:eastAsia="Calibri"/>
-                <w:b w:val="0"/>
-                <w:i w:val="0"/>
-                <w:color w:val="1F2937"/>
-                <w:sz w:val="18"/>
-              </w:rPr>
-              <w:t>25,000 STX</w:t>
-            </w:r>
-          </w:p>
-        </w:tc>
-        <w:tc>
-          <w:tcPr>
-            <w:tcW w:type="dxa" w:w="2304"/>
-            <w:shd w:fill="F7FAFC" w:val="clear"/>
-            <w:tcBorders>
-              <w:top w:val="single" w:sz="4" w:space="0" w:color="CBD5E1"/>
-              <w:left w:val="single" w:sz="4" w:space="0" w:color="CBD5E1"/>
-              <w:bottom w:val="single" w:sz="4" w:space="0" w:color="CBD5E1"/>
-              <w:right w:val="single" w:sz="4" w:space="0" w:color="CBD5E1"/>
-            </w:tcBorders>
-          </w:tcPr>
-          <w:p>
-            <w:pPr>
-              <w:spacing w:before="40" w:after="40" w:lineRule="auto" w:line="240"/>
-              <w:jc w:val="left"/>
-            </w:pPr>
-            <w:r/>
-            <w:r>
-              <w:rPr>
-                <w:rFonts w:ascii="Calibri" w:hAnsi="Calibri" w:eastAsia="Calibri"/>
-                <w:b w:val="0"/>
-                <w:i w:val="0"/>
-                <w:color w:val="1F2937"/>
-                <w:sz w:val="18"/>
-              </w:rPr>
-              <w:t>300,000 STX</w:t>
-            </w:r>
-          </w:p>
-        </w:tc>
-        <w:tc>
-          <w:tcPr>
-            <w:tcW w:type="dxa" w:w="1872"/>
-            <w:shd w:fill="F7FAFC" w:val="clear"/>
-            <w:tcBorders>
-              <w:top w:val="single" w:sz="4" w:space="0" w:color="CBD5E1"/>
-              <w:left w:val="single" w:sz="4" w:space="0" w:color="CBD5E1"/>
-              <w:bottom w:val="single" w:sz="4" w:space="0" w:color="CBD5E1"/>
-              <w:right w:val="single" w:sz="4" w:space="0" w:color="CBD5E1"/>
-            </w:tcBorders>
-          </w:tcPr>
-          <w:p>
-            <w:pPr>
-              <w:spacing w:before="40" w:after="40" w:lineRule="auto" w:line="240"/>
-              <w:jc w:val="left"/>
-            </w:pPr>
-            <w:r/>
-            <w:r>
-              <w:rPr>
-                <w:rFonts w:ascii="Calibri" w:hAnsi="Calibri" w:eastAsia="Calibri"/>
-                <w:b w:val="0"/>
-                <w:i w:val="0"/>
-                <w:color w:val="1F2937"/>
-                <w:sz w:val="18"/>
-              </w:rPr>
-              <w:t>120</w:t>
-            </w:r>
-          </w:p>
-        </w:tc>
-      </w:tr>
-      <w:tr>
-        <w:tc>
-          <w:tcPr>
-            <w:tcW w:type="dxa" w:w="1008"/>
-            <w:tcBorders>
-              <w:top w:val="single" w:sz="4" w:space="0" w:color="CBD5E1"/>
-              <w:left w:val="single" w:sz="4" w:space="0" w:color="CBD5E1"/>
-              <w:bottom w:val="single" w:sz="4" w:space="0" w:color="CBD5E1"/>
-              <w:right w:val="single" w:sz="4" w:space="0" w:color="CBD5E1"/>
-            </w:tcBorders>
-          </w:tcPr>
-          <w:p>
-            <w:pPr>
-              <w:spacing w:before="40" w:after="40" w:lineRule="auto" w:line="240"/>
-              <w:jc w:val="center"/>
-            </w:pPr>
-            <w:r/>
-            <w:r>
-              <w:rPr>
-                <w:rFonts w:ascii="Calibri" w:hAnsi="Calibri" w:eastAsia="Calibri"/>
-                <w:b w:val="0"/>
-                <w:i w:val="0"/>
-                <w:color w:val="1F2937"/>
-                <w:sz w:val="18"/>
-              </w:rPr>
-              <w:t>C</w:t>
-            </w:r>
-          </w:p>
-        </w:tc>
-        <w:tc>
-          <w:tcPr>
-            <w:tcW w:type="dxa" w:w="1584"/>
-            <w:tcBorders>
-              <w:top w:val="single" w:sz="4" w:space="0" w:color="CBD5E1"/>
-              <w:left w:val="single" w:sz="4" w:space="0" w:color="CBD5E1"/>
-              <w:bottom w:val="single" w:sz="4" w:space="0" w:color="CBD5E1"/>
-              <w:right w:val="single" w:sz="4" w:space="0" w:color="CBD5E1"/>
-            </w:tcBorders>
-          </w:tcPr>
-          <w:p>
-            <w:pPr>
-              <w:spacing w:before="40" w:after="40" w:lineRule="auto" w:line="240"/>
-              <w:jc w:val="left"/>
-            </w:pPr>
-            <w:r/>
-            <w:r>
-              <w:rPr>
-                <w:rFonts w:ascii="Calibri" w:hAnsi="Calibri" w:eastAsia="Calibri"/>
-                <w:b w:val="0"/>
-                <w:i w:val="0"/>
-                <w:color w:val="1F2937"/>
-                <w:sz w:val="18"/>
-              </w:rPr>
-              <w:t>Sequential</w:t>
-            </w:r>
-          </w:p>
-        </w:tc>
-        <w:tc>
-          <w:tcPr>
-            <w:tcW w:type="dxa" w:w="1440"/>
-            <w:tcBorders>
-              <w:top w:val="single" w:sz="4" w:space="0" w:color="CBD5E1"/>
-              <w:left w:val="single" w:sz="4" w:space="0" w:color="CBD5E1"/>
-              <w:bottom w:val="single" w:sz="4" w:space="0" w:color="CBD5E1"/>
-              <w:right w:val="single" w:sz="4" w:space="0" w:color="CBD5E1"/>
-            </w:tcBorders>
-          </w:tcPr>
-          <w:p>
-            <w:pPr>
-              <w:spacing w:before="40" w:after="40" w:lineRule="auto" w:line="240"/>
-              <w:jc w:val="left"/>
-            </w:pPr>
-            <w:r/>
-            <w:r>
-              <w:rPr>
-                <w:rFonts w:ascii="Calibri" w:hAnsi="Calibri" w:eastAsia="Calibri"/>
-                <w:b w:val="0"/>
-                <w:i w:val="0"/>
-                <w:color w:val="1F2937"/>
-                <w:sz w:val="18"/>
-              </w:rPr>
-              <w:t>1</w:t>
-            </w:r>
-          </w:p>
-        </w:tc>
-        <w:tc>
-          <w:tcPr>
-            <w:tcW w:type="dxa" w:w="1584"/>
+            <w:tcW w:type="dxa" w:w="2160"/>
             <w:tcBorders>
               <w:top w:val="single" w:sz="4" w:space="0" w:color="CBD5E1"/>
               <w:left w:val="single" w:sz="4" w:space="0" w:color="CBD5E1"/>
@@ -3384,35 +3527,7 @@
         </w:tc>
         <w:tc>
           <w:tcPr>
-            <w:tcW w:type="dxa" w:w="2304"/>
-            <w:tcBorders>
-              <w:top w:val="single" w:sz="4" w:space="0" w:color="CBD5E1"/>
-              <w:left w:val="single" w:sz="4" w:space="0" w:color="CBD5E1"/>
-              <w:bottom w:val="single" w:sz="4" w:space="0" w:color="CBD5E1"/>
-              <w:right w:val="single" w:sz="4" w:space="0" w:color="CBD5E1"/>
-            </w:tcBorders>
-          </w:tcPr>
-          <w:p>
-            <w:pPr>
-              <w:spacing w:before="40" w:after="40" w:lineRule="auto" w:line="240"/>
-              <w:jc w:val="left"/>
-            </w:pPr>
-            <w:r/>
-            <w:r>
-              <w:rPr>
-                <w:rFonts w:ascii="Calibri" w:hAnsi="Calibri" w:eastAsia="Calibri"/>
-                <w:b w:val="0"/>
-                <w:i w:val="0"/>
-                <w:color w:val="1F2937"/>
-                <w:sz w:val="18"/>
-              </w:rPr>
-              <w:t>100,000 STX</w:t>
-            </w:r>
-          </w:p>
-        </w:tc>
-        <w:tc>
-          <w:tcPr>
-            <w:tcW w:type="dxa" w:w="1872"/>
+            <w:tcW w:type="dxa" w:w="1728"/>
             <w:tcBorders>
               <w:top w:val="single" w:sz="4" w:space="0" w:color="CBD5E1"/>
               <w:left w:val="single" w:sz="4" w:space="0" w:color="CBD5E1"/>
@@ -3442,7 +3557,7 @@
       <w:tr>
         <w:tc>
           <w:tcPr>
-            <w:tcW w:type="dxa" w:w="1008"/>
+            <w:tcW w:type="dxa" w:w="864"/>
             <w:shd w:fill="EEF2F7" w:val="clear"/>
             <w:tcBorders>
               <w:top w:val="single" w:sz="4" w:space="0" w:color="CBD5E1"/>
@@ -3471,7 +3586,65 @@
         </w:tc>
         <w:tc>
           <w:tcPr>
-            <w:tcW w:type="dxa" w:w="1584"/>
+            <w:tcW w:type="dxa" w:w="1440"/>
+            <w:shd w:fill="EEF2F7" w:val="clear"/>
+            <w:tcBorders>
+              <w:top w:val="single" w:sz="4" w:space="0" w:color="CBD5E1"/>
+              <w:left w:val="single" w:sz="4" w:space="0" w:color="CBD5E1"/>
+              <w:bottom w:val="single" w:sz="4" w:space="0" w:color="CBD5E1"/>
+              <w:right w:val="single" w:sz="4" w:space="0" w:color="CBD5E1"/>
+            </w:tcBorders>
+          </w:tcPr>
+          <w:p>
+            <w:pPr>
+              <w:spacing w:before="40" w:after="40" w:lineRule="auto" w:line="240"/>
+              <w:jc w:val="left"/>
+            </w:pPr>
+            <w:r/>
+            <w:r>
+              <w:rPr>
+                <w:rFonts w:ascii="Calibri" w:hAnsi="Calibri" w:eastAsia="Calibri"/>
+                <w:b/>
+                <w:i w:val="0"/>
+                <w:color w:val="1A365D"/>
+                <w:sz w:val="18"/>
+              </w:rPr>
+              <w:t>—</w:t>
+            </w:r>
+          </w:p>
+        </w:tc>
+        <w:tc>
+          <w:tcPr>
+            <w:tcW w:type="dxa" w:w="1296"/>
+            <w:shd w:fill="EEF2F7" w:val="clear"/>
+            <w:tcBorders>
+              <w:top w:val="single" w:sz="4" w:space="0" w:color="CBD5E1"/>
+              <w:left w:val="single" w:sz="4" w:space="0" w:color="CBD5E1"/>
+              <w:bottom w:val="single" w:sz="4" w:space="0" w:color="CBD5E1"/>
+              <w:right w:val="single" w:sz="4" w:space="0" w:color="CBD5E1"/>
+            </w:tcBorders>
+          </w:tcPr>
+          <w:p>
+            <w:pPr>
+              <w:spacing w:before="40" w:after="40" w:lineRule="auto" w:line="240"/>
+              <w:jc w:val="left"/>
+            </w:pPr>
+            <w:r/>
+            <w:r>
+              <w:rPr>
+                <w:rFonts w:ascii="Calibri" w:hAnsi="Calibri" w:eastAsia="Calibri"/>
+                <w:b/>
+                <w:i w:val="0"/>
+                <w:color w:val="1A365D"/>
+                <w:sz w:val="18"/>
+              </w:rPr>
+              <w:t>23</w:t>
+            </w:r>
+          </w:p>
+        </w:tc>
+        <w:tc>
+          <w:tcPr>
+            <w:tcW w:type="dxa" w:w="1440"/>
             <w:shd w:fill="EEF2F7" w:val="clear"/>
             <w:tcBorders>
               <w:top w:val="single" w:sz="4" w:space="0" w:color="CBD5E1"/>
@@ -3523,42 +3696,13 @@
                 <w:color w:val="1A365D"/>
                 <w:sz w:val="18"/>
               </w:rPr>
-              <w:t>23</w:t>
-            </w:r>
-          </w:p>
-        </w:tc>
-        <w:tc>
-          <w:tcPr>
-            <w:tcW w:type="dxa" w:w="1584"/>
-            <w:shd w:fill="EEF2F7" w:val="clear"/>
-            <w:tcBorders>
-              <w:top w:val="single" w:sz="4" w:space="0" w:color="CBD5E1"/>
-              <w:left w:val="single" w:sz="4" w:space="0" w:color="CBD5E1"/>
-              <w:bottom w:val="single" w:sz="4" w:space="0" w:color="CBD5E1"/>
-              <w:right w:val="single" w:sz="4" w:space="0" w:color="CBD5E1"/>
-            </w:tcBorders>
-          </w:tcPr>
-          <w:p>
-            <w:pPr>
-              <w:spacing w:before="40" w:after="40" w:lineRule="auto" w:line="240"/>
-              <w:jc w:val="left"/>
-            </w:pPr>
-            <w:r/>
-            <w:r>
-              <w:rPr>
-                <w:rFonts w:ascii="Calibri" w:hAnsi="Calibri" w:eastAsia="Calibri"/>
-                <w:b/>
-                <w:i w:val="0"/>
-                <w:color w:val="1A365D"/>
-                <w:sz w:val="18"/>
-              </w:rPr>
               <w:t>—</w:t>
             </w:r>
           </w:p>
         </w:tc>
         <w:tc>
           <w:tcPr>
-            <w:tcW w:type="dxa" w:w="2304"/>
+            <w:tcW w:type="dxa" w:w="2160"/>
             <w:shd w:fill="EEF2F7" w:val="clear"/>
             <w:tcBorders>
               <w:top w:val="single" w:sz="4" w:space="0" w:color="CBD5E1"/>
@@ -3587,7 +3731,7 @@
         </w:tc>
         <w:tc>
           <w:tcPr>
-            <w:tcW w:type="dxa" w:w="1872"/>
+            <w:tcW w:type="dxa" w:w="1728"/>
             <w:shd w:fill="EEF2F7" w:val="clear"/>
             <w:tcBorders>
               <w:top w:val="single" w:sz="4" w:space="0" w:color="CBD5E1"/>
@@ -3663,7 +3807,27 @@
           <w:color w:val="4A5568"/>
           <w:sz w:val="18"/>
         </w:rPr>
-        <w:t xml:space="preserve">sponsor capital delegated to that tier each cycle (returned and reused; not an additive spend across cycles). </w:t>
+        <w:t xml:space="preserve">sponsor capital delegated to that tier each cycle (returned and reused; not multiplied across cycles). </w:t>
+      </w:r>
+      <w:r>
+        <w:rPr>
+          <w:rFonts w:ascii="Calibri" w:hAnsi="Calibri" w:eastAsia="Calibri"/>
+          <w:b/>
+          <w:i/>
+          <w:color w:val="4A5568"/>
+          <w:sz w:val="18"/>
+        </w:rPr>
+        <w:t xml:space="preserve">Total Participants: </w:t>
+      </w:r>
+      <w:r>
+        <w:rPr>
+          <w:rFonts w:ascii="Calibri" w:hAnsi="Calibri" w:eastAsia="Calibri"/>
+          <w:b w:val="0"/>
+          <w:i/>
+          <w:color w:val="4A5568"/>
+          <w:sz w:val="18"/>
+        </w:rPr>
+        <w:t xml:space="preserve">Min. Participants × Qty × 10 cycles. </w:t>
       </w:r>
       <w:r>
         <w:rPr>
@@ -3683,7 +3847,7 @@
           <w:color w:val="4A5568"/>
           <w:sz w:val="18"/>
         </w:rPr>
-        <w:t>lifecycle only (deploy + activate + start + close = 4 txs × pots × 10 cycles). Participant-join txs are additional and scale with fill.</w:t>
+        <w:t>lifecycle (4 × pots × 10 cycles) + participant joins (1 × Total Participants).</w:t>
       </w:r>
     </w:p>
     <w:p>
@@ -3698,7 +3862,767 @@
           <w:color w:val="2B6CB0"/>
           <w:sz w:val="24"/>
         </w:rPr>
-        <w:t>Transaction Accounting (Lifecycle)</w:t>
+        <w:t>How the Totals Are Calculated</w:t>
+      </w:r>
+    </w:p>
+    <w:tbl>
+      <w:tblPr>
+        <w:tblW w:type="auto" w:w="0"/>
+        <w:jc w:val="center"/>
+        <w:tblLayout w:type="autofit"/>
+        <w:tblLook w:firstColumn="1" w:firstRow="1" w:lastColumn="0" w:lastRow="0" w:noHBand="0" w:noVBand="1" w:val="04A0"/>
+      </w:tblPr>
+      <w:tblGrid>
+        <w:gridCol w:w="1958"/>
+        <w:gridCol w:w="1958"/>
+        <w:gridCol w:w="1958"/>
+        <w:gridCol w:w="1958"/>
+        <w:gridCol w:w="1958"/>
+      </w:tblGrid>
+      <w:tr>
+        <w:tc>
+          <w:tcPr>
+            <w:tcW w:type="dxa" w:w="3168"/>
+            <w:shd w:fill="1A365D" w:val="clear"/>
+            <w:tcBorders>
+              <w:top w:val="single" w:sz="4" w:space="0" w:color="1A365D"/>
+              <w:left w:val="single" w:sz="4" w:space="0" w:color="1A365D"/>
+              <w:bottom w:val="single" w:sz="4" w:space="0" w:color="1A365D"/>
+              <w:right w:val="single" w:sz="4" w:space="0" w:color="1A365D"/>
+            </w:tcBorders>
+          </w:tcPr>
+          <w:p>
+            <w:pPr>
+              <w:spacing w:before="40" w:after="40" w:lineRule="auto" w:line="240"/>
+              <w:jc w:val="center"/>
+            </w:pPr>
+            <w:r/>
+            <w:r>
+              <w:rPr>
+                <w:rFonts w:ascii="Calibri" w:hAnsi="Calibri" w:eastAsia="Calibri"/>
+                <w:b/>
+                <w:i w:val="0"/>
+                <w:color w:val="FFFFFF"/>
+                <w:sz w:val="18"/>
+              </w:rPr>
+              <w:t>Tier</w:t>
+            </w:r>
+          </w:p>
+        </w:tc>
+        <w:tc>
+          <w:tcPr>
+            <w:tcW w:type="dxa" w:w="1584"/>
+            <w:shd w:fill="1A365D" w:val="clear"/>
+            <w:tcBorders>
+              <w:top w:val="single" w:sz="4" w:space="0" w:color="1A365D"/>
+              <w:left w:val="single" w:sz="4" w:space="0" w:color="1A365D"/>
+              <w:bottom w:val="single" w:sz="4" w:space="0" w:color="1A365D"/>
+              <w:right w:val="single" w:sz="4" w:space="0" w:color="1A365D"/>
+            </w:tcBorders>
+          </w:tcPr>
+          <w:p>
+            <w:pPr>
+              <w:spacing w:before="40" w:after="40" w:lineRule="auto" w:line="240"/>
+              <w:jc w:val="center"/>
+            </w:pPr>
+            <w:r/>
+            <w:r>
+              <w:rPr>
+                <w:rFonts w:ascii="Calibri" w:hAnsi="Calibri" w:eastAsia="Calibri"/>
+                <w:b/>
+                <w:i w:val="0"/>
+                <w:color w:val="FFFFFF"/>
+                <w:sz w:val="18"/>
+              </w:rPr>
+              <w:t>Lifecycle Txs</w:t>
+            </w:r>
+          </w:p>
+        </w:tc>
+        <w:tc>
+          <w:tcPr>
+            <w:tcW w:type="dxa" w:w="1584"/>
+            <w:shd w:fill="1A365D" w:val="clear"/>
+            <w:tcBorders>
+              <w:top w:val="single" w:sz="4" w:space="0" w:color="1A365D"/>
+              <w:left w:val="single" w:sz="4" w:space="0" w:color="1A365D"/>
+              <w:bottom w:val="single" w:sz="4" w:space="0" w:color="1A365D"/>
+              <w:right w:val="single" w:sz="4" w:space="0" w:color="1A365D"/>
+            </w:tcBorders>
+          </w:tcPr>
+          <w:p>
+            <w:pPr>
+              <w:spacing w:before="40" w:after="40" w:lineRule="auto" w:line="240"/>
+              <w:jc w:val="center"/>
+            </w:pPr>
+            <w:r/>
+            <w:r>
+              <w:rPr>
+                <w:rFonts w:ascii="Calibri" w:hAnsi="Calibri" w:eastAsia="Calibri"/>
+                <w:b/>
+                <w:i w:val="0"/>
+                <w:color w:val="FFFFFF"/>
+                <w:sz w:val="18"/>
+              </w:rPr>
+              <w:t>Join Txs</w:t>
+            </w:r>
+          </w:p>
+        </w:tc>
+        <w:tc>
+          <w:tcPr>
+            <w:tcW w:type="dxa" w:w="1440"/>
+            <w:shd w:fill="1A365D" w:val="clear"/>
+            <w:tcBorders>
+              <w:top w:val="single" w:sz="4" w:space="0" w:color="1A365D"/>
+              <w:left w:val="single" w:sz="4" w:space="0" w:color="1A365D"/>
+              <w:bottom w:val="single" w:sz="4" w:space="0" w:color="1A365D"/>
+              <w:right w:val="single" w:sz="4" w:space="0" w:color="1A365D"/>
+            </w:tcBorders>
+          </w:tcPr>
+          <w:p>
+            <w:pPr>
+              <w:spacing w:before="40" w:after="40" w:lineRule="auto" w:line="240"/>
+              <w:jc w:val="center"/>
+            </w:pPr>
+            <w:r/>
+            <w:r>
+              <w:rPr>
+                <w:rFonts w:ascii="Calibri" w:hAnsi="Calibri" w:eastAsia="Calibri"/>
+                <w:b/>
+                <w:i w:val="0"/>
+                <w:color w:val="FFFFFF"/>
+                <w:sz w:val="18"/>
+              </w:rPr>
+              <w:t>Total Tx</w:t>
+            </w:r>
+          </w:p>
+        </w:tc>
+        <w:tc>
+          <w:tcPr>
+            <w:tcW w:type="dxa" w:w="2016"/>
+            <w:shd w:fill="1A365D" w:val="clear"/>
+            <w:tcBorders>
+              <w:top w:val="single" w:sz="4" w:space="0" w:color="1A365D"/>
+              <w:left w:val="single" w:sz="4" w:space="0" w:color="1A365D"/>
+              <w:bottom w:val="single" w:sz="4" w:space="0" w:color="1A365D"/>
+              <w:right w:val="single" w:sz="4" w:space="0" w:color="1A365D"/>
+            </w:tcBorders>
+          </w:tcPr>
+          <w:p>
+            <w:pPr>
+              <w:spacing w:before="40" w:after="40" w:lineRule="auto" w:line="240"/>
+              <w:jc w:val="center"/>
+            </w:pPr>
+            <w:r/>
+            <w:r>
+              <w:rPr>
+                <w:rFonts w:ascii="Calibri" w:hAnsi="Calibri" w:eastAsia="Calibri"/>
+                <w:b/>
+                <w:i w:val="0"/>
+                <w:color w:val="FFFFFF"/>
+                <w:sz w:val="18"/>
+              </w:rPr>
+              <w:t>Total Participants</w:t>
+            </w:r>
+          </w:p>
+        </w:tc>
+      </w:tr>
+      <w:tr>
+        <w:tc>
+          <w:tcPr>
+            <w:tcW w:type="dxa" w:w="3168"/>
+            <w:tcBorders>
+              <w:top w:val="single" w:sz="4" w:space="0" w:color="CBD5E1"/>
+              <w:left w:val="single" w:sz="4" w:space="0" w:color="CBD5E1"/>
+              <w:bottom w:val="single" w:sz="4" w:space="0" w:color="CBD5E1"/>
+              <w:right w:val="single" w:sz="4" w:space="0" w:color="CBD5E1"/>
+            </w:tcBorders>
+          </w:tcPr>
+          <w:p>
+            <w:pPr>
+              <w:spacing w:before="40" w:after="40" w:lineRule="auto" w:line="240"/>
+              <w:jc w:val="center"/>
+            </w:pPr>
+            <w:r/>
+            <w:r>
+              <w:rPr>
+                <w:rFonts w:ascii="Calibri" w:hAnsi="Calibri" w:eastAsia="Calibri"/>
+                <w:b w:val="0"/>
+                <w:i w:val="0"/>
+                <w:color w:val="1F2937"/>
+                <w:sz w:val="18"/>
+              </w:rPr>
+              <w:t>A — 10 JackPot × 25 min</w:t>
+            </w:r>
+          </w:p>
+        </w:tc>
+        <w:tc>
+          <w:tcPr>
+            <w:tcW w:type="dxa" w:w="1584"/>
+            <w:tcBorders>
+              <w:top w:val="single" w:sz="4" w:space="0" w:color="CBD5E1"/>
+              <w:left w:val="single" w:sz="4" w:space="0" w:color="CBD5E1"/>
+              <w:bottom w:val="single" w:sz="4" w:space="0" w:color="CBD5E1"/>
+              <w:right w:val="single" w:sz="4" w:space="0" w:color="CBD5E1"/>
+            </w:tcBorders>
+          </w:tcPr>
+          <w:p>
+            <w:pPr>
+              <w:spacing w:before="40" w:after="40" w:lineRule="auto" w:line="240"/>
+              <w:jc w:val="left"/>
+            </w:pPr>
+            <w:r/>
+            <w:r>
+              <w:rPr>
+                <w:rFonts w:ascii="Calibri" w:hAnsi="Calibri" w:eastAsia="Calibri"/>
+                <w:b w:val="0"/>
+                <w:i w:val="0"/>
+                <w:color w:val="1F2937"/>
+                <w:sz w:val="18"/>
+              </w:rPr>
+              <w:t>400</w:t>
+            </w:r>
+          </w:p>
+        </w:tc>
+        <w:tc>
+          <w:tcPr>
+            <w:tcW w:type="dxa" w:w="1584"/>
+            <w:tcBorders>
+              <w:top w:val="single" w:sz="4" w:space="0" w:color="CBD5E1"/>
+              <w:left w:val="single" w:sz="4" w:space="0" w:color="CBD5E1"/>
+              <w:bottom w:val="single" w:sz="4" w:space="0" w:color="CBD5E1"/>
+              <w:right w:val="single" w:sz="4" w:space="0" w:color="CBD5E1"/>
+            </w:tcBorders>
+          </w:tcPr>
+          <w:p>
+            <w:pPr>
+              <w:spacing w:before="40" w:after="40" w:lineRule="auto" w:line="240"/>
+              <w:jc w:val="left"/>
+            </w:pPr>
+            <w:r/>
+            <w:r>
+              <w:rPr>
+                <w:rFonts w:ascii="Calibri" w:hAnsi="Calibri" w:eastAsia="Calibri"/>
+                <w:b w:val="0"/>
+                <w:i w:val="0"/>
+                <w:color w:val="1F2937"/>
+                <w:sz w:val="18"/>
+              </w:rPr>
+              <w:t>2,500</w:t>
+            </w:r>
+          </w:p>
+        </w:tc>
+        <w:tc>
+          <w:tcPr>
+            <w:tcW w:type="dxa" w:w="1440"/>
+            <w:tcBorders>
+              <w:top w:val="single" w:sz="4" w:space="0" w:color="CBD5E1"/>
+              <w:left w:val="single" w:sz="4" w:space="0" w:color="CBD5E1"/>
+              <w:bottom w:val="single" w:sz="4" w:space="0" w:color="CBD5E1"/>
+              <w:right w:val="single" w:sz="4" w:space="0" w:color="CBD5E1"/>
+            </w:tcBorders>
+          </w:tcPr>
+          <w:p>
+            <w:pPr>
+              <w:spacing w:before="40" w:after="40" w:lineRule="auto" w:line="240"/>
+              <w:jc w:val="left"/>
+            </w:pPr>
+            <w:r/>
+            <w:r>
+              <w:rPr>
+                <w:rFonts w:ascii="Calibri" w:hAnsi="Calibri" w:eastAsia="Calibri"/>
+                <w:b w:val="0"/>
+                <w:i w:val="0"/>
+                <w:color w:val="1F2937"/>
+                <w:sz w:val="18"/>
+              </w:rPr>
+              <w:t>2,900</w:t>
+            </w:r>
+          </w:p>
+        </w:tc>
+        <w:tc>
+          <w:tcPr>
+            <w:tcW w:type="dxa" w:w="2016"/>
+            <w:tcBorders>
+              <w:top w:val="single" w:sz="4" w:space="0" w:color="CBD5E1"/>
+              <w:left w:val="single" w:sz="4" w:space="0" w:color="CBD5E1"/>
+              <w:bottom w:val="single" w:sz="4" w:space="0" w:color="CBD5E1"/>
+              <w:right w:val="single" w:sz="4" w:space="0" w:color="CBD5E1"/>
+            </w:tcBorders>
+          </w:tcPr>
+          <w:p>
+            <w:pPr>
+              <w:spacing w:before="40" w:after="40" w:lineRule="auto" w:line="240"/>
+              <w:jc w:val="left"/>
+            </w:pPr>
+            <w:r/>
+            <w:r>
+              <w:rPr>
+                <w:rFonts w:ascii="Calibri" w:hAnsi="Calibri" w:eastAsia="Calibri"/>
+                <w:b w:val="0"/>
+                <w:i w:val="0"/>
+                <w:color w:val="1F2937"/>
+                <w:sz w:val="18"/>
+              </w:rPr>
+              <w:t>2,500</w:t>
+            </w:r>
+          </w:p>
+        </w:tc>
+      </w:tr>
+      <w:tr>
+        <w:tc>
+          <w:tcPr>
+            <w:tcW w:type="dxa" w:w="3168"/>
+            <w:shd w:fill="F7FAFC" w:val="clear"/>
+            <w:tcBorders>
+              <w:top w:val="single" w:sz="4" w:space="0" w:color="CBD5E1"/>
+              <w:left w:val="single" w:sz="4" w:space="0" w:color="CBD5E1"/>
+              <w:bottom w:val="single" w:sz="4" w:space="0" w:color="CBD5E1"/>
+              <w:right w:val="single" w:sz="4" w:space="0" w:color="CBD5E1"/>
+            </w:tcBorders>
+          </w:tcPr>
+          <w:p>
+            <w:pPr>
+              <w:spacing w:before="40" w:after="40" w:lineRule="auto" w:line="240"/>
+              <w:jc w:val="center"/>
+            </w:pPr>
+            <w:r/>
+            <w:r>
+              <w:rPr>
+                <w:rFonts w:ascii="Calibri" w:hAnsi="Calibri" w:eastAsia="Calibri"/>
+                <w:b w:val="0"/>
+                <w:i w:val="0"/>
+                <w:color w:val="1F2937"/>
+                <w:sz w:val="18"/>
+              </w:rPr>
+              <w:t>B — 12 JackPot × 50 min</w:t>
+            </w:r>
+          </w:p>
+        </w:tc>
+        <w:tc>
+          <w:tcPr>
+            <w:tcW w:type="dxa" w:w="1584"/>
+            <w:shd w:fill="F7FAFC" w:val="clear"/>
+            <w:tcBorders>
+              <w:top w:val="single" w:sz="4" w:space="0" w:color="CBD5E1"/>
+              <w:left w:val="single" w:sz="4" w:space="0" w:color="CBD5E1"/>
+              <w:bottom w:val="single" w:sz="4" w:space="0" w:color="CBD5E1"/>
+              <w:right w:val="single" w:sz="4" w:space="0" w:color="CBD5E1"/>
+            </w:tcBorders>
+          </w:tcPr>
+          <w:p>
+            <w:pPr>
+              <w:spacing w:before="40" w:after="40" w:lineRule="auto" w:line="240"/>
+              <w:jc w:val="left"/>
+            </w:pPr>
+            <w:r/>
+            <w:r>
+              <w:rPr>
+                <w:rFonts w:ascii="Calibri" w:hAnsi="Calibri" w:eastAsia="Calibri"/>
+                <w:b w:val="0"/>
+                <w:i w:val="0"/>
+                <w:color w:val="1F2937"/>
+                <w:sz w:val="18"/>
+              </w:rPr>
+              <w:t>480</w:t>
+            </w:r>
+          </w:p>
+        </w:tc>
+        <w:tc>
+          <w:tcPr>
+            <w:tcW w:type="dxa" w:w="1584"/>
+            <w:shd w:fill="F7FAFC" w:val="clear"/>
+            <w:tcBorders>
+              <w:top w:val="single" w:sz="4" w:space="0" w:color="CBD5E1"/>
+              <w:left w:val="single" w:sz="4" w:space="0" w:color="CBD5E1"/>
+              <w:bottom w:val="single" w:sz="4" w:space="0" w:color="CBD5E1"/>
+              <w:right w:val="single" w:sz="4" w:space="0" w:color="CBD5E1"/>
+            </w:tcBorders>
+          </w:tcPr>
+          <w:p>
+            <w:pPr>
+              <w:spacing w:before="40" w:after="40" w:lineRule="auto" w:line="240"/>
+              <w:jc w:val="left"/>
+            </w:pPr>
+            <w:r/>
+            <w:r>
+              <w:rPr>
+                <w:rFonts w:ascii="Calibri" w:hAnsi="Calibri" w:eastAsia="Calibri"/>
+                <w:b w:val="0"/>
+                <w:i w:val="0"/>
+                <w:color w:val="1F2937"/>
+                <w:sz w:val="18"/>
+              </w:rPr>
+              <w:t>6,000</w:t>
+            </w:r>
+          </w:p>
+        </w:tc>
+        <w:tc>
+          <w:tcPr>
+            <w:tcW w:type="dxa" w:w="1440"/>
+            <w:shd w:fill="F7FAFC" w:val="clear"/>
+            <w:tcBorders>
+              <w:top w:val="single" w:sz="4" w:space="0" w:color="CBD5E1"/>
+              <w:left w:val="single" w:sz="4" w:space="0" w:color="CBD5E1"/>
+              <w:bottom w:val="single" w:sz="4" w:space="0" w:color="CBD5E1"/>
+              <w:right w:val="single" w:sz="4" w:space="0" w:color="CBD5E1"/>
+            </w:tcBorders>
+          </w:tcPr>
+          <w:p>
+            <w:pPr>
+              <w:spacing w:before="40" w:after="40" w:lineRule="auto" w:line="240"/>
+              <w:jc w:val="left"/>
+            </w:pPr>
+            <w:r/>
+            <w:r>
+              <w:rPr>
+                <w:rFonts w:ascii="Calibri" w:hAnsi="Calibri" w:eastAsia="Calibri"/>
+                <w:b w:val="0"/>
+                <w:i w:val="0"/>
+                <w:color w:val="1F2937"/>
+                <w:sz w:val="18"/>
+              </w:rPr>
+              <w:t>6,480</w:t>
+            </w:r>
+          </w:p>
+        </w:tc>
+        <w:tc>
+          <w:tcPr>
+            <w:tcW w:type="dxa" w:w="2016"/>
+            <w:shd w:fill="F7FAFC" w:val="clear"/>
+            <w:tcBorders>
+              <w:top w:val="single" w:sz="4" w:space="0" w:color="CBD5E1"/>
+              <w:left w:val="single" w:sz="4" w:space="0" w:color="CBD5E1"/>
+              <w:bottom w:val="single" w:sz="4" w:space="0" w:color="CBD5E1"/>
+              <w:right w:val="single" w:sz="4" w:space="0" w:color="CBD5E1"/>
+            </w:tcBorders>
+          </w:tcPr>
+          <w:p>
+            <w:pPr>
+              <w:spacing w:before="40" w:after="40" w:lineRule="auto" w:line="240"/>
+              <w:jc w:val="left"/>
+            </w:pPr>
+            <w:r/>
+            <w:r>
+              <w:rPr>
+                <w:rFonts w:ascii="Calibri" w:hAnsi="Calibri" w:eastAsia="Calibri"/>
+                <w:b w:val="0"/>
+                <w:i w:val="0"/>
+                <w:color w:val="1F2937"/>
+                <w:sz w:val="18"/>
+              </w:rPr>
+              <w:t>6,000</w:t>
+            </w:r>
+          </w:p>
+        </w:tc>
+      </w:tr>
+      <w:tr>
+        <w:tc>
+          <w:tcPr>
+            <w:tcW w:type="dxa" w:w="3168"/>
+            <w:tcBorders>
+              <w:top w:val="single" w:sz="4" w:space="0" w:color="CBD5E1"/>
+              <w:left w:val="single" w:sz="4" w:space="0" w:color="CBD5E1"/>
+              <w:bottom w:val="single" w:sz="4" w:space="0" w:color="CBD5E1"/>
+              <w:right w:val="single" w:sz="4" w:space="0" w:color="CBD5E1"/>
+            </w:tcBorders>
+          </w:tcPr>
+          <w:p>
+            <w:pPr>
+              <w:spacing w:before="40" w:after="40" w:lineRule="auto" w:line="240"/>
+              <w:jc w:val="center"/>
+            </w:pPr>
+            <w:r/>
+            <w:r>
+              <w:rPr>
+                <w:rFonts w:ascii="Calibri" w:hAnsi="Calibri" w:eastAsia="Calibri"/>
+                <w:b w:val="0"/>
+                <w:i w:val="0"/>
+                <w:color w:val="1F2937"/>
+                <w:sz w:val="18"/>
+              </w:rPr>
+              <w:t>C — 1 Sequential × 10 min</w:t>
+            </w:r>
+          </w:p>
+        </w:tc>
+        <w:tc>
+          <w:tcPr>
+            <w:tcW w:type="dxa" w:w="1584"/>
+            <w:tcBorders>
+              <w:top w:val="single" w:sz="4" w:space="0" w:color="CBD5E1"/>
+              <w:left w:val="single" w:sz="4" w:space="0" w:color="CBD5E1"/>
+              <w:bottom w:val="single" w:sz="4" w:space="0" w:color="CBD5E1"/>
+              <w:right w:val="single" w:sz="4" w:space="0" w:color="CBD5E1"/>
+            </w:tcBorders>
+          </w:tcPr>
+          <w:p>
+            <w:pPr>
+              <w:spacing w:before="40" w:after="40" w:lineRule="auto" w:line="240"/>
+              <w:jc w:val="left"/>
+            </w:pPr>
+            <w:r/>
+            <w:r>
+              <w:rPr>
+                <w:rFonts w:ascii="Calibri" w:hAnsi="Calibri" w:eastAsia="Calibri"/>
+                <w:b w:val="0"/>
+                <w:i w:val="0"/>
+                <w:color w:val="1F2937"/>
+                <w:sz w:val="18"/>
+              </w:rPr>
+              <w:t>40</w:t>
+            </w:r>
+          </w:p>
+        </w:tc>
+        <w:tc>
+          <w:tcPr>
+            <w:tcW w:type="dxa" w:w="1584"/>
+            <w:tcBorders>
+              <w:top w:val="single" w:sz="4" w:space="0" w:color="CBD5E1"/>
+              <w:left w:val="single" w:sz="4" w:space="0" w:color="CBD5E1"/>
+              <w:bottom w:val="single" w:sz="4" w:space="0" w:color="CBD5E1"/>
+              <w:right w:val="single" w:sz="4" w:space="0" w:color="CBD5E1"/>
+            </w:tcBorders>
+          </w:tcPr>
+          <w:p>
+            <w:pPr>
+              <w:spacing w:before="40" w:after="40" w:lineRule="auto" w:line="240"/>
+              <w:jc w:val="left"/>
+            </w:pPr>
+            <w:r/>
+            <w:r>
+              <w:rPr>
+                <w:rFonts w:ascii="Calibri" w:hAnsi="Calibri" w:eastAsia="Calibri"/>
+                <w:b w:val="0"/>
+                <w:i w:val="0"/>
+                <w:color w:val="1F2937"/>
+                <w:sz w:val="18"/>
+              </w:rPr>
+              <w:t>100</w:t>
+            </w:r>
+          </w:p>
+        </w:tc>
+        <w:tc>
+          <w:tcPr>
+            <w:tcW w:type="dxa" w:w="1440"/>
+            <w:tcBorders>
+              <w:top w:val="single" w:sz="4" w:space="0" w:color="CBD5E1"/>
+              <w:left w:val="single" w:sz="4" w:space="0" w:color="CBD5E1"/>
+              <w:bottom w:val="single" w:sz="4" w:space="0" w:color="CBD5E1"/>
+              <w:right w:val="single" w:sz="4" w:space="0" w:color="CBD5E1"/>
+            </w:tcBorders>
+          </w:tcPr>
+          <w:p>
+            <w:pPr>
+              <w:spacing w:before="40" w:after="40" w:lineRule="auto" w:line="240"/>
+              <w:jc w:val="left"/>
+            </w:pPr>
+            <w:r/>
+            <w:r>
+              <w:rPr>
+                <w:rFonts w:ascii="Calibri" w:hAnsi="Calibri" w:eastAsia="Calibri"/>
+                <w:b w:val="0"/>
+                <w:i w:val="0"/>
+                <w:color w:val="1F2937"/>
+                <w:sz w:val="18"/>
+              </w:rPr>
+              <w:t>140</w:t>
+            </w:r>
+          </w:p>
+        </w:tc>
+        <w:tc>
+          <w:tcPr>
+            <w:tcW w:type="dxa" w:w="2016"/>
+            <w:tcBorders>
+              <w:top w:val="single" w:sz="4" w:space="0" w:color="CBD5E1"/>
+              <w:left w:val="single" w:sz="4" w:space="0" w:color="CBD5E1"/>
+              <w:bottom w:val="single" w:sz="4" w:space="0" w:color="CBD5E1"/>
+              <w:right w:val="single" w:sz="4" w:space="0" w:color="CBD5E1"/>
+            </w:tcBorders>
+          </w:tcPr>
+          <w:p>
+            <w:pPr>
+              <w:spacing w:before="40" w:after="40" w:lineRule="auto" w:line="240"/>
+              <w:jc w:val="left"/>
+            </w:pPr>
+            <w:r/>
+            <w:r>
+              <w:rPr>
+                <w:rFonts w:ascii="Calibri" w:hAnsi="Calibri" w:eastAsia="Calibri"/>
+                <w:b w:val="0"/>
+                <w:i w:val="0"/>
+                <w:color w:val="1F2937"/>
+                <w:sz w:val="18"/>
+              </w:rPr>
+              <w:t>100</w:t>
+            </w:r>
+          </w:p>
+        </w:tc>
+      </w:tr>
+      <w:tr>
+        <w:tc>
+          <w:tcPr>
+            <w:tcW w:type="dxa" w:w="3168"/>
+            <w:shd w:fill="EEF2F7" w:val="clear"/>
+            <w:tcBorders>
+              <w:top w:val="single" w:sz="4" w:space="0" w:color="CBD5E1"/>
+              <w:left w:val="single" w:sz="4" w:space="0" w:color="CBD5E1"/>
+              <w:bottom w:val="single" w:sz="4" w:space="0" w:color="CBD5E1"/>
+              <w:right w:val="single" w:sz="4" w:space="0" w:color="CBD5E1"/>
+            </w:tcBorders>
+          </w:tcPr>
+          <w:p>
+            <w:pPr>
+              <w:spacing w:before="40" w:after="40" w:lineRule="auto" w:line="240"/>
+              <w:jc w:val="center"/>
+            </w:pPr>
+            <w:r/>
+            <w:r>
+              <w:rPr>
+                <w:rFonts w:ascii="Calibri" w:hAnsi="Calibri" w:eastAsia="Calibri"/>
+                <w:b/>
+                <w:i w:val="0"/>
+                <w:color w:val="1A365D"/>
+                <w:sz w:val="18"/>
+              </w:rPr>
+              <w:t>Program</w:t>
+            </w:r>
+          </w:p>
+        </w:tc>
+        <w:tc>
+          <w:tcPr>
+            <w:tcW w:type="dxa" w:w="1584"/>
+            <w:shd w:fill="EEF2F7" w:val="clear"/>
+            <w:tcBorders>
+              <w:top w:val="single" w:sz="4" w:space="0" w:color="CBD5E1"/>
+              <w:left w:val="single" w:sz="4" w:space="0" w:color="CBD5E1"/>
+              <w:bottom w:val="single" w:sz="4" w:space="0" w:color="CBD5E1"/>
+              <w:right w:val="single" w:sz="4" w:space="0" w:color="CBD5E1"/>
+            </w:tcBorders>
+          </w:tcPr>
+          <w:p>
+            <w:pPr>
+              <w:spacing w:before="40" w:after="40" w:lineRule="auto" w:line="240"/>
+              <w:jc w:val="left"/>
+            </w:pPr>
+            <w:r/>
+            <w:r>
+              <w:rPr>
+                <w:rFonts w:ascii="Calibri" w:hAnsi="Calibri" w:eastAsia="Calibri"/>
+                <w:b/>
+                <w:i w:val="0"/>
+                <w:color w:val="1A365D"/>
+                <w:sz w:val="18"/>
+              </w:rPr>
+              <w:t>920</w:t>
+            </w:r>
+          </w:p>
+        </w:tc>
+        <w:tc>
+          <w:tcPr>
+            <w:tcW w:type="dxa" w:w="1584"/>
+            <w:shd w:fill="EEF2F7" w:val="clear"/>
+            <w:tcBorders>
+              <w:top w:val="single" w:sz="4" w:space="0" w:color="CBD5E1"/>
+              <w:left w:val="single" w:sz="4" w:space="0" w:color="CBD5E1"/>
+              <w:bottom w:val="single" w:sz="4" w:space="0" w:color="CBD5E1"/>
+              <w:right w:val="single" w:sz="4" w:space="0" w:color="CBD5E1"/>
+            </w:tcBorders>
+          </w:tcPr>
+          <w:p>
+            <w:pPr>
+              <w:spacing w:before="40" w:after="40" w:lineRule="auto" w:line="240"/>
+              <w:jc w:val="left"/>
+            </w:pPr>
+            <w:r/>
+            <w:r>
+              <w:rPr>
+                <w:rFonts w:ascii="Calibri" w:hAnsi="Calibri" w:eastAsia="Calibri"/>
+                <w:b/>
+                <w:i w:val="0"/>
+                <w:color w:val="1A365D"/>
+                <w:sz w:val="18"/>
+              </w:rPr>
+              <w:t>8,600</w:t>
+            </w:r>
+          </w:p>
+        </w:tc>
+        <w:tc>
+          <w:tcPr>
+            <w:tcW w:type="dxa" w:w="1440"/>
+            <w:shd w:fill="EEF2F7" w:val="clear"/>
+            <w:tcBorders>
+              <w:top w:val="single" w:sz="4" w:space="0" w:color="CBD5E1"/>
+              <w:left w:val="single" w:sz="4" w:space="0" w:color="CBD5E1"/>
+              <w:bottom w:val="single" w:sz="4" w:space="0" w:color="CBD5E1"/>
+              <w:right w:val="single" w:sz="4" w:space="0" w:color="CBD5E1"/>
+            </w:tcBorders>
+          </w:tcPr>
+          <w:p>
+            <w:pPr>
+              <w:spacing w:before="40" w:after="40" w:lineRule="auto" w:line="240"/>
+              <w:jc w:val="left"/>
+            </w:pPr>
+            <w:r/>
+            <w:r>
+              <w:rPr>
+                <w:rFonts w:ascii="Calibri" w:hAnsi="Calibri" w:eastAsia="Calibri"/>
+                <w:b/>
+                <w:i w:val="0"/>
+                <w:color w:val="1A365D"/>
+                <w:sz w:val="18"/>
+              </w:rPr>
+              <w:t>9,520</w:t>
+            </w:r>
+          </w:p>
+        </w:tc>
+        <w:tc>
+          <w:tcPr>
+            <w:tcW w:type="dxa" w:w="2016"/>
+            <w:shd w:fill="EEF2F7" w:val="clear"/>
+            <w:tcBorders>
+              <w:top w:val="single" w:sz="4" w:space="0" w:color="CBD5E1"/>
+              <w:left w:val="single" w:sz="4" w:space="0" w:color="CBD5E1"/>
+              <w:bottom w:val="single" w:sz="4" w:space="0" w:color="CBD5E1"/>
+              <w:right w:val="single" w:sz="4" w:space="0" w:color="CBD5E1"/>
+            </w:tcBorders>
+          </w:tcPr>
+          <w:p>
+            <w:pPr>
+              <w:spacing w:before="40" w:after="40" w:lineRule="auto" w:line="240"/>
+              <w:jc w:val="left"/>
+            </w:pPr>
+            <w:r/>
+            <w:r>
+              <w:rPr>
+                <w:rFonts w:ascii="Calibri" w:hAnsi="Calibri" w:eastAsia="Calibri"/>
+                <w:b/>
+                <w:i w:val="0"/>
+                <w:color w:val="1A365D"/>
+                <w:sz w:val="18"/>
+              </w:rPr>
+              <w:t>8,600</w:t>
+            </w:r>
+          </w:p>
+        </w:tc>
+      </w:tr>
+    </w:tbl>
+    <w:p>
+      <w:pPr>
+        <w:spacing w:before="0" w:after="120" w:lineRule="auto" w:line="240"/>
+      </w:pPr>
+    </w:p>
+    <w:p>
+      <w:pPr>
+        <w:spacing w:before="200" w:after="120" w:lineRule="auto" w:line="276"/>
+      </w:pPr>
+      <w:r>
+        <w:rPr>
+          <w:rFonts w:ascii="Calibri" w:hAnsi="Calibri" w:eastAsia="Calibri"/>
+          <w:b/>
+          <w:i w:val="0"/>
+          <w:color w:val="2B6CB0"/>
+          <w:sz w:val="24"/>
+        </w:rPr>
+        <w:t>Transaction Accounting</w:t>
       </w:r>
     </w:p>
     <w:tbl>
@@ -3719,7 +4643,7 @@
       <w:tr>
         <w:tc>
           <w:tcPr>
-            <w:tcW w:type="dxa" w:w="1872"/>
+            <w:tcW w:type="dxa" w:w="2016"/>
             <w:shd w:fill="1A365D" w:val="clear"/>
             <w:tcBorders>
               <w:top w:val="single" w:sz="4" w:space="0" w:color="1A365D"/>
@@ -3748,7 +4672,7 @@
         </w:tc>
         <w:tc>
           <w:tcPr>
-            <w:tcW w:type="dxa" w:w="1152"/>
+            <w:tcW w:type="dxa" w:w="1872"/>
             <w:shd w:fill="1A365D" w:val="clear"/>
             <w:tcBorders>
               <w:top w:val="single" w:sz="4" w:space="0" w:color="1A365D"/>
@@ -3771,13 +4695,13 @@
                 <w:color w:val="FFFFFF"/>
                 <w:sz w:val="18"/>
               </w:rPr>
-              <w:t>Per Pot</w:t>
+              <w:t>Per Pot / Per Join</w:t>
             </w:r>
           </w:p>
         </w:tc>
         <w:tc>
           <w:tcPr>
-            <w:tcW w:type="dxa" w:w="1728"/>
+            <w:tcW w:type="dxa" w:w="1440"/>
             <w:shd w:fill="1A365D" w:val="clear"/>
             <w:tcBorders>
               <w:top w:val="single" w:sz="4" w:space="0" w:color="1A365D"/>
@@ -3800,13 +4724,13 @@
                 <w:color w:val="FFFFFF"/>
                 <w:sz w:val="18"/>
               </w:rPr>
-              <w:t>Tier A (10×10)</w:t>
+              <w:t>Tier A</w:t>
             </w:r>
           </w:p>
         </w:tc>
         <w:tc>
           <w:tcPr>
-            <w:tcW w:type="dxa" w:w="1728"/>
+            <w:tcW w:type="dxa" w:w="1440"/>
             <w:shd w:fill="1A365D" w:val="clear"/>
             <w:tcBorders>
               <w:top w:val="single" w:sz="4" w:space="0" w:color="1A365D"/>
@@ -3829,13 +4753,13 @@
                 <w:color w:val="FFFFFF"/>
                 <w:sz w:val="18"/>
               </w:rPr>
-              <w:t>Tier B (12×10)</w:t>
+              <w:t>Tier B</w:t>
             </w:r>
           </w:p>
         </w:tc>
         <w:tc>
           <w:tcPr>
-            <w:tcW w:type="dxa" w:w="1584"/>
+            <w:tcW w:type="dxa" w:w="1296"/>
             <w:shd w:fill="1A365D" w:val="clear"/>
             <w:tcBorders>
               <w:top w:val="single" w:sz="4" w:space="0" w:color="1A365D"/>
@@ -3858,13 +4782,13 @@
                 <w:color w:val="FFFFFF"/>
                 <w:sz w:val="18"/>
               </w:rPr>
-              <w:t>Tier C (1×10)</w:t>
+              <w:t>Tier C</w:t>
             </w:r>
           </w:p>
         </w:tc>
         <w:tc>
           <w:tcPr>
-            <w:tcW w:type="dxa" w:w="1296"/>
+            <w:tcW w:type="dxa" w:w="1440"/>
             <w:shd w:fill="1A365D" w:val="clear"/>
             <w:tcBorders>
               <w:top w:val="single" w:sz="4" w:space="0" w:color="1A365D"/>
@@ -3895,7 +4819,7 @@
       <w:tr>
         <w:tc>
           <w:tcPr>
-            <w:tcW w:type="dxa" w:w="1872"/>
+            <w:tcW w:type="dxa" w:w="2016"/>
             <w:tcBorders>
               <w:top w:val="single" w:sz="4" w:space="0" w:color="CBD5E1"/>
               <w:left w:val="single" w:sz="4" w:space="0" w:color="CBD5E1"/>
@@ -3923,7 +4847,7 @@
         </w:tc>
         <w:tc>
           <w:tcPr>
-            <w:tcW w:type="dxa" w:w="1152"/>
+            <w:tcW w:type="dxa" w:w="1872"/>
             <w:tcBorders>
               <w:top w:val="single" w:sz="4" w:space="0" w:color="CBD5E1"/>
               <w:left w:val="single" w:sz="4" w:space="0" w:color="CBD5E1"/>
@@ -3945,13 +4869,13 @@
                 <w:color w:val="1F2937"/>
                 <w:sz w:val="18"/>
               </w:rPr>
-              <w:t>1</w:t>
+              <w:t>1 / pot</w:t>
             </w:r>
           </w:p>
         </w:tc>
         <w:tc>
           <w:tcPr>
-            <w:tcW w:type="dxa" w:w="1728"/>
+            <w:tcW w:type="dxa" w:w="1440"/>
             <w:tcBorders>
               <w:top w:val="single" w:sz="4" w:space="0" w:color="CBD5E1"/>
               <w:left w:val="single" w:sz="4" w:space="0" w:color="CBD5E1"/>
@@ -3979,7 +4903,7 @@
         </w:tc>
         <w:tc>
           <w:tcPr>
-            <w:tcW w:type="dxa" w:w="1728"/>
+            <w:tcW w:type="dxa" w:w="1440"/>
             <w:tcBorders>
               <w:top w:val="single" w:sz="4" w:space="0" w:color="CBD5E1"/>
               <w:left w:val="single" w:sz="4" w:space="0" w:color="CBD5E1"/>
@@ -4007,7 +4931,7 @@
         </w:tc>
         <w:tc>
           <w:tcPr>
-            <w:tcW w:type="dxa" w:w="1584"/>
+            <w:tcW w:type="dxa" w:w="1296"/>
             <w:tcBorders>
               <w:top w:val="single" w:sz="4" w:space="0" w:color="CBD5E1"/>
               <w:left w:val="single" w:sz="4" w:space="0" w:color="CBD5E1"/>
@@ -4035,7 +4959,7 @@
         </w:tc>
         <w:tc>
           <w:tcPr>
-            <w:tcW w:type="dxa" w:w="1296"/>
+            <w:tcW w:type="dxa" w:w="1440"/>
             <w:tcBorders>
               <w:top w:val="single" w:sz="4" w:space="0" w:color="CBD5E1"/>
               <w:left w:val="single" w:sz="4" w:space="0" w:color="CBD5E1"/>
@@ -4065,7 +4989,7 @@
       <w:tr>
         <w:tc>
           <w:tcPr>
-            <w:tcW w:type="dxa" w:w="1872"/>
+            <w:tcW w:type="dxa" w:w="2016"/>
             <w:shd w:fill="F7FAFC" w:val="clear"/>
             <w:tcBorders>
               <w:top w:val="single" w:sz="4" w:space="0" w:color="CBD5E1"/>
@@ -4094,7 +5018,7 @@
         </w:tc>
         <w:tc>
           <w:tcPr>
-            <w:tcW w:type="dxa" w:w="1152"/>
+            <w:tcW w:type="dxa" w:w="1872"/>
             <w:shd w:fill="F7FAFC" w:val="clear"/>
             <w:tcBorders>
               <w:top w:val="single" w:sz="4" w:space="0" w:color="CBD5E1"/>
@@ -4117,13 +5041,13 @@
                 <w:color w:val="1F2937"/>
                 <w:sz w:val="18"/>
               </w:rPr>
-              <w:t>1</w:t>
+              <w:t>1 / pot</w:t>
             </w:r>
           </w:p>
         </w:tc>
         <w:tc>
           <w:tcPr>
-            <w:tcW w:type="dxa" w:w="1728"/>
+            <w:tcW w:type="dxa" w:w="1440"/>
             <w:shd w:fill="F7FAFC" w:val="clear"/>
             <w:tcBorders>
               <w:top w:val="single" w:sz="4" w:space="0" w:color="CBD5E1"/>
@@ -4152,7 +5076,7 @@
         </w:tc>
         <w:tc>
           <w:tcPr>
-            <w:tcW w:type="dxa" w:w="1728"/>
+            <w:tcW w:type="dxa" w:w="1440"/>
             <w:shd w:fill="F7FAFC" w:val="clear"/>
             <w:tcBorders>
               <w:top w:val="single" w:sz="4" w:space="0" w:color="CBD5E1"/>
@@ -4181,7 +5105,7 @@
         </w:tc>
         <w:tc>
           <w:tcPr>
-            <w:tcW w:type="dxa" w:w="1584"/>
+            <w:tcW w:type="dxa" w:w="1296"/>
             <w:shd w:fill="F7FAFC" w:val="clear"/>
             <w:tcBorders>
               <w:top w:val="single" w:sz="4" w:space="0" w:color="CBD5E1"/>
@@ -4210,7 +5134,7 @@
         </w:tc>
         <w:tc>
           <w:tcPr>
-            <w:tcW w:type="dxa" w:w="1296"/>
+            <w:tcW w:type="dxa" w:w="1440"/>
             <w:shd w:fill="F7FAFC" w:val="clear"/>
             <w:tcBorders>
               <w:top w:val="single" w:sz="4" w:space="0" w:color="CBD5E1"/>
@@ -4241,7 +5165,7 @@
       <w:tr>
         <w:tc>
           <w:tcPr>
-            <w:tcW w:type="dxa" w:w="1872"/>
+            <w:tcW w:type="dxa" w:w="2016"/>
             <w:tcBorders>
               <w:top w:val="single" w:sz="4" w:space="0" w:color="CBD5E1"/>
               <w:left w:val="single" w:sz="4" w:space="0" w:color="CBD5E1"/>
@@ -4269,7 +5193,7 @@
         </w:tc>
         <w:tc>
           <w:tcPr>
-            <w:tcW w:type="dxa" w:w="1152"/>
+            <w:tcW w:type="dxa" w:w="1872"/>
             <w:tcBorders>
               <w:top w:val="single" w:sz="4" w:space="0" w:color="CBD5E1"/>
               <w:left w:val="single" w:sz="4" w:space="0" w:color="CBD5E1"/>
@@ -4291,13 +5215,13 @@
                 <w:color w:val="1F2937"/>
                 <w:sz w:val="18"/>
               </w:rPr>
-              <w:t>1</w:t>
+              <w:t>1 / pot</w:t>
             </w:r>
           </w:p>
         </w:tc>
         <w:tc>
           <w:tcPr>
-            <w:tcW w:type="dxa" w:w="1728"/>
+            <w:tcW w:type="dxa" w:w="1440"/>
             <w:tcBorders>
               <w:top w:val="single" w:sz="4" w:space="0" w:color="CBD5E1"/>
               <w:left w:val="single" w:sz="4" w:space="0" w:color="CBD5E1"/>
@@ -4325,7 +5249,7 @@
         </w:tc>
         <w:tc>
           <w:tcPr>
-            <w:tcW w:type="dxa" w:w="1728"/>
+            <w:tcW w:type="dxa" w:w="1440"/>
             <w:tcBorders>
               <w:top w:val="single" w:sz="4" w:space="0" w:color="CBD5E1"/>
               <w:left w:val="single" w:sz="4" w:space="0" w:color="CBD5E1"/>
@@ -4353,7 +5277,7 @@
         </w:tc>
         <w:tc>
           <w:tcPr>
-            <w:tcW w:type="dxa" w:w="1584"/>
+            <w:tcW w:type="dxa" w:w="1296"/>
             <w:tcBorders>
               <w:top w:val="single" w:sz="4" w:space="0" w:color="CBD5E1"/>
               <w:left w:val="single" w:sz="4" w:space="0" w:color="CBD5E1"/>
@@ -4381,7 +5305,7 @@
         </w:tc>
         <w:tc>
           <w:tcPr>
-            <w:tcW w:type="dxa" w:w="1296"/>
+            <w:tcW w:type="dxa" w:w="1440"/>
             <w:tcBorders>
               <w:top w:val="single" w:sz="4" w:space="0" w:color="CBD5E1"/>
               <w:left w:val="single" w:sz="4" w:space="0" w:color="CBD5E1"/>
@@ -4411,7 +5335,7 @@
       <w:tr>
         <w:tc>
           <w:tcPr>
-            <w:tcW w:type="dxa" w:w="1872"/>
+            <w:tcW w:type="dxa" w:w="2016"/>
             <w:shd w:fill="F7FAFC" w:val="clear"/>
             <w:tcBorders>
               <w:top w:val="single" w:sz="4" w:space="0" w:color="CBD5E1"/>
@@ -4440,7 +5364,7 @@
         </w:tc>
         <w:tc>
           <w:tcPr>
-            <w:tcW w:type="dxa" w:w="1152"/>
+            <w:tcW w:type="dxa" w:w="1872"/>
             <w:shd w:fill="F7FAFC" w:val="clear"/>
             <w:tcBorders>
               <w:top w:val="single" w:sz="4" w:space="0" w:color="CBD5E1"/>
@@ -4463,13 +5387,13 @@
                 <w:color w:val="1F2937"/>
                 <w:sz w:val="18"/>
               </w:rPr>
-              <w:t>1</w:t>
+              <w:t>1 / pot</w:t>
             </w:r>
           </w:p>
         </w:tc>
         <w:tc>
           <w:tcPr>
-            <w:tcW w:type="dxa" w:w="1728"/>
+            <w:tcW w:type="dxa" w:w="1440"/>
             <w:shd w:fill="F7FAFC" w:val="clear"/>
             <w:tcBorders>
               <w:top w:val="single" w:sz="4" w:space="0" w:color="CBD5E1"/>
@@ -4498,7 +5422,7 @@
         </w:tc>
         <w:tc>
           <w:tcPr>
-            <w:tcW w:type="dxa" w:w="1728"/>
+            <w:tcW w:type="dxa" w:w="1440"/>
             <w:shd w:fill="F7FAFC" w:val="clear"/>
             <w:tcBorders>
               <w:top w:val="single" w:sz="4" w:space="0" w:color="CBD5E1"/>
@@ -4527,7 +5451,7 @@
         </w:tc>
         <w:tc>
           <w:tcPr>
-            <w:tcW w:type="dxa" w:w="1584"/>
+            <w:tcW w:type="dxa" w:w="1296"/>
             <w:shd w:fill="F7FAFC" w:val="clear"/>
             <w:tcBorders>
               <w:top w:val="single" w:sz="4" w:space="0" w:color="CBD5E1"/>
@@ -4556,7 +5480,7 @@
         </w:tc>
         <w:tc>
           <w:tcPr>
-            <w:tcW w:type="dxa" w:w="1296"/>
+            <w:tcW w:type="dxa" w:w="1440"/>
             <w:shd w:fill="F7FAFC" w:val="clear"/>
             <w:tcBorders>
               <w:top w:val="single" w:sz="4" w:space="0" w:color="CBD5E1"/>
@@ -4587,7 +5511,177 @@
       <w:tr>
         <w:tc>
           <w:tcPr>
+            <w:tcW w:type="dxa" w:w="2016"/>
+            <w:tcBorders>
+              <w:top w:val="single" w:sz="4" w:space="0" w:color="CBD5E1"/>
+              <w:left w:val="single" w:sz="4" w:space="0" w:color="CBD5E1"/>
+              <w:bottom w:val="single" w:sz="4" w:space="0" w:color="CBD5E1"/>
+              <w:right w:val="single" w:sz="4" w:space="0" w:color="CBD5E1"/>
+            </w:tcBorders>
+          </w:tcPr>
+          <w:p>
+            <w:pPr>
+              <w:spacing w:before="40" w:after="40" w:lineRule="auto" w:line="240"/>
+              <w:jc w:val="center"/>
+            </w:pPr>
+            <w:r/>
+            <w:r>
+              <w:rPr>
+                <w:rFonts w:ascii="Calibri" w:hAnsi="Calibri" w:eastAsia="Calibri"/>
+                <w:b w:val="0"/>
+                <w:i w:val="0"/>
+                <w:color w:val="1F2937"/>
+                <w:sz w:val="18"/>
+              </w:rPr>
+              <w:t>Participant join</w:t>
+            </w:r>
+          </w:p>
+        </w:tc>
+        <w:tc>
+          <w:tcPr>
             <w:tcW w:type="dxa" w:w="1872"/>
+            <w:tcBorders>
+              <w:top w:val="single" w:sz="4" w:space="0" w:color="CBD5E1"/>
+              <w:left w:val="single" w:sz="4" w:space="0" w:color="CBD5E1"/>
+              <w:bottom w:val="single" w:sz="4" w:space="0" w:color="CBD5E1"/>
+              <w:right w:val="single" w:sz="4" w:space="0" w:color="CBD5E1"/>
+            </w:tcBorders>
+          </w:tcPr>
+          <w:p>
+            <w:pPr>
+              <w:spacing w:before="40" w:after="40" w:lineRule="auto" w:line="240"/>
+              <w:jc w:val="left"/>
+            </w:pPr>
+            <w:r/>
+            <w:r>
+              <w:rPr>
+                <w:rFonts w:ascii="Calibri" w:hAnsi="Calibri" w:eastAsia="Calibri"/>
+                <w:b w:val="0"/>
+                <w:i w:val="0"/>
+                <w:color w:val="1F2937"/>
+                <w:sz w:val="18"/>
+              </w:rPr>
+              <w:t>1 / participant</w:t>
+            </w:r>
+          </w:p>
+        </w:tc>
+        <w:tc>
+          <w:tcPr>
+            <w:tcW w:type="dxa" w:w="1440"/>
+            <w:tcBorders>
+              <w:top w:val="single" w:sz="4" w:space="0" w:color="CBD5E1"/>
+              <w:left w:val="single" w:sz="4" w:space="0" w:color="CBD5E1"/>
+              <w:bottom w:val="single" w:sz="4" w:space="0" w:color="CBD5E1"/>
+              <w:right w:val="single" w:sz="4" w:space="0" w:color="CBD5E1"/>
+            </w:tcBorders>
+          </w:tcPr>
+          <w:p>
+            <w:pPr>
+              <w:spacing w:before="40" w:after="40" w:lineRule="auto" w:line="240"/>
+              <w:jc w:val="left"/>
+            </w:pPr>
+            <w:r/>
+            <w:r>
+              <w:rPr>
+                <w:rFonts w:ascii="Calibri" w:hAnsi="Calibri" w:eastAsia="Calibri"/>
+                <w:b w:val="0"/>
+                <w:i w:val="0"/>
+                <w:color w:val="1F2937"/>
+                <w:sz w:val="18"/>
+              </w:rPr>
+              <w:t>2,500</w:t>
+            </w:r>
+          </w:p>
+        </w:tc>
+        <w:tc>
+          <w:tcPr>
+            <w:tcW w:type="dxa" w:w="1440"/>
+            <w:tcBorders>
+              <w:top w:val="single" w:sz="4" w:space="0" w:color="CBD5E1"/>
+              <w:left w:val="single" w:sz="4" w:space="0" w:color="CBD5E1"/>
+              <w:bottom w:val="single" w:sz="4" w:space="0" w:color="CBD5E1"/>
+              <w:right w:val="single" w:sz="4" w:space="0" w:color="CBD5E1"/>
+            </w:tcBorders>
+          </w:tcPr>
+          <w:p>
+            <w:pPr>
+              <w:spacing w:before="40" w:after="40" w:lineRule="auto" w:line="240"/>
+              <w:jc w:val="left"/>
+            </w:pPr>
+            <w:r/>
+            <w:r>
+              <w:rPr>
+                <w:rFonts w:ascii="Calibri" w:hAnsi="Calibri" w:eastAsia="Calibri"/>
+                <w:b w:val="0"/>
+                <w:i w:val="0"/>
+                <w:color w:val="1F2937"/>
+                <w:sz w:val="18"/>
+              </w:rPr>
+              <w:t>6,000</w:t>
+            </w:r>
+          </w:p>
+        </w:tc>
+        <w:tc>
+          <w:tcPr>
+            <w:tcW w:type="dxa" w:w="1296"/>
+            <w:tcBorders>
+              <w:top w:val="single" w:sz="4" w:space="0" w:color="CBD5E1"/>
+              <w:left w:val="single" w:sz="4" w:space="0" w:color="CBD5E1"/>
+              <w:bottom w:val="single" w:sz="4" w:space="0" w:color="CBD5E1"/>
+              <w:right w:val="single" w:sz="4" w:space="0" w:color="CBD5E1"/>
+            </w:tcBorders>
+          </w:tcPr>
+          <w:p>
+            <w:pPr>
+              <w:spacing w:before="40" w:after="40" w:lineRule="auto" w:line="240"/>
+              <w:jc w:val="left"/>
+            </w:pPr>
+            <w:r/>
+            <w:r>
+              <w:rPr>
+                <w:rFonts w:ascii="Calibri" w:hAnsi="Calibri" w:eastAsia="Calibri"/>
+                <w:b w:val="0"/>
+                <w:i w:val="0"/>
+                <w:color w:val="1F2937"/>
+                <w:sz w:val="18"/>
+              </w:rPr>
+              <w:t>100</w:t>
+            </w:r>
+          </w:p>
+        </w:tc>
+        <w:tc>
+          <w:tcPr>
+            <w:tcW w:type="dxa" w:w="1440"/>
+            <w:tcBorders>
+              <w:top w:val="single" w:sz="4" w:space="0" w:color="CBD5E1"/>
+              <w:left w:val="single" w:sz="4" w:space="0" w:color="CBD5E1"/>
+              <w:bottom w:val="single" w:sz="4" w:space="0" w:color="CBD5E1"/>
+              <w:right w:val="single" w:sz="4" w:space="0" w:color="CBD5E1"/>
+            </w:tcBorders>
+          </w:tcPr>
+          <w:p>
+            <w:pPr>
+              <w:spacing w:before="40" w:after="40" w:lineRule="auto" w:line="240"/>
+              <w:jc w:val="left"/>
+            </w:pPr>
+            <w:r/>
+            <w:r>
+              <w:rPr>
+                <w:rFonts w:ascii="Calibri" w:hAnsi="Calibri" w:eastAsia="Calibri"/>
+                <w:b w:val="0"/>
+                <w:i w:val="0"/>
+                <w:color w:val="1F2937"/>
+                <w:sz w:val="18"/>
+              </w:rPr>
+              <w:t>8,600</w:t>
+            </w:r>
+          </w:p>
+        </w:tc>
+      </w:tr>
+      <w:tr>
+        <w:tc>
+          <w:tcPr>
+            <w:tcW w:type="dxa" w:w="2016"/>
             <w:shd w:fill="EEF2F7" w:val="clear"/>
             <w:tcBorders>
               <w:top w:val="single" w:sz="4" w:space="0" w:color="CBD5E1"/>
@@ -4610,13 +5704,13 @@
                 <w:color w:val="1A365D"/>
                 <w:sz w:val="18"/>
               </w:rPr>
-              <w:t>Lifecycle total</w:t>
+              <w:t>Total txs</w:t>
             </w:r>
           </w:p>
         </w:tc>
         <w:tc>
           <w:tcPr>
-            <w:tcW w:type="dxa" w:w="1152"/>
+            <w:tcW w:type="dxa" w:w="1872"/>
             <w:shd w:fill="EEF2F7" w:val="clear"/>
             <w:tcBorders>
               <w:top w:val="single" w:sz="4" w:space="0" w:color="CBD5E1"/>
@@ -4639,13 +5733,13 @@
                 <w:color w:val="1A365D"/>
                 <w:sz w:val="18"/>
               </w:rPr>
-              <w:t>4</w:t>
+              <w:t>—</w:t>
             </w:r>
           </w:p>
         </w:tc>
         <w:tc>
           <w:tcPr>
-            <w:tcW w:type="dxa" w:w="1728"/>
+            <w:tcW w:type="dxa" w:w="1440"/>
             <w:shd w:fill="EEF2F7" w:val="clear"/>
             <w:tcBorders>
               <w:top w:val="single" w:sz="4" w:space="0" w:color="CBD5E1"/>
@@ -4668,13 +5762,13 @@
                 <w:color w:val="1A365D"/>
                 <w:sz w:val="18"/>
               </w:rPr>
-              <w:t>400</w:t>
+              <w:t>2,900</w:t>
             </w:r>
           </w:p>
         </w:tc>
         <w:tc>
           <w:tcPr>
-            <w:tcW w:type="dxa" w:w="1728"/>
+            <w:tcW w:type="dxa" w:w="1440"/>
             <w:shd w:fill="EEF2F7" w:val="clear"/>
             <w:tcBorders>
               <w:top w:val="single" w:sz="4" w:space="0" w:color="CBD5E1"/>
@@ -4697,36 +5791,7 @@
                 <w:color w:val="1A365D"/>
                 <w:sz w:val="18"/>
               </w:rPr>
-              <w:t>480</w:t>
-            </w:r>
-          </w:p>
-        </w:tc>
-        <w:tc>
-          <w:tcPr>
-            <w:tcW w:type="dxa" w:w="1584"/>
-            <w:shd w:fill="EEF2F7" w:val="clear"/>
-            <w:tcBorders>
-              <w:top w:val="single" w:sz="4" w:space="0" w:color="CBD5E1"/>
-              <w:left w:val="single" w:sz="4" w:space="0" w:color="CBD5E1"/>
-              <w:bottom w:val="single" w:sz="4" w:space="0" w:color="CBD5E1"/>
-              <w:right w:val="single" w:sz="4" w:space="0" w:color="CBD5E1"/>
-            </w:tcBorders>
-          </w:tcPr>
-          <w:p>
-            <w:pPr>
-              <w:spacing w:before="40" w:after="40" w:lineRule="auto" w:line="240"/>
-              <w:jc w:val="left"/>
-            </w:pPr>
-            <w:r/>
-            <w:r>
-              <w:rPr>
-                <w:rFonts w:ascii="Calibri" w:hAnsi="Calibri" w:eastAsia="Calibri"/>
-                <w:b/>
-                <w:i w:val="0"/>
-                <w:color w:val="1A365D"/>
-                <w:sz w:val="18"/>
-              </w:rPr>
-              <w:t>40</w:t>
+              <w:t>6,480</w:t>
             </w:r>
           </w:p>
         </w:tc>
@@ -4755,7 +5820,36 @@
                 <w:color w:val="1A365D"/>
                 <w:sz w:val="18"/>
               </w:rPr>
-              <w:t>920</w:t>
+              <w:t>140</w:t>
+            </w:r>
+          </w:p>
+        </w:tc>
+        <w:tc>
+          <w:tcPr>
+            <w:tcW w:type="dxa" w:w="1440"/>
+            <w:shd w:fill="EEF2F7" w:val="clear"/>
+            <w:tcBorders>
+              <w:top w:val="single" w:sz="4" w:space="0" w:color="CBD5E1"/>
+              <w:left w:val="single" w:sz="4" w:space="0" w:color="CBD5E1"/>
+              <w:bottom w:val="single" w:sz="4" w:space="0" w:color="CBD5E1"/>
+              <w:right w:val="single" w:sz="4" w:space="0" w:color="CBD5E1"/>
+            </w:tcBorders>
+          </w:tcPr>
+          <w:p>
+            <w:pPr>
+              <w:spacing w:before="40" w:after="40" w:lineRule="auto" w:line="240"/>
+              <w:jc w:val="left"/>
+            </w:pPr>
+            <w:r/>
+            <w:r>
+              <w:rPr>
+                <w:rFonts w:ascii="Calibri" w:hAnsi="Calibri" w:eastAsia="Calibri"/>
+                <w:b/>
+                <w:i w:val="0"/>
+                <w:color w:val="1A365D"/>
+                <w:sz w:val="18"/>
+              </w:rPr>
+              <w:t>9,520</w:t>
             </w:r>
           </w:p>
         </w:tc>
@@ -4778,7 +5872,7 @@
           <w:color w:val="1F2937"/>
           <w:sz w:val="22"/>
         </w:rPr>
-        <w:t>Entry minimums, minimum participants, pot targets, and resulting Total Participants / join-transaction totals are set at pot deployment within each JackPot or Sequential configuration and will be reported each cycle.</w:t>
+        <w:t>Entry minimums and pot targets are set at pot deployment within each JackPot or Sequential configuration and will be reflected in reported STX deposited.</w:t>
       </w:r>
     </w:p>
     <w:p>
@@ -4929,7 +6023,7 @@
         <w:tc>
           <w:tcPr>
             <w:tcW w:type="dxa" w:w="3456"/>
-            <w:shd w:fill="F7FAFC" w:val="clear"/>
+            <w:shd w:fill="EEF2F7" w:val="clear"/>
             <w:tcBorders>
               <w:top w:val="single" w:sz="4" w:space="0" w:color="CBD5E1"/>
               <w:left w:val="single" w:sz="4" w:space="0" w:color="CBD5E1"/>
@@ -4946,19 +6040,19 @@
             <w:r>
               <w:rPr>
                 <w:rFonts w:ascii="Calibri" w:hAnsi="Calibri" w:eastAsia="Calibri"/>
-                <w:b w:val="0"/>
+                <w:b/>
                 <w:i w:val="0"/>
-                <w:color w:val="1F2937"/>
+                <w:color w:val="1A365D"/>
                 <w:sz w:val="18"/>
               </w:rPr>
-              <w:t>Lifecycle on-chain transactions</w:t>
+              <w:t>Minimum participants (program)</w:t>
             </w:r>
           </w:p>
         </w:tc>
         <w:tc>
           <w:tcPr>
             <w:tcW w:type="dxa" w:w="5904"/>
-            <w:shd w:fill="F7FAFC" w:val="clear"/>
+            <w:shd w:fill="EEF2F7" w:val="clear"/>
             <w:tcBorders>
               <w:top w:val="single" w:sz="4" w:space="0" w:color="CBD5E1"/>
               <w:left w:val="single" w:sz="4" w:space="0" w:color="CBD5E1"/>
@@ -4975,12 +6069,12 @@
             <w:r>
               <w:rPr>
                 <w:rFonts w:ascii="Calibri" w:hAnsi="Calibri" w:eastAsia="Calibri"/>
-                <w:b w:val="0"/>
+                <w:b/>
                 <w:i w:val="0"/>
-                <w:color w:val="1F2937"/>
+                <w:color w:val="1A365D"/>
                 <w:sz w:val="18"/>
               </w:rPr>
-              <w:t>920 minimum (deploy, activate, start, close)</w:t>
+              <w:t>8,600 (2,500 + 6,000 + 100)</w:t>
             </w:r>
           </w:p>
         </w:tc>
@@ -5010,7 +6104,7 @@
                 <w:color w:val="1F2937"/>
                 <w:sz w:val="18"/>
               </w:rPr>
-              <w:t>Participant join transactions</w:t>
+              <w:t>On-chain transactions (minimum)</w:t>
             </w:r>
           </w:p>
         </w:tc>
@@ -5038,7 +6132,7 @@
                 <w:color w:val="1F2937"/>
                 <w:sz w:val="18"/>
               </w:rPr>
-              <w:t>Reported from live fill (each join = 1 tx)</w:t>
+              <w:t>9,520 (920 lifecycle + 8,600 joins)</w:t>
             </w:r>
           </w:p>
         </w:tc>
@@ -5098,7 +6192,7 @@
                 <w:color w:val="1F2937"/>
                 <w:sz w:val="18"/>
               </w:rPr>
-              <w:t>46 pots / month · 2 cycles</w:t>
+              <w:t>46 pots / month · 1,720 min. participants · 2 cycles</w:t>
             </w:r>
           </w:p>
         </w:tc>

</xml_diff>

<commit_message>
Fill entry mins and recompute pot targets and stacked STX
Set entry minimums at 25/50/350 STX, derive pot targets, and update
Total Stacked to participant STX at minimum fill (397,500 STX).

Co-authored-by: cryptosmith.btc <Zeus-Adin@users.noreply.github.com>
</commit_message>
<xml_diff>
--- a/StacksPot-Growth-Acceleration-Proposal.docx
+++ b/StacksPot-Growth-Acceleration-Proposal.docx
@@ -1647,7 +1647,7 @@
         </w:tc>
         <w:tc>
           <w:tcPr>
-            <w:tcW w:type="dxa" w:w="1008"/>
+            <w:tcW w:type="dxa" w:w="1080"/>
             <w:shd w:fill="1A365D" w:val="clear"/>
             <w:tcBorders>
               <w:top w:val="single" w:sz="4" w:space="0" w:color="1A365D"/>
@@ -1676,7 +1676,7 @@
         </w:tc>
         <w:tc>
           <w:tcPr>
-            <w:tcW w:type="dxa" w:w="936"/>
+            <w:tcW w:type="dxa" w:w="864"/>
             <w:shd w:fill="1A365D" w:val="clear"/>
             <w:tcBorders>
               <w:top w:val="single" w:sz="4" w:space="0" w:color="1A365D"/>
@@ -1705,7 +1705,7 @@
         </w:tc>
         <w:tc>
           <w:tcPr>
-            <w:tcW w:type="dxa" w:w="1368"/>
+            <w:tcW w:type="dxa" w:w="1296"/>
             <w:shd w:fill="1A365D" w:val="clear"/>
             <w:tcBorders>
               <w:top w:val="single" w:sz="4" w:space="0" w:color="1A365D"/>
@@ -1734,7 +1734,7 @@
         </w:tc>
         <w:tc>
           <w:tcPr>
-            <w:tcW w:type="dxa" w:w="1368"/>
+            <w:tcW w:type="dxa" w:w="1296"/>
             <w:shd w:fill="1A365D" w:val="clear"/>
             <w:tcBorders>
               <w:top w:val="single" w:sz="4" w:space="0" w:color="1A365D"/>
@@ -1763,7 +1763,7 @@
         </w:tc>
         <w:tc>
           <w:tcPr>
-            <w:tcW w:type="dxa" w:w="1656"/>
+            <w:tcW w:type="dxa" w:w="1584"/>
             <w:shd w:fill="1A365D" w:val="clear"/>
             <w:tcBorders>
               <w:top w:val="single" w:sz="4" w:space="0" w:color="1A365D"/>
@@ -1844,7 +1844,7 @@
                 <w:color w:val="1F2937"/>
                 <w:sz w:val="16"/>
               </w:rPr>
-              <w:t>—</w:t>
+              <w:t>25 STX</w:t>
             </w:r>
           </w:p>
         </w:tc>
@@ -1878,7 +1878,7 @@
         </w:tc>
         <w:tc>
           <w:tcPr>
-            <w:tcW w:type="dxa" w:w="1008"/>
+            <w:tcW w:type="dxa" w:w="1080"/>
             <w:tcBorders>
               <w:top w:val="single" w:sz="4" w:space="0" w:color="CBD5E1"/>
               <w:left w:val="single" w:sz="4" w:space="0" w:color="CBD5E1"/>
@@ -1900,13 +1900,13 @@
                 <w:color w:val="1F2937"/>
                 <w:sz w:val="16"/>
               </w:rPr>
-              <w:t>—</w:t>
+              <w:t>625 STX</w:t>
             </w:r>
           </w:p>
         </w:tc>
         <w:tc>
           <w:tcPr>
-            <w:tcW w:type="dxa" w:w="936"/>
+            <w:tcW w:type="dxa" w:w="864"/>
             <w:tcBorders>
               <w:top w:val="single" w:sz="4" w:space="0" w:color="CBD5E1"/>
               <w:left w:val="single" w:sz="4" w:space="0" w:color="CBD5E1"/>
@@ -1934,7 +1934,7 @@
         </w:tc>
         <w:tc>
           <w:tcPr>
-            <w:tcW w:type="dxa" w:w="1368"/>
+            <w:tcW w:type="dxa" w:w="1296"/>
             <w:tcBorders>
               <w:top w:val="single" w:sz="4" w:space="0" w:color="CBD5E1"/>
               <w:left w:val="single" w:sz="4" w:space="0" w:color="CBD5E1"/>
@@ -1956,13 +1956,13 @@
                 <w:color w:val="1F2937"/>
                 <w:sz w:val="16"/>
               </w:rPr>
-              <w:t>100,000 STX</w:t>
+              <w:t>62,500 STX</w:t>
             </w:r>
           </w:p>
         </w:tc>
         <w:tc>
           <w:tcPr>
-            <w:tcW w:type="dxa" w:w="1368"/>
+            <w:tcW w:type="dxa" w:w="1296"/>
             <w:tcBorders>
               <w:top w:val="single" w:sz="4" w:space="0" w:color="CBD5E1"/>
               <w:left w:val="single" w:sz="4" w:space="0" w:color="CBD5E1"/>
@@ -1990,7 +1990,7 @@
         </w:tc>
         <w:tc>
           <w:tcPr>
-            <w:tcW w:type="dxa" w:w="1656"/>
+            <w:tcW w:type="dxa" w:w="1584"/>
             <w:tcBorders>
               <w:top w:val="single" w:sz="4" w:space="0" w:color="CBD5E1"/>
               <w:left w:val="single" w:sz="4" w:space="0" w:color="CBD5E1"/>
@@ -2072,7 +2072,7 @@
                 <w:color w:val="1F2937"/>
                 <w:sz w:val="16"/>
               </w:rPr>
-              <w:t>—</w:t>
+              <w:t>50 STX</w:t>
             </w:r>
           </w:p>
         </w:tc>
@@ -2107,7 +2107,7 @@
         </w:tc>
         <w:tc>
           <w:tcPr>
-            <w:tcW w:type="dxa" w:w="1008"/>
+            <w:tcW w:type="dxa" w:w="1080"/>
             <w:shd w:fill="F7FAFC" w:val="clear"/>
             <w:tcBorders>
               <w:top w:val="single" w:sz="4" w:space="0" w:color="CBD5E1"/>
@@ -2130,13 +2130,13 @@
                 <w:color w:val="1F2937"/>
                 <w:sz w:val="16"/>
               </w:rPr>
-              <w:t>—</w:t>
+              <w:t>2,500 STX</w:t>
             </w:r>
           </w:p>
         </w:tc>
         <w:tc>
           <w:tcPr>
-            <w:tcW w:type="dxa" w:w="936"/>
+            <w:tcW w:type="dxa" w:w="864"/>
             <w:shd w:fill="F7FAFC" w:val="clear"/>
             <w:tcBorders>
               <w:top w:val="single" w:sz="4" w:space="0" w:color="CBD5E1"/>
@@ -2165,7 +2165,7 @@
         </w:tc>
         <w:tc>
           <w:tcPr>
-            <w:tcW w:type="dxa" w:w="1368"/>
+            <w:tcW w:type="dxa" w:w="1296"/>
             <w:shd w:fill="F7FAFC" w:val="clear"/>
             <w:tcBorders>
               <w:top w:val="single" w:sz="4" w:space="0" w:color="CBD5E1"/>
@@ -2194,7 +2194,7 @@
         </w:tc>
         <w:tc>
           <w:tcPr>
-            <w:tcW w:type="dxa" w:w="1368"/>
+            <w:tcW w:type="dxa" w:w="1296"/>
             <w:shd w:fill="F7FAFC" w:val="clear"/>
             <w:tcBorders>
               <w:top w:val="single" w:sz="4" w:space="0" w:color="CBD5E1"/>
@@ -2223,7 +2223,7 @@
         </w:tc>
         <w:tc>
           <w:tcPr>
-            <w:tcW w:type="dxa" w:w="1656"/>
+            <w:tcW w:type="dxa" w:w="1584"/>
             <w:shd w:fill="F7FAFC" w:val="clear"/>
             <w:tcBorders>
               <w:top w:val="single" w:sz="4" w:space="0" w:color="CBD5E1"/>
@@ -2304,7 +2304,7 @@
                 <w:color w:val="1F2937"/>
                 <w:sz w:val="16"/>
               </w:rPr>
-              <w:t>—</w:t>
+              <w:t>350 STX</w:t>
             </w:r>
           </w:p>
         </w:tc>
@@ -2338,7 +2338,7 @@
         </w:tc>
         <w:tc>
           <w:tcPr>
-            <w:tcW w:type="dxa" w:w="1008"/>
+            <w:tcW w:type="dxa" w:w="1080"/>
             <w:tcBorders>
               <w:top w:val="single" w:sz="4" w:space="0" w:color="CBD5E1"/>
               <w:left w:val="single" w:sz="4" w:space="0" w:color="CBD5E1"/>
@@ -2360,13 +2360,13 @@
                 <w:color w:val="1F2937"/>
                 <w:sz w:val="16"/>
               </w:rPr>
-              <w:t>—</w:t>
+              <w:t>3,500 STX</w:t>
             </w:r>
           </w:p>
         </w:tc>
         <w:tc>
           <w:tcPr>
-            <w:tcW w:type="dxa" w:w="936"/>
+            <w:tcW w:type="dxa" w:w="864"/>
             <w:tcBorders>
               <w:top w:val="single" w:sz="4" w:space="0" w:color="CBD5E1"/>
               <w:left w:val="single" w:sz="4" w:space="0" w:color="CBD5E1"/>
@@ -2394,7 +2394,7 @@
         </w:tc>
         <w:tc>
           <w:tcPr>
-            <w:tcW w:type="dxa" w:w="1368"/>
+            <w:tcW w:type="dxa" w:w="1296"/>
             <w:tcBorders>
               <w:top w:val="single" w:sz="4" w:space="0" w:color="CBD5E1"/>
               <w:left w:val="single" w:sz="4" w:space="0" w:color="CBD5E1"/>
@@ -2416,13 +2416,13 @@
                 <w:color w:val="1F2937"/>
                 <w:sz w:val="16"/>
               </w:rPr>
-              <w:t>100,000 STX</w:t>
+              <w:t>35,000 STX</w:t>
             </w:r>
           </w:p>
         </w:tc>
         <w:tc>
           <w:tcPr>
-            <w:tcW w:type="dxa" w:w="1368"/>
+            <w:tcW w:type="dxa" w:w="1296"/>
             <w:tcBorders>
               <w:top w:val="single" w:sz="4" w:space="0" w:color="CBD5E1"/>
               <w:left w:val="single" w:sz="4" w:space="0" w:color="CBD5E1"/>
@@ -2450,7 +2450,7 @@
         </w:tc>
         <w:tc>
           <w:tcPr>
-            <w:tcW w:type="dxa" w:w="1656"/>
+            <w:tcW w:type="dxa" w:w="1584"/>
             <w:tcBorders>
               <w:top w:val="single" w:sz="4" w:space="0" w:color="CBD5E1"/>
               <w:left w:val="single" w:sz="4" w:space="0" w:color="CBD5E1"/>
@@ -2567,7 +2567,7 @@
         </w:tc>
         <w:tc>
           <w:tcPr>
-            <w:tcW w:type="dxa" w:w="1008"/>
+            <w:tcW w:type="dxa" w:w="1080"/>
             <w:shd w:fill="EEF2F7" w:val="clear"/>
             <w:tcBorders>
               <w:top w:val="single" w:sz="4" w:space="0" w:color="CBD5E1"/>
@@ -2596,7 +2596,7 @@
         </w:tc>
         <w:tc>
           <w:tcPr>
-            <w:tcW w:type="dxa" w:w="936"/>
+            <w:tcW w:type="dxa" w:w="864"/>
             <w:shd w:fill="EEF2F7" w:val="clear"/>
             <w:tcBorders>
               <w:top w:val="single" w:sz="4" w:space="0" w:color="CBD5E1"/>
@@ -2625,7 +2625,7 @@
         </w:tc>
         <w:tc>
           <w:tcPr>
-            <w:tcW w:type="dxa" w:w="1368"/>
+            <w:tcW w:type="dxa" w:w="1296"/>
             <w:shd w:fill="EEF2F7" w:val="clear"/>
             <w:tcBorders>
               <w:top w:val="single" w:sz="4" w:space="0" w:color="CBD5E1"/>
@@ -2648,13 +2648,13 @@
                 <w:color w:val="1A365D"/>
                 <w:sz w:val="16"/>
               </w:rPr>
-              <w:t>500,000 STX</w:t>
+              <w:t>397,500 STX</w:t>
             </w:r>
           </w:p>
         </w:tc>
         <w:tc>
           <w:tcPr>
-            <w:tcW w:type="dxa" w:w="1368"/>
+            <w:tcW w:type="dxa" w:w="1296"/>
             <w:shd w:fill="EEF2F7" w:val="clear"/>
             <w:tcBorders>
               <w:top w:val="single" w:sz="4" w:space="0" w:color="CBD5E1"/>
@@ -2683,7 +2683,7 @@
         </w:tc>
         <w:tc>
           <w:tcPr>
-            <w:tcW w:type="dxa" w:w="1656"/>
+            <w:tcW w:type="dxa" w:w="1584"/>
             <w:shd w:fill="EEF2F7" w:val="clear"/>
             <w:tcBorders>
               <w:top w:val="single" w:sz="4" w:space="0" w:color="CBD5E1"/>
@@ -2740,18 +2740,19 @@
         <w:tblLook w:firstColumn="1" w:firstRow="1" w:lastColumn="0" w:lastRow="0" w:noHBand="0" w:noVBand="1" w:val="04A0"/>
       </w:tblPr>
       <w:tblGrid>
-        <w:gridCol w:w="1399"/>
-        <w:gridCol w:w="1399"/>
-        <w:gridCol w:w="1399"/>
-        <w:gridCol w:w="1399"/>
-        <w:gridCol w:w="1399"/>
-        <w:gridCol w:w="1399"/>
-        <w:gridCol w:w="1399"/>
+        <w:gridCol w:w="1224"/>
+        <w:gridCol w:w="1224"/>
+        <w:gridCol w:w="1224"/>
+        <w:gridCol w:w="1224"/>
+        <w:gridCol w:w="1224"/>
+        <w:gridCol w:w="1224"/>
+        <w:gridCol w:w="1224"/>
+        <w:gridCol w:w="1224"/>
       </w:tblGrid>
       <w:tr>
         <w:tc>
           <w:tcPr>
-            <w:tcW w:type="dxa" w:w="864"/>
+            <w:tcW w:type="dxa" w:w="792"/>
             <w:shd w:fill="1A365D" w:val="clear"/>
             <w:tcBorders>
               <w:top w:val="single" w:sz="4" w:space="0" w:color="1A365D"/>
@@ -2772,9 +2773,183 @@
                 <w:b/>
                 <w:i w:val="0"/>
                 <w:color w:val="FFFFFF"/>
-                <w:sz w:val="18"/>
+                <w:sz w:val="16"/>
               </w:rPr>
               <w:t>Tier</w:t>
+            </w:r>
+          </w:p>
+        </w:tc>
+        <w:tc>
+          <w:tcPr>
+            <w:tcW w:type="dxa" w:w="1296"/>
+            <w:shd w:fill="1A365D" w:val="clear"/>
+            <w:tcBorders>
+              <w:top w:val="single" w:sz="4" w:space="0" w:color="1A365D"/>
+              <w:left w:val="single" w:sz="4" w:space="0" w:color="1A365D"/>
+              <w:bottom w:val="single" w:sz="4" w:space="0" w:color="1A365D"/>
+              <w:right w:val="single" w:sz="4" w:space="0" w:color="1A365D"/>
+            </w:tcBorders>
+          </w:tcPr>
+          <w:p>
+            <w:pPr>
+              <w:spacing w:before="40" w:after="40" w:lineRule="auto" w:line="240"/>
+              <w:jc w:val="center"/>
+            </w:pPr>
+            <w:r/>
+            <w:r>
+              <w:rPr>
+                <w:rFonts w:ascii="Calibri" w:hAnsi="Calibri" w:eastAsia="Calibri"/>
+                <w:b/>
+                <w:i w:val="0"/>
+                <w:color w:val="FFFFFF"/>
+                <w:sz w:val="16"/>
+              </w:rPr>
+              <w:t>Pot Type</w:t>
+            </w:r>
+          </w:p>
+        </w:tc>
+        <w:tc>
+          <w:tcPr>
+            <w:tcW w:type="dxa" w:w="1224"/>
+            <w:shd w:fill="1A365D" w:val="clear"/>
+            <w:tcBorders>
+              <w:top w:val="single" w:sz="4" w:space="0" w:color="1A365D"/>
+              <w:left w:val="single" w:sz="4" w:space="0" w:color="1A365D"/>
+              <w:bottom w:val="single" w:sz="4" w:space="0" w:color="1A365D"/>
+              <w:right w:val="single" w:sz="4" w:space="0" w:color="1A365D"/>
+            </w:tcBorders>
+          </w:tcPr>
+          <w:p>
+            <w:pPr>
+              <w:spacing w:before="40" w:after="40" w:lineRule="auto" w:line="240"/>
+              <w:jc w:val="center"/>
+            </w:pPr>
+            <w:r/>
+            <w:r>
+              <w:rPr>
+                <w:rFonts w:ascii="Calibri" w:hAnsi="Calibri" w:eastAsia="Calibri"/>
+                <w:b/>
+                <w:i w:val="0"/>
+                <w:color w:val="FFFFFF"/>
+                <w:sz w:val="16"/>
+              </w:rPr>
+              <w:t>Pots / Cycle</w:t>
+            </w:r>
+          </w:p>
+        </w:tc>
+        <w:tc>
+          <w:tcPr>
+            <w:tcW w:type="dxa" w:w="1080"/>
+            <w:shd w:fill="1A365D" w:val="clear"/>
+            <w:tcBorders>
+              <w:top w:val="single" w:sz="4" w:space="0" w:color="1A365D"/>
+              <w:left w:val="single" w:sz="4" w:space="0" w:color="1A365D"/>
+              <w:bottom w:val="single" w:sz="4" w:space="0" w:color="1A365D"/>
+              <w:right w:val="single" w:sz="4" w:space="0" w:color="1A365D"/>
+            </w:tcBorders>
+          </w:tcPr>
+          <w:p>
+            <w:pPr>
+              <w:spacing w:before="40" w:after="40" w:lineRule="auto" w:line="240"/>
+              <w:jc w:val="center"/>
+            </w:pPr>
+            <w:r/>
+            <w:r>
+              <w:rPr>
+                <w:rFonts w:ascii="Calibri" w:hAnsi="Calibri" w:eastAsia="Calibri"/>
+                <w:b/>
+                <w:i w:val="0"/>
+                <w:color w:val="FFFFFF"/>
+                <w:sz w:val="16"/>
+              </w:rPr>
+              <w:t>Entry Min.</w:t>
+            </w:r>
+          </w:p>
+        </w:tc>
+        <w:tc>
+          <w:tcPr>
+            <w:tcW w:type="dxa" w:w="1368"/>
+            <w:shd w:fill="1A365D" w:val="clear"/>
+            <w:tcBorders>
+              <w:top w:val="single" w:sz="4" w:space="0" w:color="1A365D"/>
+              <w:left w:val="single" w:sz="4" w:space="0" w:color="1A365D"/>
+              <w:bottom w:val="single" w:sz="4" w:space="0" w:color="1A365D"/>
+              <w:right w:val="single" w:sz="4" w:space="0" w:color="1A365D"/>
+            </w:tcBorders>
+          </w:tcPr>
+          <w:p>
+            <w:pPr>
+              <w:spacing w:before="40" w:after="40" w:lineRule="auto" w:line="240"/>
+              <w:jc w:val="center"/>
+            </w:pPr>
+            <w:r/>
+            <w:r>
+              <w:rPr>
+                <w:rFonts w:ascii="Calibri" w:hAnsi="Calibri" w:eastAsia="Calibri"/>
+                <w:b/>
+                <w:i w:val="0"/>
+                <w:color w:val="FFFFFF"/>
+                <w:sz w:val="16"/>
+              </w:rPr>
+              <w:t>Min. Part. / Pot</w:t>
+            </w:r>
+          </w:p>
+        </w:tc>
+        <w:tc>
+          <w:tcPr>
+            <w:tcW w:type="dxa" w:w="1224"/>
+            <w:shd w:fill="1A365D" w:val="clear"/>
+            <w:tcBorders>
+              <w:top w:val="single" w:sz="4" w:space="0" w:color="1A365D"/>
+              <w:left w:val="single" w:sz="4" w:space="0" w:color="1A365D"/>
+              <w:bottom w:val="single" w:sz="4" w:space="0" w:color="1A365D"/>
+              <w:right w:val="single" w:sz="4" w:space="0" w:color="1A365D"/>
+            </w:tcBorders>
+          </w:tcPr>
+          <w:p>
+            <w:pPr>
+              <w:spacing w:before="40" w:after="40" w:lineRule="auto" w:line="240"/>
+              <w:jc w:val="center"/>
+            </w:pPr>
+            <w:r/>
+            <w:r>
+              <w:rPr>
+                <w:rFonts w:ascii="Calibri" w:hAnsi="Calibri" w:eastAsia="Calibri"/>
+                <w:b/>
+                <w:i w:val="0"/>
+                <w:color w:val="FFFFFF"/>
+                <w:sz w:val="16"/>
+              </w:rPr>
+              <w:t>Pot Target</w:t>
+            </w:r>
+          </w:p>
+        </w:tc>
+        <w:tc>
+          <w:tcPr>
+            <w:tcW w:type="dxa" w:w="1368"/>
+            <w:shd w:fill="1A365D" w:val="clear"/>
+            <w:tcBorders>
+              <w:top w:val="single" w:sz="4" w:space="0" w:color="1A365D"/>
+              <w:left w:val="single" w:sz="4" w:space="0" w:color="1A365D"/>
+              <w:bottom w:val="single" w:sz="4" w:space="0" w:color="1A365D"/>
+              <w:right w:val="single" w:sz="4" w:space="0" w:color="1A365D"/>
+            </w:tcBorders>
+          </w:tcPr>
+          <w:p>
+            <w:pPr>
+              <w:spacing w:before="40" w:after="40" w:lineRule="auto" w:line="240"/>
+              <w:jc w:val="center"/>
+            </w:pPr>
+            <w:r/>
+            <w:r>
+              <w:rPr>
+                <w:rFonts w:ascii="Calibri" w:hAnsi="Calibri" w:eastAsia="Calibri"/>
+                <w:b/>
+                <w:i w:val="0"/>
+                <w:color w:val="FFFFFF"/>
+                <w:sz w:val="16"/>
+              </w:rPr>
+              <w:t>Boost / Pot</w:t>
             </w:r>
           </w:p>
         </w:tc>
@@ -2801,154 +2976,9 @@
                 <w:b/>
                 <w:i w:val="0"/>
                 <w:color w:val="FFFFFF"/>
-                <w:sz w:val="18"/>
+                <w:sz w:val="16"/>
               </w:rPr>
-              <w:t>Pot Type</w:t>
-            </w:r>
-          </w:p>
-        </w:tc>
-        <w:tc>
-          <w:tcPr>
-            <w:tcW w:type="dxa" w:w="1296"/>
-            <w:shd w:fill="1A365D" w:val="clear"/>
-            <w:tcBorders>
-              <w:top w:val="single" w:sz="4" w:space="0" w:color="1A365D"/>
-              <w:left w:val="single" w:sz="4" w:space="0" w:color="1A365D"/>
-              <w:bottom w:val="single" w:sz="4" w:space="0" w:color="1A365D"/>
-              <w:right w:val="single" w:sz="4" w:space="0" w:color="1A365D"/>
-            </w:tcBorders>
-          </w:tcPr>
-          <w:p>
-            <w:pPr>
-              <w:spacing w:before="40" w:after="40" w:lineRule="auto" w:line="240"/>
-              <w:jc w:val="center"/>
-            </w:pPr>
-            <w:r/>
-            <w:r>
-              <w:rPr>
-                <w:rFonts w:ascii="Calibri" w:hAnsi="Calibri" w:eastAsia="Calibri"/>
-                <w:b/>
-                <w:i w:val="0"/>
-                <w:color w:val="FFFFFF"/>
-                <w:sz w:val="18"/>
-              </w:rPr>
-              <w:t>Pots / Cycle</w:t>
-            </w:r>
-          </w:p>
-        </w:tc>
-        <w:tc>
-          <w:tcPr>
-            <w:tcW w:type="dxa" w:w="1440"/>
-            <w:shd w:fill="1A365D" w:val="clear"/>
-            <w:tcBorders>
-              <w:top w:val="single" w:sz="4" w:space="0" w:color="1A365D"/>
-              <w:left w:val="single" w:sz="4" w:space="0" w:color="1A365D"/>
-              <w:bottom w:val="single" w:sz="4" w:space="0" w:color="1A365D"/>
-              <w:right w:val="single" w:sz="4" w:space="0" w:color="1A365D"/>
-            </w:tcBorders>
-          </w:tcPr>
-          <w:p>
-            <w:pPr>
-              <w:spacing w:before="40" w:after="40" w:lineRule="auto" w:line="240"/>
-              <w:jc w:val="center"/>
-            </w:pPr>
-            <w:r/>
-            <w:r>
-              <w:rPr>
-                <w:rFonts w:ascii="Calibri" w:hAnsi="Calibri" w:eastAsia="Calibri"/>
-                <w:b/>
-                <w:i w:val="0"/>
-                <w:color w:val="FFFFFF"/>
-                <w:sz w:val="18"/>
-              </w:rPr>
-              <w:t>Min. Part. / Pot</w:t>
-            </w:r>
-          </w:p>
-        </w:tc>
-        <w:tc>
-          <w:tcPr>
-            <w:tcW w:type="dxa" w:w="1440"/>
-            <w:shd w:fill="1A365D" w:val="clear"/>
-            <w:tcBorders>
-              <w:top w:val="single" w:sz="4" w:space="0" w:color="1A365D"/>
-              <w:left w:val="single" w:sz="4" w:space="0" w:color="1A365D"/>
-              <w:bottom w:val="single" w:sz="4" w:space="0" w:color="1A365D"/>
-              <w:right w:val="single" w:sz="4" w:space="0" w:color="1A365D"/>
-            </w:tcBorders>
-          </w:tcPr>
-          <w:p>
-            <w:pPr>
-              <w:spacing w:before="40" w:after="40" w:lineRule="auto" w:line="240"/>
-              <w:jc w:val="center"/>
-            </w:pPr>
-            <w:r/>
-            <w:r>
-              <w:rPr>
-                <w:rFonts w:ascii="Calibri" w:hAnsi="Calibri" w:eastAsia="Calibri"/>
-                <w:b/>
-                <w:i w:val="0"/>
-                <w:color w:val="FFFFFF"/>
-                <w:sz w:val="18"/>
-              </w:rPr>
-              <w:t>Boost / Pot</w:t>
-            </w:r>
-          </w:p>
-        </w:tc>
-        <w:tc>
-          <w:tcPr>
-            <w:tcW w:type="dxa" w:w="2160"/>
-            <w:shd w:fill="1A365D" w:val="clear"/>
-            <w:tcBorders>
-              <w:top w:val="single" w:sz="4" w:space="0" w:color="1A365D"/>
-              <w:left w:val="single" w:sz="4" w:space="0" w:color="1A365D"/>
-              <w:bottom w:val="single" w:sz="4" w:space="0" w:color="1A365D"/>
-              <w:right w:val="single" w:sz="4" w:space="0" w:color="1A365D"/>
-            </w:tcBorders>
-          </w:tcPr>
-          <w:p>
-            <w:pPr>
-              <w:spacing w:before="40" w:after="40" w:lineRule="auto" w:line="240"/>
-              <w:jc w:val="center"/>
-            </w:pPr>
-            <w:r/>
-            <w:r>
-              <w:rPr>
-                <w:rFonts w:ascii="Calibri" w:hAnsi="Calibri" w:eastAsia="Calibri"/>
-                <w:b/>
-                <w:i w:val="0"/>
-                <w:color w:val="FFFFFF"/>
-                <w:sz w:val="18"/>
-              </w:rPr>
-              <w:t>Tier Capital (reusable)</w:t>
-            </w:r>
-          </w:p>
-        </w:tc>
-        <w:tc>
-          <w:tcPr>
-            <w:tcW w:type="dxa" w:w="1728"/>
-            <w:shd w:fill="1A365D" w:val="clear"/>
-            <w:tcBorders>
-              <w:top w:val="single" w:sz="4" w:space="0" w:color="1A365D"/>
-              <w:left w:val="single" w:sz="4" w:space="0" w:color="1A365D"/>
-              <w:bottom w:val="single" w:sz="4" w:space="0" w:color="1A365D"/>
-              <w:right w:val="single" w:sz="4" w:space="0" w:color="1A365D"/>
-            </w:tcBorders>
-          </w:tcPr>
-          <w:p>
-            <w:pPr>
-              <w:spacing w:before="40" w:after="40" w:lineRule="auto" w:line="240"/>
-              <w:jc w:val="center"/>
-            </w:pPr>
-            <w:r/>
-            <w:r>
-              <w:rPr>
-                <w:rFonts w:ascii="Calibri" w:hAnsi="Calibri" w:eastAsia="Calibri"/>
-                <w:b/>
-                <w:i w:val="0"/>
-                <w:color w:val="FFFFFF"/>
-                <w:sz w:val="18"/>
-              </w:rPr>
-              <w:t>Program Pots (×10)</w:t>
+              <w:t>Tier Capital</w:t>
             </w:r>
           </w:p>
         </w:tc>
@@ -2956,7 +2986,7 @@
       <w:tr>
         <w:tc>
           <w:tcPr>
-            <w:tcW w:type="dxa" w:w="864"/>
+            <w:tcW w:type="dxa" w:w="792"/>
             <w:tcBorders>
               <w:top w:val="single" w:sz="4" w:space="0" w:color="CBD5E1"/>
               <w:left w:val="single" w:sz="4" w:space="0" w:color="CBD5E1"/>
@@ -2976,9 +3006,177 @@
                 <w:b w:val="0"/>
                 <w:i w:val="0"/>
                 <w:color w:val="1F2937"/>
-                <w:sz w:val="18"/>
+                <w:sz w:val="16"/>
               </w:rPr>
               <w:t>A</w:t>
+            </w:r>
+          </w:p>
+        </w:tc>
+        <w:tc>
+          <w:tcPr>
+            <w:tcW w:type="dxa" w:w="1296"/>
+            <w:tcBorders>
+              <w:top w:val="single" w:sz="4" w:space="0" w:color="CBD5E1"/>
+              <w:left w:val="single" w:sz="4" w:space="0" w:color="CBD5E1"/>
+              <w:bottom w:val="single" w:sz="4" w:space="0" w:color="CBD5E1"/>
+              <w:right w:val="single" w:sz="4" w:space="0" w:color="CBD5E1"/>
+            </w:tcBorders>
+          </w:tcPr>
+          <w:p>
+            <w:pPr>
+              <w:spacing w:before="40" w:after="40" w:lineRule="auto" w:line="240"/>
+              <w:jc w:val="left"/>
+            </w:pPr>
+            <w:r/>
+            <w:r>
+              <w:rPr>
+                <w:rFonts w:ascii="Calibri" w:hAnsi="Calibri" w:eastAsia="Calibri"/>
+                <w:b w:val="0"/>
+                <w:i w:val="0"/>
+                <w:color w:val="1F2937"/>
+                <w:sz w:val="16"/>
+              </w:rPr>
+              <w:t>JackPot</w:t>
+            </w:r>
+          </w:p>
+        </w:tc>
+        <w:tc>
+          <w:tcPr>
+            <w:tcW w:type="dxa" w:w="1224"/>
+            <w:tcBorders>
+              <w:top w:val="single" w:sz="4" w:space="0" w:color="CBD5E1"/>
+              <w:left w:val="single" w:sz="4" w:space="0" w:color="CBD5E1"/>
+              <w:bottom w:val="single" w:sz="4" w:space="0" w:color="CBD5E1"/>
+              <w:right w:val="single" w:sz="4" w:space="0" w:color="CBD5E1"/>
+            </w:tcBorders>
+          </w:tcPr>
+          <w:p>
+            <w:pPr>
+              <w:spacing w:before="40" w:after="40" w:lineRule="auto" w:line="240"/>
+              <w:jc w:val="left"/>
+            </w:pPr>
+            <w:r/>
+            <w:r>
+              <w:rPr>
+                <w:rFonts w:ascii="Calibri" w:hAnsi="Calibri" w:eastAsia="Calibri"/>
+                <w:b w:val="0"/>
+                <w:i w:val="0"/>
+                <w:color w:val="1F2937"/>
+                <w:sz w:val="16"/>
+              </w:rPr>
+              <w:t>10</w:t>
+            </w:r>
+          </w:p>
+        </w:tc>
+        <w:tc>
+          <w:tcPr>
+            <w:tcW w:type="dxa" w:w="1080"/>
+            <w:tcBorders>
+              <w:top w:val="single" w:sz="4" w:space="0" w:color="CBD5E1"/>
+              <w:left w:val="single" w:sz="4" w:space="0" w:color="CBD5E1"/>
+              <w:bottom w:val="single" w:sz="4" w:space="0" w:color="CBD5E1"/>
+              <w:right w:val="single" w:sz="4" w:space="0" w:color="CBD5E1"/>
+            </w:tcBorders>
+          </w:tcPr>
+          <w:p>
+            <w:pPr>
+              <w:spacing w:before="40" w:after="40" w:lineRule="auto" w:line="240"/>
+              <w:jc w:val="left"/>
+            </w:pPr>
+            <w:r/>
+            <w:r>
+              <w:rPr>
+                <w:rFonts w:ascii="Calibri" w:hAnsi="Calibri" w:eastAsia="Calibri"/>
+                <w:b w:val="0"/>
+                <w:i w:val="0"/>
+                <w:color w:val="1F2937"/>
+                <w:sz w:val="16"/>
+              </w:rPr>
+              <w:t>25 STX</w:t>
+            </w:r>
+          </w:p>
+        </w:tc>
+        <w:tc>
+          <w:tcPr>
+            <w:tcW w:type="dxa" w:w="1368"/>
+            <w:tcBorders>
+              <w:top w:val="single" w:sz="4" w:space="0" w:color="CBD5E1"/>
+              <w:left w:val="single" w:sz="4" w:space="0" w:color="CBD5E1"/>
+              <w:bottom w:val="single" w:sz="4" w:space="0" w:color="CBD5E1"/>
+              <w:right w:val="single" w:sz="4" w:space="0" w:color="CBD5E1"/>
+            </w:tcBorders>
+          </w:tcPr>
+          <w:p>
+            <w:pPr>
+              <w:spacing w:before="40" w:after="40" w:lineRule="auto" w:line="240"/>
+              <w:jc w:val="left"/>
+            </w:pPr>
+            <w:r/>
+            <w:r>
+              <w:rPr>
+                <w:rFonts w:ascii="Calibri" w:hAnsi="Calibri" w:eastAsia="Calibri"/>
+                <w:b w:val="0"/>
+                <w:i w:val="0"/>
+                <w:color w:val="1F2937"/>
+                <w:sz w:val="16"/>
+              </w:rPr>
+              <w:t>25</w:t>
+            </w:r>
+          </w:p>
+        </w:tc>
+        <w:tc>
+          <w:tcPr>
+            <w:tcW w:type="dxa" w:w="1224"/>
+            <w:tcBorders>
+              <w:top w:val="single" w:sz="4" w:space="0" w:color="CBD5E1"/>
+              <w:left w:val="single" w:sz="4" w:space="0" w:color="CBD5E1"/>
+              <w:bottom w:val="single" w:sz="4" w:space="0" w:color="CBD5E1"/>
+              <w:right w:val="single" w:sz="4" w:space="0" w:color="CBD5E1"/>
+            </w:tcBorders>
+          </w:tcPr>
+          <w:p>
+            <w:pPr>
+              <w:spacing w:before="40" w:after="40" w:lineRule="auto" w:line="240"/>
+              <w:jc w:val="left"/>
+            </w:pPr>
+            <w:r/>
+            <w:r>
+              <w:rPr>
+                <w:rFonts w:ascii="Calibri" w:hAnsi="Calibri" w:eastAsia="Calibri"/>
+                <w:b w:val="0"/>
+                <w:i w:val="0"/>
+                <w:color w:val="1F2937"/>
+                <w:sz w:val="16"/>
+              </w:rPr>
+              <w:t>625 STX</w:t>
+            </w:r>
+          </w:p>
+        </w:tc>
+        <w:tc>
+          <w:tcPr>
+            <w:tcW w:type="dxa" w:w="1368"/>
+            <w:tcBorders>
+              <w:top w:val="single" w:sz="4" w:space="0" w:color="CBD5E1"/>
+              <w:left w:val="single" w:sz="4" w:space="0" w:color="CBD5E1"/>
+              <w:bottom w:val="single" w:sz="4" w:space="0" w:color="CBD5E1"/>
+              <w:right w:val="single" w:sz="4" w:space="0" w:color="CBD5E1"/>
+            </w:tcBorders>
+          </w:tcPr>
+          <w:p>
+            <w:pPr>
+              <w:spacing w:before="40" w:after="40" w:lineRule="auto" w:line="240"/>
+              <w:jc w:val="left"/>
+            </w:pPr>
+            <w:r/>
+            <w:r>
+              <w:rPr>
+                <w:rFonts w:ascii="Calibri" w:hAnsi="Calibri" w:eastAsia="Calibri"/>
+                <w:b w:val="0"/>
+                <w:i w:val="0"/>
+                <w:color w:val="1F2937"/>
+                <w:sz w:val="16"/>
+              </w:rPr>
+              <w:t>10,000 STX</w:t>
             </w:r>
           </w:p>
         </w:tc>
@@ -3004,149 +3202,9 @@
                 <w:b w:val="0"/>
                 <w:i w:val="0"/>
                 <w:color w:val="1F2937"/>
-                <w:sz w:val="18"/>
-              </w:rPr>
-              <w:t>JackPot</w:t>
-            </w:r>
-          </w:p>
-        </w:tc>
-        <w:tc>
-          <w:tcPr>
-            <w:tcW w:type="dxa" w:w="1296"/>
-            <w:tcBorders>
-              <w:top w:val="single" w:sz="4" w:space="0" w:color="CBD5E1"/>
-              <w:left w:val="single" w:sz="4" w:space="0" w:color="CBD5E1"/>
-              <w:bottom w:val="single" w:sz="4" w:space="0" w:color="CBD5E1"/>
-              <w:right w:val="single" w:sz="4" w:space="0" w:color="CBD5E1"/>
-            </w:tcBorders>
-          </w:tcPr>
-          <w:p>
-            <w:pPr>
-              <w:spacing w:before="40" w:after="40" w:lineRule="auto" w:line="240"/>
-              <w:jc w:val="left"/>
-            </w:pPr>
-            <w:r/>
-            <w:r>
-              <w:rPr>
-                <w:rFonts w:ascii="Calibri" w:hAnsi="Calibri" w:eastAsia="Calibri"/>
-                <w:b w:val="0"/>
-                <w:i w:val="0"/>
-                <w:color w:val="1F2937"/>
-                <w:sz w:val="18"/>
-              </w:rPr>
-              <w:t>10</w:t>
-            </w:r>
-          </w:p>
-        </w:tc>
-        <w:tc>
-          <w:tcPr>
-            <w:tcW w:type="dxa" w:w="1440"/>
-            <w:tcBorders>
-              <w:top w:val="single" w:sz="4" w:space="0" w:color="CBD5E1"/>
-              <w:left w:val="single" w:sz="4" w:space="0" w:color="CBD5E1"/>
-              <w:bottom w:val="single" w:sz="4" w:space="0" w:color="CBD5E1"/>
-              <w:right w:val="single" w:sz="4" w:space="0" w:color="CBD5E1"/>
-            </w:tcBorders>
-          </w:tcPr>
-          <w:p>
-            <w:pPr>
-              <w:spacing w:before="40" w:after="40" w:lineRule="auto" w:line="240"/>
-              <w:jc w:val="left"/>
-            </w:pPr>
-            <w:r/>
-            <w:r>
-              <w:rPr>
-                <w:rFonts w:ascii="Calibri" w:hAnsi="Calibri" w:eastAsia="Calibri"/>
-                <w:b w:val="0"/>
-                <w:i w:val="0"/>
-                <w:color w:val="1F2937"/>
-                <w:sz w:val="18"/>
-              </w:rPr>
-              <w:t>25</w:t>
-            </w:r>
-          </w:p>
-        </w:tc>
-        <w:tc>
-          <w:tcPr>
-            <w:tcW w:type="dxa" w:w="1440"/>
-            <w:tcBorders>
-              <w:top w:val="single" w:sz="4" w:space="0" w:color="CBD5E1"/>
-              <w:left w:val="single" w:sz="4" w:space="0" w:color="CBD5E1"/>
-              <w:bottom w:val="single" w:sz="4" w:space="0" w:color="CBD5E1"/>
-              <w:right w:val="single" w:sz="4" w:space="0" w:color="CBD5E1"/>
-            </w:tcBorders>
-          </w:tcPr>
-          <w:p>
-            <w:pPr>
-              <w:spacing w:before="40" w:after="40" w:lineRule="auto" w:line="240"/>
-              <w:jc w:val="left"/>
-            </w:pPr>
-            <w:r/>
-            <w:r>
-              <w:rPr>
-                <w:rFonts w:ascii="Calibri" w:hAnsi="Calibri" w:eastAsia="Calibri"/>
-                <w:b w:val="0"/>
-                <w:i w:val="0"/>
-                <w:color w:val="1F2937"/>
-                <w:sz w:val="18"/>
-              </w:rPr>
-              <w:t>10,000 STX</w:t>
-            </w:r>
-          </w:p>
-        </w:tc>
-        <w:tc>
-          <w:tcPr>
-            <w:tcW w:type="dxa" w:w="2160"/>
-            <w:tcBorders>
-              <w:top w:val="single" w:sz="4" w:space="0" w:color="CBD5E1"/>
-              <w:left w:val="single" w:sz="4" w:space="0" w:color="CBD5E1"/>
-              <w:bottom w:val="single" w:sz="4" w:space="0" w:color="CBD5E1"/>
-              <w:right w:val="single" w:sz="4" w:space="0" w:color="CBD5E1"/>
-            </w:tcBorders>
-          </w:tcPr>
-          <w:p>
-            <w:pPr>
-              <w:spacing w:before="40" w:after="40" w:lineRule="auto" w:line="240"/>
-              <w:jc w:val="left"/>
-            </w:pPr>
-            <w:r/>
-            <w:r>
-              <w:rPr>
-                <w:rFonts w:ascii="Calibri" w:hAnsi="Calibri" w:eastAsia="Calibri"/>
-                <w:b w:val="0"/>
-                <w:i w:val="0"/>
-                <w:color w:val="1F2937"/>
-                <w:sz w:val="18"/>
+                <w:sz w:val="16"/>
               </w:rPr>
               <w:t>100,000 STX</w:t>
-            </w:r>
-          </w:p>
-        </w:tc>
-        <w:tc>
-          <w:tcPr>
-            <w:tcW w:type="dxa" w:w="1728"/>
-            <w:tcBorders>
-              <w:top w:val="single" w:sz="4" w:space="0" w:color="CBD5E1"/>
-              <w:left w:val="single" w:sz="4" w:space="0" w:color="CBD5E1"/>
-              <w:bottom w:val="single" w:sz="4" w:space="0" w:color="CBD5E1"/>
-              <w:right w:val="single" w:sz="4" w:space="0" w:color="CBD5E1"/>
-            </w:tcBorders>
-          </w:tcPr>
-          <w:p>
-            <w:pPr>
-              <w:spacing w:before="40" w:after="40" w:lineRule="auto" w:line="240"/>
-              <w:jc w:val="left"/>
-            </w:pPr>
-            <w:r/>
-            <w:r>
-              <w:rPr>
-                <w:rFonts w:ascii="Calibri" w:hAnsi="Calibri" w:eastAsia="Calibri"/>
-                <w:b w:val="0"/>
-                <w:i w:val="0"/>
-                <w:color w:val="1F2937"/>
-                <w:sz w:val="18"/>
-              </w:rPr>
-              <w:t>100</w:t>
             </w:r>
           </w:p>
         </w:tc>
@@ -3154,7 +3212,7 @@
       <w:tr>
         <w:tc>
           <w:tcPr>
-            <w:tcW w:type="dxa" w:w="864"/>
+            <w:tcW w:type="dxa" w:w="792"/>
             <w:shd w:fill="F7FAFC" w:val="clear"/>
             <w:tcBorders>
               <w:top w:val="single" w:sz="4" w:space="0" w:color="CBD5E1"/>
@@ -3175,9 +3233,183 @@
                 <w:b w:val="0"/>
                 <w:i w:val="0"/>
                 <w:color w:val="1F2937"/>
-                <w:sz w:val="18"/>
+                <w:sz w:val="16"/>
               </w:rPr>
               <w:t>B</w:t>
+            </w:r>
+          </w:p>
+        </w:tc>
+        <w:tc>
+          <w:tcPr>
+            <w:tcW w:type="dxa" w:w="1296"/>
+            <w:shd w:fill="F7FAFC" w:val="clear"/>
+            <w:tcBorders>
+              <w:top w:val="single" w:sz="4" w:space="0" w:color="CBD5E1"/>
+              <w:left w:val="single" w:sz="4" w:space="0" w:color="CBD5E1"/>
+              <w:bottom w:val="single" w:sz="4" w:space="0" w:color="CBD5E1"/>
+              <w:right w:val="single" w:sz="4" w:space="0" w:color="CBD5E1"/>
+            </w:tcBorders>
+          </w:tcPr>
+          <w:p>
+            <w:pPr>
+              <w:spacing w:before="40" w:after="40" w:lineRule="auto" w:line="240"/>
+              <w:jc w:val="left"/>
+            </w:pPr>
+            <w:r/>
+            <w:r>
+              <w:rPr>
+                <w:rFonts w:ascii="Calibri" w:hAnsi="Calibri" w:eastAsia="Calibri"/>
+                <w:b w:val="0"/>
+                <w:i w:val="0"/>
+                <w:color w:val="1F2937"/>
+                <w:sz w:val="16"/>
+              </w:rPr>
+              <w:t>JackPot</w:t>
+            </w:r>
+          </w:p>
+        </w:tc>
+        <w:tc>
+          <w:tcPr>
+            <w:tcW w:type="dxa" w:w="1224"/>
+            <w:shd w:fill="F7FAFC" w:val="clear"/>
+            <w:tcBorders>
+              <w:top w:val="single" w:sz="4" w:space="0" w:color="CBD5E1"/>
+              <w:left w:val="single" w:sz="4" w:space="0" w:color="CBD5E1"/>
+              <w:bottom w:val="single" w:sz="4" w:space="0" w:color="CBD5E1"/>
+              <w:right w:val="single" w:sz="4" w:space="0" w:color="CBD5E1"/>
+            </w:tcBorders>
+          </w:tcPr>
+          <w:p>
+            <w:pPr>
+              <w:spacing w:before="40" w:after="40" w:lineRule="auto" w:line="240"/>
+              <w:jc w:val="left"/>
+            </w:pPr>
+            <w:r/>
+            <w:r>
+              <w:rPr>
+                <w:rFonts w:ascii="Calibri" w:hAnsi="Calibri" w:eastAsia="Calibri"/>
+                <w:b w:val="0"/>
+                <w:i w:val="0"/>
+                <w:color w:val="1F2937"/>
+                <w:sz w:val="16"/>
+              </w:rPr>
+              <w:t>12</w:t>
+            </w:r>
+          </w:p>
+        </w:tc>
+        <w:tc>
+          <w:tcPr>
+            <w:tcW w:type="dxa" w:w="1080"/>
+            <w:shd w:fill="F7FAFC" w:val="clear"/>
+            <w:tcBorders>
+              <w:top w:val="single" w:sz="4" w:space="0" w:color="CBD5E1"/>
+              <w:left w:val="single" w:sz="4" w:space="0" w:color="CBD5E1"/>
+              <w:bottom w:val="single" w:sz="4" w:space="0" w:color="CBD5E1"/>
+              <w:right w:val="single" w:sz="4" w:space="0" w:color="CBD5E1"/>
+            </w:tcBorders>
+          </w:tcPr>
+          <w:p>
+            <w:pPr>
+              <w:spacing w:before="40" w:after="40" w:lineRule="auto" w:line="240"/>
+              <w:jc w:val="left"/>
+            </w:pPr>
+            <w:r/>
+            <w:r>
+              <w:rPr>
+                <w:rFonts w:ascii="Calibri" w:hAnsi="Calibri" w:eastAsia="Calibri"/>
+                <w:b w:val="0"/>
+                <w:i w:val="0"/>
+                <w:color w:val="1F2937"/>
+                <w:sz w:val="16"/>
+              </w:rPr>
+              <w:t>50 STX</w:t>
+            </w:r>
+          </w:p>
+        </w:tc>
+        <w:tc>
+          <w:tcPr>
+            <w:tcW w:type="dxa" w:w="1368"/>
+            <w:shd w:fill="F7FAFC" w:val="clear"/>
+            <w:tcBorders>
+              <w:top w:val="single" w:sz="4" w:space="0" w:color="CBD5E1"/>
+              <w:left w:val="single" w:sz="4" w:space="0" w:color="CBD5E1"/>
+              <w:bottom w:val="single" w:sz="4" w:space="0" w:color="CBD5E1"/>
+              <w:right w:val="single" w:sz="4" w:space="0" w:color="CBD5E1"/>
+            </w:tcBorders>
+          </w:tcPr>
+          <w:p>
+            <w:pPr>
+              <w:spacing w:before="40" w:after="40" w:lineRule="auto" w:line="240"/>
+              <w:jc w:val="left"/>
+            </w:pPr>
+            <w:r/>
+            <w:r>
+              <w:rPr>
+                <w:rFonts w:ascii="Calibri" w:hAnsi="Calibri" w:eastAsia="Calibri"/>
+                <w:b w:val="0"/>
+                <w:i w:val="0"/>
+                <w:color w:val="1F2937"/>
+                <w:sz w:val="16"/>
+              </w:rPr>
+              <w:t>50</w:t>
+            </w:r>
+          </w:p>
+        </w:tc>
+        <w:tc>
+          <w:tcPr>
+            <w:tcW w:type="dxa" w:w="1224"/>
+            <w:shd w:fill="F7FAFC" w:val="clear"/>
+            <w:tcBorders>
+              <w:top w:val="single" w:sz="4" w:space="0" w:color="CBD5E1"/>
+              <w:left w:val="single" w:sz="4" w:space="0" w:color="CBD5E1"/>
+              <w:bottom w:val="single" w:sz="4" w:space="0" w:color="CBD5E1"/>
+              <w:right w:val="single" w:sz="4" w:space="0" w:color="CBD5E1"/>
+            </w:tcBorders>
+          </w:tcPr>
+          <w:p>
+            <w:pPr>
+              <w:spacing w:before="40" w:after="40" w:lineRule="auto" w:line="240"/>
+              <w:jc w:val="left"/>
+            </w:pPr>
+            <w:r/>
+            <w:r>
+              <w:rPr>
+                <w:rFonts w:ascii="Calibri" w:hAnsi="Calibri" w:eastAsia="Calibri"/>
+                <w:b w:val="0"/>
+                <w:i w:val="0"/>
+                <w:color w:val="1F2937"/>
+                <w:sz w:val="16"/>
+              </w:rPr>
+              <w:t>2,500 STX</w:t>
+            </w:r>
+          </w:p>
+        </w:tc>
+        <w:tc>
+          <w:tcPr>
+            <w:tcW w:type="dxa" w:w="1368"/>
+            <w:shd w:fill="F7FAFC" w:val="clear"/>
+            <w:tcBorders>
+              <w:top w:val="single" w:sz="4" w:space="0" w:color="CBD5E1"/>
+              <w:left w:val="single" w:sz="4" w:space="0" w:color="CBD5E1"/>
+              <w:bottom w:val="single" w:sz="4" w:space="0" w:color="CBD5E1"/>
+              <w:right w:val="single" w:sz="4" w:space="0" w:color="CBD5E1"/>
+            </w:tcBorders>
+          </w:tcPr>
+          <w:p>
+            <w:pPr>
+              <w:spacing w:before="40" w:after="40" w:lineRule="auto" w:line="240"/>
+              <w:jc w:val="left"/>
+            </w:pPr>
+            <w:r/>
+            <w:r>
+              <w:rPr>
+                <w:rFonts w:ascii="Calibri" w:hAnsi="Calibri" w:eastAsia="Calibri"/>
+                <w:b w:val="0"/>
+                <w:i w:val="0"/>
+                <w:color w:val="1F2937"/>
+                <w:sz w:val="16"/>
+              </w:rPr>
+              <w:t>25,000 STX</w:t>
             </w:r>
           </w:p>
         </w:tc>
@@ -3204,16 +3436,45 @@
                 <w:b w:val="0"/>
                 <w:i w:val="0"/>
                 <w:color w:val="1F2937"/>
-                <w:sz w:val="18"/>
+                <w:sz w:val="16"/>
               </w:rPr>
-              <w:t>JackPot</w:t>
+              <w:t>300,000 STX</w:t>
+            </w:r>
+          </w:p>
+        </w:tc>
+      </w:tr>
+      <w:tr>
+        <w:tc>
+          <w:tcPr>
+            <w:tcW w:type="dxa" w:w="792"/>
+            <w:tcBorders>
+              <w:top w:val="single" w:sz="4" w:space="0" w:color="CBD5E1"/>
+              <w:left w:val="single" w:sz="4" w:space="0" w:color="CBD5E1"/>
+              <w:bottom w:val="single" w:sz="4" w:space="0" w:color="CBD5E1"/>
+              <w:right w:val="single" w:sz="4" w:space="0" w:color="CBD5E1"/>
+            </w:tcBorders>
+          </w:tcPr>
+          <w:p>
+            <w:pPr>
+              <w:spacing w:before="40" w:after="40" w:lineRule="auto" w:line="240"/>
+              <w:jc w:val="center"/>
+            </w:pPr>
+            <w:r/>
+            <w:r>
+              <w:rPr>
+                <w:rFonts w:ascii="Calibri" w:hAnsi="Calibri" w:eastAsia="Calibri"/>
+                <w:b w:val="0"/>
+                <w:i w:val="0"/>
+                <w:color w:val="1F2937"/>
+                <w:sz w:val="16"/>
+              </w:rPr>
+              <w:t>C</w:t>
             </w:r>
           </w:p>
         </w:tc>
         <w:tc>
           <w:tcPr>
             <w:tcW w:type="dxa" w:w="1296"/>
-            <w:shd w:fill="F7FAFC" w:val="clear"/>
             <w:tcBorders>
               <w:top w:val="single" w:sz="4" w:space="0" w:color="CBD5E1"/>
               <w:left w:val="single" w:sz="4" w:space="0" w:color="CBD5E1"/>
@@ -3233,16 +3494,15 @@
                 <w:b w:val="0"/>
                 <w:i w:val="0"/>
                 <w:color w:val="1F2937"/>
-                <w:sz w:val="18"/>
+                <w:sz w:val="16"/>
               </w:rPr>
-              <w:t>12</w:t>
+              <w:t>Sequential</w:t>
             </w:r>
           </w:p>
         </w:tc>
         <w:tc>
           <w:tcPr>
-            <w:tcW w:type="dxa" w:w="1440"/>
-            <w:shd w:fill="F7FAFC" w:val="clear"/>
+            <w:tcW w:type="dxa" w:w="1224"/>
             <w:tcBorders>
               <w:top w:val="single" w:sz="4" w:space="0" w:color="CBD5E1"/>
               <w:left w:val="single" w:sz="4" w:space="0" w:color="CBD5E1"/>
@@ -3262,16 +3522,15 @@
                 <w:b w:val="0"/>
                 <w:i w:val="0"/>
                 <w:color w:val="1F2937"/>
-                <w:sz w:val="18"/>
+                <w:sz w:val="16"/>
               </w:rPr>
-              <w:t>50</w:t>
+              <w:t>1</w:t>
             </w:r>
           </w:p>
         </w:tc>
         <w:tc>
           <w:tcPr>
-            <w:tcW w:type="dxa" w:w="1440"/>
-            <w:shd w:fill="F7FAFC" w:val="clear"/>
+            <w:tcW w:type="dxa" w:w="1080"/>
             <w:tcBorders>
               <w:top w:val="single" w:sz="4" w:space="0" w:color="CBD5E1"/>
               <w:left w:val="single" w:sz="4" w:space="0" w:color="CBD5E1"/>
@@ -3291,16 +3550,15 @@
                 <w:b w:val="0"/>
                 <w:i w:val="0"/>
                 <w:color w:val="1F2937"/>
-                <w:sz w:val="18"/>
+                <w:sz w:val="16"/>
               </w:rPr>
-              <w:t>25,000 STX</w:t>
+              <w:t>350 STX</w:t>
             </w:r>
           </w:p>
         </w:tc>
         <w:tc>
           <w:tcPr>
-            <w:tcW w:type="dxa" w:w="2160"/>
-            <w:shd w:fill="F7FAFC" w:val="clear"/>
+            <w:tcW w:type="dxa" w:w="1368"/>
             <w:tcBorders>
               <w:top w:val="single" w:sz="4" w:space="0" w:color="CBD5E1"/>
               <w:left w:val="single" w:sz="4" w:space="0" w:color="CBD5E1"/>
@@ -3320,16 +3578,15 @@
                 <w:b w:val="0"/>
                 <w:i w:val="0"/>
                 <w:color w:val="1F2937"/>
-                <w:sz w:val="18"/>
+                <w:sz w:val="16"/>
               </w:rPr>
-              <w:t>300,000 STX</w:t>
+              <w:t>10</w:t>
             </w:r>
           </w:p>
         </w:tc>
         <w:tc>
           <w:tcPr>
-            <w:tcW w:type="dxa" w:w="1728"/>
-            <w:shd w:fill="F7FAFC" w:val="clear"/>
+            <w:tcW w:type="dxa" w:w="1224"/>
             <w:tcBorders>
               <w:top w:val="single" w:sz="4" w:space="0" w:color="CBD5E1"/>
               <w:left w:val="single" w:sz="4" w:space="0" w:color="CBD5E1"/>
@@ -3349,17 +3606,15 @@
                 <w:b w:val="0"/>
                 <w:i w:val="0"/>
                 <w:color w:val="1F2937"/>
-                <w:sz w:val="18"/>
+                <w:sz w:val="16"/>
               </w:rPr>
-              <w:t>120</w:t>
+              <w:t>3,500 STX</w:t>
             </w:r>
           </w:p>
         </w:tc>
-      </w:tr>
-      <w:tr>
         <w:tc>
           <w:tcPr>
-            <w:tcW w:type="dxa" w:w="864"/>
+            <w:tcW w:type="dxa" w:w="1368"/>
             <w:tcBorders>
               <w:top w:val="single" w:sz="4" w:space="0" w:color="CBD5E1"/>
               <w:left w:val="single" w:sz="4" w:space="0" w:color="CBD5E1"/>
@@ -3370,7 +3625,7 @@
           <w:p>
             <w:pPr>
               <w:spacing w:before="40" w:after="40" w:lineRule="auto" w:line="240"/>
-              <w:jc w:val="center"/>
+              <w:jc w:val="left"/>
             </w:pPr>
             <w:r/>
             <w:r>
@@ -3379,9 +3634,9 @@
                 <w:b w:val="0"/>
                 <w:i w:val="0"/>
                 <w:color w:val="1F2937"/>
-                <w:sz w:val="18"/>
+                <w:sz w:val="16"/>
               </w:rPr>
-              <w:t>C</w:t>
+              <w:t>100,000 STX</w:t>
             </w:r>
           </w:p>
         </w:tc>
@@ -3407,149 +3662,9 @@
                 <w:b w:val="0"/>
                 <w:i w:val="0"/>
                 <w:color w:val="1F2937"/>
-                <w:sz w:val="18"/>
-              </w:rPr>
-              <w:t>Sequential</w:t>
-            </w:r>
-          </w:p>
-        </w:tc>
-        <w:tc>
-          <w:tcPr>
-            <w:tcW w:type="dxa" w:w="1296"/>
-            <w:tcBorders>
-              <w:top w:val="single" w:sz="4" w:space="0" w:color="CBD5E1"/>
-              <w:left w:val="single" w:sz="4" w:space="0" w:color="CBD5E1"/>
-              <w:bottom w:val="single" w:sz="4" w:space="0" w:color="CBD5E1"/>
-              <w:right w:val="single" w:sz="4" w:space="0" w:color="CBD5E1"/>
-            </w:tcBorders>
-          </w:tcPr>
-          <w:p>
-            <w:pPr>
-              <w:spacing w:before="40" w:after="40" w:lineRule="auto" w:line="240"/>
-              <w:jc w:val="left"/>
-            </w:pPr>
-            <w:r/>
-            <w:r>
-              <w:rPr>
-                <w:rFonts w:ascii="Calibri" w:hAnsi="Calibri" w:eastAsia="Calibri"/>
-                <w:b w:val="0"/>
-                <w:i w:val="0"/>
-                <w:color w:val="1F2937"/>
-                <w:sz w:val="18"/>
-              </w:rPr>
-              <w:t>1</w:t>
-            </w:r>
-          </w:p>
-        </w:tc>
-        <w:tc>
-          <w:tcPr>
-            <w:tcW w:type="dxa" w:w="1440"/>
-            <w:tcBorders>
-              <w:top w:val="single" w:sz="4" w:space="0" w:color="CBD5E1"/>
-              <w:left w:val="single" w:sz="4" w:space="0" w:color="CBD5E1"/>
-              <w:bottom w:val="single" w:sz="4" w:space="0" w:color="CBD5E1"/>
-              <w:right w:val="single" w:sz="4" w:space="0" w:color="CBD5E1"/>
-            </w:tcBorders>
-          </w:tcPr>
-          <w:p>
-            <w:pPr>
-              <w:spacing w:before="40" w:after="40" w:lineRule="auto" w:line="240"/>
-              <w:jc w:val="left"/>
-            </w:pPr>
-            <w:r/>
-            <w:r>
-              <w:rPr>
-                <w:rFonts w:ascii="Calibri" w:hAnsi="Calibri" w:eastAsia="Calibri"/>
-                <w:b w:val="0"/>
-                <w:i w:val="0"/>
-                <w:color w:val="1F2937"/>
-                <w:sz w:val="18"/>
-              </w:rPr>
-              <w:t>10</w:t>
-            </w:r>
-          </w:p>
-        </w:tc>
-        <w:tc>
-          <w:tcPr>
-            <w:tcW w:type="dxa" w:w="1440"/>
-            <w:tcBorders>
-              <w:top w:val="single" w:sz="4" w:space="0" w:color="CBD5E1"/>
-              <w:left w:val="single" w:sz="4" w:space="0" w:color="CBD5E1"/>
-              <w:bottom w:val="single" w:sz="4" w:space="0" w:color="CBD5E1"/>
-              <w:right w:val="single" w:sz="4" w:space="0" w:color="CBD5E1"/>
-            </w:tcBorders>
-          </w:tcPr>
-          <w:p>
-            <w:pPr>
-              <w:spacing w:before="40" w:after="40" w:lineRule="auto" w:line="240"/>
-              <w:jc w:val="left"/>
-            </w:pPr>
-            <w:r/>
-            <w:r>
-              <w:rPr>
-                <w:rFonts w:ascii="Calibri" w:hAnsi="Calibri" w:eastAsia="Calibri"/>
-                <w:b w:val="0"/>
-                <w:i w:val="0"/>
-                <w:color w:val="1F2937"/>
-                <w:sz w:val="18"/>
+                <w:sz w:val="16"/>
               </w:rPr>
               <w:t>100,000 STX</w:t>
-            </w:r>
-          </w:p>
-        </w:tc>
-        <w:tc>
-          <w:tcPr>
-            <w:tcW w:type="dxa" w:w="2160"/>
-            <w:tcBorders>
-              <w:top w:val="single" w:sz="4" w:space="0" w:color="CBD5E1"/>
-              <w:left w:val="single" w:sz="4" w:space="0" w:color="CBD5E1"/>
-              <w:bottom w:val="single" w:sz="4" w:space="0" w:color="CBD5E1"/>
-              <w:right w:val="single" w:sz="4" w:space="0" w:color="CBD5E1"/>
-            </w:tcBorders>
-          </w:tcPr>
-          <w:p>
-            <w:pPr>
-              <w:spacing w:before="40" w:after="40" w:lineRule="auto" w:line="240"/>
-              <w:jc w:val="left"/>
-            </w:pPr>
-            <w:r/>
-            <w:r>
-              <w:rPr>
-                <w:rFonts w:ascii="Calibri" w:hAnsi="Calibri" w:eastAsia="Calibri"/>
-                <w:b w:val="0"/>
-                <w:i w:val="0"/>
-                <w:color w:val="1F2937"/>
-                <w:sz w:val="18"/>
-              </w:rPr>
-              <w:t>100,000 STX</w:t>
-            </w:r>
-          </w:p>
-        </w:tc>
-        <w:tc>
-          <w:tcPr>
-            <w:tcW w:type="dxa" w:w="1728"/>
-            <w:tcBorders>
-              <w:top w:val="single" w:sz="4" w:space="0" w:color="CBD5E1"/>
-              <w:left w:val="single" w:sz="4" w:space="0" w:color="CBD5E1"/>
-              <w:bottom w:val="single" w:sz="4" w:space="0" w:color="CBD5E1"/>
-              <w:right w:val="single" w:sz="4" w:space="0" w:color="CBD5E1"/>
-            </w:tcBorders>
-          </w:tcPr>
-          <w:p>
-            <w:pPr>
-              <w:spacing w:before="40" w:after="40" w:lineRule="auto" w:line="240"/>
-              <w:jc w:val="left"/>
-            </w:pPr>
-            <w:r/>
-            <w:r>
-              <w:rPr>
-                <w:rFonts w:ascii="Calibri" w:hAnsi="Calibri" w:eastAsia="Calibri"/>
-                <w:b w:val="0"/>
-                <w:i w:val="0"/>
-                <w:color w:val="1F2937"/>
-                <w:sz w:val="18"/>
-              </w:rPr>
-              <w:t>10</w:t>
             </w:r>
           </w:p>
         </w:tc>
@@ -3557,7 +3672,7 @@
       <w:tr>
         <w:tc>
           <w:tcPr>
-            <w:tcW w:type="dxa" w:w="864"/>
+            <w:tcW w:type="dxa" w:w="792"/>
             <w:shd w:fill="EEF2F7" w:val="clear"/>
             <w:tcBorders>
               <w:top w:val="single" w:sz="4" w:space="0" w:color="CBD5E1"/>
@@ -3578,38 +3693,9 @@
                 <w:b/>
                 <w:i w:val="0"/>
                 <w:color w:val="1A365D"/>
-                <w:sz w:val="18"/>
+                <w:sz w:val="16"/>
               </w:rPr>
               <w:t>Total</w:t>
-            </w:r>
-          </w:p>
-        </w:tc>
-        <w:tc>
-          <w:tcPr>
-            <w:tcW w:type="dxa" w:w="1440"/>
-            <w:shd w:fill="EEF2F7" w:val="clear"/>
-            <w:tcBorders>
-              <w:top w:val="single" w:sz="4" w:space="0" w:color="CBD5E1"/>
-              <w:left w:val="single" w:sz="4" w:space="0" w:color="CBD5E1"/>
-              <w:bottom w:val="single" w:sz="4" w:space="0" w:color="CBD5E1"/>
-              <w:right w:val="single" w:sz="4" w:space="0" w:color="CBD5E1"/>
-            </w:tcBorders>
-          </w:tcPr>
-          <w:p>
-            <w:pPr>
-              <w:spacing w:before="40" w:after="40" w:lineRule="auto" w:line="240"/>
-              <w:jc w:val="left"/>
-            </w:pPr>
-            <w:r/>
-            <w:r>
-              <w:rPr>
-                <w:rFonts w:ascii="Calibri" w:hAnsi="Calibri" w:eastAsia="Calibri"/>
-                <w:b/>
-                <w:i w:val="0"/>
-                <w:color w:val="1A365D"/>
-                <w:sz w:val="18"/>
-              </w:rPr>
-              <w:t>—</w:t>
             </w:r>
           </w:p>
         </w:tc>
@@ -3636,15 +3722,15 @@
                 <w:b/>
                 <w:i w:val="0"/>
                 <w:color w:val="1A365D"/>
-                <w:sz w:val="18"/>
+                <w:sz w:val="16"/>
               </w:rPr>
-              <w:t>23</w:t>
+              <w:t>—</w:t>
             </w:r>
           </w:p>
         </w:tc>
         <w:tc>
           <w:tcPr>
-            <w:tcW w:type="dxa" w:w="1440"/>
+            <w:tcW w:type="dxa" w:w="1224"/>
             <w:shd w:fill="EEF2F7" w:val="clear"/>
             <w:tcBorders>
               <w:top w:val="single" w:sz="4" w:space="0" w:color="CBD5E1"/>
@@ -3665,7 +3751,123 @@
                 <w:b/>
                 <w:i w:val="0"/>
                 <w:color w:val="1A365D"/>
-                <w:sz w:val="18"/>
+                <w:sz w:val="16"/>
+              </w:rPr>
+              <w:t>23</w:t>
+            </w:r>
+          </w:p>
+        </w:tc>
+        <w:tc>
+          <w:tcPr>
+            <w:tcW w:type="dxa" w:w="1080"/>
+            <w:shd w:fill="EEF2F7" w:val="clear"/>
+            <w:tcBorders>
+              <w:top w:val="single" w:sz="4" w:space="0" w:color="CBD5E1"/>
+              <w:left w:val="single" w:sz="4" w:space="0" w:color="CBD5E1"/>
+              <w:bottom w:val="single" w:sz="4" w:space="0" w:color="CBD5E1"/>
+              <w:right w:val="single" w:sz="4" w:space="0" w:color="CBD5E1"/>
+            </w:tcBorders>
+          </w:tcPr>
+          <w:p>
+            <w:pPr>
+              <w:spacing w:before="40" w:after="40" w:lineRule="auto" w:line="240"/>
+              <w:jc w:val="left"/>
+            </w:pPr>
+            <w:r/>
+            <w:r>
+              <w:rPr>
+                <w:rFonts w:ascii="Calibri" w:hAnsi="Calibri" w:eastAsia="Calibri"/>
+                <w:b/>
+                <w:i w:val="0"/>
+                <w:color w:val="1A365D"/>
+                <w:sz w:val="16"/>
+              </w:rPr>
+              <w:t>—</w:t>
+            </w:r>
+          </w:p>
+        </w:tc>
+        <w:tc>
+          <w:tcPr>
+            <w:tcW w:type="dxa" w:w="1368"/>
+            <w:shd w:fill="EEF2F7" w:val="clear"/>
+            <w:tcBorders>
+              <w:top w:val="single" w:sz="4" w:space="0" w:color="CBD5E1"/>
+              <w:left w:val="single" w:sz="4" w:space="0" w:color="CBD5E1"/>
+              <w:bottom w:val="single" w:sz="4" w:space="0" w:color="CBD5E1"/>
+              <w:right w:val="single" w:sz="4" w:space="0" w:color="CBD5E1"/>
+            </w:tcBorders>
+          </w:tcPr>
+          <w:p>
+            <w:pPr>
+              <w:spacing w:before="40" w:after="40" w:lineRule="auto" w:line="240"/>
+              <w:jc w:val="left"/>
+            </w:pPr>
+            <w:r/>
+            <w:r>
+              <w:rPr>
+                <w:rFonts w:ascii="Calibri" w:hAnsi="Calibri" w:eastAsia="Calibri"/>
+                <w:b/>
+                <w:i w:val="0"/>
+                <w:color w:val="1A365D"/>
+                <w:sz w:val="16"/>
+              </w:rPr>
+              <w:t>—</w:t>
+            </w:r>
+          </w:p>
+        </w:tc>
+        <w:tc>
+          <w:tcPr>
+            <w:tcW w:type="dxa" w:w="1224"/>
+            <w:shd w:fill="EEF2F7" w:val="clear"/>
+            <w:tcBorders>
+              <w:top w:val="single" w:sz="4" w:space="0" w:color="CBD5E1"/>
+              <w:left w:val="single" w:sz="4" w:space="0" w:color="CBD5E1"/>
+              <w:bottom w:val="single" w:sz="4" w:space="0" w:color="CBD5E1"/>
+              <w:right w:val="single" w:sz="4" w:space="0" w:color="CBD5E1"/>
+            </w:tcBorders>
+          </w:tcPr>
+          <w:p>
+            <w:pPr>
+              <w:spacing w:before="40" w:after="40" w:lineRule="auto" w:line="240"/>
+              <w:jc w:val="left"/>
+            </w:pPr>
+            <w:r/>
+            <w:r>
+              <w:rPr>
+                <w:rFonts w:ascii="Calibri" w:hAnsi="Calibri" w:eastAsia="Calibri"/>
+                <w:b/>
+                <w:i w:val="0"/>
+                <w:color w:val="1A365D"/>
+                <w:sz w:val="16"/>
+              </w:rPr>
+              <w:t>—</w:t>
+            </w:r>
+          </w:p>
+        </w:tc>
+        <w:tc>
+          <w:tcPr>
+            <w:tcW w:type="dxa" w:w="1368"/>
+            <w:shd w:fill="EEF2F7" w:val="clear"/>
+            <w:tcBorders>
+              <w:top w:val="single" w:sz="4" w:space="0" w:color="CBD5E1"/>
+              <w:left w:val="single" w:sz="4" w:space="0" w:color="CBD5E1"/>
+              <w:bottom w:val="single" w:sz="4" w:space="0" w:color="CBD5E1"/>
+              <w:right w:val="single" w:sz="4" w:space="0" w:color="CBD5E1"/>
+            </w:tcBorders>
+          </w:tcPr>
+          <w:p>
+            <w:pPr>
+              <w:spacing w:before="40" w:after="40" w:lineRule="auto" w:line="240"/>
+              <w:jc w:val="left"/>
+            </w:pPr>
+            <w:r/>
+            <w:r>
+              <w:rPr>
+                <w:rFonts w:ascii="Calibri" w:hAnsi="Calibri" w:eastAsia="Calibri"/>
+                <w:b/>
+                <w:i w:val="0"/>
+                <w:color w:val="1A365D"/>
+                <w:sz w:val="16"/>
               </w:rPr>
               <w:t>—</w:t>
             </w:r>
@@ -3694,67 +3896,9 @@
                 <w:b/>
                 <w:i w:val="0"/>
                 <w:color w:val="1A365D"/>
-                <w:sz w:val="18"/>
-              </w:rPr>
-              <w:t>—</w:t>
-            </w:r>
-          </w:p>
-        </w:tc>
-        <w:tc>
-          <w:tcPr>
-            <w:tcW w:type="dxa" w:w="2160"/>
-            <w:shd w:fill="EEF2F7" w:val="clear"/>
-            <w:tcBorders>
-              <w:top w:val="single" w:sz="4" w:space="0" w:color="CBD5E1"/>
-              <w:left w:val="single" w:sz="4" w:space="0" w:color="CBD5E1"/>
-              <w:bottom w:val="single" w:sz="4" w:space="0" w:color="CBD5E1"/>
-              <w:right w:val="single" w:sz="4" w:space="0" w:color="CBD5E1"/>
-            </w:tcBorders>
-          </w:tcPr>
-          <w:p>
-            <w:pPr>
-              <w:spacing w:before="40" w:after="40" w:lineRule="auto" w:line="240"/>
-              <w:jc w:val="left"/>
-            </w:pPr>
-            <w:r/>
-            <w:r>
-              <w:rPr>
-                <w:rFonts w:ascii="Calibri" w:hAnsi="Calibri" w:eastAsia="Calibri"/>
-                <w:b/>
-                <w:i w:val="0"/>
-                <w:color w:val="1A365D"/>
-                <w:sz w:val="18"/>
+                <w:sz w:val="16"/>
               </w:rPr>
               <w:t>500,000 STX</w:t>
-            </w:r>
-          </w:p>
-        </w:tc>
-        <w:tc>
-          <w:tcPr>
-            <w:tcW w:type="dxa" w:w="1728"/>
-            <w:shd w:fill="EEF2F7" w:val="clear"/>
-            <w:tcBorders>
-              <w:top w:val="single" w:sz="4" w:space="0" w:color="CBD5E1"/>
-              <w:left w:val="single" w:sz="4" w:space="0" w:color="CBD5E1"/>
-              <w:bottom w:val="single" w:sz="4" w:space="0" w:color="CBD5E1"/>
-              <w:right w:val="single" w:sz="4" w:space="0" w:color="CBD5E1"/>
-            </w:tcBorders>
-          </w:tcPr>
-          <w:p>
-            <w:pPr>
-              <w:spacing w:before="40" w:after="40" w:lineRule="auto" w:line="240"/>
-              <w:jc w:val="left"/>
-            </w:pPr>
-            <w:r/>
-            <w:r>
-              <w:rPr>
-                <w:rFonts w:ascii="Calibri" w:hAnsi="Calibri" w:eastAsia="Calibri"/>
-                <w:b/>
-                <w:i w:val="0"/>
-                <w:color w:val="1A365D"/>
-                <w:sz w:val="18"/>
-              </w:rPr>
-              <w:t>230</w:t>
             </w:r>
           </w:p>
         </w:tc>
@@ -3787,7 +3931,27 @@
           <w:color w:val="4A5568"/>
           <w:sz w:val="18"/>
         </w:rPr>
-        <w:t xml:space="preserve">12 JackPot pots share 300,000 STX of boost capital per cycle → 25,000 STX awarded boost per pot. </w:t>
+        <w:t xml:space="preserve">12 JackPot pots share 300,000 STX boost capital per cycle → 25,000 STX / pot. </w:t>
+      </w:r>
+      <w:r>
+        <w:rPr>
+          <w:rFonts w:ascii="Calibri" w:hAnsi="Calibri" w:eastAsia="Calibri"/>
+          <w:b/>
+          <w:i/>
+          <w:color w:val="4A5568"/>
+          <w:sz w:val="18"/>
+        </w:rPr>
+        <w:t xml:space="preserve">Pot Target: </w:t>
+      </w:r>
+      <w:r>
+        <w:rPr>
+          <w:rFonts w:ascii="Calibri" w:hAnsi="Calibri" w:eastAsia="Calibri"/>
+          <w:b w:val="0"/>
+          <w:i/>
+          <w:color w:val="4A5568"/>
+          <w:sz w:val="18"/>
+        </w:rPr>
+        <w:t xml:space="preserve">Entry Min. × Min. Participants. </w:t>
       </w:r>
       <w:r>
         <w:rPr>
@@ -3807,7 +3971,7 @@
           <w:color w:val="4A5568"/>
           <w:sz w:val="18"/>
         </w:rPr>
-        <w:t xml:space="preserve">sponsor capital delegated to that tier each cycle (returned and reused; not multiplied across cycles). </w:t>
+        <w:t xml:space="preserve">Pot Target × Qty × 10 cycles (participant STX at min fill). </w:t>
       </w:r>
       <w:r>
         <w:rPr>
@@ -3847,7 +4011,7 @@
           <w:color w:val="4A5568"/>
           <w:sz w:val="18"/>
         </w:rPr>
-        <w:t>lifecycle (4 × pots × 10 cycles) + participant joins (1 × Total Participants).</w:t>
+        <w:t>lifecycle (4 × pots × 10) + joins. Awarded Boost / Tier Capital = reusable sponsor STX (not in Total Stacked).</w:t>
       </w:r>
     </w:p>
     <w:p>
@@ -3873,16 +4037,18 @@
         <w:tblLook w:firstColumn="1" w:firstRow="1" w:lastColumn="0" w:lastRow="0" w:noHBand="0" w:noVBand="1" w:val="04A0"/>
       </w:tblPr>
       <w:tblGrid>
-        <w:gridCol w:w="1958"/>
-        <w:gridCol w:w="1958"/>
-        <w:gridCol w:w="1958"/>
-        <w:gridCol w:w="1958"/>
-        <w:gridCol w:w="1958"/>
+        <w:gridCol w:w="1399"/>
+        <w:gridCol w:w="1399"/>
+        <w:gridCol w:w="1399"/>
+        <w:gridCol w:w="1399"/>
+        <w:gridCol w:w="1399"/>
+        <w:gridCol w:w="1399"/>
+        <w:gridCol w:w="1399"/>
       </w:tblGrid>
       <w:tr>
         <w:tc>
           <w:tcPr>
-            <w:tcW w:type="dxa" w:w="3168"/>
+            <w:tcW w:type="dxa" w:w="2592"/>
             <w:shd w:fill="1A365D" w:val="clear"/>
             <w:tcBorders>
               <w:top w:val="single" w:sz="4" w:space="0" w:color="1A365D"/>
@@ -3903,7 +4069,7 @@
                 <w:b/>
                 <w:i w:val="0"/>
                 <w:color w:val="FFFFFF"/>
-                <w:sz w:val="18"/>
+                <w:sz w:val="16"/>
               </w:rPr>
               <w:t>Tier</w:t>
             </w:r>
@@ -3911,7 +4077,7 @@
         </w:tc>
         <w:tc>
           <w:tcPr>
-            <w:tcW w:type="dxa" w:w="1584"/>
+            <w:tcW w:type="dxa" w:w="1152"/>
             <w:shd w:fill="1A365D" w:val="clear"/>
             <w:tcBorders>
               <w:top w:val="single" w:sz="4" w:space="0" w:color="1A365D"/>
@@ -3932,15 +4098,15 @@
                 <w:b/>
                 <w:i w:val="0"/>
                 <w:color w:val="FFFFFF"/>
-                <w:sz w:val="18"/>
+                <w:sz w:val="16"/>
               </w:rPr>
-              <w:t>Lifecycle Txs</w:t>
+              <w:t>Pot Target</w:t>
             </w:r>
           </w:p>
         </w:tc>
         <w:tc>
           <w:tcPr>
-            <w:tcW w:type="dxa" w:w="1584"/>
+            <w:tcW w:type="dxa" w:w="2016"/>
             <w:shd w:fill="1A365D" w:val="clear"/>
             <w:tcBorders>
               <w:top w:val="single" w:sz="4" w:space="0" w:color="1A365D"/>
@@ -3961,9 +4127,9 @@
                 <w:b/>
                 <w:i w:val="0"/>
                 <w:color w:val="FFFFFF"/>
-                <w:sz w:val="18"/>
+                <w:sz w:val="16"/>
               </w:rPr>
-              <w:t>Join Txs</w:t>
+              <w:t>Total Stacked (10 cycles)</w:t>
             </w:r>
           </w:p>
         </w:tc>
@@ -3990,15 +4156,15 @@
                 <w:b/>
                 <w:i w:val="0"/>
                 <w:color w:val="FFFFFF"/>
-                <w:sz w:val="18"/>
+                <w:sz w:val="16"/>
               </w:rPr>
-              <w:t>Total Tx</w:t>
+              <w:t>Lifecycle Txs</w:t>
             </w:r>
           </w:p>
         </w:tc>
         <w:tc>
           <w:tcPr>
-            <w:tcW w:type="dxa" w:w="2016"/>
+            <w:tcW w:type="dxa" w:w="1224"/>
             <w:shd w:fill="1A365D" w:val="clear"/>
             <w:tcBorders>
               <w:top w:val="single" w:sz="4" w:space="0" w:color="1A365D"/>
@@ -4019,7 +4185,65 @@
                 <w:b/>
                 <w:i w:val="0"/>
                 <w:color w:val="FFFFFF"/>
-                <w:sz w:val="18"/>
+                <w:sz w:val="16"/>
+              </w:rPr>
+              <w:t>Join Txs</w:t>
+            </w:r>
+          </w:p>
+        </w:tc>
+        <w:tc>
+          <w:tcPr>
+            <w:tcW w:type="dxa" w:w="1152"/>
+            <w:shd w:fill="1A365D" w:val="clear"/>
+            <w:tcBorders>
+              <w:top w:val="single" w:sz="4" w:space="0" w:color="1A365D"/>
+              <w:left w:val="single" w:sz="4" w:space="0" w:color="1A365D"/>
+              <w:bottom w:val="single" w:sz="4" w:space="0" w:color="1A365D"/>
+              <w:right w:val="single" w:sz="4" w:space="0" w:color="1A365D"/>
+            </w:tcBorders>
+          </w:tcPr>
+          <w:p>
+            <w:pPr>
+              <w:spacing w:before="40" w:after="40" w:lineRule="auto" w:line="240"/>
+              <w:jc w:val="center"/>
+            </w:pPr>
+            <w:r/>
+            <w:r>
+              <w:rPr>
+                <w:rFonts w:ascii="Calibri" w:hAnsi="Calibri" w:eastAsia="Calibri"/>
+                <w:b/>
+                <w:i w:val="0"/>
+                <w:color w:val="FFFFFF"/>
+                <w:sz w:val="16"/>
+              </w:rPr>
+              <w:t>Total Tx</w:t>
+            </w:r>
+          </w:p>
+        </w:tc>
+        <w:tc>
+          <w:tcPr>
+            <w:tcW w:type="dxa" w:w="1728"/>
+            <w:shd w:fill="1A365D" w:val="clear"/>
+            <w:tcBorders>
+              <w:top w:val="single" w:sz="4" w:space="0" w:color="1A365D"/>
+              <w:left w:val="single" w:sz="4" w:space="0" w:color="1A365D"/>
+              <w:bottom w:val="single" w:sz="4" w:space="0" w:color="1A365D"/>
+              <w:right w:val="single" w:sz="4" w:space="0" w:color="1A365D"/>
+            </w:tcBorders>
+          </w:tcPr>
+          <w:p>
+            <w:pPr>
+              <w:spacing w:before="40" w:after="40" w:lineRule="auto" w:line="240"/>
+              <w:jc w:val="center"/>
+            </w:pPr>
+            <w:r/>
+            <w:r>
+              <w:rPr>
+                <w:rFonts w:ascii="Calibri" w:hAnsi="Calibri" w:eastAsia="Calibri"/>
+                <w:b/>
+                <w:i w:val="0"/>
+                <w:color w:val="FFFFFF"/>
+                <w:sz w:val="16"/>
               </w:rPr>
               <w:t>Total Participants</w:t>
             </w:r>
@@ -4029,7 +4253,7 @@
       <w:tr>
         <w:tc>
           <w:tcPr>
-            <w:tcW w:type="dxa" w:w="3168"/>
+            <w:tcW w:type="dxa" w:w="2592"/>
             <w:tcBorders>
               <w:top w:val="single" w:sz="4" w:space="0" w:color="CBD5E1"/>
               <w:left w:val="single" w:sz="4" w:space="0" w:color="CBD5E1"/>
@@ -4049,15 +4273,15 @@
                 <w:b w:val="0"/>
                 <w:i w:val="0"/>
                 <w:color w:val="1F2937"/>
-                <w:sz w:val="18"/>
+                <w:sz w:val="16"/>
               </w:rPr>
-              <w:t>A — 10 JackPot × 25 min</w:t>
+              <w:t>A — 10 × 25 STX × 25 min</w:t>
             </w:r>
           </w:p>
         </w:tc>
         <w:tc>
           <w:tcPr>
-            <w:tcW w:type="dxa" w:w="1584"/>
+            <w:tcW w:type="dxa" w:w="1152"/>
             <w:tcBorders>
               <w:top w:val="single" w:sz="4" w:space="0" w:color="CBD5E1"/>
               <w:left w:val="single" w:sz="4" w:space="0" w:color="CBD5E1"/>
@@ -4077,15 +4301,15 @@
                 <w:b w:val="0"/>
                 <w:i w:val="0"/>
                 <w:color w:val="1F2937"/>
-                <w:sz w:val="18"/>
+                <w:sz w:val="16"/>
               </w:rPr>
-              <w:t>400</w:t>
+              <w:t>625</w:t>
             </w:r>
           </w:p>
         </w:tc>
         <w:tc>
           <w:tcPr>
-            <w:tcW w:type="dxa" w:w="1584"/>
+            <w:tcW w:type="dxa" w:w="2016"/>
             <w:tcBorders>
               <w:top w:val="single" w:sz="4" w:space="0" w:color="CBD5E1"/>
               <w:left w:val="single" w:sz="4" w:space="0" w:color="CBD5E1"/>
@@ -4105,9 +4329,9 @@
                 <w:b w:val="0"/>
                 <w:i w:val="0"/>
                 <w:color w:val="1F2937"/>
-                <w:sz w:val="18"/>
+                <w:sz w:val="16"/>
               </w:rPr>
-              <w:t>2,500</w:t>
+              <w:t>62,500 STX</w:t>
             </w:r>
           </w:p>
         </w:tc>
@@ -4133,15 +4357,15 @@
                 <w:b w:val="0"/>
                 <w:i w:val="0"/>
                 <w:color w:val="1F2937"/>
-                <w:sz w:val="18"/>
+                <w:sz w:val="16"/>
               </w:rPr>
-              <w:t>2,900</w:t>
+              <w:t>400</w:t>
             </w:r>
           </w:p>
         </w:tc>
         <w:tc>
           <w:tcPr>
-            <w:tcW w:type="dxa" w:w="2016"/>
+            <w:tcW w:type="dxa" w:w="1224"/>
             <w:tcBorders>
               <w:top w:val="single" w:sz="4" w:space="0" w:color="CBD5E1"/>
               <w:left w:val="single" w:sz="4" w:space="0" w:color="CBD5E1"/>
@@ -4161,7 +4385,63 @@
                 <w:b w:val="0"/>
                 <w:i w:val="0"/>
                 <w:color w:val="1F2937"/>
-                <w:sz w:val="18"/>
+                <w:sz w:val="16"/>
+              </w:rPr>
+              <w:t>2,500</w:t>
+            </w:r>
+          </w:p>
+        </w:tc>
+        <w:tc>
+          <w:tcPr>
+            <w:tcW w:type="dxa" w:w="1152"/>
+            <w:tcBorders>
+              <w:top w:val="single" w:sz="4" w:space="0" w:color="CBD5E1"/>
+              <w:left w:val="single" w:sz="4" w:space="0" w:color="CBD5E1"/>
+              <w:bottom w:val="single" w:sz="4" w:space="0" w:color="CBD5E1"/>
+              <w:right w:val="single" w:sz="4" w:space="0" w:color="CBD5E1"/>
+            </w:tcBorders>
+          </w:tcPr>
+          <w:p>
+            <w:pPr>
+              <w:spacing w:before="40" w:after="40" w:lineRule="auto" w:line="240"/>
+              <w:jc w:val="left"/>
+            </w:pPr>
+            <w:r/>
+            <w:r>
+              <w:rPr>
+                <w:rFonts w:ascii="Calibri" w:hAnsi="Calibri" w:eastAsia="Calibri"/>
+                <w:b w:val="0"/>
+                <w:i w:val="0"/>
+                <w:color w:val="1F2937"/>
+                <w:sz w:val="16"/>
+              </w:rPr>
+              <w:t>2,900</w:t>
+            </w:r>
+          </w:p>
+        </w:tc>
+        <w:tc>
+          <w:tcPr>
+            <w:tcW w:type="dxa" w:w="1728"/>
+            <w:tcBorders>
+              <w:top w:val="single" w:sz="4" w:space="0" w:color="CBD5E1"/>
+              <w:left w:val="single" w:sz="4" w:space="0" w:color="CBD5E1"/>
+              <w:bottom w:val="single" w:sz="4" w:space="0" w:color="CBD5E1"/>
+              <w:right w:val="single" w:sz="4" w:space="0" w:color="CBD5E1"/>
+            </w:tcBorders>
+          </w:tcPr>
+          <w:p>
+            <w:pPr>
+              <w:spacing w:before="40" w:after="40" w:lineRule="auto" w:line="240"/>
+              <w:jc w:val="left"/>
+            </w:pPr>
+            <w:r/>
+            <w:r>
+              <w:rPr>
+                <w:rFonts w:ascii="Calibri" w:hAnsi="Calibri" w:eastAsia="Calibri"/>
+                <w:b w:val="0"/>
+                <w:i w:val="0"/>
+                <w:color w:val="1F2937"/>
+                <w:sz w:val="16"/>
               </w:rPr>
               <w:t>2,500</w:t>
             </w:r>
@@ -4171,7 +4451,7 @@
       <w:tr>
         <w:tc>
           <w:tcPr>
-            <w:tcW w:type="dxa" w:w="3168"/>
+            <w:tcW w:type="dxa" w:w="2592"/>
             <w:shd w:fill="F7FAFC" w:val="clear"/>
             <w:tcBorders>
               <w:top w:val="single" w:sz="4" w:space="0" w:color="CBD5E1"/>
@@ -4192,15 +4472,15 @@
                 <w:b w:val="0"/>
                 <w:i w:val="0"/>
                 <w:color w:val="1F2937"/>
-                <w:sz w:val="18"/>
+                <w:sz w:val="16"/>
               </w:rPr>
-              <w:t>B — 12 JackPot × 50 min</w:t>
+              <w:t>B — 12 × 50 STX × 50 min</w:t>
             </w:r>
           </w:p>
         </w:tc>
         <w:tc>
           <w:tcPr>
-            <w:tcW w:type="dxa" w:w="1584"/>
+            <w:tcW w:type="dxa" w:w="1152"/>
             <w:shd w:fill="F7FAFC" w:val="clear"/>
             <w:tcBorders>
               <w:top w:val="single" w:sz="4" w:space="0" w:color="CBD5E1"/>
@@ -4221,15 +4501,15 @@
                 <w:b w:val="0"/>
                 <w:i w:val="0"/>
                 <w:color w:val="1F2937"/>
-                <w:sz w:val="18"/>
+                <w:sz w:val="16"/>
               </w:rPr>
-              <w:t>480</w:t>
+              <w:t>2,500</w:t>
             </w:r>
           </w:p>
         </w:tc>
         <w:tc>
           <w:tcPr>
-            <w:tcW w:type="dxa" w:w="1584"/>
+            <w:tcW w:type="dxa" w:w="2016"/>
             <w:shd w:fill="F7FAFC" w:val="clear"/>
             <w:tcBorders>
               <w:top w:val="single" w:sz="4" w:space="0" w:color="CBD5E1"/>
@@ -4250,9 +4530,9 @@
                 <w:b w:val="0"/>
                 <w:i w:val="0"/>
                 <w:color w:val="1F2937"/>
-                <w:sz w:val="18"/>
+                <w:sz w:val="16"/>
               </w:rPr>
-              <w:t>6,000</w:t>
+              <w:t>300,000 STX</w:t>
             </w:r>
           </w:p>
         </w:tc>
@@ -4279,15 +4559,15 @@
                 <w:b w:val="0"/>
                 <w:i w:val="0"/>
                 <w:color w:val="1F2937"/>
-                <w:sz w:val="18"/>
+                <w:sz w:val="16"/>
               </w:rPr>
-              <w:t>6,480</w:t>
+              <w:t>480</w:t>
             </w:r>
           </w:p>
         </w:tc>
         <w:tc>
           <w:tcPr>
-            <w:tcW w:type="dxa" w:w="2016"/>
+            <w:tcW w:type="dxa" w:w="1224"/>
             <w:shd w:fill="F7FAFC" w:val="clear"/>
             <w:tcBorders>
               <w:top w:val="single" w:sz="4" w:space="0" w:color="CBD5E1"/>
@@ -4308,7 +4588,65 @@
                 <w:b w:val="0"/>
                 <w:i w:val="0"/>
                 <w:color w:val="1F2937"/>
-                <w:sz w:val="18"/>
+                <w:sz w:val="16"/>
+              </w:rPr>
+              <w:t>6,000</w:t>
+            </w:r>
+          </w:p>
+        </w:tc>
+        <w:tc>
+          <w:tcPr>
+            <w:tcW w:type="dxa" w:w="1152"/>
+            <w:shd w:fill="F7FAFC" w:val="clear"/>
+            <w:tcBorders>
+              <w:top w:val="single" w:sz="4" w:space="0" w:color="CBD5E1"/>
+              <w:left w:val="single" w:sz="4" w:space="0" w:color="CBD5E1"/>
+              <w:bottom w:val="single" w:sz="4" w:space="0" w:color="CBD5E1"/>
+              <w:right w:val="single" w:sz="4" w:space="0" w:color="CBD5E1"/>
+            </w:tcBorders>
+          </w:tcPr>
+          <w:p>
+            <w:pPr>
+              <w:spacing w:before="40" w:after="40" w:lineRule="auto" w:line="240"/>
+              <w:jc w:val="left"/>
+            </w:pPr>
+            <w:r/>
+            <w:r>
+              <w:rPr>
+                <w:rFonts w:ascii="Calibri" w:hAnsi="Calibri" w:eastAsia="Calibri"/>
+                <w:b w:val="0"/>
+                <w:i w:val="0"/>
+                <w:color w:val="1F2937"/>
+                <w:sz w:val="16"/>
+              </w:rPr>
+              <w:t>6,480</w:t>
+            </w:r>
+          </w:p>
+        </w:tc>
+        <w:tc>
+          <w:tcPr>
+            <w:tcW w:type="dxa" w:w="1728"/>
+            <w:shd w:fill="F7FAFC" w:val="clear"/>
+            <w:tcBorders>
+              <w:top w:val="single" w:sz="4" w:space="0" w:color="CBD5E1"/>
+              <w:left w:val="single" w:sz="4" w:space="0" w:color="CBD5E1"/>
+              <w:bottom w:val="single" w:sz="4" w:space="0" w:color="CBD5E1"/>
+              <w:right w:val="single" w:sz="4" w:space="0" w:color="CBD5E1"/>
+            </w:tcBorders>
+          </w:tcPr>
+          <w:p>
+            <w:pPr>
+              <w:spacing w:before="40" w:after="40" w:lineRule="auto" w:line="240"/>
+              <w:jc w:val="left"/>
+            </w:pPr>
+            <w:r/>
+            <w:r>
+              <w:rPr>
+                <w:rFonts w:ascii="Calibri" w:hAnsi="Calibri" w:eastAsia="Calibri"/>
+                <w:b w:val="0"/>
+                <w:i w:val="0"/>
+                <w:color w:val="1F2937"/>
+                <w:sz w:val="16"/>
               </w:rPr>
               <w:t>6,000</w:t>
             </w:r>
@@ -4318,7 +4656,7 @@
       <w:tr>
         <w:tc>
           <w:tcPr>
-            <w:tcW w:type="dxa" w:w="3168"/>
+            <w:tcW w:type="dxa" w:w="2592"/>
             <w:tcBorders>
               <w:top w:val="single" w:sz="4" w:space="0" w:color="CBD5E1"/>
               <w:left w:val="single" w:sz="4" w:space="0" w:color="CBD5E1"/>
@@ -4338,15 +4676,15 @@
                 <w:b w:val="0"/>
                 <w:i w:val="0"/>
                 <w:color w:val="1F2937"/>
-                <w:sz w:val="18"/>
+                <w:sz w:val="16"/>
               </w:rPr>
-              <w:t>C — 1 Sequential × 10 min</w:t>
+              <w:t>C — 1 × 350 STX × 10 min</w:t>
             </w:r>
           </w:p>
         </w:tc>
         <w:tc>
           <w:tcPr>
-            <w:tcW w:type="dxa" w:w="1584"/>
+            <w:tcW w:type="dxa" w:w="1152"/>
             <w:tcBorders>
               <w:top w:val="single" w:sz="4" w:space="0" w:color="CBD5E1"/>
               <w:left w:val="single" w:sz="4" w:space="0" w:color="CBD5E1"/>
@@ -4366,15 +4704,15 @@
                 <w:b w:val="0"/>
                 <w:i w:val="0"/>
                 <w:color w:val="1F2937"/>
-                <w:sz w:val="18"/>
+                <w:sz w:val="16"/>
               </w:rPr>
-              <w:t>40</w:t>
+              <w:t>3,500</w:t>
             </w:r>
           </w:p>
         </w:tc>
         <w:tc>
           <w:tcPr>
-            <w:tcW w:type="dxa" w:w="1584"/>
+            <w:tcW w:type="dxa" w:w="2016"/>
             <w:tcBorders>
               <w:top w:val="single" w:sz="4" w:space="0" w:color="CBD5E1"/>
               <w:left w:val="single" w:sz="4" w:space="0" w:color="CBD5E1"/>
@@ -4394,9 +4732,9 @@
                 <w:b w:val="0"/>
                 <w:i w:val="0"/>
                 <w:color w:val="1F2937"/>
-                <w:sz w:val="18"/>
+                <w:sz w:val="16"/>
               </w:rPr>
-              <w:t>100</w:t>
+              <w:t>35,000 STX</w:t>
             </w:r>
           </w:p>
         </w:tc>
@@ -4422,15 +4760,15 @@
                 <w:b w:val="0"/>
                 <w:i w:val="0"/>
                 <w:color w:val="1F2937"/>
-                <w:sz w:val="18"/>
+                <w:sz w:val="16"/>
               </w:rPr>
-              <w:t>140</w:t>
+              <w:t>40</w:t>
             </w:r>
           </w:p>
         </w:tc>
         <w:tc>
           <w:tcPr>
-            <w:tcW w:type="dxa" w:w="2016"/>
+            <w:tcW w:type="dxa" w:w="1224"/>
             <w:tcBorders>
               <w:top w:val="single" w:sz="4" w:space="0" w:color="CBD5E1"/>
               <w:left w:val="single" w:sz="4" w:space="0" w:color="CBD5E1"/>
@@ -4450,7 +4788,63 @@
                 <w:b w:val="0"/>
                 <w:i w:val="0"/>
                 <w:color w:val="1F2937"/>
-                <w:sz w:val="18"/>
+                <w:sz w:val="16"/>
+              </w:rPr>
+              <w:t>100</w:t>
+            </w:r>
+          </w:p>
+        </w:tc>
+        <w:tc>
+          <w:tcPr>
+            <w:tcW w:type="dxa" w:w="1152"/>
+            <w:tcBorders>
+              <w:top w:val="single" w:sz="4" w:space="0" w:color="CBD5E1"/>
+              <w:left w:val="single" w:sz="4" w:space="0" w:color="CBD5E1"/>
+              <w:bottom w:val="single" w:sz="4" w:space="0" w:color="CBD5E1"/>
+              <w:right w:val="single" w:sz="4" w:space="0" w:color="CBD5E1"/>
+            </w:tcBorders>
+          </w:tcPr>
+          <w:p>
+            <w:pPr>
+              <w:spacing w:before="40" w:after="40" w:lineRule="auto" w:line="240"/>
+              <w:jc w:val="left"/>
+            </w:pPr>
+            <w:r/>
+            <w:r>
+              <w:rPr>
+                <w:rFonts w:ascii="Calibri" w:hAnsi="Calibri" w:eastAsia="Calibri"/>
+                <w:b w:val="0"/>
+                <w:i w:val="0"/>
+                <w:color w:val="1F2937"/>
+                <w:sz w:val="16"/>
+              </w:rPr>
+              <w:t>140</w:t>
+            </w:r>
+          </w:p>
+        </w:tc>
+        <w:tc>
+          <w:tcPr>
+            <w:tcW w:type="dxa" w:w="1728"/>
+            <w:tcBorders>
+              <w:top w:val="single" w:sz="4" w:space="0" w:color="CBD5E1"/>
+              <w:left w:val="single" w:sz="4" w:space="0" w:color="CBD5E1"/>
+              <w:bottom w:val="single" w:sz="4" w:space="0" w:color="CBD5E1"/>
+              <w:right w:val="single" w:sz="4" w:space="0" w:color="CBD5E1"/>
+            </w:tcBorders>
+          </w:tcPr>
+          <w:p>
+            <w:pPr>
+              <w:spacing w:before="40" w:after="40" w:lineRule="auto" w:line="240"/>
+              <w:jc w:val="left"/>
+            </w:pPr>
+            <w:r/>
+            <w:r>
+              <w:rPr>
+                <w:rFonts w:ascii="Calibri" w:hAnsi="Calibri" w:eastAsia="Calibri"/>
+                <w:b w:val="0"/>
+                <w:i w:val="0"/>
+                <w:color w:val="1F2937"/>
+                <w:sz w:val="16"/>
               </w:rPr>
               <w:t>100</w:t>
             </w:r>
@@ -4460,7 +4854,7 @@
       <w:tr>
         <w:tc>
           <w:tcPr>
-            <w:tcW w:type="dxa" w:w="3168"/>
+            <w:tcW w:type="dxa" w:w="2592"/>
             <w:shd w:fill="EEF2F7" w:val="clear"/>
             <w:tcBorders>
               <w:top w:val="single" w:sz="4" w:space="0" w:color="CBD5E1"/>
@@ -4481,7 +4875,7 @@
                 <w:b/>
                 <w:i w:val="0"/>
                 <w:color w:val="1A365D"/>
-                <w:sz w:val="18"/>
+                <w:sz w:val="16"/>
               </w:rPr>
               <w:t>Program</w:t>
             </w:r>
@@ -4489,7 +4883,7 @@
         </w:tc>
         <w:tc>
           <w:tcPr>
-            <w:tcW w:type="dxa" w:w="1584"/>
+            <w:tcW w:type="dxa" w:w="1152"/>
             <w:shd w:fill="EEF2F7" w:val="clear"/>
             <w:tcBorders>
               <w:top w:val="single" w:sz="4" w:space="0" w:color="CBD5E1"/>
@@ -4510,15 +4904,15 @@
                 <w:b/>
                 <w:i w:val="0"/>
                 <w:color w:val="1A365D"/>
-                <w:sz w:val="18"/>
+                <w:sz w:val="16"/>
               </w:rPr>
-              <w:t>920</w:t>
+              <w:t>—</w:t>
             </w:r>
           </w:p>
         </w:tc>
         <w:tc>
           <w:tcPr>
-            <w:tcW w:type="dxa" w:w="1584"/>
+            <w:tcW w:type="dxa" w:w="2016"/>
             <w:shd w:fill="EEF2F7" w:val="clear"/>
             <w:tcBorders>
               <w:top w:val="single" w:sz="4" w:space="0" w:color="CBD5E1"/>
@@ -4539,9 +4933,9 @@
                 <w:b/>
                 <w:i w:val="0"/>
                 <w:color w:val="1A365D"/>
-                <w:sz w:val="18"/>
+                <w:sz w:val="16"/>
               </w:rPr>
-              <w:t>8,600</w:t>
+              <w:t>397,500 STX</w:t>
             </w:r>
           </w:p>
         </w:tc>
@@ -4568,15 +4962,15 @@
                 <w:b/>
                 <w:i w:val="0"/>
                 <w:color w:val="1A365D"/>
-                <w:sz w:val="18"/>
+                <w:sz w:val="16"/>
               </w:rPr>
-              <w:t>9,520</w:t>
+              <w:t>920</w:t>
             </w:r>
           </w:p>
         </w:tc>
         <w:tc>
           <w:tcPr>
-            <w:tcW w:type="dxa" w:w="2016"/>
+            <w:tcW w:type="dxa" w:w="1224"/>
             <w:shd w:fill="EEF2F7" w:val="clear"/>
             <w:tcBorders>
               <w:top w:val="single" w:sz="4" w:space="0" w:color="CBD5E1"/>
@@ -4597,7 +4991,65 @@
                 <w:b/>
                 <w:i w:val="0"/>
                 <w:color w:val="1A365D"/>
-                <w:sz w:val="18"/>
+                <w:sz w:val="16"/>
+              </w:rPr>
+              <w:t>8,600</w:t>
+            </w:r>
+          </w:p>
+        </w:tc>
+        <w:tc>
+          <w:tcPr>
+            <w:tcW w:type="dxa" w:w="1152"/>
+            <w:shd w:fill="EEF2F7" w:val="clear"/>
+            <w:tcBorders>
+              <w:top w:val="single" w:sz="4" w:space="0" w:color="CBD5E1"/>
+              <w:left w:val="single" w:sz="4" w:space="0" w:color="CBD5E1"/>
+              <w:bottom w:val="single" w:sz="4" w:space="0" w:color="CBD5E1"/>
+              <w:right w:val="single" w:sz="4" w:space="0" w:color="CBD5E1"/>
+            </w:tcBorders>
+          </w:tcPr>
+          <w:p>
+            <w:pPr>
+              <w:spacing w:before="40" w:after="40" w:lineRule="auto" w:line="240"/>
+              <w:jc w:val="left"/>
+            </w:pPr>
+            <w:r/>
+            <w:r>
+              <w:rPr>
+                <w:rFonts w:ascii="Calibri" w:hAnsi="Calibri" w:eastAsia="Calibri"/>
+                <w:b/>
+                <w:i w:val="0"/>
+                <w:color w:val="1A365D"/>
+                <w:sz w:val="16"/>
+              </w:rPr>
+              <w:t>9,520</w:t>
+            </w:r>
+          </w:p>
+        </w:tc>
+        <w:tc>
+          <w:tcPr>
+            <w:tcW w:type="dxa" w:w="1728"/>
+            <w:shd w:fill="EEF2F7" w:val="clear"/>
+            <w:tcBorders>
+              <w:top w:val="single" w:sz="4" w:space="0" w:color="CBD5E1"/>
+              <w:left w:val="single" w:sz="4" w:space="0" w:color="CBD5E1"/>
+              <w:bottom w:val="single" w:sz="4" w:space="0" w:color="CBD5E1"/>
+              <w:right w:val="single" w:sz="4" w:space="0" w:color="CBD5E1"/>
+            </w:tcBorders>
+          </w:tcPr>
+          <w:p>
+            <w:pPr>
+              <w:spacing w:before="40" w:after="40" w:lineRule="auto" w:line="240"/>
+              <w:jc w:val="left"/>
+            </w:pPr>
+            <w:r/>
+            <w:r>
+              <w:rPr>
+                <w:rFonts w:ascii="Calibri" w:hAnsi="Calibri" w:eastAsia="Calibri"/>
+                <w:b/>
+                <w:i w:val="0"/>
+                <w:color w:val="1A365D"/>
+                <w:sz w:val="16"/>
               </w:rPr>
               <w:t>8,600</w:t>
             </w:r>
@@ -5862,21 +6314,6 @@
     </w:p>
     <w:p>
       <w:pPr>
-        <w:spacing w:before="0" w:after="160" w:lineRule="auto" w:line="276"/>
-      </w:pPr>
-      <w:r>
-        <w:rPr>
-          <w:rFonts w:ascii="Calibri" w:hAnsi="Calibri" w:eastAsia="Calibri"/>
-          <w:b w:val="0"/>
-          <w:i w:val="0"/>
-          <w:color w:val="1F2937"/>
-          <w:sz w:val="22"/>
-        </w:rPr>
-        <w:t>Entry minimums and pot targets are set at pot deployment within each JackPot or Sequential configuration and will be reflected in reported STX deposited.</w:t>
-      </w:r>
-    </w:p>
-    <w:p>
-      <w:pPr>
         <w:spacing w:before="320" w:after="120" w:lineRule="auto" w:line="276"/>
       </w:pPr>
       <w:r>
@@ -6104,6 +6541,65 @@
                 <w:color w:val="1F2937"/>
                 <w:sz w:val="18"/>
               </w:rPr>
+              <w:t>Participant STX stacked (minimum)</w:t>
+            </w:r>
+          </w:p>
+        </w:tc>
+        <w:tc>
+          <w:tcPr>
+            <w:tcW w:type="dxa" w:w="5904"/>
+            <w:tcBorders>
+              <w:top w:val="single" w:sz="4" w:space="0" w:color="CBD5E1"/>
+              <w:left w:val="single" w:sz="4" w:space="0" w:color="CBD5E1"/>
+              <w:bottom w:val="single" w:sz="4" w:space="0" w:color="CBD5E1"/>
+              <w:right w:val="single" w:sz="4" w:space="0" w:color="CBD5E1"/>
+            </w:tcBorders>
+          </w:tcPr>
+          <w:p>
+            <w:pPr>
+              <w:spacing w:before="40" w:after="40" w:lineRule="auto" w:line="240"/>
+              <w:jc w:val="left"/>
+            </w:pPr>
+            <w:r/>
+            <w:r>
+              <w:rPr>
+                <w:rFonts w:ascii="Calibri" w:hAnsi="Calibri" w:eastAsia="Calibri"/>
+                <w:b w:val="0"/>
+                <w:i w:val="0"/>
+                <w:color w:val="1F2937"/>
+                <w:sz w:val="18"/>
+              </w:rPr>
+              <w:t>397,500 STX (62,500 + 300,000 + 35,000)</w:t>
+            </w:r>
+          </w:p>
+        </w:tc>
+      </w:tr>
+      <w:tr>
+        <w:tc>
+          <w:tcPr>
+            <w:tcW w:type="dxa" w:w="3456"/>
+            <w:shd w:fill="F7FAFC" w:val="clear"/>
+            <w:tcBorders>
+              <w:top w:val="single" w:sz="4" w:space="0" w:color="CBD5E1"/>
+              <w:left w:val="single" w:sz="4" w:space="0" w:color="CBD5E1"/>
+              <w:bottom w:val="single" w:sz="4" w:space="0" w:color="CBD5E1"/>
+              <w:right w:val="single" w:sz="4" w:space="0" w:color="CBD5E1"/>
+            </w:tcBorders>
+          </w:tcPr>
+          <w:p>
+            <w:pPr>
+              <w:spacing w:before="40" w:after="40" w:lineRule="auto" w:line="240"/>
+              <w:jc w:val="center"/>
+            </w:pPr>
+            <w:r/>
+            <w:r>
+              <w:rPr>
+                <w:rFonts w:ascii="Calibri" w:hAnsi="Calibri" w:eastAsia="Calibri"/>
+                <w:b w:val="0"/>
+                <w:i w:val="0"/>
+                <w:color w:val="1F2937"/>
+                <w:sz w:val="18"/>
+              </w:rPr>
               <w:t>On-chain transactions (minimum)</w:t>
             </w:r>
           </w:p>
@@ -6111,6 +6607,7 @@
         <w:tc>
           <w:tcPr>
             <w:tcW w:type="dxa" w:w="5904"/>
+            <w:shd w:fill="F7FAFC" w:val="clear"/>
             <w:tcBorders>
               <w:top w:val="single" w:sz="4" w:space="0" w:color="CBD5E1"/>
               <w:left w:val="single" w:sz="4" w:space="0" w:color="CBD5E1"/>
@@ -6141,7 +6638,6 @@
         <w:tc>
           <w:tcPr>
             <w:tcW w:type="dxa" w:w="3456"/>
-            <w:shd w:fill="F7FAFC" w:val="clear"/>
             <w:tcBorders>
               <w:top w:val="single" w:sz="4" w:space="0" w:color="CBD5E1"/>
               <w:left w:val="single" w:sz="4" w:space="0" w:color="CBD5E1"/>
@@ -6170,7 +6666,6 @@
         <w:tc>
           <w:tcPr>
             <w:tcW w:type="dxa" w:w="5904"/>
-            <w:shd w:fill="F7FAFC" w:val="clear"/>
             <w:tcBorders>
               <w:top w:val="single" w:sz="4" w:space="0" w:color="CBD5E1"/>
               <w:left w:val="single" w:sz="4" w:space="0" w:color="CBD5E1"/>
@@ -6201,6 +6696,7 @@
         <w:tc>
           <w:tcPr>
             <w:tcW w:type="dxa" w:w="3456"/>
+            <w:shd w:fill="F7FAFC" w:val="clear"/>
             <w:tcBorders>
               <w:top w:val="single" w:sz="4" w:space="0" w:color="CBD5E1"/>
               <w:left w:val="single" w:sz="4" w:space="0" w:color="CBD5E1"/>
@@ -6229,6 +6725,7 @@
         <w:tc>
           <w:tcPr>
             <w:tcW w:type="dxa" w:w="5904"/>
+            <w:shd w:fill="F7FAFC" w:val="clear"/>
             <w:tcBorders>
               <w:top w:val="single" w:sz="4" w:space="0" w:color="CBD5E1"/>
               <w:left w:val="single" w:sz="4" w:space="0" w:color="CBD5E1"/>
@@ -6259,7 +6756,6 @@
         <w:tc>
           <w:tcPr>
             <w:tcW w:type="dxa" w:w="3456"/>
-            <w:shd w:fill="F7FAFC" w:val="clear"/>
             <w:tcBorders>
               <w:top w:val="single" w:sz="4" w:space="0" w:color="CBD5E1"/>
               <w:left w:val="single" w:sz="4" w:space="0" w:color="CBD5E1"/>
@@ -6288,7 +6784,6 @@
         <w:tc>
           <w:tcPr>
             <w:tcW w:type="dxa" w:w="5904"/>
-            <w:shd w:fill="F7FAFC" w:val="clear"/>
             <w:tcBorders>
               <w:top w:val="single" w:sz="4" w:space="0" w:color="CBD5E1"/>
               <w:left w:val="single" w:sz="4" w:space="0" w:color="CBD5E1"/>

</xml_diff>

<commit_message>
Fix Total Stacked to pot target plus boost
Recalculate Total Stacked as (Pot Target + Awarded Boost) x Qty x
10 cycles, totaling 5,397,500 STX across the program.

Co-authored-by: cryptosmith.btc <Zeus-Adin@users.noreply.github.com>
</commit_message>
<xml_diff>
--- a/StacksPot-Growth-Acceleration-Proposal.docx
+++ b/StacksPot-Growth-Acceleration-Proposal.docx
@@ -1956,7 +1956,7 @@
                 <w:color w:val="1F2937"/>
                 <w:sz w:val="16"/>
               </w:rPr>
-              <w:t>62,500 STX</w:t>
+              <w:t>1,062,500 STX</w:t>
             </w:r>
           </w:p>
         </w:tc>
@@ -2188,7 +2188,7 @@
                 <w:color w:val="1F2937"/>
                 <w:sz w:val="16"/>
               </w:rPr>
-              <w:t>300,000 STX</w:t>
+              <w:t>3,300,000 STX</w:t>
             </w:r>
           </w:p>
         </w:tc>
@@ -2416,7 +2416,7 @@
                 <w:color w:val="1F2937"/>
                 <w:sz w:val="16"/>
               </w:rPr>
-              <w:t>35,000 STX</w:t>
+              <w:t>1,035,000 STX</w:t>
             </w:r>
           </w:p>
         </w:tc>
@@ -2648,7 +2648,7 @@
                 <w:color w:val="1A365D"/>
                 <w:sz w:val="16"/>
               </w:rPr>
-              <w:t>397,500 STX</w:t>
+              <w:t>5,397,500 STX</w:t>
             </w:r>
           </w:p>
         </w:tc>
@@ -3971,7 +3971,7 @@
           <w:color w:val="4A5568"/>
           <w:sz w:val="18"/>
         </w:rPr>
-        <w:t xml:space="preserve">Pot Target × Qty × 10 cycles (participant STX at min fill). </w:t>
+        <w:t xml:space="preserve">(Pot Target + Awarded Boost) × Qty × 10 cycles. </w:t>
       </w:r>
       <w:r>
         <w:rPr>
@@ -4011,7 +4011,7 @@
           <w:color w:val="4A5568"/>
           <w:sz w:val="18"/>
         </w:rPr>
-        <w:t>lifecycle (4 × pots × 10) + joins. Awarded Boost / Tier Capital = reusable sponsor STX (not in Total Stacked).</w:t>
+        <w:t>lifecycle (4 × pots × 10) + joins. Boost is counted in Total Stacked as deployed volume; capital committed remains 500,000 STX.</w:t>
       </w:r>
     </w:p>
     <w:p>
@@ -4077,7 +4077,7 @@
         </w:tc>
         <w:tc>
           <w:tcPr>
-            <w:tcW w:type="dxa" w:w="1152"/>
+            <w:tcW w:type="dxa" w:w="1440"/>
             <w:shd w:fill="1A365D" w:val="clear"/>
             <w:tcBorders>
               <w:top w:val="single" w:sz="4" w:space="0" w:color="1A365D"/>
@@ -4100,7 +4100,7 @@
                 <w:color w:val="FFFFFF"/>
                 <w:sz w:val="16"/>
               </w:rPr>
-              <w:t>Pot Target</w:t>
+              <w:t>Per-Pot Stacked</w:t>
             </w:r>
           </w:p>
         </w:tc>
@@ -4222,7 +4222,7 @@
         </w:tc>
         <w:tc>
           <w:tcPr>
-            <w:tcW w:type="dxa" w:w="1728"/>
+            <w:tcW w:type="dxa" w:w="1584"/>
             <w:shd w:fill="1A365D" w:val="clear"/>
             <w:tcBorders>
               <w:top w:val="single" w:sz="4" w:space="0" w:color="1A365D"/>
@@ -4281,7 +4281,7 @@
         </w:tc>
         <w:tc>
           <w:tcPr>
-            <w:tcW w:type="dxa" w:w="1152"/>
+            <w:tcW w:type="dxa" w:w="1440"/>
             <w:tcBorders>
               <w:top w:val="single" w:sz="4" w:space="0" w:color="CBD5E1"/>
               <w:left w:val="single" w:sz="4" w:space="0" w:color="CBD5E1"/>
@@ -4303,7 +4303,7 @@
                 <w:color w:val="1F2937"/>
                 <w:sz w:val="16"/>
               </w:rPr>
-              <w:t>625</w:t>
+              <w:t>10,625</w:t>
             </w:r>
           </w:p>
         </w:tc>
@@ -4331,7 +4331,7 @@
                 <w:color w:val="1F2937"/>
                 <w:sz w:val="16"/>
               </w:rPr>
-              <w:t>62,500 STX</w:t>
+              <w:t>1,062,500 STX</w:t>
             </w:r>
           </w:p>
         </w:tc>
@@ -4421,7 +4421,7 @@
         </w:tc>
         <w:tc>
           <w:tcPr>
-            <w:tcW w:type="dxa" w:w="1728"/>
+            <w:tcW w:type="dxa" w:w="1584"/>
             <w:tcBorders>
               <w:top w:val="single" w:sz="4" w:space="0" w:color="CBD5E1"/>
               <w:left w:val="single" w:sz="4" w:space="0" w:color="CBD5E1"/>
@@ -4480,7 +4480,7 @@
         </w:tc>
         <w:tc>
           <w:tcPr>
-            <w:tcW w:type="dxa" w:w="1152"/>
+            <w:tcW w:type="dxa" w:w="1440"/>
             <w:shd w:fill="F7FAFC" w:val="clear"/>
             <w:tcBorders>
               <w:top w:val="single" w:sz="4" w:space="0" w:color="CBD5E1"/>
@@ -4503,7 +4503,7 @@
                 <w:color w:val="1F2937"/>
                 <w:sz w:val="16"/>
               </w:rPr>
-              <w:t>2,500</w:t>
+              <w:t>27,500</w:t>
             </w:r>
           </w:p>
         </w:tc>
@@ -4532,7 +4532,7 @@
                 <w:color w:val="1F2937"/>
                 <w:sz w:val="16"/>
               </w:rPr>
-              <w:t>300,000 STX</w:t>
+              <w:t>3,300,000 STX</w:t>
             </w:r>
           </w:p>
         </w:tc>
@@ -4625,7 +4625,7 @@
         </w:tc>
         <w:tc>
           <w:tcPr>
-            <w:tcW w:type="dxa" w:w="1728"/>
+            <w:tcW w:type="dxa" w:w="1584"/>
             <w:shd w:fill="F7FAFC" w:val="clear"/>
             <w:tcBorders>
               <w:top w:val="single" w:sz="4" w:space="0" w:color="CBD5E1"/>
@@ -4684,7 +4684,7 @@
         </w:tc>
         <w:tc>
           <w:tcPr>
-            <w:tcW w:type="dxa" w:w="1152"/>
+            <w:tcW w:type="dxa" w:w="1440"/>
             <w:tcBorders>
               <w:top w:val="single" w:sz="4" w:space="0" w:color="CBD5E1"/>
               <w:left w:val="single" w:sz="4" w:space="0" w:color="CBD5E1"/>
@@ -4706,7 +4706,7 @@
                 <w:color w:val="1F2937"/>
                 <w:sz w:val="16"/>
               </w:rPr>
-              <w:t>3,500</w:t>
+              <w:t>103,500</w:t>
             </w:r>
           </w:p>
         </w:tc>
@@ -4734,7 +4734,7 @@
                 <w:color w:val="1F2937"/>
                 <w:sz w:val="16"/>
               </w:rPr>
-              <w:t>35,000 STX</w:t>
+              <w:t>1,035,000 STX</w:t>
             </w:r>
           </w:p>
         </w:tc>
@@ -4824,7 +4824,7 @@
         </w:tc>
         <w:tc>
           <w:tcPr>
-            <w:tcW w:type="dxa" w:w="1728"/>
+            <w:tcW w:type="dxa" w:w="1584"/>
             <w:tcBorders>
               <w:top w:val="single" w:sz="4" w:space="0" w:color="CBD5E1"/>
               <w:left w:val="single" w:sz="4" w:space="0" w:color="CBD5E1"/>
@@ -4883,7 +4883,7 @@
         </w:tc>
         <w:tc>
           <w:tcPr>
-            <w:tcW w:type="dxa" w:w="1152"/>
+            <w:tcW w:type="dxa" w:w="1440"/>
             <w:shd w:fill="EEF2F7" w:val="clear"/>
             <w:tcBorders>
               <w:top w:val="single" w:sz="4" w:space="0" w:color="CBD5E1"/>
@@ -4935,7 +4935,7 @@
                 <w:color w:val="1A365D"/>
                 <w:sz w:val="16"/>
               </w:rPr>
-              <w:t>397,500 STX</w:t>
+              <w:t>5,397,500 STX</w:t>
             </w:r>
           </w:p>
         </w:tc>
@@ -5028,7 +5028,7 @@
         </w:tc>
         <w:tc>
           <w:tcPr>
-            <w:tcW w:type="dxa" w:w="1728"/>
+            <w:tcW w:type="dxa" w:w="1584"/>
             <w:shd w:fill="EEF2F7" w:val="clear"/>
             <w:tcBorders>
               <w:top w:val="single" w:sz="4" w:space="0" w:color="CBD5E1"/>
@@ -6520,6 +6520,7 @@
         <w:tc>
           <w:tcPr>
             <w:tcW w:type="dxa" w:w="3456"/>
+            <w:shd w:fill="EEF2F7" w:val="clear"/>
             <w:tcBorders>
               <w:top w:val="single" w:sz="4" w:space="0" w:color="CBD5E1"/>
               <w:left w:val="single" w:sz="4" w:space="0" w:color="CBD5E1"/>
@@ -6536,18 +6537,19 @@
             <w:r>
               <w:rPr>
                 <w:rFonts w:ascii="Calibri" w:hAnsi="Calibri" w:eastAsia="Calibri"/>
-                <w:b w:val="0"/>
+                <w:b/>
                 <w:i w:val="0"/>
-                <w:color w:val="1F2937"/>
+                <w:color w:val="1A365D"/>
                 <w:sz w:val="18"/>
               </w:rPr>
-              <w:t>Participant STX stacked (minimum)</w:t>
+              <w:t>Total STX stacked (min. pot target + boost)</w:t>
             </w:r>
           </w:p>
         </w:tc>
         <w:tc>
           <w:tcPr>
             <w:tcW w:type="dxa" w:w="5904"/>
+            <w:shd w:fill="EEF2F7" w:val="clear"/>
             <w:tcBorders>
               <w:top w:val="single" w:sz="4" w:space="0" w:color="CBD5E1"/>
               <w:left w:val="single" w:sz="4" w:space="0" w:color="CBD5E1"/>
@@ -6564,12 +6566,12 @@
             <w:r>
               <w:rPr>
                 <w:rFonts w:ascii="Calibri" w:hAnsi="Calibri" w:eastAsia="Calibri"/>
-                <w:b w:val="0"/>
+                <w:b/>
                 <w:i w:val="0"/>
-                <w:color w:val="1F2937"/>
+                <w:color w:val="1A365D"/>
                 <w:sz w:val="18"/>
               </w:rPr>
-              <w:t>397,500 STX (62,500 + 300,000 + 35,000)</w:t>
+              <w:t>5,397,500 STX (1,062,500 + 3,300,000 + 1,035,000)</w:t>
             </w:r>
           </w:p>
         </w:tc>

</xml_diff>

<commit_message>
Add averages column to expected outcomes table
Show per-cycle, per-month, and per-pot averages alongside program
targets for pots, participants, stacked STX, and transactions.

Co-authored-by: cryptosmith.btc <Zeus-Adin@users.noreply.github.com>
</commit_message>
<xml_diff>
--- a/StacksPot-Growth-Acceleration-Proposal.docx
+++ b/StacksPot-Growth-Acceleration-Proposal.docx
@@ -6335,13 +6335,14 @@
         <w:tblLook w:firstColumn="1" w:firstRow="1" w:lastColumn="0" w:lastRow="0" w:noHBand="0" w:noVBand="1" w:val="04A0"/>
       </w:tblPr>
       <w:tblGrid>
-        <w:gridCol w:w="4896"/>
-        <w:gridCol w:w="4896"/>
+        <w:gridCol w:w="3264"/>
+        <w:gridCol w:w="3264"/>
+        <w:gridCol w:w="3264"/>
       </w:tblGrid>
       <w:tr>
         <w:tc>
           <w:tcPr>
-            <w:tcW w:type="dxa" w:w="3456"/>
+            <w:tcW w:type="dxa" w:w="3168"/>
             <w:shd w:fill="1A365D" w:val="clear"/>
             <w:tcBorders>
               <w:top w:val="single" w:sz="4" w:space="0" w:color="1A365D"/>
@@ -6362,7 +6363,7 @@
                 <w:b/>
                 <w:i w:val="0"/>
                 <w:color w:val="FFFFFF"/>
-                <w:sz w:val="18"/>
+                <w:sz w:val="16"/>
               </w:rPr>
               <w:t>Outcome</w:t>
             </w:r>
@@ -6370,7 +6371,7 @@
         </w:tc>
         <w:tc>
           <w:tcPr>
-            <w:tcW w:type="dxa" w:w="5904"/>
+            <w:tcW w:type="dxa" w:w="3168"/>
             <w:shd w:fill="1A365D" w:val="clear"/>
             <w:tcBorders>
               <w:top w:val="single" w:sz="4" w:space="0" w:color="1A365D"/>
@@ -6391,9 +6392,38 @@
                 <w:b/>
                 <w:i w:val="0"/>
                 <w:color w:val="FFFFFF"/>
-                <w:sz w:val="18"/>
+                <w:sz w:val="16"/>
               </w:rPr>
-              <w:t>Target</w:t>
+              <w:t>Program Target</w:t>
+            </w:r>
+          </w:p>
+        </w:tc>
+        <w:tc>
+          <w:tcPr>
+            <w:tcW w:type="dxa" w:w="3168"/>
+            <w:shd w:fill="1A365D" w:val="clear"/>
+            <w:tcBorders>
+              <w:top w:val="single" w:sz="4" w:space="0" w:color="1A365D"/>
+              <w:left w:val="single" w:sz="4" w:space="0" w:color="1A365D"/>
+              <w:bottom w:val="single" w:sz="4" w:space="0" w:color="1A365D"/>
+              <w:right w:val="single" w:sz="4" w:space="0" w:color="1A365D"/>
+            </w:tcBorders>
+          </w:tcPr>
+          <w:p>
+            <w:pPr>
+              <w:spacing w:before="40" w:after="40" w:lineRule="auto" w:line="240"/>
+              <w:jc w:val="center"/>
+            </w:pPr>
+            <w:r/>
+            <w:r>
+              <w:rPr>
+                <w:rFonts w:ascii="Calibri" w:hAnsi="Calibri" w:eastAsia="Calibri"/>
+                <w:b/>
+                <w:i w:val="0"/>
+                <w:color w:val="FFFFFF"/>
+                <w:sz w:val="16"/>
+              </w:rPr>
+              <w:t>Average</w:t>
             </w:r>
           </w:p>
         </w:tc>
@@ -6401,7 +6431,7 @@
       <w:tr>
         <w:tc>
           <w:tcPr>
-            <w:tcW w:type="dxa" w:w="3456"/>
+            <w:tcW w:type="dxa" w:w="3168"/>
             <w:tcBorders>
               <w:top w:val="single" w:sz="4" w:space="0" w:color="CBD5E1"/>
               <w:left w:val="single" w:sz="4" w:space="0" w:color="CBD5E1"/>
@@ -6421,7 +6451,7 @@
                 <w:b w:val="0"/>
                 <w:i w:val="0"/>
                 <w:color w:val="1F2937"/>
-                <w:sz w:val="18"/>
+                <w:sz w:val="16"/>
               </w:rPr>
               <w:t>Sponsored pots delivered</w:t>
             </w:r>
@@ -6429,7 +6459,7 @@
         </w:tc>
         <w:tc>
           <w:tcPr>
-            <w:tcW w:type="dxa" w:w="5904"/>
+            <w:tcW w:type="dxa" w:w="3168"/>
             <w:tcBorders>
               <w:top w:val="single" w:sz="4" w:space="0" w:color="CBD5E1"/>
               <w:left w:val="single" w:sz="4" w:space="0" w:color="CBD5E1"/>
@@ -6449,9 +6479,37 @@
                 <w:b w:val="0"/>
                 <w:i w:val="0"/>
                 <w:color w:val="1F2937"/>
-                <w:sz w:val="18"/>
+                <w:sz w:val="16"/>
               </w:rPr>
               <w:t>230 (23 / cycle × 10 cycles)</w:t>
+            </w:r>
+          </w:p>
+        </w:tc>
+        <w:tc>
+          <w:tcPr>
+            <w:tcW w:type="dxa" w:w="3168"/>
+            <w:tcBorders>
+              <w:top w:val="single" w:sz="4" w:space="0" w:color="CBD5E1"/>
+              <w:left w:val="single" w:sz="4" w:space="0" w:color="CBD5E1"/>
+              <w:bottom w:val="single" w:sz="4" w:space="0" w:color="CBD5E1"/>
+              <w:right w:val="single" w:sz="4" w:space="0" w:color="CBD5E1"/>
+            </w:tcBorders>
+          </w:tcPr>
+          <w:p>
+            <w:pPr>
+              <w:spacing w:before="40" w:after="40" w:lineRule="auto" w:line="240"/>
+              <w:jc w:val="left"/>
+            </w:pPr>
+            <w:r/>
+            <w:r>
+              <w:rPr>
+                <w:rFonts w:ascii="Calibri" w:hAnsi="Calibri" w:eastAsia="Calibri"/>
+                <w:b w:val="0"/>
+                <w:i w:val="0"/>
+                <w:color w:val="1F2937"/>
+                <w:sz w:val="16"/>
+              </w:rPr>
+              <w:t>23 / cycle · 46 / month</w:t>
             </w:r>
           </w:p>
         </w:tc>
@@ -6459,7 +6517,96 @@
       <w:tr>
         <w:tc>
           <w:tcPr>
-            <w:tcW w:type="dxa" w:w="3456"/>
+            <w:tcW w:type="dxa" w:w="3168"/>
+            <w:shd w:fill="F7FAFC" w:val="clear"/>
+            <w:tcBorders>
+              <w:top w:val="single" w:sz="4" w:space="0" w:color="CBD5E1"/>
+              <w:left w:val="single" w:sz="4" w:space="0" w:color="CBD5E1"/>
+              <w:bottom w:val="single" w:sz="4" w:space="0" w:color="CBD5E1"/>
+              <w:right w:val="single" w:sz="4" w:space="0" w:color="CBD5E1"/>
+            </w:tcBorders>
+          </w:tcPr>
+          <w:p>
+            <w:pPr>
+              <w:spacing w:before="40" w:after="40" w:lineRule="auto" w:line="240"/>
+              <w:jc w:val="center"/>
+            </w:pPr>
+            <w:r/>
+            <w:r>
+              <w:rPr>
+                <w:rFonts w:ascii="Calibri" w:hAnsi="Calibri" w:eastAsia="Calibri"/>
+                <w:b w:val="0"/>
+                <w:i w:val="0"/>
+                <w:color w:val="1F2937"/>
+                <w:sz w:val="16"/>
+              </w:rPr>
+              <w:t>Minimum participants</w:t>
+            </w:r>
+          </w:p>
+        </w:tc>
+        <w:tc>
+          <w:tcPr>
+            <w:tcW w:type="dxa" w:w="3168"/>
+            <w:shd w:fill="F7FAFC" w:val="clear"/>
+            <w:tcBorders>
+              <w:top w:val="single" w:sz="4" w:space="0" w:color="CBD5E1"/>
+              <w:left w:val="single" w:sz="4" w:space="0" w:color="CBD5E1"/>
+              <w:bottom w:val="single" w:sz="4" w:space="0" w:color="CBD5E1"/>
+              <w:right w:val="single" w:sz="4" w:space="0" w:color="CBD5E1"/>
+            </w:tcBorders>
+          </w:tcPr>
+          <w:p>
+            <w:pPr>
+              <w:spacing w:before="40" w:after="40" w:lineRule="auto" w:line="240"/>
+              <w:jc w:val="left"/>
+            </w:pPr>
+            <w:r/>
+            <w:r>
+              <w:rPr>
+                <w:rFonts w:ascii="Calibri" w:hAnsi="Calibri" w:eastAsia="Calibri"/>
+                <w:b w:val="0"/>
+                <w:i w:val="0"/>
+                <w:color w:val="1F2937"/>
+                <w:sz w:val="16"/>
+              </w:rPr>
+              <w:t>8,600 (2,500 + 6,000 + 100)</w:t>
+            </w:r>
+          </w:p>
+        </w:tc>
+        <w:tc>
+          <w:tcPr>
+            <w:tcW w:type="dxa" w:w="3168"/>
+            <w:shd w:fill="F7FAFC" w:val="clear"/>
+            <w:tcBorders>
+              <w:top w:val="single" w:sz="4" w:space="0" w:color="CBD5E1"/>
+              <w:left w:val="single" w:sz="4" w:space="0" w:color="CBD5E1"/>
+              <w:bottom w:val="single" w:sz="4" w:space="0" w:color="CBD5E1"/>
+              <w:right w:val="single" w:sz="4" w:space="0" w:color="CBD5E1"/>
+            </w:tcBorders>
+          </w:tcPr>
+          <w:p>
+            <w:pPr>
+              <w:spacing w:before="40" w:after="40" w:lineRule="auto" w:line="240"/>
+              <w:jc w:val="left"/>
+            </w:pPr>
+            <w:r/>
+            <w:r>
+              <w:rPr>
+                <w:rFonts w:ascii="Calibri" w:hAnsi="Calibri" w:eastAsia="Calibri"/>
+                <w:b w:val="0"/>
+                <w:i w:val="0"/>
+                <w:color w:val="1F2937"/>
+                <w:sz w:val="16"/>
+              </w:rPr>
+              <w:t>860 / cycle · 1,720 / month</w:t>
+            </w:r>
+          </w:p>
+        </w:tc>
+      </w:tr>
+      <w:tr>
+        <w:tc>
+          <w:tcPr>
+            <w:tcW w:type="dxa" w:w="3168"/>
             <w:shd w:fill="EEF2F7" w:val="clear"/>
             <w:tcBorders>
               <w:top w:val="single" w:sz="4" w:space="0" w:color="CBD5E1"/>
@@ -6480,15 +6627,15 @@
                 <w:b/>
                 <w:i w:val="0"/>
                 <w:color w:val="1A365D"/>
-                <w:sz w:val="18"/>
+                <w:sz w:val="16"/>
               </w:rPr>
-              <w:t>Minimum participants (program)</w:t>
+              <w:t>Total STX stacked (pot target + boost)</w:t>
             </w:r>
           </w:p>
         </w:tc>
         <w:tc>
           <w:tcPr>
-            <w:tcW w:type="dxa" w:w="5904"/>
+            <w:tcW w:type="dxa" w:w="3168"/>
             <w:shd w:fill="EEF2F7" w:val="clear"/>
             <w:tcBorders>
               <w:top w:val="single" w:sz="4" w:space="0" w:color="CBD5E1"/>
@@ -6509,46 +6656,15 @@
                 <w:b/>
                 <w:i w:val="0"/>
                 <w:color w:val="1A365D"/>
-                <w:sz w:val="18"/>
+                <w:sz w:val="16"/>
               </w:rPr>
-              <w:t>8,600 (2,500 + 6,000 + 100)</w:t>
-            </w:r>
-          </w:p>
-        </w:tc>
-      </w:tr>
-      <w:tr>
-        <w:tc>
-          <w:tcPr>
-            <w:tcW w:type="dxa" w:w="3456"/>
-            <w:shd w:fill="EEF2F7" w:val="clear"/>
-            <w:tcBorders>
-              <w:top w:val="single" w:sz="4" w:space="0" w:color="CBD5E1"/>
-              <w:left w:val="single" w:sz="4" w:space="0" w:color="CBD5E1"/>
-              <w:bottom w:val="single" w:sz="4" w:space="0" w:color="CBD5E1"/>
-              <w:right w:val="single" w:sz="4" w:space="0" w:color="CBD5E1"/>
-            </w:tcBorders>
-          </w:tcPr>
-          <w:p>
-            <w:pPr>
-              <w:spacing w:before="40" w:after="40" w:lineRule="auto" w:line="240"/>
-              <w:jc w:val="center"/>
-            </w:pPr>
-            <w:r/>
-            <w:r>
-              <w:rPr>
-                <w:rFonts w:ascii="Calibri" w:hAnsi="Calibri" w:eastAsia="Calibri"/>
-                <w:b/>
-                <w:i w:val="0"/>
-                <w:color w:val="1A365D"/>
-                <w:sz w:val="18"/>
-              </w:rPr>
-              <w:t>Total STX stacked (min. pot target + boost)</w:t>
+              <w:t>5,397,500 STX</w:t>
             </w:r>
           </w:p>
         </w:tc>
         <w:tc>
           <w:tcPr>
-            <w:tcW w:type="dxa" w:w="5904"/>
+            <w:tcW w:type="dxa" w:w="3168"/>
             <w:shd w:fill="EEF2F7" w:val="clear"/>
             <w:tcBorders>
               <w:top w:val="single" w:sz="4" w:space="0" w:color="CBD5E1"/>
@@ -6569,9 +6685,9 @@
                 <w:b/>
                 <w:i w:val="0"/>
                 <w:color w:val="1A365D"/>
-                <w:sz w:val="18"/>
+                <w:sz w:val="16"/>
               </w:rPr>
-              <w:t>5,397,500 STX (1,062,500 + 3,300,000 + 1,035,000)</w:t>
+              <w:t>539,750 STX / cycle · 1,079,500 STX / month</w:t>
             </w:r>
           </w:p>
         </w:tc>
@@ -6579,7 +6695,7 @@
       <w:tr>
         <w:tc>
           <w:tcPr>
-            <w:tcW w:type="dxa" w:w="3456"/>
+            <w:tcW w:type="dxa" w:w="3168"/>
             <w:shd w:fill="F7FAFC" w:val="clear"/>
             <w:tcBorders>
               <w:top w:val="single" w:sz="4" w:space="0" w:color="CBD5E1"/>
@@ -6600,7 +6716,7 @@
                 <w:b w:val="0"/>
                 <w:i w:val="0"/>
                 <w:color w:val="1F2937"/>
-                <w:sz w:val="18"/>
+                <w:sz w:val="16"/>
               </w:rPr>
               <w:t>On-chain transactions (minimum)</w:t>
             </w:r>
@@ -6608,7 +6724,7 @@
         </w:tc>
         <w:tc>
           <w:tcPr>
-            <w:tcW w:type="dxa" w:w="5904"/>
+            <w:tcW w:type="dxa" w:w="3168"/>
             <w:shd w:fill="F7FAFC" w:val="clear"/>
             <w:tcBorders>
               <w:top w:val="single" w:sz="4" w:space="0" w:color="CBD5E1"/>
@@ -6629,9 +6745,38 @@
                 <w:b w:val="0"/>
                 <w:i w:val="0"/>
                 <w:color w:val="1F2937"/>
-                <w:sz w:val="18"/>
+                <w:sz w:val="16"/>
               </w:rPr>
               <w:t>9,520 (920 lifecycle + 8,600 joins)</w:t>
+            </w:r>
+          </w:p>
+        </w:tc>
+        <w:tc>
+          <w:tcPr>
+            <w:tcW w:type="dxa" w:w="3168"/>
+            <w:shd w:fill="F7FAFC" w:val="clear"/>
+            <w:tcBorders>
+              <w:top w:val="single" w:sz="4" w:space="0" w:color="CBD5E1"/>
+              <w:left w:val="single" w:sz="4" w:space="0" w:color="CBD5E1"/>
+              <w:bottom w:val="single" w:sz="4" w:space="0" w:color="CBD5E1"/>
+              <w:right w:val="single" w:sz="4" w:space="0" w:color="CBD5E1"/>
+            </w:tcBorders>
+          </w:tcPr>
+          <w:p>
+            <w:pPr>
+              <w:spacing w:before="40" w:after="40" w:lineRule="auto" w:line="240"/>
+              <w:jc w:val="left"/>
+            </w:pPr>
+            <w:r/>
+            <w:r>
+              <w:rPr>
+                <w:rFonts w:ascii="Calibri" w:hAnsi="Calibri" w:eastAsia="Calibri"/>
+                <w:b w:val="0"/>
+                <w:i w:val="0"/>
+                <w:color w:val="1F2937"/>
+                <w:sz w:val="16"/>
+              </w:rPr>
+              <w:t>952 / cycle · 1,904 / month</w:t>
             </w:r>
           </w:p>
         </w:tc>
@@ -6639,7 +6784,7 @@
       <w:tr>
         <w:tc>
           <w:tcPr>
-            <w:tcW w:type="dxa" w:w="3456"/>
+            <w:tcW w:type="dxa" w:w="3168"/>
             <w:tcBorders>
               <w:top w:val="single" w:sz="4" w:space="0" w:color="CBD5E1"/>
               <w:left w:val="single" w:sz="4" w:space="0" w:color="CBD5E1"/>
@@ -6659,15 +6804,15 @@
                 <w:b w:val="0"/>
                 <w:i w:val="0"/>
                 <w:color w:val="1F2937"/>
-                <w:sz w:val="18"/>
+                <w:sz w:val="16"/>
               </w:rPr>
-              <w:t>Monthly throughput</w:t>
+              <w:t>Avg. participants per pot</w:t>
             </w:r>
           </w:p>
         </w:tc>
         <w:tc>
           <w:tcPr>
-            <w:tcW w:type="dxa" w:w="5904"/>
+            <w:tcW w:type="dxa" w:w="3168"/>
             <w:tcBorders>
               <w:top w:val="single" w:sz="4" w:space="0" w:color="CBD5E1"/>
               <w:left w:val="single" w:sz="4" w:space="0" w:color="CBD5E1"/>
@@ -6687,9 +6832,37 @@
                 <w:b w:val="0"/>
                 <w:i w:val="0"/>
                 <w:color w:val="1F2937"/>
-                <w:sz w:val="18"/>
+                <w:sz w:val="16"/>
               </w:rPr>
-              <w:t>46 pots / month · 1,720 min. participants · 2 cycles</w:t>
+              <w:t>—</w:t>
+            </w:r>
+          </w:p>
+        </w:tc>
+        <w:tc>
+          <w:tcPr>
+            <w:tcW w:type="dxa" w:w="3168"/>
+            <w:tcBorders>
+              <w:top w:val="single" w:sz="4" w:space="0" w:color="CBD5E1"/>
+              <w:left w:val="single" w:sz="4" w:space="0" w:color="CBD5E1"/>
+              <w:bottom w:val="single" w:sz="4" w:space="0" w:color="CBD5E1"/>
+              <w:right w:val="single" w:sz="4" w:space="0" w:color="CBD5E1"/>
+            </w:tcBorders>
+          </w:tcPr>
+          <w:p>
+            <w:pPr>
+              <w:spacing w:before="40" w:after="40" w:lineRule="auto" w:line="240"/>
+              <w:jc w:val="left"/>
+            </w:pPr>
+            <w:r/>
+            <w:r>
+              <w:rPr>
+                <w:rFonts w:ascii="Calibri" w:hAnsi="Calibri" w:eastAsia="Calibri"/>
+                <w:b w:val="0"/>
+                <w:i w:val="0"/>
+                <w:color w:val="1F2937"/>
+                <w:sz w:val="16"/>
+              </w:rPr>
+              <w:t>~37 (8,600 ÷ 230)</w:t>
             </w:r>
           </w:p>
         </w:tc>
@@ -6697,7 +6870,7 @@
       <w:tr>
         <w:tc>
           <w:tcPr>
-            <w:tcW w:type="dxa" w:w="3456"/>
+            <w:tcW w:type="dxa" w:w="3168"/>
             <w:shd w:fill="F7FAFC" w:val="clear"/>
             <w:tcBorders>
               <w:top w:val="single" w:sz="4" w:space="0" w:color="CBD5E1"/>
@@ -6718,15 +6891,15 @@
                 <w:b w:val="0"/>
                 <w:i w:val="0"/>
                 <w:color w:val="1F2937"/>
-                <w:sz w:val="18"/>
+                <w:sz w:val="16"/>
               </w:rPr>
-              <w:t>Capital efficiency</w:t>
+              <w:t>Avg. STX stacked per pot</w:t>
             </w:r>
           </w:p>
         </w:tc>
         <w:tc>
           <w:tcPr>
-            <w:tcW w:type="dxa" w:w="5904"/>
+            <w:tcW w:type="dxa" w:w="3168"/>
             <w:shd w:fill="F7FAFC" w:val="clear"/>
             <w:tcBorders>
               <w:top w:val="single" w:sz="4" w:space="0" w:color="CBD5E1"/>
@@ -6747,9 +6920,38 @@
                 <w:b w:val="0"/>
                 <w:i w:val="0"/>
                 <w:color w:val="1F2937"/>
-                <w:sz w:val="18"/>
+                <w:sz w:val="16"/>
               </w:rPr>
-              <w:t>500,000 STX committed once; returned and reused every cycle</w:t>
+              <w:t>—</w:t>
+            </w:r>
+          </w:p>
+        </w:tc>
+        <w:tc>
+          <w:tcPr>
+            <w:tcW w:type="dxa" w:w="3168"/>
+            <w:shd w:fill="F7FAFC" w:val="clear"/>
+            <w:tcBorders>
+              <w:top w:val="single" w:sz="4" w:space="0" w:color="CBD5E1"/>
+              <w:left w:val="single" w:sz="4" w:space="0" w:color="CBD5E1"/>
+              <w:bottom w:val="single" w:sz="4" w:space="0" w:color="CBD5E1"/>
+              <w:right w:val="single" w:sz="4" w:space="0" w:color="CBD5E1"/>
+            </w:tcBorders>
+          </w:tcPr>
+          <w:p>
+            <w:pPr>
+              <w:spacing w:before="40" w:after="40" w:lineRule="auto" w:line="240"/>
+              <w:jc w:val="left"/>
+            </w:pPr>
+            <w:r/>
+            <w:r>
+              <w:rPr>
+                <w:rFonts w:ascii="Calibri" w:hAnsi="Calibri" w:eastAsia="Calibri"/>
+                <w:b w:val="0"/>
+                <w:i w:val="0"/>
+                <w:color w:val="1F2937"/>
+                <w:sz w:val="16"/>
+              </w:rPr>
+              <w:t>~23,467 STX (5,397,500 ÷ 230)</w:t>
             </w:r>
           </w:p>
         </w:tc>
@@ -6757,7 +6959,7 @@
       <w:tr>
         <w:tc>
           <w:tcPr>
-            <w:tcW w:type="dxa" w:w="3456"/>
+            <w:tcW w:type="dxa" w:w="3168"/>
             <w:tcBorders>
               <w:top w:val="single" w:sz="4" w:space="0" w:color="CBD5E1"/>
               <w:left w:val="single" w:sz="4" w:space="0" w:color="CBD5E1"/>
@@ -6777,15 +6979,15 @@
                 <w:b w:val="0"/>
                 <w:i w:val="0"/>
                 <w:color w:val="1F2937"/>
-                <w:sz w:val="18"/>
+                <w:sz w:val="16"/>
               </w:rPr>
-              <w:t>Ecosystem impact</w:t>
+              <w:t>Avg. transactions per pot</w:t>
             </w:r>
           </w:p>
         </w:tc>
         <w:tc>
           <w:tcPr>
-            <w:tcW w:type="dxa" w:w="5904"/>
+            <w:tcW w:type="dxa" w:w="3168"/>
             <w:tcBorders>
               <w:top w:val="single" w:sz="4" w:space="0" w:color="CBD5E1"/>
               <w:left w:val="single" w:sz="4" w:space="0" w:color="CBD5E1"/>
@@ -6805,9 +7007,212 @@
                 <w:b w:val="0"/>
                 <w:i w:val="0"/>
                 <w:color w:val="1F2937"/>
-                <w:sz w:val="18"/>
+                <w:sz w:val="16"/>
+              </w:rPr>
+              <w:t>—</w:t>
+            </w:r>
+          </w:p>
+        </w:tc>
+        <w:tc>
+          <w:tcPr>
+            <w:tcW w:type="dxa" w:w="3168"/>
+            <w:tcBorders>
+              <w:top w:val="single" w:sz="4" w:space="0" w:color="CBD5E1"/>
+              <w:left w:val="single" w:sz="4" w:space="0" w:color="CBD5E1"/>
+              <w:bottom w:val="single" w:sz="4" w:space="0" w:color="CBD5E1"/>
+              <w:right w:val="single" w:sz="4" w:space="0" w:color="CBD5E1"/>
+            </w:tcBorders>
+          </w:tcPr>
+          <w:p>
+            <w:pPr>
+              <w:spacing w:before="40" w:after="40" w:lineRule="auto" w:line="240"/>
+              <w:jc w:val="left"/>
+            </w:pPr>
+            <w:r/>
+            <w:r>
+              <w:rPr>
+                <w:rFonts w:ascii="Calibri" w:hAnsi="Calibri" w:eastAsia="Calibri"/>
+                <w:b w:val="0"/>
+                <w:i w:val="0"/>
+                <w:color w:val="1F2937"/>
+                <w:sz w:val="16"/>
+              </w:rPr>
+              <w:t>~41 (9,520 ÷ 230)</w:t>
+            </w:r>
+          </w:p>
+        </w:tc>
+      </w:tr>
+      <w:tr>
+        <w:tc>
+          <w:tcPr>
+            <w:tcW w:type="dxa" w:w="3168"/>
+            <w:shd w:fill="F7FAFC" w:val="clear"/>
+            <w:tcBorders>
+              <w:top w:val="single" w:sz="4" w:space="0" w:color="CBD5E1"/>
+              <w:left w:val="single" w:sz="4" w:space="0" w:color="CBD5E1"/>
+              <w:bottom w:val="single" w:sz="4" w:space="0" w:color="CBD5E1"/>
+              <w:right w:val="single" w:sz="4" w:space="0" w:color="CBD5E1"/>
+            </w:tcBorders>
+          </w:tcPr>
+          <w:p>
+            <w:pPr>
+              <w:spacing w:before="40" w:after="40" w:lineRule="auto" w:line="240"/>
+              <w:jc w:val="center"/>
+            </w:pPr>
+            <w:r/>
+            <w:r>
+              <w:rPr>
+                <w:rFonts w:ascii="Calibri" w:hAnsi="Calibri" w:eastAsia="Calibri"/>
+                <w:b w:val="0"/>
+                <w:i w:val="0"/>
+                <w:color w:val="1F2937"/>
+                <w:sz w:val="16"/>
+              </w:rPr>
+              <w:t>Capital efficiency</w:t>
+            </w:r>
+          </w:p>
+        </w:tc>
+        <w:tc>
+          <w:tcPr>
+            <w:tcW w:type="dxa" w:w="3168"/>
+            <w:shd w:fill="F7FAFC" w:val="clear"/>
+            <w:tcBorders>
+              <w:top w:val="single" w:sz="4" w:space="0" w:color="CBD5E1"/>
+              <w:left w:val="single" w:sz="4" w:space="0" w:color="CBD5E1"/>
+              <w:bottom w:val="single" w:sz="4" w:space="0" w:color="CBD5E1"/>
+              <w:right w:val="single" w:sz="4" w:space="0" w:color="CBD5E1"/>
+            </w:tcBorders>
+          </w:tcPr>
+          <w:p>
+            <w:pPr>
+              <w:spacing w:before="40" w:after="40" w:lineRule="auto" w:line="240"/>
+              <w:jc w:val="left"/>
+            </w:pPr>
+            <w:r/>
+            <w:r>
+              <w:rPr>
+                <w:rFonts w:ascii="Calibri" w:hAnsi="Calibri" w:eastAsia="Calibri"/>
+                <w:b w:val="0"/>
+                <w:i w:val="0"/>
+                <w:color w:val="1F2937"/>
+                <w:sz w:val="16"/>
+              </w:rPr>
+              <w:t>500,000 STX committed once; reused every cycle</w:t>
+            </w:r>
+          </w:p>
+        </w:tc>
+        <w:tc>
+          <w:tcPr>
+            <w:tcW w:type="dxa" w:w="3168"/>
+            <w:shd w:fill="F7FAFC" w:val="clear"/>
+            <w:tcBorders>
+              <w:top w:val="single" w:sz="4" w:space="0" w:color="CBD5E1"/>
+              <w:left w:val="single" w:sz="4" w:space="0" w:color="CBD5E1"/>
+              <w:bottom w:val="single" w:sz="4" w:space="0" w:color="CBD5E1"/>
+              <w:right w:val="single" w:sz="4" w:space="0" w:color="CBD5E1"/>
+            </w:tcBorders>
+          </w:tcPr>
+          <w:p>
+            <w:pPr>
+              <w:spacing w:before="40" w:after="40" w:lineRule="auto" w:line="240"/>
+              <w:jc w:val="left"/>
+            </w:pPr>
+            <w:r/>
+            <w:r>
+              <w:rPr>
+                <w:rFonts w:ascii="Calibri" w:hAnsi="Calibri" w:eastAsia="Calibri"/>
+                <w:b w:val="0"/>
+                <w:i w:val="0"/>
+                <w:color w:val="1F2937"/>
+                <w:sz w:val="16"/>
+              </w:rPr>
+              <w:t>500,000 STX constant (reusable)</w:t>
+            </w:r>
+          </w:p>
+        </w:tc>
+      </w:tr>
+      <w:tr>
+        <w:tc>
+          <w:tcPr>
+            <w:tcW w:type="dxa" w:w="3168"/>
+            <w:tcBorders>
+              <w:top w:val="single" w:sz="4" w:space="0" w:color="CBD5E1"/>
+              <w:left w:val="single" w:sz="4" w:space="0" w:color="CBD5E1"/>
+              <w:bottom w:val="single" w:sz="4" w:space="0" w:color="CBD5E1"/>
+              <w:right w:val="single" w:sz="4" w:space="0" w:color="CBD5E1"/>
+            </w:tcBorders>
+          </w:tcPr>
+          <w:p>
+            <w:pPr>
+              <w:spacing w:before="40" w:after="40" w:lineRule="auto" w:line="240"/>
+              <w:jc w:val="center"/>
+            </w:pPr>
+            <w:r/>
+            <w:r>
+              <w:rPr>
+                <w:rFonts w:ascii="Calibri" w:hAnsi="Calibri" w:eastAsia="Calibri"/>
+                <w:b w:val="0"/>
+                <w:i w:val="0"/>
+                <w:color w:val="1F2937"/>
+                <w:sz w:val="16"/>
+              </w:rPr>
+              <w:t>Ecosystem impact</w:t>
+            </w:r>
+          </w:p>
+        </w:tc>
+        <w:tc>
+          <w:tcPr>
+            <w:tcW w:type="dxa" w:w="3168"/>
+            <w:tcBorders>
+              <w:top w:val="single" w:sz="4" w:space="0" w:color="CBD5E1"/>
+              <w:left w:val="single" w:sz="4" w:space="0" w:color="CBD5E1"/>
+              <w:bottom w:val="single" w:sz="4" w:space="0" w:color="CBD5E1"/>
+              <w:right w:val="single" w:sz="4" w:space="0" w:color="CBD5E1"/>
+            </w:tcBorders>
+          </w:tcPr>
+          <w:p>
+            <w:pPr>
+              <w:spacing w:before="40" w:after="40" w:lineRule="auto" w:line="240"/>
+              <w:jc w:val="left"/>
+            </w:pPr>
+            <w:r/>
+            <w:r>
+              <w:rPr>
+                <w:rFonts w:ascii="Calibri" w:hAnsi="Calibri" w:eastAsia="Calibri"/>
+                <w:b w:val="0"/>
+                <w:i w:val="0"/>
+                <w:color w:val="1F2937"/>
+                <w:sz w:val="16"/>
               </w:rPr>
               <w:t>Higher STX deposits, wallet activity, and Bitcoin DeFi awareness on Stacks</w:t>
+            </w:r>
+          </w:p>
+        </w:tc>
+        <w:tc>
+          <w:tcPr>
+            <w:tcW w:type="dxa" w:w="3168"/>
+            <w:tcBorders>
+              <w:top w:val="single" w:sz="4" w:space="0" w:color="CBD5E1"/>
+              <w:left w:val="single" w:sz="4" w:space="0" w:color="CBD5E1"/>
+              <w:bottom w:val="single" w:sz="4" w:space="0" w:color="CBD5E1"/>
+              <w:right w:val="single" w:sz="4" w:space="0" w:color="CBD5E1"/>
+            </w:tcBorders>
+          </w:tcPr>
+          <w:p>
+            <w:pPr>
+              <w:spacing w:before="40" w:after="40" w:lineRule="auto" w:line="240"/>
+              <w:jc w:val="left"/>
+            </w:pPr>
+            <w:r/>
+            <w:r>
+              <w:rPr>
+                <w:rFonts w:ascii="Calibri" w:hAnsi="Calibri" w:eastAsia="Calibri"/>
+                <w:b w:val="0"/>
+                <w:i w:val="0"/>
+                <w:color w:val="1F2937"/>
+                <w:sz w:val="16"/>
+              </w:rPr>
+              <w:t>—</w:t>
             </w:r>
           </w:p>
         </w:tc>

</xml_diff>

<commit_message>
Revert Expected Outcomes averages from PR #9
Restore the pre-averages Expected Outcomes table (Outcome | Target
only) in the markdown and Word proposal.

Co-authored-by: cryptosmith.btc <Zeus-Adin@users.noreply.github.com>
</commit_message>
<xml_diff>
--- a/StacksPot-Growth-Acceleration-Proposal.docx
+++ b/StacksPot-Growth-Acceleration-Proposal.docx
@@ -6335,14 +6335,13 @@
         <w:tblLook w:firstColumn="1" w:firstRow="1" w:lastColumn="0" w:lastRow="0" w:noHBand="0" w:noVBand="1" w:val="04A0"/>
       </w:tblPr>
       <w:tblGrid>
-        <w:gridCol w:w="3264"/>
-        <w:gridCol w:w="3264"/>
-        <w:gridCol w:w="3264"/>
+        <w:gridCol w:w="4896"/>
+        <w:gridCol w:w="4896"/>
       </w:tblGrid>
       <w:tr>
         <w:tc>
           <w:tcPr>
-            <w:tcW w:type="dxa" w:w="3168"/>
+            <w:tcW w:type="dxa" w:w="3456"/>
             <w:shd w:fill="1A365D" w:val="clear"/>
             <w:tcBorders>
               <w:top w:val="single" w:sz="4" w:space="0" w:color="1A365D"/>
@@ -6363,7 +6362,7 @@
                 <w:b/>
                 <w:i w:val="0"/>
                 <w:color w:val="FFFFFF"/>
-                <w:sz w:val="16"/>
+                <w:sz w:val="18"/>
               </w:rPr>
               <w:t>Outcome</w:t>
             </w:r>
@@ -6371,7 +6370,7 @@
         </w:tc>
         <w:tc>
           <w:tcPr>
-            <w:tcW w:type="dxa" w:w="3168"/>
+            <w:tcW w:type="dxa" w:w="5904"/>
             <w:shd w:fill="1A365D" w:val="clear"/>
             <w:tcBorders>
               <w:top w:val="single" w:sz="4" w:space="0" w:color="1A365D"/>
@@ -6392,38 +6391,9 @@
                 <w:b/>
                 <w:i w:val="0"/>
                 <w:color w:val="FFFFFF"/>
-                <w:sz w:val="16"/>
+                <w:sz w:val="18"/>
               </w:rPr>
-              <w:t>Program Target</w:t>
-            </w:r>
-          </w:p>
-        </w:tc>
-        <w:tc>
-          <w:tcPr>
-            <w:tcW w:type="dxa" w:w="3168"/>
-            <w:shd w:fill="1A365D" w:val="clear"/>
-            <w:tcBorders>
-              <w:top w:val="single" w:sz="4" w:space="0" w:color="1A365D"/>
-              <w:left w:val="single" w:sz="4" w:space="0" w:color="1A365D"/>
-              <w:bottom w:val="single" w:sz="4" w:space="0" w:color="1A365D"/>
-              <w:right w:val="single" w:sz="4" w:space="0" w:color="1A365D"/>
-            </w:tcBorders>
-          </w:tcPr>
-          <w:p>
-            <w:pPr>
-              <w:spacing w:before="40" w:after="40" w:lineRule="auto" w:line="240"/>
-              <w:jc w:val="center"/>
-            </w:pPr>
-            <w:r/>
-            <w:r>
-              <w:rPr>
-                <w:rFonts w:ascii="Calibri" w:hAnsi="Calibri" w:eastAsia="Calibri"/>
-                <w:b/>
-                <w:i w:val="0"/>
-                <w:color w:val="FFFFFF"/>
-                <w:sz w:val="16"/>
-              </w:rPr>
-              <w:t>Average</w:t>
+              <w:t>Target</w:t>
             </w:r>
           </w:p>
         </w:tc>
@@ -6431,7 +6401,7 @@
       <w:tr>
         <w:tc>
           <w:tcPr>
-            <w:tcW w:type="dxa" w:w="3168"/>
+            <w:tcW w:type="dxa" w:w="3456"/>
             <w:tcBorders>
               <w:top w:val="single" w:sz="4" w:space="0" w:color="CBD5E1"/>
               <w:left w:val="single" w:sz="4" w:space="0" w:color="CBD5E1"/>
@@ -6451,7 +6421,7 @@
                 <w:b w:val="0"/>
                 <w:i w:val="0"/>
                 <w:color w:val="1F2937"/>
-                <w:sz w:val="16"/>
+                <w:sz w:val="18"/>
               </w:rPr>
               <w:t>Sponsored pots delivered</w:t>
             </w:r>
@@ -6459,7 +6429,7 @@
         </w:tc>
         <w:tc>
           <w:tcPr>
-            <w:tcW w:type="dxa" w:w="3168"/>
+            <w:tcW w:type="dxa" w:w="5904"/>
             <w:tcBorders>
               <w:top w:val="single" w:sz="4" w:space="0" w:color="CBD5E1"/>
               <w:left w:val="single" w:sz="4" w:space="0" w:color="CBD5E1"/>
@@ -6479,15 +6449,47 @@
                 <w:b w:val="0"/>
                 <w:i w:val="0"/>
                 <w:color w:val="1F2937"/>
-                <w:sz w:val="16"/>
+                <w:sz w:val="18"/>
               </w:rPr>
               <w:t>230 (23 / cycle × 10 cycles)</w:t>
             </w:r>
           </w:p>
         </w:tc>
+      </w:tr>
+      <w:tr>
         <w:tc>
           <w:tcPr>
-            <w:tcW w:type="dxa" w:w="3168"/>
+            <w:tcW w:type="dxa" w:w="3456"/>
+            <w:shd w:fill="EEF2F7" w:val="clear"/>
+            <w:tcBorders>
+              <w:top w:val="single" w:sz="4" w:space="0" w:color="CBD5E1"/>
+              <w:left w:val="single" w:sz="4" w:space="0" w:color="CBD5E1"/>
+              <w:bottom w:val="single" w:sz="4" w:space="0" w:color="CBD5E1"/>
+              <w:right w:val="single" w:sz="4" w:space="0" w:color="CBD5E1"/>
+            </w:tcBorders>
+          </w:tcPr>
+          <w:p>
+            <w:pPr>
+              <w:spacing w:before="40" w:after="40" w:lineRule="auto" w:line="240"/>
+              <w:jc w:val="center"/>
+            </w:pPr>
+            <w:r/>
+            <w:r>
+              <w:rPr>
+                <w:rFonts w:ascii="Calibri" w:hAnsi="Calibri" w:eastAsia="Calibri"/>
+                <w:b/>
+                <w:i w:val="0"/>
+                <w:color w:val="1A365D"/>
+                <w:sz w:val="18"/>
+              </w:rPr>
+              <w:t>Minimum participants (program)</w:t>
+            </w:r>
+          </w:p>
+        </w:tc>
+        <w:tc>
+          <w:tcPr>
+            <w:tcW w:type="dxa" w:w="5904"/>
+            <w:shd w:fill="EEF2F7" w:val="clear"/>
             <w:tcBorders>
               <w:top w:val="single" w:sz="4" w:space="0" w:color="CBD5E1"/>
               <w:left w:val="single" w:sz="4" w:space="0" w:color="CBD5E1"/>
@@ -6504,12 +6506,12 @@
             <w:r>
               <w:rPr>
                 <w:rFonts w:ascii="Calibri" w:hAnsi="Calibri" w:eastAsia="Calibri"/>
-                <w:b w:val="0"/>
+                <w:b/>
                 <w:i w:val="0"/>
-                <w:color w:val="1F2937"/>
-                <w:sz w:val="16"/>
+                <w:color w:val="1A365D"/>
+                <w:sz w:val="18"/>
               </w:rPr>
-              <w:t>23 / cycle · 46 / month</w:t>
+              <w:t>8,600 (2,500 + 6,000 + 100)</w:t>
             </w:r>
           </w:p>
         </w:tc>
@@ -6517,7 +6519,67 @@
       <w:tr>
         <w:tc>
           <w:tcPr>
-            <w:tcW w:type="dxa" w:w="3168"/>
+            <w:tcW w:type="dxa" w:w="3456"/>
+            <w:shd w:fill="EEF2F7" w:val="clear"/>
+            <w:tcBorders>
+              <w:top w:val="single" w:sz="4" w:space="0" w:color="CBD5E1"/>
+              <w:left w:val="single" w:sz="4" w:space="0" w:color="CBD5E1"/>
+              <w:bottom w:val="single" w:sz="4" w:space="0" w:color="CBD5E1"/>
+              <w:right w:val="single" w:sz="4" w:space="0" w:color="CBD5E1"/>
+            </w:tcBorders>
+          </w:tcPr>
+          <w:p>
+            <w:pPr>
+              <w:spacing w:before="40" w:after="40" w:lineRule="auto" w:line="240"/>
+              <w:jc w:val="center"/>
+            </w:pPr>
+            <w:r/>
+            <w:r>
+              <w:rPr>
+                <w:rFonts w:ascii="Calibri" w:hAnsi="Calibri" w:eastAsia="Calibri"/>
+                <w:b/>
+                <w:i w:val="0"/>
+                <w:color w:val="1A365D"/>
+                <w:sz w:val="18"/>
+              </w:rPr>
+              <w:t>Total STX stacked (min. pot target + boost)</w:t>
+            </w:r>
+          </w:p>
+        </w:tc>
+        <w:tc>
+          <w:tcPr>
+            <w:tcW w:type="dxa" w:w="5904"/>
+            <w:shd w:fill="EEF2F7" w:val="clear"/>
+            <w:tcBorders>
+              <w:top w:val="single" w:sz="4" w:space="0" w:color="CBD5E1"/>
+              <w:left w:val="single" w:sz="4" w:space="0" w:color="CBD5E1"/>
+              <w:bottom w:val="single" w:sz="4" w:space="0" w:color="CBD5E1"/>
+              <w:right w:val="single" w:sz="4" w:space="0" w:color="CBD5E1"/>
+            </w:tcBorders>
+          </w:tcPr>
+          <w:p>
+            <w:pPr>
+              <w:spacing w:before="40" w:after="40" w:lineRule="auto" w:line="240"/>
+              <w:jc w:val="left"/>
+            </w:pPr>
+            <w:r/>
+            <w:r>
+              <w:rPr>
+                <w:rFonts w:ascii="Calibri" w:hAnsi="Calibri" w:eastAsia="Calibri"/>
+                <w:b/>
+                <w:i w:val="0"/>
+                <w:color w:val="1A365D"/>
+                <w:sz w:val="18"/>
+              </w:rPr>
+              <w:t>5,397,500 STX (1,062,500 + 3,300,000 + 1,035,000)</w:t>
+            </w:r>
+          </w:p>
+        </w:tc>
+      </w:tr>
+      <w:tr>
+        <w:tc>
+          <w:tcPr>
+            <w:tcW w:type="dxa" w:w="3456"/>
             <w:shd w:fill="F7FAFC" w:val="clear"/>
             <w:tcBorders>
               <w:top w:val="single" w:sz="4" w:space="0" w:color="CBD5E1"/>
@@ -6538,15 +6600,15 @@
                 <w:b w:val="0"/>
                 <w:i w:val="0"/>
                 <w:color w:val="1F2937"/>
-                <w:sz w:val="16"/>
+                <w:sz w:val="18"/>
               </w:rPr>
-              <w:t>Minimum participants</w:t>
+              <w:t>On-chain transactions (minimum)</w:t>
             </w:r>
           </w:p>
         </w:tc>
         <w:tc>
           <w:tcPr>
-            <w:tcW w:type="dxa" w:w="3168"/>
+            <w:tcW w:type="dxa" w:w="5904"/>
             <w:shd w:fill="F7FAFC" w:val="clear"/>
             <w:tcBorders>
               <w:top w:val="single" w:sz="4" w:space="0" w:color="CBD5E1"/>
@@ -6567,15 +6629,104 @@
                 <w:b w:val="0"/>
                 <w:i w:val="0"/>
                 <w:color w:val="1F2937"/>
-                <w:sz w:val="16"/>
+                <w:sz w:val="18"/>
               </w:rPr>
-              <w:t>8,600 (2,500 + 6,000 + 100)</w:t>
+              <w:t>9,520 (920 lifecycle + 8,600 joins)</w:t>
+            </w:r>
+          </w:p>
+        </w:tc>
+      </w:tr>
+      <w:tr>
+        <w:tc>
+          <w:tcPr>
+            <w:tcW w:type="dxa" w:w="3456"/>
+            <w:tcBorders>
+              <w:top w:val="single" w:sz="4" w:space="0" w:color="CBD5E1"/>
+              <w:left w:val="single" w:sz="4" w:space="0" w:color="CBD5E1"/>
+              <w:bottom w:val="single" w:sz="4" w:space="0" w:color="CBD5E1"/>
+              <w:right w:val="single" w:sz="4" w:space="0" w:color="CBD5E1"/>
+            </w:tcBorders>
+          </w:tcPr>
+          <w:p>
+            <w:pPr>
+              <w:spacing w:before="40" w:after="40" w:lineRule="auto" w:line="240"/>
+              <w:jc w:val="center"/>
+            </w:pPr>
+            <w:r/>
+            <w:r>
+              <w:rPr>
+                <w:rFonts w:ascii="Calibri" w:hAnsi="Calibri" w:eastAsia="Calibri"/>
+                <w:b w:val="0"/>
+                <w:i w:val="0"/>
+                <w:color w:val="1F2937"/>
+                <w:sz w:val="18"/>
+              </w:rPr>
+              <w:t>Monthly throughput</w:t>
             </w:r>
           </w:p>
         </w:tc>
         <w:tc>
           <w:tcPr>
-            <w:tcW w:type="dxa" w:w="3168"/>
+            <w:tcW w:type="dxa" w:w="5904"/>
+            <w:tcBorders>
+              <w:top w:val="single" w:sz="4" w:space="0" w:color="CBD5E1"/>
+              <w:left w:val="single" w:sz="4" w:space="0" w:color="CBD5E1"/>
+              <w:bottom w:val="single" w:sz="4" w:space="0" w:color="CBD5E1"/>
+              <w:right w:val="single" w:sz="4" w:space="0" w:color="CBD5E1"/>
+            </w:tcBorders>
+          </w:tcPr>
+          <w:p>
+            <w:pPr>
+              <w:spacing w:before="40" w:after="40" w:lineRule="auto" w:line="240"/>
+              <w:jc w:val="left"/>
+            </w:pPr>
+            <w:r/>
+            <w:r>
+              <w:rPr>
+                <w:rFonts w:ascii="Calibri" w:hAnsi="Calibri" w:eastAsia="Calibri"/>
+                <w:b w:val="0"/>
+                <w:i w:val="0"/>
+                <w:color w:val="1F2937"/>
+                <w:sz w:val="18"/>
+              </w:rPr>
+              <w:t>46 pots / month · 1,720 min. participants · 2 cycles</w:t>
+            </w:r>
+          </w:p>
+        </w:tc>
+      </w:tr>
+      <w:tr>
+        <w:tc>
+          <w:tcPr>
+            <w:tcW w:type="dxa" w:w="3456"/>
+            <w:shd w:fill="F7FAFC" w:val="clear"/>
+            <w:tcBorders>
+              <w:top w:val="single" w:sz="4" w:space="0" w:color="CBD5E1"/>
+              <w:left w:val="single" w:sz="4" w:space="0" w:color="CBD5E1"/>
+              <w:bottom w:val="single" w:sz="4" w:space="0" w:color="CBD5E1"/>
+              <w:right w:val="single" w:sz="4" w:space="0" w:color="CBD5E1"/>
+            </w:tcBorders>
+          </w:tcPr>
+          <w:p>
+            <w:pPr>
+              <w:spacing w:before="40" w:after="40" w:lineRule="auto" w:line="240"/>
+              <w:jc w:val="center"/>
+            </w:pPr>
+            <w:r/>
+            <w:r>
+              <w:rPr>
+                <w:rFonts w:ascii="Calibri" w:hAnsi="Calibri" w:eastAsia="Calibri"/>
+                <w:b w:val="0"/>
+                <w:i w:val="0"/>
+                <w:color w:val="1F2937"/>
+                <w:sz w:val="18"/>
+              </w:rPr>
+              <w:t>Capital efficiency</w:t>
+            </w:r>
+          </w:p>
+        </w:tc>
+        <w:tc>
+          <w:tcPr>
+            <w:tcW w:type="dxa" w:w="5904"/>
             <w:shd w:fill="F7FAFC" w:val="clear"/>
             <w:tcBorders>
               <w:top w:val="single" w:sz="4" w:space="0" w:color="CBD5E1"/>
@@ -6596,9 +6747,9 @@
                 <w:b w:val="0"/>
                 <w:i w:val="0"/>
                 <w:color w:val="1F2937"/>
-                <w:sz w:val="16"/>
+                <w:sz w:val="18"/>
               </w:rPr>
-              <w:t>860 / cycle · 1,720 / month</w:t>
+              <w:t>500,000 STX committed once; returned and reused every cycle</w:t>
             </w:r>
           </w:p>
         </w:tc>
@@ -6606,97 +6757,7 @@
       <w:tr>
         <w:tc>
           <w:tcPr>
-            <w:tcW w:type="dxa" w:w="3168"/>
-            <w:shd w:fill="EEF2F7" w:val="clear"/>
-            <w:tcBorders>
-              <w:top w:val="single" w:sz="4" w:space="0" w:color="CBD5E1"/>
-              <w:left w:val="single" w:sz="4" w:space="0" w:color="CBD5E1"/>
-              <w:bottom w:val="single" w:sz="4" w:space="0" w:color="CBD5E1"/>
-              <w:right w:val="single" w:sz="4" w:space="0" w:color="CBD5E1"/>
-            </w:tcBorders>
-          </w:tcPr>
-          <w:p>
-            <w:pPr>
-              <w:spacing w:before="40" w:after="40" w:lineRule="auto" w:line="240"/>
-              <w:jc w:val="center"/>
-            </w:pPr>
-            <w:r/>
-            <w:r>
-              <w:rPr>
-                <w:rFonts w:ascii="Calibri" w:hAnsi="Calibri" w:eastAsia="Calibri"/>
-                <w:b/>
-                <w:i w:val="0"/>
-                <w:color w:val="1A365D"/>
-                <w:sz w:val="16"/>
-              </w:rPr>
-              <w:t>Total STX stacked (pot target + boost)</w:t>
-            </w:r>
-          </w:p>
-        </w:tc>
-        <w:tc>
-          <w:tcPr>
-            <w:tcW w:type="dxa" w:w="3168"/>
-            <w:shd w:fill="EEF2F7" w:val="clear"/>
-            <w:tcBorders>
-              <w:top w:val="single" w:sz="4" w:space="0" w:color="CBD5E1"/>
-              <w:left w:val="single" w:sz="4" w:space="0" w:color="CBD5E1"/>
-              <w:bottom w:val="single" w:sz="4" w:space="0" w:color="CBD5E1"/>
-              <w:right w:val="single" w:sz="4" w:space="0" w:color="CBD5E1"/>
-            </w:tcBorders>
-          </w:tcPr>
-          <w:p>
-            <w:pPr>
-              <w:spacing w:before="40" w:after="40" w:lineRule="auto" w:line="240"/>
-              <w:jc w:val="left"/>
-            </w:pPr>
-            <w:r/>
-            <w:r>
-              <w:rPr>
-                <w:rFonts w:ascii="Calibri" w:hAnsi="Calibri" w:eastAsia="Calibri"/>
-                <w:b/>
-                <w:i w:val="0"/>
-                <w:color w:val="1A365D"/>
-                <w:sz w:val="16"/>
-              </w:rPr>
-              <w:t>5,397,500 STX</w:t>
-            </w:r>
-          </w:p>
-        </w:tc>
-        <w:tc>
-          <w:tcPr>
-            <w:tcW w:type="dxa" w:w="3168"/>
-            <w:shd w:fill="EEF2F7" w:val="clear"/>
-            <w:tcBorders>
-              <w:top w:val="single" w:sz="4" w:space="0" w:color="CBD5E1"/>
-              <w:left w:val="single" w:sz="4" w:space="0" w:color="CBD5E1"/>
-              <w:bottom w:val="single" w:sz="4" w:space="0" w:color="CBD5E1"/>
-              <w:right w:val="single" w:sz="4" w:space="0" w:color="CBD5E1"/>
-            </w:tcBorders>
-          </w:tcPr>
-          <w:p>
-            <w:pPr>
-              <w:spacing w:before="40" w:after="40" w:lineRule="auto" w:line="240"/>
-              <w:jc w:val="left"/>
-            </w:pPr>
-            <w:r/>
-            <w:r>
-              <w:rPr>
-                <w:rFonts w:ascii="Calibri" w:hAnsi="Calibri" w:eastAsia="Calibri"/>
-                <w:b/>
-                <w:i w:val="0"/>
-                <w:color w:val="1A365D"/>
-                <w:sz w:val="16"/>
-              </w:rPr>
-              <w:t>539,750 STX / cycle · 1,079,500 STX / month</w:t>
-            </w:r>
-          </w:p>
-        </w:tc>
-      </w:tr>
-      <w:tr>
-        <w:tc>
-          <w:tcPr>
-            <w:tcW w:type="dxa" w:w="3168"/>
-            <w:shd w:fill="F7FAFC" w:val="clear"/>
+            <w:tcW w:type="dxa" w:w="3456"/>
             <w:tcBorders>
               <w:top w:val="single" w:sz="4" w:space="0" w:color="CBD5E1"/>
               <w:left w:val="single" w:sz="4" w:space="0" w:color="CBD5E1"/>
@@ -6716,16 +6777,15 @@
                 <w:b w:val="0"/>
                 <w:i w:val="0"/>
                 <w:color w:val="1F2937"/>
-                <w:sz w:val="16"/>
+                <w:sz w:val="18"/>
               </w:rPr>
-              <w:t>On-chain transactions (minimum)</w:t>
+              <w:t>Ecosystem impact</w:t>
             </w:r>
           </w:p>
         </w:tc>
         <w:tc>
           <w:tcPr>
-            <w:tcW w:type="dxa" w:w="3168"/>
-            <w:shd w:fill="F7FAFC" w:val="clear"/>
+            <w:tcW w:type="dxa" w:w="5904"/>
             <w:tcBorders>
               <w:top w:val="single" w:sz="4" w:space="0" w:color="CBD5E1"/>
               <w:left w:val="single" w:sz="4" w:space="0" w:color="CBD5E1"/>
@@ -6745,474 +6805,9 @@
                 <w:b w:val="0"/>
                 <w:i w:val="0"/>
                 <w:color w:val="1F2937"/>
-                <w:sz w:val="16"/>
-              </w:rPr>
-              <w:t>9,520 (920 lifecycle + 8,600 joins)</w:t>
-            </w:r>
-          </w:p>
-        </w:tc>
-        <w:tc>
-          <w:tcPr>
-            <w:tcW w:type="dxa" w:w="3168"/>
-            <w:shd w:fill="F7FAFC" w:val="clear"/>
-            <w:tcBorders>
-              <w:top w:val="single" w:sz="4" w:space="0" w:color="CBD5E1"/>
-              <w:left w:val="single" w:sz="4" w:space="0" w:color="CBD5E1"/>
-              <w:bottom w:val="single" w:sz="4" w:space="0" w:color="CBD5E1"/>
-              <w:right w:val="single" w:sz="4" w:space="0" w:color="CBD5E1"/>
-            </w:tcBorders>
-          </w:tcPr>
-          <w:p>
-            <w:pPr>
-              <w:spacing w:before="40" w:after="40" w:lineRule="auto" w:line="240"/>
-              <w:jc w:val="left"/>
-            </w:pPr>
-            <w:r/>
-            <w:r>
-              <w:rPr>
-                <w:rFonts w:ascii="Calibri" w:hAnsi="Calibri" w:eastAsia="Calibri"/>
-                <w:b w:val="0"/>
-                <w:i w:val="0"/>
-                <w:color w:val="1F2937"/>
-                <w:sz w:val="16"/>
-              </w:rPr>
-              <w:t>952 / cycle · 1,904 / month</w:t>
-            </w:r>
-          </w:p>
-        </w:tc>
-      </w:tr>
-      <w:tr>
-        <w:tc>
-          <w:tcPr>
-            <w:tcW w:type="dxa" w:w="3168"/>
-            <w:tcBorders>
-              <w:top w:val="single" w:sz="4" w:space="0" w:color="CBD5E1"/>
-              <w:left w:val="single" w:sz="4" w:space="0" w:color="CBD5E1"/>
-              <w:bottom w:val="single" w:sz="4" w:space="0" w:color="CBD5E1"/>
-              <w:right w:val="single" w:sz="4" w:space="0" w:color="CBD5E1"/>
-            </w:tcBorders>
-          </w:tcPr>
-          <w:p>
-            <w:pPr>
-              <w:spacing w:before="40" w:after="40" w:lineRule="auto" w:line="240"/>
-              <w:jc w:val="center"/>
-            </w:pPr>
-            <w:r/>
-            <w:r>
-              <w:rPr>
-                <w:rFonts w:ascii="Calibri" w:hAnsi="Calibri" w:eastAsia="Calibri"/>
-                <w:b w:val="0"/>
-                <w:i w:val="0"/>
-                <w:color w:val="1F2937"/>
-                <w:sz w:val="16"/>
-              </w:rPr>
-              <w:t>Avg. participants per pot</w:t>
-            </w:r>
-          </w:p>
-        </w:tc>
-        <w:tc>
-          <w:tcPr>
-            <w:tcW w:type="dxa" w:w="3168"/>
-            <w:tcBorders>
-              <w:top w:val="single" w:sz="4" w:space="0" w:color="CBD5E1"/>
-              <w:left w:val="single" w:sz="4" w:space="0" w:color="CBD5E1"/>
-              <w:bottom w:val="single" w:sz="4" w:space="0" w:color="CBD5E1"/>
-              <w:right w:val="single" w:sz="4" w:space="0" w:color="CBD5E1"/>
-            </w:tcBorders>
-          </w:tcPr>
-          <w:p>
-            <w:pPr>
-              <w:spacing w:before="40" w:after="40" w:lineRule="auto" w:line="240"/>
-              <w:jc w:val="left"/>
-            </w:pPr>
-            <w:r/>
-            <w:r>
-              <w:rPr>
-                <w:rFonts w:ascii="Calibri" w:hAnsi="Calibri" w:eastAsia="Calibri"/>
-                <w:b w:val="0"/>
-                <w:i w:val="0"/>
-                <w:color w:val="1F2937"/>
-                <w:sz w:val="16"/>
-              </w:rPr>
-              <w:t>—</w:t>
-            </w:r>
-          </w:p>
-        </w:tc>
-        <w:tc>
-          <w:tcPr>
-            <w:tcW w:type="dxa" w:w="3168"/>
-            <w:tcBorders>
-              <w:top w:val="single" w:sz="4" w:space="0" w:color="CBD5E1"/>
-              <w:left w:val="single" w:sz="4" w:space="0" w:color="CBD5E1"/>
-              <w:bottom w:val="single" w:sz="4" w:space="0" w:color="CBD5E1"/>
-              <w:right w:val="single" w:sz="4" w:space="0" w:color="CBD5E1"/>
-            </w:tcBorders>
-          </w:tcPr>
-          <w:p>
-            <w:pPr>
-              <w:spacing w:before="40" w:after="40" w:lineRule="auto" w:line="240"/>
-              <w:jc w:val="left"/>
-            </w:pPr>
-            <w:r/>
-            <w:r>
-              <w:rPr>
-                <w:rFonts w:ascii="Calibri" w:hAnsi="Calibri" w:eastAsia="Calibri"/>
-                <w:b w:val="0"/>
-                <w:i w:val="0"/>
-                <w:color w:val="1F2937"/>
-                <w:sz w:val="16"/>
-              </w:rPr>
-              <w:t>~37 (8,600 ÷ 230)</w:t>
-            </w:r>
-          </w:p>
-        </w:tc>
-      </w:tr>
-      <w:tr>
-        <w:tc>
-          <w:tcPr>
-            <w:tcW w:type="dxa" w:w="3168"/>
-            <w:shd w:fill="F7FAFC" w:val="clear"/>
-            <w:tcBorders>
-              <w:top w:val="single" w:sz="4" w:space="0" w:color="CBD5E1"/>
-              <w:left w:val="single" w:sz="4" w:space="0" w:color="CBD5E1"/>
-              <w:bottom w:val="single" w:sz="4" w:space="0" w:color="CBD5E1"/>
-              <w:right w:val="single" w:sz="4" w:space="0" w:color="CBD5E1"/>
-            </w:tcBorders>
-          </w:tcPr>
-          <w:p>
-            <w:pPr>
-              <w:spacing w:before="40" w:after="40" w:lineRule="auto" w:line="240"/>
-              <w:jc w:val="center"/>
-            </w:pPr>
-            <w:r/>
-            <w:r>
-              <w:rPr>
-                <w:rFonts w:ascii="Calibri" w:hAnsi="Calibri" w:eastAsia="Calibri"/>
-                <w:b w:val="0"/>
-                <w:i w:val="0"/>
-                <w:color w:val="1F2937"/>
-                <w:sz w:val="16"/>
-              </w:rPr>
-              <w:t>Avg. STX stacked per pot</w:t>
-            </w:r>
-          </w:p>
-        </w:tc>
-        <w:tc>
-          <w:tcPr>
-            <w:tcW w:type="dxa" w:w="3168"/>
-            <w:shd w:fill="F7FAFC" w:val="clear"/>
-            <w:tcBorders>
-              <w:top w:val="single" w:sz="4" w:space="0" w:color="CBD5E1"/>
-              <w:left w:val="single" w:sz="4" w:space="0" w:color="CBD5E1"/>
-              <w:bottom w:val="single" w:sz="4" w:space="0" w:color="CBD5E1"/>
-              <w:right w:val="single" w:sz="4" w:space="0" w:color="CBD5E1"/>
-            </w:tcBorders>
-          </w:tcPr>
-          <w:p>
-            <w:pPr>
-              <w:spacing w:before="40" w:after="40" w:lineRule="auto" w:line="240"/>
-              <w:jc w:val="left"/>
-            </w:pPr>
-            <w:r/>
-            <w:r>
-              <w:rPr>
-                <w:rFonts w:ascii="Calibri" w:hAnsi="Calibri" w:eastAsia="Calibri"/>
-                <w:b w:val="0"/>
-                <w:i w:val="0"/>
-                <w:color w:val="1F2937"/>
-                <w:sz w:val="16"/>
-              </w:rPr>
-              <w:t>—</w:t>
-            </w:r>
-          </w:p>
-        </w:tc>
-        <w:tc>
-          <w:tcPr>
-            <w:tcW w:type="dxa" w:w="3168"/>
-            <w:shd w:fill="F7FAFC" w:val="clear"/>
-            <w:tcBorders>
-              <w:top w:val="single" w:sz="4" w:space="0" w:color="CBD5E1"/>
-              <w:left w:val="single" w:sz="4" w:space="0" w:color="CBD5E1"/>
-              <w:bottom w:val="single" w:sz="4" w:space="0" w:color="CBD5E1"/>
-              <w:right w:val="single" w:sz="4" w:space="0" w:color="CBD5E1"/>
-            </w:tcBorders>
-          </w:tcPr>
-          <w:p>
-            <w:pPr>
-              <w:spacing w:before="40" w:after="40" w:lineRule="auto" w:line="240"/>
-              <w:jc w:val="left"/>
-            </w:pPr>
-            <w:r/>
-            <w:r>
-              <w:rPr>
-                <w:rFonts w:ascii="Calibri" w:hAnsi="Calibri" w:eastAsia="Calibri"/>
-                <w:b w:val="0"/>
-                <w:i w:val="0"/>
-                <w:color w:val="1F2937"/>
-                <w:sz w:val="16"/>
-              </w:rPr>
-              <w:t>~23,467 STX (5,397,500 ÷ 230)</w:t>
-            </w:r>
-          </w:p>
-        </w:tc>
-      </w:tr>
-      <w:tr>
-        <w:tc>
-          <w:tcPr>
-            <w:tcW w:type="dxa" w:w="3168"/>
-            <w:tcBorders>
-              <w:top w:val="single" w:sz="4" w:space="0" w:color="CBD5E1"/>
-              <w:left w:val="single" w:sz="4" w:space="0" w:color="CBD5E1"/>
-              <w:bottom w:val="single" w:sz="4" w:space="0" w:color="CBD5E1"/>
-              <w:right w:val="single" w:sz="4" w:space="0" w:color="CBD5E1"/>
-            </w:tcBorders>
-          </w:tcPr>
-          <w:p>
-            <w:pPr>
-              <w:spacing w:before="40" w:after="40" w:lineRule="auto" w:line="240"/>
-              <w:jc w:val="center"/>
-            </w:pPr>
-            <w:r/>
-            <w:r>
-              <w:rPr>
-                <w:rFonts w:ascii="Calibri" w:hAnsi="Calibri" w:eastAsia="Calibri"/>
-                <w:b w:val="0"/>
-                <w:i w:val="0"/>
-                <w:color w:val="1F2937"/>
-                <w:sz w:val="16"/>
-              </w:rPr>
-              <w:t>Avg. transactions per pot</w:t>
-            </w:r>
-          </w:p>
-        </w:tc>
-        <w:tc>
-          <w:tcPr>
-            <w:tcW w:type="dxa" w:w="3168"/>
-            <w:tcBorders>
-              <w:top w:val="single" w:sz="4" w:space="0" w:color="CBD5E1"/>
-              <w:left w:val="single" w:sz="4" w:space="0" w:color="CBD5E1"/>
-              <w:bottom w:val="single" w:sz="4" w:space="0" w:color="CBD5E1"/>
-              <w:right w:val="single" w:sz="4" w:space="0" w:color="CBD5E1"/>
-            </w:tcBorders>
-          </w:tcPr>
-          <w:p>
-            <w:pPr>
-              <w:spacing w:before="40" w:after="40" w:lineRule="auto" w:line="240"/>
-              <w:jc w:val="left"/>
-            </w:pPr>
-            <w:r/>
-            <w:r>
-              <w:rPr>
-                <w:rFonts w:ascii="Calibri" w:hAnsi="Calibri" w:eastAsia="Calibri"/>
-                <w:b w:val="0"/>
-                <w:i w:val="0"/>
-                <w:color w:val="1F2937"/>
-                <w:sz w:val="16"/>
-              </w:rPr>
-              <w:t>—</w:t>
-            </w:r>
-          </w:p>
-        </w:tc>
-        <w:tc>
-          <w:tcPr>
-            <w:tcW w:type="dxa" w:w="3168"/>
-            <w:tcBorders>
-              <w:top w:val="single" w:sz="4" w:space="0" w:color="CBD5E1"/>
-              <w:left w:val="single" w:sz="4" w:space="0" w:color="CBD5E1"/>
-              <w:bottom w:val="single" w:sz="4" w:space="0" w:color="CBD5E1"/>
-              <w:right w:val="single" w:sz="4" w:space="0" w:color="CBD5E1"/>
-            </w:tcBorders>
-          </w:tcPr>
-          <w:p>
-            <w:pPr>
-              <w:spacing w:before="40" w:after="40" w:lineRule="auto" w:line="240"/>
-              <w:jc w:val="left"/>
-            </w:pPr>
-            <w:r/>
-            <w:r>
-              <w:rPr>
-                <w:rFonts w:ascii="Calibri" w:hAnsi="Calibri" w:eastAsia="Calibri"/>
-                <w:b w:val="0"/>
-                <w:i w:val="0"/>
-                <w:color w:val="1F2937"/>
-                <w:sz w:val="16"/>
-              </w:rPr>
-              <w:t>~41 (9,520 ÷ 230)</w:t>
-            </w:r>
-          </w:p>
-        </w:tc>
-      </w:tr>
-      <w:tr>
-        <w:tc>
-          <w:tcPr>
-            <w:tcW w:type="dxa" w:w="3168"/>
-            <w:shd w:fill="F7FAFC" w:val="clear"/>
-            <w:tcBorders>
-              <w:top w:val="single" w:sz="4" w:space="0" w:color="CBD5E1"/>
-              <w:left w:val="single" w:sz="4" w:space="0" w:color="CBD5E1"/>
-              <w:bottom w:val="single" w:sz="4" w:space="0" w:color="CBD5E1"/>
-              <w:right w:val="single" w:sz="4" w:space="0" w:color="CBD5E1"/>
-            </w:tcBorders>
-          </w:tcPr>
-          <w:p>
-            <w:pPr>
-              <w:spacing w:before="40" w:after="40" w:lineRule="auto" w:line="240"/>
-              <w:jc w:val="center"/>
-            </w:pPr>
-            <w:r/>
-            <w:r>
-              <w:rPr>
-                <w:rFonts w:ascii="Calibri" w:hAnsi="Calibri" w:eastAsia="Calibri"/>
-                <w:b w:val="0"/>
-                <w:i w:val="0"/>
-                <w:color w:val="1F2937"/>
-                <w:sz w:val="16"/>
-              </w:rPr>
-              <w:t>Capital efficiency</w:t>
-            </w:r>
-          </w:p>
-        </w:tc>
-        <w:tc>
-          <w:tcPr>
-            <w:tcW w:type="dxa" w:w="3168"/>
-            <w:shd w:fill="F7FAFC" w:val="clear"/>
-            <w:tcBorders>
-              <w:top w:val="single" w:sz="4" w:space="0" w:color="CBD5E1"/>
-              <w:left w:val="single" w:sz="4" w:space="0" w:color="CBD5E1"/>
-              <w:bottom w:val="single" w:sz="4" w:space="0" w:color="CBD5E1"/>
-              <w:right w:val="single" w:sz="4" w:space="0" w:color="CBD5E1"/>
-            </w:tcBorders>
-          </w:tcPr>
-          <w:p>
-            <w:pPr>
-              <w:spacing w:before="40" w:after="40" w:lineRule="auto" w:line="240"/>
-              <w:jc w:val="left"/>
-            </w:pPr>
-            <w:r/>
-            <w:r>
-              <w:rPr>
-                <w:rFonts w:ascii="Calibri" w:hAnsi="Calibri" w:eastAsia="Calibri"/>
-                <w:b w:val="0"/>
-                <w:i w:val="0"/>
-                <w:color w:val="1F2937"/>
-                <w:sz w:val="16"/>
-              </w:rPr>
-              <w:t>500,000 STX committed once; reused every cycle</w:t>
-            </w:r>
-          </w:p>
-        </w:tc>
-        <w:tc>
-          <w:tcPr>
-            <w:tcW w:type="dxa" w:w="3168"/>
-            <w:shd w:fill="F7FAFC" w:val="clear"/>
-            <w:tcBorders>
-              <w:top w:val="single" w:sz="4" w:space="0" w:color="CBD5E1"/>
-              <w:left w:val="single" w:sz="4" w:space="0" w:color="CBD5E1"/>
-              <w:bottom w:val="single" w:sz="4" w:space="0" w:color="CBD5E1"/>
-              <w:right w:val="single" w:sz="4" w:space="0" w:color="CBD5E1"/>
-            </w:tcBorders>
-          </w:tcPr>
-          <w:p>
-            <w:pPr>
-              <w:spacing w:before="40" w:after="40" w:lineRule="auto" w:line="240"/>
-              <w:jc w:val="left"/>
-            </w:pPr>
-            <w:r/>
-            <w:r>
-              <w:rPr>
-                <w:rFonts w:ascii="Calibri" w:hAnsi="Calibri" w:eastAsia="Calibri"/>
-                <w:b w:val="0"/>
-                <w:i w:val="0"/>
-                <w:color w:val="1F2937"/>
-                <w:sz w:val="16"/>
-              </w:rPr>
-              <w:t>500,000 STX constant (reusable)</w:t>
-            </w:r>
-          </w:p>
-        </w:tc>
-      </w:tr>
-      <w:tr>
-        <w:tc>
-          <w:tcPr>
-            <w:tcW w:type="dxa" w:w="3168"/>
-            <w:tcBorders>
-              <w:top w:val="single" w:sz="4" w:space="0" w:color="CBD5E1"/>
-              <w:left w:val="single" w:sz="4" w:space="0" w:color="CBD5E1"/>
-              <w:bottom w:val="single" w:sz="4" w:space="0" w:color="CBD5E1"/>
-              <w:right w:val="single" w:sz="4" w:space="0" w:color="CBD5E1"/>
-            </w:tcBorders>
-          </w:tcPr>
-          <w:p>
-            <w:pPr>
-              <w:spacing w:before="40" w:after="40" w:lineRule="auto" w:line="240"/>
-              <w:jc w:val="center"/>
-            </w:pPr>
-            <w:r/>
-            <w:r>
-              <w:rPr>
-                <w:rFonts w:ascii="Calibri" w:hAnsi="Calibri" w:eastAsia="Calibri"/>
-                <w:b w:val="0"/>
-                <w:i w:val="0"/>
-                <w:color w:val="1F2937"/>
-                <w:sz w:val="16"/>
-              </w:rPr>
-              <w:t>Ecosystem impact</w:t>
-            </w:r>
-          </w:p>
-        </w:tc>
-        <w:tc>
-          <w:tcPr>
-            <w:tcW w:type="dxa" w:w="3168"/>
-            <w:tcBorders>
-              <w:top w:val="single" w:sz="4" w:space="0" w:color="CBD5E1"/>
-              <w:left w:val="single" w:sz="4" w:space="0" w:color="CBD5E1"/>
-              <w:bottom w:val="single" w:sz="4" w:space="0" w:color="CBD5E1"/>
-              <w:right w:val="single" w:sz="4" w:space="0" w:color="CBD5E1"/>
-            </w:tcBorders>
-          </w:tcPr>
-          <w:p>
-            <w:pPr>
-              <w:spacing w:before="40" w:after="40" w:lineRule="auto" w:line="240"/>
-              <w:jc w:val="left"/>
-            </w:pPr>
-            <w:r/>
-            <w:r>
-              <w:rPr>
-                <w:rFonts w:ascii="Calibri" w:hAnsi="Calibri" w:eastAsia="Calibri"/>
-                <w:b w:val="0"/>
-                <w:i w:val="0"/>
-                <w:color w:val="1F2937"/>
-                <w:sz w:val="16"/>
+                <w:sz w:val="18"/>
               </w:rPr>
               <w:t>Higher STX deposits, wallet activity, and Bitcoin DeFi awareness on Stacks</w:t>
-            </w:r>
-          </w:p>
-        </w:tc>
-        <w:tc>
-          <w:tcPr>
-            <w:tcW w:type="dxa" w:w="3168"/>
-            <w:tcBorders>
-              <w:top w:val="single" w:sz="4" w:space="0" w:color="CBD5E1"/>
-              <w:left w:val="single" w:sz="4" w:space="0" w:color="CBD5E1"/>
-              <w:bottom w:val="single" w:sz="4" w:space="0" w:color="CBD5E1"/>
-              <w:right w:val="single" w:sz="4" w:space="0" w:color="CBD5E1"/>
-            </w:tcBorders>
-          </w:tcPr>
-          <w:p>
-            <w:pPr>
-              <w:spacing w:before="40" w:after="40" w:lineRule="auto" w:line="240"/>
-              <w:jc w:val="left"/>
-            </w:pPr>
-            <w:r/>
-            <w:r>
-              <w:rPr>
-                <w:rFonts w:ascii="Calibri" w:hAnsi="Calibri" w:eastAsia="Calibri"/>
-                <w:b w:val="0"/>
-                <w:i w:val="0"/>
-                <w:color w:val="1F2937"/>
-                <w:sz w:val="16"/>
-              </w:rPr>
-              <w:t>—</w:t>
             </w:r>
           </w:p>
         </w:tc>

</xml_diff>

<commit_message>
Add Aims section and platform/ecosystem benefits table
Insert Aims before Objective, renumber sections, and add a
side-by-side benefits table after Expected Outcomes.

Co-authored-by: cryptosmith.btc <Zeus-Adin@users.noreply.github.com>
</commit_message>
<xml_diff>
--- a/StacksPot-Growth-Acceleration-Proposal.docx
+++ b/StacksPot-Growth-Acceleration-Proposal.docx
@@ -670,7 +670,167 @@
           <w:color w:val="1A365D"/>
           <w:sz w:val="30"/>
         </w:rPr>
-        <w:t>1. Objective</w:t>
+        <w:t>1. Aims</w:t>
+      </w:r>
+    </w:p>
+    <w:p>
+      <w:pPr>
+        <w:spacing w:before="0" w:after="80" w:lineRule="auto" w:line="276"/>
+      </w:pPr>
+      <w:r>
+        <w:rPr>
+          <w:rFonts w:ascii="Calibri" w:hAnsi="Calibri" w:eastAsia="Calibri"/>
+          <w:b w:val="0"/>
+          <w:i w:val="0"/>
+          <w:color w:val="1F2937"/>
+          <w:sz w:val="22"/>
+        </w:rPr>
+        <w:t>This Growth Accelerator is designed to:</w:t>
+      </w:r>
+    </w:p>
+    <w:p>
+      <w:pPr>
+        <w:pStyle w:val="ListNumber"/>
+        <w:spacing w:before="0" w:after="60" w:lineRule="auto" w:line="264"/>
+      </w:pPr>
+      <w:r>
+        <w:rPr>
+          <w:rFonts w:ascii="Calibri" w:hAnsi="Calibri" w:eastAsia="Calibri"/>
+          <w:b/>
+          <w:i w:val="0"/>
+          <w:color w:val="1F2937"/>
+          <w:sz w:val="22"/>
+        </w:rPr>
+        <w:t>Catalyze adoption</w:t>
+      </w:r>
+      <w:r>
+        <w:rPr>
+          <w:rFonts w:ascii="Calibri" w:hAnsi="Calibri" w:eastAsia="Calibri"/>
+          <w:b w:val="0"/>
+          <w:i w:val="0"/>
+          <w:color w:val="1F2937"/>
+          <w:sz w:val="22"/>
+        </w:rPr>
+        <w:t xml:space="preserve"> — bring new and returning users into Stacks DeFi through attractive, time-bound sponsored pots</w:t>
+      </w:r>
+    </w:p>
+    <w:p>
+      <w:pPr>
+        <w:pStyle w:val="ListNumber"/>
+        <w:spacing w:before="0" w:after="60" w:lineRule="auto" w:line="264"/>
+      </w:pPr>
+      <w:r>
+        <w:rPr>
+          <w:rFonts w:ascii="Calibri" w:hAnsi="Calibri" w:eastAsia="Calibri"/>
+          <w:b/>
+          <w:i w:val="0"/>
+          <w:color w:val="1F2937"/>
+          <w:sz w:val="22"/>
+        </w:rPr>
+        <w:t>Prove capital-efficient incentives</w:t>
+      </w:r>
+      <w:r>
+        <w:rPr>
+          <w:rFonts w:ascii="Calibri" w:hAnsi="Calibri" w:eastAsia="Calibri"/>
+          <w:b w:val="0"/>
+          <w:i w:val="0"/>
+          <w:color w:val="1F2937"/>
+          <w:sz w:val="22"/>
+        </w:rPr>
+        <w:t xml:space="preserve"> — show that a single reusable 500,000 STX allocation can power 10 cycles of high-frequency campaigns</w:t>
+      </w:r>
+    </w:p>
+    <w:p>
+      <w:pPr>
+        <w:pStyle w:val="ListNumber"/>
+        <w:spacing w:before="0" w:after="60" w:lineRule="auto" w:line="264"/>
+      </w:pPr>
+      <w:r>
+        <w:rPr>
+          <w:rFonts w:ascii="Calibri" w:hAnsi="Calibri" w:eastAsia="Calibri"/>
+          <w:b/>
+          <w:i w:val="0"/>
+          <w:color w:val="1F2937"/>
+          <w:sz w:val="22"/>
+        </w:rPr>
+        <w:t>Scale on-chain activity</w:t>
+      </w:r>
+      <w:r>
+        <w:rPr>
+          <w:rFonts w:ascii="Calibri" w:hAnsi="Calibri" w:eastAsia="Calibri"/>
+          <w:b w:val="0"/>
+          <w:i w:val="0"/>
+          <w:color w:val="1F2937"/>
+          <w:sz w:val="22"/>
+        </w:rPr>
+        <w:t xml:space="preserve"> — drive measurable growth in pot deployments, participant joins, STX stacking, and wallet interactions</w:t>
+      </w:r>
+    </w:p>
+    <w:p>
+      <w:pPr>
+        <w:pStyle w:val="ListNumber"/>
+        <w:spacing w:before="0" w:after="60" w:lineRule="auto" w:line="264"/>
+      </w:pPr>
+      <w:r>
+        <w:rPr>
+          <w:rFonts w:ascii="Calibri" w:hAnsi="Calibri" w:eastAsia="Calibri"/>
+          <w:b/>
+          <w:i w:val="0"/>
+          <w:color w:val="1F2937"/>
+          <w:sz w:val="22"/>
+        </w:rPr>
+        <w:t>Strengthen community infrastructure</w:t>
+      </w:r>
+      <w:r>
+        <w:rPr>
+          <w:rFonts w:ascii="Calibri" w:hAnsi="Calibri" w:eastAsia="Calibri"/>
+          <w:b w:val="0"/>
+          <w:i w:val="0"/>
+          <w:color w:val="1F2937"/>
+          <w:sz w:val="22"/>
+        </w:rPr>
+        <w:t xml:space="preserve"> — position StacksPot as a repeatable incentive layer communities and builders can use beyond this program</w:t>
+      </w:r>
+    </w:p>
+    <w:p>
+      <w:pPr>
+        <w:pStyle w:val="ListNumber"/>
+        <w:spacing w:before="0" w:after="60" w:lineRule="auto" w:line="264"/>
+      </w:pPr>
+      <w:r>
+        <w:rPr>
+          <w:rFonts w:ascii="Calibri" w:hAnsi="Calibri" w:eastAsia="Calibri"/>
+          <w:b/>
+          <w:i w:val="0"/>
+          <w:color w:val="1F2937"/>
+          <w:sz w:val="22"/>
+        </w:rPr>
+        <w:t>Expand Bitcoin DeFi awareness</w:t>
+      </w:r>
+      <w:r>
+        <w:rPr>
+          <w:rFonts w:ascii="Calibri" w:hAnsi="Calibri" w:eastAsia="Calibri"/>
+          <w:b w:val="0"/>
+          <w:i w:val="0"/>
+          <w:color w:val="1F2937"/>
+          <w:sz w:val="22"/>
+        </w:rPr>
+        <w:t xml:space="preserve"> — introduce more participants to Bitcoin-secured yield opportunities available through Stacks</w:t>
+      </w:r>
+    </w:p>
+    <w:p>
+      <w:pPr>
+        <w:spacing w:before="320" w:after="120" w:lineRule="auto" w:line="276"/>
+      </w:pPr>
+      <w:r>
+        <w:rPr>
+          <w:rFonts w:ascii="Calibri" w:hAnsi="Calibri" w:eastAsia="Calibri"/>
+          <w:b/>
+          <w:i w:val="0"/>
+          <w:color w:val="1A365D"/>
+          <w:sz w:val="30"/>
+        </w:rPr>
+        <w:t>2. Objective</w:t>
       </w:r>
     </w:p>
     <w:p>
@@ -700,7 +860,7 @@
           <w:color w:val="1A365D"/>
           <w:sz w:val="30"/>
         </w:rPr>
-        <w:t>2. Executive Summary</w:t>
+        <w:t>3. Executive Summary</w:t>
       </w:r>
     </w:p>
     <w:p>
@@ -1387,7 +1547,7 @@
           <w:color w:val="1A365D"/>
           <w:sz w:val="30"/>
         </w:rPr>
-        <w:t>3. How Sponsorship Capital Works</w:t>
+        <w:t>4. How Sponsorship Capital Works</w:t>
       </w:r>
     </w:p>
     <w:p>
@@ -1497,7 +1657,7 @@
           <w:color w:val="1A365D"/>
           <w:sz w:val="30"/>
         </w:rPr>
-        <w:t>4. Boosting Campaign Structure</w:t>
+        <w:t>5. Boosting Campaign Structure</w:t>
       </w:r>
     </w:p>
     <w:p>
@@ -6324,7 +6484,7 @@
           <w:color w:val="1A365D"/>
           <w:sz w:val="30"/>
         </w:rPr>
-        <w:t>5. Expected Outcomes</w:t>
+        <w:t>6. Expected Outcomes</w:t>
       </w:r>
     </w:p>
     <w:tbl>
@@ -6830,7 +6990,453 @@
           <w:color w:val="1A365D"/>
           <w:sz w:val="30"/>
         </w:rPr>
-        <w:t>6. Reporting</w:t>
+        <w:t>7. Benefits</w:t>
+      </w:r>
+    </w:p>
+    <w:tbl>
+      <w:tblPr>
+        <w:tblW w:type="auto" w:w="0"/>
+        <w:jc w:val="center"/>
+        <w:tblLayout w:type="autofit"/>
+        <w:tblLook w:firstColumn="1" w:firstRow="1" w:lastColumn="0" w:lastRow="0" w:noHBand="0" w:noVBand="1" w:val="04A0"/>
+      </w:tblPr>
+      <w:tblGrid>
+        <w:gridCol w:w="4896"/>
+        <w:gridCol w:w="4896"/>
+      </w:tblGrid>
+      <w:tr>
+        <w:tc>
+          <w:tcPr>
+            <w:tcW w:type="dxa" w:w="4752"/>
+            <w:shd w:fill="1A365D" w:val="clear"/>
+            <w:tcBorders>
+              <w:top w:val="single" w:sz="4" w:space="0" w:color="1A365D"/>
+              <w:left w:val="single" w:sz="4" w:space="0" w:color="1A365D"/>
+              <w:bottom w:val="single" w:sz="4" w:space="0" w:color="1A365D"/>
+              <w:right w:val="single" w:sz="4" w:space="0" w:color="1A365D"/>
+            </w:tcBorders>
+          </w:tcPr>
+          <w:p>
+            <w:pPr>
+              <w:spacing w:before="40" w:after="40" w:lineRule="auto" w:line="240"/>
+              <w:jc w:val="center"/>
+            </w:pPr>
+            <w:r/>
+            <w:r>
+              <w:rPr>
+                <w:rFonts w:ascii="Calibri" w:hAnsi="Calibri" w:eastAsia="Calibri"/>
+                <w:b/>
+                <w:i w:val="0"/>
+                <w:color w:val="FFFFFF"/>
+                <w:sz w:val="18"/>
+              </w:rPr>
+              <w:t>Benefits of the StacksPot Platform</w:t>
+            </w:r>
+          </w:p>
+        </w:tc>
+        <w:tc>
+          <w:tcPr>
+            <w:tcW w:type="dxa" w:w="4752"/>
+            <w:shd w:fill="1A365D" w:val="clear"/>
+            <w:tcBorders>
+              <w:top w:val="single" w:sz="4" w:space="0" w:color="1A365D"/>
+              <w:left w:val="single" w:sz="4" w:space="0" w:color="1A365D"/>
+              <w:bottom w:val="single" w:sz="4" w:space="0" w:color="1A365D"/>
+              <w:right w:val="single" w:sz="4" w:space="0" w:color="1A365D"/>
+            </w:tcBorders>
+          </w:tcPr>
+          <w:p>
+            <w:pPr>
+              <w:spacing w:before="40" w:after="40" w:lineRule="auto" w:line="240"/>
+              <w:jc w:val="center"/>
+            </w:pPr>
+            <w:r/>
+            <w:r>
+              <w:rPr>
+                <w:rFonts w:ascii="Calibri" w:hAnsi="Calibri" w:eastAsia="Calibri"/>
+                <w:b/>
+                <w:i w:val="0"/>
+                <w:color w:val="FFFFFF"/>
+                <w:sz w:val="18"/>
+              </w:rPr>
+              <w:t>Benefits of the Stacks Ecosystem</w:t>
+            </w:r>
+          </w:p>
+        </w:tc>
+      </w:tr>
+      <w:tr>
+        <w:tc>
+          <w:tcPr>
+            <w:tcW w:type="dxa" w:w="4752"/>
+            <w:tcBorders>
+              <w:top w:val="single" w:sz="4" w:space="0" w:color="CBD5E1"/>
+              <w:left w:val="single" w:sz="4" w:space="0" w:color="CBD5E1"/>
+              <w:bottom w:val="single" w:sz="4" w:space="0" w:color="CBD5E1"/>
+              <w:right w:val="single" w:sz="4" w:space="0" w:color="CBD5E1"/>
+            </w:tcBorders>
+          </w:tcPr>
+          <w:p>
+            <w:pPr>
+              <w:spacing w:before="40" w:after="40" w:lineRule="auto" w:line="240"/>
+              <w:jc w:val="center"/>
+            </w:pPr>
+            <w:r/>
+            <w:r>
+              <w:rPr>
+                <w:rFonts w:ascii="Calibri" w:hAnsi="Calibri" w:eastAsia="Calibri"/>
+                <w:b w:val="0"/>
+                <w:i w:val="0"/>
+                <w:color w:val="1F2937"/>
+                <w:sz w:val="18"/>
+              </w:rPr>
+              <w:t>Stronger reward perception through sponsored boosts, increasing pot fill rates and repeat participation</w:t>
+            </w:r>
+          </w:p>
+        </w:tc>
+        <w:tc>
+          <w:tcPr>
+            <w:tcW w:type="dxa" w:w="4752"/>
+            <w:tcBorders>
+              <w:top w:val="single" w:sz="4" w:space="0" w:color="CBD5E1"/>
+              <w:left w:val="single" w:sz="4" w:space="0" w:color="CBD5E1"/>
+              <w:bottom w:val="single" w:sz="4" w:space="0" w:color="CBD5E1"/>
+              <w:right w:val="single" w:sz="4" w:space="0" w:color="CBD5E1"/>
+            </w:tcBorders>
+          </w:tcPr>
+          <w:p>
+            <w:pPr>
+              <w:spacing w:before="40" w:after="40" w:lineRule="auto" w:line="240"/>
+              <w:jc w:val="left"/>
+            </w:pPr>
+            <w:r/>
+            <w:r>
+              <w:rPr>
+                <w:rFonts w:ascii="Calibri" w:hAnsi="Calibri" w:eastAsia="Calibri"/>
+                <w:b w:val="0"/>
+                <w:i w:val="0"/>
+                <w:color w:val="1F2937"/>
+                <w:sz w:val="18"/>
+              </w:rPr>
+              <w:t>More STX deposited and actively used across DeFi, increasing network economic activity</w:t>
+            </w:r>
+          </w:p>
+        </w:tc>
+      </w:tr>
+      <w:tr>
+        <w:tc>
+          <w:tcPr>
+            <w:tcW w:type="dxa" w:w="4752"/>
+            <w:shd w:fill="F7FAFC" w:val="clear"/>
+            <w:tcBorders>
+              <w:top w:val="single" w:sz="4" w:space="0" w:color="CBD5E1"/>
+              <w:left w:val="single" w:sz="4" w:space="0" w:color="CBD5E1"/>
+              <w:bottom w:val="single" w:sz="4" w:space="0" w:color="CBD5E1"/>
+              <w:right w:val="single" w:sz="4" w:space="0" w:color="CBD5E1"/>
+            </w:tcBorders>
+          </w:tcPr>
+          <w:p>
+            <w:pPr>
+              <w:spacing w:before="40" w:after="40" w:lineRule="auto" w:line="240"/>
+              <w:jc w:val="center"/>
+            </w:pPr>
+            <w:r/>
+            <w:r>
+              <w:rPr>
+                <w:rFonts w:ascii="Calibri" w:hAnsi="Calibri" w:eastAsia="Calibri"/>
+                <w:b w:val="0"/>
+                <w:i w:val="0"/>
+                <w:color w:val="1F2937"/>
+                <w:sz w:val="18"/>
+              </w:rPr>
+              <w:t>Predictable 2-week / 23-pot campaign cadence that communities can plan around</w:t>
+            </w:r>
+          </w:p>
+        </w:tc>
+        <w:tc>
+          <w:tcPr>
+            <w:tcW w:type="dxa" w:w="4752"/>
+            <w:shd w:fill="F7FAFC" w:val="clear"/>
+            <w:tcBorders>
+              <w:top w:val="single" w:sz="4" w:space="0" w:color="CBD5E1"/>
+              <w:left w:val="single" w:sz="4" w:space="0" w:color="CBD5E1"/>
+              <w:bottom w:val="single" w:sz="4" w:space="0" w:color="CBD5E1"/>
+              <w:right w:val="single" w:sz="4" w:space="0" w:color="CBD5E1"/>
+            </w:tcBorders>
+          </w:tcPr>
+          <w:p>
+            <w:pPr>
+              <w:spacing w:before="40" w:after="40" w:lineRule="auto" w:line="240"/>
+              <w:jc w:val="left"/>
+            </w:pPr>
+            <w:r/>
+            <w:r>
+              <w:rPr>
+                <w:rFonts w:ascii="Calibri" w:hAnsi="Calibri" w:eastAsia="Calibri"/>
+                <w:b w:val="0"/>
+                <w:i w:val="0"/>
+                <w:color w:val="1F2937"/>
+                <w:sz w:val="18"/>
+              </w:rPr>
+              <w:t>Higher wallet activity and on-chain transaction volume (target 9,520+ txs over 5 months)</w:t>
+            </w:r>
+          </w:p>
+        </w:tc>
+      </w:tr>
+      <w:tr>
+        <w:tc>
+          <w:tcPr>
+            <w:tcW w:type="dxa" w:w="4752"/>
+            <w:tcBorders>
+              <w:top w:val="single" w:sz="4" w:space="0" w:color="CBD5E1"/>
+              <w:left w:val="single" w:sz="4" w:space="0" w:color="CBD5E1"/>
+              <w:bottom w:val="single" w:sz="4" w:space="0" w:color="CBD5E1"/>
+              <w:right w:val="single" w:sz="4" w:space="0" w:color="CBD5E1"/>
+            </w:tcBorders>
+          </w:tcPr>
+          <w:p>
+            <w:pPr>
+              <w:spacing w:before="40" w:after="40" w:lineRule="auto" w:line="240"/>
+              <w:jc w:val="center"/>
+            </w:pPr>
+            <w:r/>
+            <w:r>
+              <w:rPr>
+                <w:rFonts w:ascii="Calibri" w:hAnsi="Calibri" w:eastAsia="Calibri"/>
+                <w:b w:val="0"/>
+                <w:i w:val="0"/>
+                <w:color w:val="1F2937"/>
+                <w:sz w:val="18"/>
+              </w:rPr>
+              <w:t>Capital-efficient growth: one 500,000 STX allocation powers 230 pots via reusable sponsorship</w:t>
+            </w:r>
+          </w:p>
+        </w:tc>
+        <w:tc>
+          <w:tcPr>
+            <w:tcW w:type="dxa" w:w="4752"/>
+            <w:tcBorders>
+              <w:top w:val="single" w:sz="4" w:space="0" w:color="CBD5E1"/>
+              <w:left w:val="single" w:sz="4" w:space="0" w:color="CBD5E1"/>
+              <w:bottom w:val="single" w:sz="4" w:space="0" w:color="CBD5E1"/>
+              <w:right w:val="single" w:sz="4" w:space="0" w:color="CBD5E1"/>
+            </w:tcBorders>
+          </w:tcPr>
+          <w:p>
+            <w:pPr>
+              <w:spacing w:before="40" w:after="40" w:lineRule="auto" w:line="240"/>
+              <w:jc w:val="left"/>
+            </w:pPr>
+            <w:r/>
+            <w:r>
+              <w:rPr>
+                <w:rFonts w:ascii="Calibri" w:hAnsi="Calibri" w:eastAsia="Calibri"/>
+                <w:b w:val="0"/>
+                <w:i w:val="0"/>
+                <w:color w:val="1F2937"/>
+                <w:sz w:val="18"/>
+              </w:rPr>
+              <w:t>Expanded surface area for Bitcoin-secured yield — new users experience Stacks as Bitcoin DeFi</w:t>
+            </w:r>
+          </w:p>
+        </w:tc>
+      </w:tr>
+      <w:tr>
+        <w:tc>
+          <w:tcPr>
+            <w:tcW w:type="dxa" w:w="4752"/>
+            <w:shd w:fill="EEF2F7" w:val="clear"/>
+            <w:tcBorders>
+              <w:top w:val="single" w:sz="4" w:space="0" w:color="CBD5E1"/>
+              <w:left w:val="single" w:sz="4" w:space="0" w:color="CBD5E1"/>
+              <w:bottom w:val="single" w:sz="4" w:space="0" w:color="CBD5E1"/>
+              <w:right w:val="single" w:sz="4" w:space="0" w:color="CBD5E1"/>
+            </w:tcBorders>
+          </w:tcPr>
+          <w:p>
+            <w:pPr>
+              <w:spacing w:before="40" w:after="40" w:lineRule="auto" w:line="240"/>
+              <w:jc w:val="center"/>
+            </w:pPr>
+            <w:r/>
+            <w:r>
+              <w:rPr>
+                <w:rFonts w:ascii="Calibri" w:hAnsi="Calibri" w:eastAsia="Calibri"/>
+                <w:b/>
+                <w:i w:val="0"/>
+                <w:color w:val="1A365D"/>
+                <w:sz w:val="18"/>
+              </w:rPr>
+              <w:t>Clear pot-type mix (JackPot + Sequential) covering small, mid, and high entry sizes</w:t>
+            </w:r>
+          </w:p>
+        </w:tc>
+        <w:tc>
+          <w:tcPr>
+            <w:tcW w:type="dxa" w:w="4752"/>
+            <w:shd w:fill="EEF2F7" w:val="clear"/>
+            <w:tcBorders>
+              <w:top w:val="single" w:sz="4" w:space="0" w:color="CBD5E1"/>
+              <w:left w:val="single" w:sz="4" w:space="0" w:color="CBD5E1"/>
+              <w:bottom w:val="single" w:sz="4" w:space="0" w:color="CBD5E1"/>
+              <w:right w:val="single" w:sz="4" w:space="0" w:color="CBD5E1"/>
+            </w:tcBorders>
+          </w:tcPr>
+          <w:p>
+            <w:pPr>
+              <w:spacing w:before="40" w:after="40" w:lineRule="auto" w:line="240"/>
+              <w:jc w:val="left"/>
+            </w:pPr>
+            <w:r/>
+            <w:r>
+              <w:rPr>
+                <w:rFonts w:ascii="Calibri" w:hAnsi="Calibri" w:eastAsia="Calibri"/>
+                <w:b/>
+                <w:i w:val="0"/>
+                <w:color w:val="1A365D"/>
+                <w:sz w:val="18"/>
+              </w:rPr>
+              <w:t>Builders and communities gain a ready-made incentive rail for their own campaigns after the program</w:t>
+            </w:r>
+          </w:p>
+        </w:tc>
+      </w:tr>
+      <w:tr>
+        <w:tc>
+          <w:tcPr>
+            <w:tcW w:type="dxa" w:w="4752"/>
+            <w:tcBorders>
+              <w:top w:val="single" w:sz="4" w:space="0" w:color="CBD5E1"/>
+              <w:left w:val="single" w:sz="4" w:space="0" w:color="CBD5E1"/>
+              <w:bottom w:val="single" w:sz="4" w:space="0" w:color="CBD5E1"/>
+              <w:right w:val="single" w:sz="4" w:space="0" w:color="CBD5E1"/>
+            </w:tcBorders>
+          </w:tcPr>
+          <w:p>
+            <w:pPr>
+              <w:spacing w:before="40" w:after="40" w:lineRule="auto" w:line="240"/>
+              <w:jc w:val="center"/>
+            </w:pPr>
+            <w:r/>
+            <w:r>
+              <w:rPr>
+                <w:rFonts w:ascii="Calibri" w:hAnsi="Calibri" w:eastAsia="Calibri"/>
+                <w:b w:val="0"/>
+                <w:i w:val="0"/>
+                <w:color w:val="1F2937"/>
+                <w:sz w:val="18"/>
+              </w:rPr>
+              <w:t>Transparent metrics: pots, participants, stacked STX, and full lifecycle transaction accounting</w:t>
+            </w:r>
+          </w:p>
+        </w:tc>
+        <w:tc>
+          <w:tcPr>
+            <w:tcW w:type="dxa" w:w="4752"/>
+            <w:tcBorders>
+              <w:top w:val="single" w:sz="4" w:space="0" w:color="CBD5E1"/>
+              <w:left w:val="single" w:sz="4" w:space="0" w:color="CBD5E1"/>
+              <w:bottom w:val="single" w:sz="4" w:space="0" w:color="CBD5E1"/>
+              <w:right w:val="single" w:sz="4" w:space="0" w:color="CBD5E1"/>
+            </w:tcBorders>
+          </w:tcPr>
+          <w:p>
+            <w:pPr>
+              <w:spacing w:before="40" w:after="40" w:lineRule="auto" w:line="240"/>
+              <w:jc w:val="left"/>
+            </w:pPr>
+            <w:r/>
+            <w:r>
+              <w:rPr>
+                <w:rFonts w:ascii="Calibri" w:hAnsi="Calibri" w:eastAsia="Calibri"/>
+                <w:b w:val="0"/>
+                <w:i w:val="0"/>
+                <w:color w:val="1F2937"/>
+                <w:sz w:val="18"/>
+              </w:rPr>
+              <w:t>Retention data across 10 cycles informs future Endowment and ecosystem incentive design</w:t>
+            </w:r>
+          </w:p>
+        </w:tc>
+      </w:tr>
+      <w:tr>
+        <w:tc>
+          <w:tcPr>
+            <w:tcW w:type="dxa" w:w="4752"/>
+            <w:shd w:fill="F7FAFC" w:val="clear"/>
+            <w:tcBorders>
+              <w:top w:val="single" w:sz="4" w:space="0" w:color="CBD5E1"/>
+              <w:left w:val="single" w:sz="4" w:space="0" w:color="CBD5E1"/>
+              <w:bottom w:val="single" w:sz="4" w:space="0" w:color="CBD5E1"/>
+              <w:right w:val="single" w:sz="4" w:space="0" w:color="CBD5E1"/>
+            </w:tcBorders>
+          </w:tcPr>
+          <w:p>
+            <w:pPr>
+              <w:spacing w:before="40" w:after="40" w:lineRule="auto" w:line="240"/>
+              <w:jc w:val="center"/>
+            </w:pPr>
+            <w:r/>
+            <w:r>
+              <w:rPr>
+                <w:rFonts w:ascii="Calibri" w:hAnsi="Calibri" w:eastAsia="Calibri"/>
+                <w:b w:val="0"/>
+                <w:i w:val="0"/>
+                <w:color w:val="1F2937"/>
+                <w:sz w:val="18"/>
+              </w:rPr>
+              <w:t>Converts campaign participants into recurring StacksPot users and pot creators</w:t>
+            </w:r>
+          </w:p>
+        </w:tc>
+        <w:tc>
+          <w:tcPr>
+            <w:tcW w:type="dxa" w:w="4752"/>
+            <w:shd w:fill="F7FAFC" w:val="clear"/>
+            <w:tcBorders>
+              <w:top w:val="single" w:sz="4" w:space="0" w:color="CBD5E1"/>
+              <w:left w:val="single" w:sz="4" w:space="0" w:color="CBD5E1"/>
+              <w:bottom w:val="single" w:sz="4" w:space="0" w:color="CBD5E1"/>
+              <w:right w:val="single" w:sz="4" w:space="0" w:color="CBD5E1"/>
+            </w:tcBorders>
+          </w:tcPr>
+          <w:p>
+            <w:pPr>
+              <w:spacing w:before="40" w:after="40" w:lineRule="auto" w:line="240"/>
+              <w:jc w:val="left"/>
+            </w:pPr>
+            <w:r/>
+            <w:r>
+              <w:rPr>
+                <w:rFonts w:ascii="Calibri" w:hAnsi="Calibri" w:eastAsia="Calibri"/>
+                <w:b w:val="0"/>
+                <w:i w:val="0"/>
+                <w:color w:val="1F2937"/>
+                <w:sz w:val="18"/>
+              </w:rPr>
+              <w:t>Strengthens Stacks’ position as the home for accessible, community-driven Bitcoin DeFi</w:t>
+            </w:r>
+          </w:p>
+        </w:tc>
+      </w:tr>
+    </w:tbl>
+    <w:p>
+      <w:pPr>
+        <w:spacing w:before="0" w:after="120" w:lineRule="auto" w:line="240"/>
+      </w:pPr>
+    </w:p>
+    <w:p>
+      <w:pPr>
+        <w:spacing w:before="320" w:after="120" w:lineRule="auto" w:line="276"/>
+      </w:pPr>
+      <w:r>
+        <w:rPr>
+          <w:rFonts w:ascii="Calibri" w:hAnsi="Calibri" w:eastAsia="Calibri"/>
+          <w:b/>
+          <w:i w:val="0"/>
+          <w:color w:val="1A365D"/>
+          <w:sz w:val="30"/>
+        </w:rPr>
+        <w:t>8. Reporting</w:t>
       </w:r>
     </w:p>
     <w:p>
@@ -6895,7 +7501,7 @@
           <w:color w:val="1A365D"/>
           <w:sz w:val="30"/>
         </w:rPr>
-        <w:t>7. Conclusion</w:t>
+        <w:t>9. Conclusion</w:t>
       </w:r>
     </w:p>
     <w:p>

</xml_diff>